<commit_message>
Chemical page: tighten copy and add tabbed resources section
- Tighten copy section by section: IPP as the subject, one fact per
  sentence, answer-first FAQs. Outline headings, preserved original
  sentences and the buying steps are unchanged.
- New hero opener (establishes / sidelining) and a maker line on each
  category card, taken from the IMS manufacturer filters on 2026-10-06.
- Merge FAQs and resources into one "Chemical Process Plants Resources"
  section with About Us, FAQs and Blog tabs. The About panel adds the
  company profile beside the IPP team photo.
- Tabs are progressive enhancement with keyboard support and
  #about-ipp, #faqs and #blog deep links.
- Validator adds tab, FAQ placement, blog card, reviews heading, buying
  steps and About photo checks (93 pass). IPP page checker: 0 issues.
- Refresh build docs: README revision note, browser checks, Word copy,
  standalone preview and preview images.

Co-Authored-By: Claude Opus 5.5 <noreply@anthropic.com>
</commit_message>
<xml_diff>
--- a/docs/chemical-build/deliverables/used-chemical-process-plants-for-sale-content.docx
+++ b/docs/chemical-build/deliverables/used-chemical-process-plants-for-sale-content.docx
@@ -74,7 +74,7 @@
         <w:rPr>
           <w:rFonts w:ascii="Roboto" w:hAnsi="Roboto" w:eastAsia="Roboto"/>
         </w:rPr>
-        <w:t>Find a complete chemical plant, source a specific processing system, or put surplus assets back to work.</w:t>
+        <w:t>Buying used chemical process plants and equipment from IPP establishes reaction, separation, and heat transfer capacity while sidelining issues like OEM lead times and new-build capital costs.</w:t>
       </w:r>
     </w:p>
     <w:p>
@@ -110,7 +110,7 @@
         <w:rPr>
           <w:rFonts w:ascii="Roboto" w:hAnsi="Roboto" w:eastAsia="Roboto"/>
         </w:rPr>
-        <w:t>Specifications. Video inspections. Global relocation support.</w:t>
+        <w:t>Specifications. Video or on-site inspections. Global relocation support.</w:t>
       </w:r>
     </w:p>
     <w:p>
@@ -129,7 +129,7 @@
         <w:rPr>
           <w:rFonts w:ascii="Roboto" w:hAnsi="Roboto" w:eastAsia="Roboto"/>
         </w:rPr>
-        <w:t>Review capacity, process technology and location for each plant.</w:t>
+        <w:t>Compare capacity, process technology, feedstock and location for each plant.</w:t>
       </w:r>
     </w:p>
     <w:p>
@@ -164,7 +164,7 @@
         <w:rPr>
           <w:rFonts w:ascii="Roboto" w:hAnsi="Roboto" w:eastAsia="Roboto"/>
         </w:rPr>
-        <w:t>Find reactors, separation systems, heat transfer equipment and more.</w:t>
+        <w:t>Source reactors, heat exchangers, centrifuges, dryers, filters, columns and tanks.</w:t>
       </w:r>
     </w:p>
     <w:p>
@@ -199,7 +199,7 @@
         <w:rPr>
           <w:rFonts w:ascii="Roboto" w:hAnsi="Roboto" w:eastAsia="Roboto"/>
         </w:rPr>
-        <w:t>Sell a plant, a process line or individual equipment to IPP.</w:t>
+        <w:t>Sell a complete plant, a process line or individual equipment to IPP.</w:t>
       </w:r>
     </w:p>
     <w:p>
@@ -352,7 +352,7 @@
         <w:rPr>
           <w:rFonts w:ascii="Roboto" w:hAnsi="Roboto" w:eastAsia="Roboto"/>
         </w:rPr>
-        <w:t>Selected listings from IPP’s inventory. Open each listing for full specifications, photographs and current availability.</w:t>
+        <w:t>Plant listings show capacity, technology, feedstock and location. Equipment listings show material, condition, pressure and temperature. Each listing opens the full specifications and photographs.</w:t>
       </w:r>
     </w:p>
     <w:p>
@@ -421,7 +421,7 @@
               <w:rPr>
                 <w:rFonts w:ascii="Roboto" w:hAnsi="Roboto" w:eastAsia="Roboto"/>
               </w:rPr>
-              <w:t>105 million lb/year at 40–45% concentration</w:t>
+              <w:t>105 million lb/year at 40 to 45% concentration</w:t>
             </w:r>
           </w:p>
         </w:tc>
@@ -2530,7 +2530,7 @@
         <w:rPr>
           <w:rFonts w:ascii="Roboto" w:hAnsi="Roboto" w:eastAsia="Roboto"/>
         </w:rPr>
-        <w:t>Availability and included equipment are confirmed against the individual listing.</w:t>
+        <w:t>Each listing confirms current availability and the equipment included.</w:t>
       </w:r>
     </w:p>
     <w:p>
@@ -2571,7 +2571,7 @@
         <w:rPr>
           <w:rFonts w:ascii="Roboto" w:hAnsi="Roboto" w:eastAsia="Roboto"/>
         </w:rPr>
-        <w:t>Individual units and connected systems for chemical manufacturing.</w:t>
+        <w:t>IPP stocks individual units and connected systems for reaction, heat transfer, separation, drying, filtration, distillation and storage.</w:t>
       </w:r>
     </w:p>
     <w:p>
@@ -2598,6 +2598,14 @@
         <w:rPr>
           <w:rFonts w:ascii="Roboto" w:hAnsi="Roboto" w:eastAsia="Roboto"/>
         </w:rPr>
+        <w:t>Makers in IPP’s inventory include Pfaudler, De Dietrich, UGE and Gale Process Solutions.</w:t>
+      </w:r>
+    </w:p>
+    <w:p>
+      <w:r>
+        <w:rPr>
+          <w:rFonts w:ascii="Roboto" w:hAnsi="Roboto" w:eastAsia="Roboto"/>
+        </w:rPr>
         <w:t>Featured listing: stainless steel 316L batch-type agitated reactor.</w:t>
       </w:r>
     </w:p>
@@ -2641,6 +2649,14 @@
         <w:rPr>
           <w:rFonts w:ascii="Roboto" w:hAnsi="Roboto" w:eastAsia="Roboto"/>
         </w:rPr>
+        <w:t>Makers in IPP’s inventory include Alfa Laval, Vicarb, Ralph Coidan and Graham.</w:t>
+      </w:r>
+    </w:p>
+    <w:p>
+      <w:r>
+        <w:rPr>
+          <w:rFonts w:ascii="Roboto" w:hAnsi="Roboto" w:eastAsia="Roboto"/>
+        </w:rPr>
         <w:t>Featured listing: shell, tubes and tubesheet in stainless steel 316L.</w:t>
       </w:r>
     </w:p>
@@ -2684,6 +2700,14 @@
         <w:rPr>
           <w:rFonts w:ascii="Roboto" w:hAnsi="Roboto" w:eastAsia="Roboto"/>
         </w:rPr>
+        <w:t>Makers in IPP’s inventory include Krauss Maffei, Alfa Laval, Westfalia and Sharples.</w:t>
+      </w:r>
+    </w:p>
+    <w:p>
+      <w:r>
+        <w:rPr>
+          <w:rFonts w:ascii="Roboto" w:hAnsi="Roboto" w:eastAsia="Roboto"/>
+        </w:rPr>
         <w:t>Featured listing: Hastelloy C22 peeler centrifuge.</w:t>
       </w:r>
     </w:p>
@@ -2727,6 +2751,14 @@
         <w:rPr>
           <w:rFonts w:ascii="Roboto" w:hAnsi="Roboto" w:eastAsia="Roboto"/>
         </w:rPr>
+        <w:t>Makers in IPP’s inventory include Gale Process Solutions, Glatt, Niro and Pfaudler.</w:t>
+      </w:r>
+    </w:p>
+    <w:p>
+      <w:r>
+        <w:rPr>
+          <w:rFonts w:ascii="Roboto" w:hAnsi="Roboto" w:eastAsia="Roboto"/>
+        </w:rPr>
         <w:t>Featured listing: stainless steel 316 spray dryer.</w:t>
       </w:r>
     </w:p>
@@ -2770,6 +2802,14 @@
         <w:rPr>
           <w:rFonts w:ascii="Roboto" w:hAnsi="Roboto" w:eastAsia="Roboto"/>
         </w:rPr>
+        <w:t>Makers in IPP’s inventory include Schenk, Cogeim, Chemap and Rosenmund.</w:t>
+      </w:r>
+    </w:p>
+    <w:p>
+      <w:r>
+        <w:rPr>
+          <w:rFonts w:ascii="Roboto" w:hAnsi="Roboto" w:eastAsia="Roboto"/>
+        </w:rPr>
         <w:t>Featured listing: polypropylene plate-and-frame filter press.</w:t>
       </w:r>
     </w:p>
@@ -2813,6 +2853,14 @@
         <w:rPr>
           <w:rFonts w:ascii="Roboto" w:hAnsi="Roboto" w:eastAsia="Roboto"/>
         </w:rPr>
+        <w:t>Makers in IPP’s inventory include Pfaudler, De Dietrich, Kühni and Schott.</w:t>
+      </w:r>
+    </w:p>
+    <w:p>
+      <w:r>
+        <w:rPr>
+          <w:rFonts w:ascii="Roboto" w:hAnsi="Roboto" w:eastAsia="Roboto"/>
+        </w:rPr>
         <w:t>Featured listing: glass-lined packed column with ceramic packing.</w:t>
       </w:r>
     </w:p>
@@ -2848,6 +2896,14 @@
         <w:rPr>
           <w:rFonts w:ascii="Roboto" w:hAnsi="Roboto" w:eastAsia="Roboto"/>
         </w:rPr>
+        <w:t>Makers in IPP’s inventory include Pfaudler, De Dietrich, Grundy and Sinclair Stainless Fabrications.</w:t>
+      </w:r>
+    </w:p>
+    <w:p>
+      <w:r>
+        <w:rPr>
+          <w:rFonts w:ascii="Roboto" w:hAnsi="Roboto" w:eastAsia="Roboto"/>
+        </w:rPr>
         <w:t>Featured listing: stainless steel 316L vertical tank.</w:t>
       </w:r>
     </w:p>
@@ -2865,6 +2921,14 @@
           <w:rFonts w:ascii="Roboto" w:hAnsi="Roboto" w:eastAsia="Roboto"/>
         </w:rPr>
         <w:t>Browse tanks ↗</w:t>
+      </w:r>
+    </w:p>
+    <w:p>
+      <w:r>
+        <w:rPr>
+          <w:rFonts w:ascii="Roboto" w:hAnsi="Roboto" w:eastAsia="Roboto"/>
+        </w:rPr>
+        <w:t>Makers listed from the manufacturer filters in IPP’s inventory, checked October 6, 2026.</w:t>
       </w:r>
     </w:p>
     <w:p>
@@ -2883,7 +2947,7 @@
         <w:rPr>
           <w:rFonts w:ascii="Roboto" w:hAnsi="Roboto" w:eastAsia="Roboto"/>
         </w:rPr>
-        <w:t>Featured equipment includes the manufacturers below. Each link opens the relevant manufacturer’s IMS listings.</w:t>
+        <w:t>The featured listings come from the manufacturers below. Each link opens that manufacturer’s equipment in IPP’s inventory.</w:t>
       </w:r>
     </w:p>
     <w:p>
@@ -3091,7 +3155,7 @@
         <w:rPr>
           <w:rFonts w:ascii="Roboto" w:hAnsi="Roboto" w:eastAsia="Roboto"/>
         </w:rPr>
-        <w:t>Access ready-to-ship systems to avoid production delays. Confirm release dates for each asset with IPP.</w:t>
+        <w:t>In-stock equipment from IPP is ready to ship. IPP confirms the release date for each stock number.</w:t>
       </w:r>
     </w:p>
     <w:p>
@@ -3118,7 +3182,7 @@
         <w:rPr>
           <w:rFonts w:ascii="Roboto" w:hAnsi="Roboto" w:eastAsia="Roboto"/>
         </w:rPr>
-        <w:t>Source individual equipment and full chemical plant lines from one inventory network.</w:t>
+        <w:t>IPP stocks chemical process equipment from Pfaudler, De Dietrich, Alfa Laval, Westfalia and other original manufacturers, alongside complete plant lines.</w:t>
       </w:r>
     </w:p>
     <w:p>
@@ -3145,7 +3209,7 @@
         <w:rPr>
           <w:rFonts w:ascii="Roboto" w:hAnsi="Roboto" w:eastAsia="Roboto"/>
         </w:rPr>
-        <w:t>Work with IPP’s international team on equipment sourcing, plant packages and relocation.</w:t>
+        <w:t>IPP operates offices in 15 countries, including the United States, the United Kingdom, Germany, India and Brazil. IPP has served 160,000+ customers worldwide.</w:t>
       </w:r>
     </w:p>
     <w:p>
@@ -3172,7 +3236,7 @@
         <w:rPr>
           <w:rFonts w:ascii="Roboto" w:hAnsi="Roboto" w:eastAsia="Roboto"/>
         </w:rPr>
-        <w:t>Review equipment from operating plants with known history. Request the records available for your selected stock number.</w:t>
+        <w:t>IPP sources equipment from operating plants with known history. Each stock number comes with the records available for that asset.</w:t>
       </w:r>
     </w:p>
     <w:p>
@@ -3199,16 +3263,10 @@
         <w:rPr>
           <w:rFonts w:ascii="Roboto" w:hAnsi="Roboto" w:eastAsia="Roboto"/>
         </w:rPr>
-        <w:t>Put existing process assets to work within your capital budget. Request a quotation for the equipment and services your project needs.</w:t>
-      </w:r>
-    </w:p>
-    <w:p>
-      <w:r>
-        <w:rPr>
-          <w:rFonts w:ascii="Roboto" w:hAnsi="Roboto" w:eastAsia="Roboto"/>
-        </w:rPr>
-        <w:t xml:space="preserve">IPP also offers access to new chemical processing systems through </w:t>
-      </w:r>
+        <w:t>Purchasing used chemical process equipment from IPP can save up to 50% of capital and 90% of lead time versus buying new. The exact savings depend on manufacturer, capacity, material of construction, and condition.</w:t>
+      </w:r>
+    </w:p>
+    <w:p>
       <w:hyperlink r:id="rId19">
         <w:r>
           <w:rPr>
@@ -3223,7 +3281,7 @@
         <w:rPr>
           <w:rFonts w:ascii="Roboto" w:hAnsi="Roboto" w:eastAsia="Roboto"/>
         </w:rPr>
-        <w:t xml:space="preserve"> and good used, rebuilt, re-glassed and new glass-lined equipment through </w:t>
+        <w:t xml:space="preserve">, an IPP group company, fabricates new stainless steel process equipment with 12 to 16 week average delivery. </w:t>
       </w:r>
       <w:hyperlink r:id="rId20">
         <w:r>
@@ -3239,7 +3297,7 @@
         <w:rPr>
           <w:rFonts w:ascii="Roboto" w:hAnsi="Roboto" w:eastAsia="Roboto"/>
         </w:rPr>
-        <w:t>.</w:t>
+        <w:t>, founded in 1995, supplies new, used, rebuilt and re-glassed glass-lined equipment.</w:t>
       </w:r>
     </w:p>
     <w:p>
@@ -3255,7 +3313,7 @@
         <w:rPr>
           <w:rFonts w:ascii="Roboto" w:hAnsi="Roboto" w:eastAsia="Roboto"/>
         </w:rPr>
-        <w:t>Customer perspectives</w:t>
+        <w:t>Customer reviews</w:t>
       </w:r>
     </w:p>
     <w:p>
@@ -3266,7 +3324,7 @@
         <w:rPr>
           <w:rFonts w:ascii="Montserrat" w:hAnsi="Montserrat" w:eastAsia="Outfit"/>
         </w:rPr>
-        <w:t>What do chemical manufacturers say about IPP? Reviews</w:t>
+        <w:t>What do chemical manufacturers say about IPP?</w:t>
       </w:r>
     </w:p>
     <w:p>
@@ -3274,7 +3332,7 @@
         <w:rPr>
           <w:rFonts w:ascii="Roboto" w:hAnsi="Roboto" w:eastAsia="Roboto"/>
         </w:rPr>
-        <w:t>IPP publishes customer interviews about working with its team. Hear from customers across its wider process-industry network in the company’s video testimonial series.</w:t>
+        <w:t>IPP publishes video interviews in which customers describe working with its team. The series features customers from across IPP’s process-industry network.</w:t>
       </w:r>
     </w:p>
     <w:p>
@@ -3503,6 +3561,14 @@
       </w:r>
     </w:p>
     <w:p>
+      <w:r>
+        <w:rPr>
+          <w:rFonts w:ascii="Roboto" w:hAnsi="Roboto" w:eastAsia="Roboto"/>
+        </w:rPr>
+        <w:t>IPP supplies used chemical plants and process equipment to producers in these sectors.</w:t>
+      </w:r>
+    </w:p>
+    <w:p>
       <w:pPr>
         <w:pStyle w:val="ListBullet"/>
       </w:pPr>
@@ -3608,7 +3674,7 @@
         <w:rPr>
           <w:rFonts w:ascii="Roboto" w:hAnsi="Roboto" w:eastAsia="Roboto"/>
         </w:rPr>
-        <w:t>Its asset services include valuation, decommissioning, dismantling and access to a global buyer network. Start with an equipment list, photographs, plant location, available documentation and your shutdown or removal schedule. IPP can assess the assets and discuss a purchase or marketing arrangement.</w:t>
+        <w:t>IPP’s asset services cover valuation, decommissioning, dismantling and marketing to a global buyer network. Sellers start with an equipment list, photographs, the plant location, available documentation and the removal schedule. IPP then assesses the assets and proposes a purchase or marketing arrangement.</w:t>
       </w:r>
     </w:p>
     <w:p>
@@ -4056,14 +4122,6 @@
       </w:r>
     </w:p>
     <w:p>
-      <w:r>
-        <w:rPr>
-          <w:rFonts w:ascii="Roboto" w:hAnsi="Roboto" w:eastAsia="Roboto"/>
-        </w:rPr>
-        <w:t>Your questions, answered</w:t>
-      </w:r>
-    </w:p>
-    <w:p>
       <w:pPr>
         <w:pStyle w:val="Heading2"/>
       </w:pPr>
@@ -4071,7 +4129,101 @@
         <w:rPr>
           <w:rFonts w:ascii="Montserrat" w:hAnsi="Montserrat" w:eastAsia="Outfit"/>
         </w:rPr>
-        <w:t>FAQs</w:t>
+        <w:t>Chemical Process Plants Resources</w:t>
+      </w:r>
+    </w:p>
+    <w:p>
+      <w:pPr>
+        <w:pStyle w:val="Heading3"/>
+      </w:pPr>
+      <w:r>
+        <w:rPr>
+          <w:rFonts w:ascii="Montserrat" w:hAnsi="Montserrat" w:eastAsia="Outfit"/>
+        </w:rPr>
+        <w:t>Used chemical process plants and equipment from IPP</w:t>
+      </w:r>
+    </w:p>
+    <w:p>
+      <w:r>
+        <w:rPr>
+          <w:rFonts w:ascii="Roboto" w:hAnsi="Roboto" w:eastAsia="Roboto"/>
+        </w:rPr>
+        <w:t>International Process Plants (IPP) buys and sells used process plants and equipment from its headquarters at 410 Princeton Hightstown Road, Princeton Junction, New Jersey.</w:t>
+      </w:r>
+    </w:p>
+    <w:p>
+      <w:r>
+        <w:rPr>
+          <w:rFonts w:ascii="Roboto" w:hAnsi="Roboto" w:eastAsia="Roboto"/>
+        </w:rPr>
+        <w:t>IPP operates offices in 15 countries: Brazil, Canada, China, the Czech Republic, France, Germany, India, Italy, Mexico, Pakistan, Portugal, Romania, Turkey, the United Kingdom and the United States. IPP has served 160,000+ customers worldwide.</w:t>
+      </w:r>
+    </w:p>
+    <w:p>
+      <w:r>
+        <w:rPr>
+          <w:rFonts w:ascii="Roboto" w:hAnsi="Roboto" w:eastAsia="Roboto"/>
+        </w:rPr>
+        <w:t>IPP’s chemical inventory covers complete plants, process lines and individual equipment such as reactors, heat exchangers, centrifuges, dryers, filters, distillation columns and tanks. IPP sources these assets from multinational chemical producers, toll manufacturers and decommissioned or restructured facilities.</w:t>
+      </w:r>
+    </w:p>
+    <w:p>
+      <w:r>
+        <w:rPr>
+          <w:rFonts w:ascii="Roboto" w:hAnsi="Roboto" w:eastAsia="Roboto"/>
+        </w:rPr>
+        <w:t>The IPP group includes Gale Process Solutions (GPS), which fabricates new stainless steel process equipment, and Universal Glasteel Equipment (UGE), which supplies and re-glasses glass-lined equipment.</w:t>
+      </w:r>
+    </w:p>
+    <w:p>
+      <w:r>
+        <w:rPr>
+          <w:rFonts w:ascii="Roboto" w:hAnsi="Roboto" w:eastAsia="Roboto"/>
+        </w:rPr>
+        <w:t>IPP affiliates acquired the GEO Specialty Chemicals site in Allentown, Pennsylvania, and agreed to acquire Novartis UK’s Grimsby API manufacturing site. In May 2024, IPP announced an agreement with BASF to market ammonia, methanol and melamine plants in Ludwigshafen, Germany.</w:t>
+      </w:r>
+    </w:p>
+    <w:p>
+      <w:r>
+        <w:rPr>
+          <w:rFonts w:ascii="Roboto" w:hAnsi="Roboto" w:eastAsia="Roboto"/>
+        </w:rPr>
+        <w:t>Ross Gale, IPP’s vice president, wrote “</w:t>
+      </w:r>
+      <w:hyperlink r:id="rId28">
+        <w:r>
+          <w:rPr>
+            <w:rFonts w:ascii="Roboto" w:hAnsi="Roboto"/>
+            <w:color w:val="0563C1"/>
+            <w:u w:val="single"/>
+          </w:rPr>
+          <w:t xml:space="preserve">Cost Engineering with Previously Owned Process Equipment</w:t>
+        </w:r>
+      </w:hyperlink>
+      <w:r>
+        <w:rPr>
+          <w:rFonts w:ascii="Roboto" w:hAnsi="Roboto" w:eastAsia="Roboto"/>
+        </w:rPr>
+        <w:t>” for Chemical Engineering in December 2024.</w:t>
+      </w:r>
+    </w:p>
+    <w:p>
+      <w:r>
+        <w:rPr>
+          <w:rFonts w:ascii="Roboto" w:hAnsi="Roboto" w:eastAsia="Roboto"/>
+        </w:rPr>
+        <w:t>IPP company profile ↗</w:t>
+      </w:r>
+    </w:p>
+    <w:p>
+      <w:pPr>
+        <w:pStyle w:val="Heading3"/>
+      </w:pPr>
+      <w:r>
+        <w:rPr>
+          <w:rFonts w:ascii="Montserrat" w:hAnsi="Montserrat" w:eastAsia="Outfit"/>
+        </w:rPr>
+        <w:t>Used chemical process plant FAQs</w:t>
       </w:r>
     </w:p>
     <w:p>
@@ -4195,7 +4347,7 @@
         <w:rPr>
           <w:rFonts w:ascii="Roboto" w:hAnsi="Roboto" w:eastAsia="Roboto"/>
         </w:rPr>
-        <w:t xml:space="preserve">This refers to the machines and systems used in chemical manufacturing, including reactors, exchangers, centrifuges, dryers, and more. Read our </w:t>
+        <w:t xml:space="preserve">Chemical process plant equipment is the set of reactors, heat exchangers, centrifuges, dryers, filters, columns and tanks that converts raw materials into chemical products. Read IPP’s </w:t>
       </w:r>
       <w:hyperlink r:id="rId30">
         <w:r>
@@ -4240,7 +4392,7 @@
         <w:rPr>
           <w:rFonts w:ascii="Roboto" w:hAnsi="Roboto" w:eastAsia="Roboto"/>
         </w:rPr>
-        <w:t xml:space="preserve"> with the stock number or your process requirements. The quotation needs to define the assets included and any dismantling, loading, shipping or other services requested.</w:t>
+        <w:t xml:space="preserve"> with the stock number or your process requirements. The quotation defines the assets included and any dismantling, loading, shipping or start-up services.</w:t>
       </w:r>
     </w:p>
     <w:p>
@@ -4259,7 +4411,7 @@
         <w:rPr>
           <w:rFonts w:ascii="Roboto" w:hAnsi="Roboto" w:eastAsia="Roboto"/>
         </w:rPr>
-        <w:t>Yes. IPP offers international shipping options, or buyers can arrange their own shipping. Confirm the asset’s location, loading requirements and delivery destination when discussing the purchase.</w:t>
+        <w:t>Yes. IPP coordinates packaging, crating, freight and delivery, or buyers can arrange their own shipping. Confirm the asset location, loading requirements and destination when you request a quotation.</w:t>
       </w:r>
     </w:p>
     <w:p>
@@ -4278,7 +4430,7 @@
         <w:rPr>
           <w:rFonts w:ascii="Roboto" w:hAnsi="Roboto" w:eastAsia="Roboto"/>
         </w:rPr>
-        <w:t>Available documentation varies by asset. Ask IPP for equipment lists, drawings, process descriptions and inspection records for the plant or stock number you are considering.</w:t>
+        <w:t>Documentation varies by asset. IPP shares the equipment lists, drawings, process descriptions and inspection records available for each plant or stock number.</w:t>
       </w:r>
     </w:p>
     <w:p>
@@ -4313,7 +4465,7 @@
         <w:rPr>
           <w:rFonts w:ascii="Roboto" w:hAnsi="Roboto" w:eastAsia="Roboto"/>
         </w:rPr>
-        <w:t xml:space="preserve"> to discuss availability and terms for your proposed purchase.</w:t>
+        <w:t xml:space="preserve"> to discuss terms for your purchase.</w:t>
       </w:r>
     </w:p>
     <w:p>
@@ -4332,7 +4484,7 @@
         <w:rPr>
           <w:rFonts w:ascii="Roboto" w:hAnsi="Roboto" w:eastAsia="Roboto"/>
         </w:rPr>
-        <w:t xml:space="preserve">Yes. IPP buys complete plants, process lines and individual equipment. Use the </w:t>
+        <w:t xml:space="preserve">Yes. IPP buys complete plants, process lines and individual equipment from shutdown, idled and restructured sites. Start with the </w:t>
       </w:r>
       <w:hyperlink r:id="rId31">
         <w:r>
@@ -4364,7 +4516,7 @@
         <w:rPr>
           <w:rFonts w:ascii="Roboto" w:hAnsi="Roboto" w:eastAsia="Roboto"/>
         </w:rPr>
-        <w:t xml:space="preserve"> form to start an assessment.</w:t>
+        <w:t xml:space="preserve"> form.</w:t>
       </w:r>
     </w:p>
     <w:p>
@@ -4383,7 +4535,7 @@
         <w:rPr>
           <w:rFonts w:ascii="Roboto" w:hAnsi="Roboto" w:eastAsia="Roboto"/>
         </w:rPr>
-        <w:t xml:space="preserve">Share an asset list, photographs, the plant location, available technical documents and your removal timeline. </w:t>
+        <w:t xml:space="preserve">Provide an asset list, photographs, the plant location, available technical documents and your removal deadline. </w:t>
       </w:r>
       <w:hyperlink r:id="rId21">
         <w:r>
@@ -4399,7 +4551,7 @@
         <w:rPr>
           <w:rFonts w:ascii="Roboto" w:hAnsi="Roboto" w:eastAsia="Roboto"/>
         </w:rPr>
-        <w:t xml:space="preserve"> can then discuss the assessment and next steps.</w:t>
+        <w:t xml:space="preserve"> reviews the information and confirms the next steps.</w:t>
       </w:r>
     </w:p>
     <w:p>
@@ -4414,6 +4566,12 @@
       </w:r>
     </w:p>
     <w:p>
+      <w:r>
+        <w:rPr>
+          <w:rFonts w:ascii="Roboto" w:hAnsi="Roboto" w:eastAsia="Roboto"/>
+        </w:rPr>
+        <w:t xml:space="preserve">IPP sets the assessment schedule for each project. </w:t>
+      </w:r>
       <w:hyperlink r:id="rId31">
         <w:r>
           <w:rPr>
@@ -4421,14 +4579,14 @@
             <w:color w:val="0563C1"/>
             <w:u w:val="single"/>
           </w:rPr>
-          <w:t xml:space="preserve">Send IPP your asset information</w:t>
+          <w:t xml:space="preserve">Send your asset information</w:t>
         </w:r>
       </w:hyperlink>
       <w:r>
         <w:rPr>
           <w:rFonts w:ascii="Roboto" w:hAnsi="Roboto" w:eastAsia="Roboto"/>
         </w:rPr>
-        <w:t xml:space="preserve"> and removal deadline to request a project-specific schedule. The team will need to establish the asset scope, available documentation and site access.</w:t>
+        <w:t xml:space="preserve"> and removal deadline; the schedule depends on the asset scope, available documentation and site access.</w:t>
       </w:r>
     </w:p>
     <w:p>
@@ -4447,7 +4605,18 @@
         <w:rPr>
           <w:rFonts w:ascii="Roboto" w:hAnsi="Roboto" w:eastAsia="Roboto"/>
         </w:rPr>
-        <w:t>A transaction may cover equipment for removal or an entire site. IPP’s published projects include equipment relocation and site repurposing. The purchase agreement defines which assets or property are included and who is responsible for the work.</w:t>
+        <w:t>The purchase agreement defines the outcome. A sale can cover equipment for removal or the entire site, and IPP’s published projects include equipment relocation and site repurposing.</w:t>
+      </w:r>
+    </w:p>
+    <w:p>
+      <w:pPr>
+        <w:pStyle w:val="Heading3"/>
+      </w:pPr>
+      <w:r>
+        <w:rPr>
+          <w:rFonts w:ascii="Montserrat" w:hAnsi="Montserrat" w:eastAsia="Outfit"/>
+        </w:rPr>
+        <w:t>Chemical process plant articles</w:t>
       </w:r>
     </w:p>
     <w:p>
@@ -4455,7 +4624,297 @@
         <w:rPr>
           <w:rFonts w:ascii="Roboto" w:hAnsi="Roboto" w:eastAsia="Roboto"/>
         </w:rPr>
-        <w:t>Further reading</w:t>
+        <w:t>All IPP articles ↗</w:t>
+      </w:r>
+    </w:p>
+    <w:p>
+      <w:r>
+        <w:rPr>
+          <w:rFonts w:ascii="Roboto" w:hAnsi="Roboto" w:eastAsia="Roboto"/>
+        </w:rPr>
+        <w:t>Guide</w:t>
+      </w:r>
+    </w:p>
+    <w:p>
+      <w:pPr>
+        <w:pStyle w:val="Heading4"/>
+      </w:pPr>
+      <w:r>
+        <w:rPr>
+          <w:rFonts w:ascii="Montserrat" w:hAnsi="Montserrat" w:eastAsia="Outfit"/>
+        </w:rPr>
+        <w:t>What is chemical process plant equipment?</w:t>
+      </w:r>
+    </w:p>
+    <w:p>
+      <w:r>
+        <w:rPr>
+          <w:rFonts w:ascii="Roboto" w:hAnsi="Roboto" w:eastAsia="Roboto"/>
+        </w:rPr>
+        <w:t>The reactors, heat exchangers, separators and dryers inside a chemical process plant.</w:t>
+      </w:r>
+    </w:p>
+    <w:p>
+      <w:r>
+        <w:rPr>
+          <w:rFonts w:ascii="Roboto" w:hAnsi="Roboto" w:eastAsia="Roboto"/>
+        </w:rPr>
+        <w:t>Read article ↗</w:t>
+      </w:r>
+    </w:p>
+    <w:p>
+      <w:hyperlink r:id="rId30">
+        <w:r>
+          <w:rPr>
+            <w:rFonts w:ascii="Roboto" w:hAnsi="Roboto"/>
+            <w:color w:val="0563C1"/>
+            <w:u w:val="single"/>
+          </w:rPr>
+          <w:t xml:space="preserve">Source / details</w:t>
+        </w:r>
+      </w:hyperlink>
+    </w:p>
+    <w:p>
+      <w:r>
+        <w:rPr>
+          <w:rFonts w:ascii="Roboto" w:hAnsi="Roboto" w:eastAsia="Roboto"/>
+        </w:rPr>
+        <w:t>Guide</w:t>
+      </w:r>
+    </w:p>
+    <w:p>
+      <w:pPr>
+        <w:pStyle w:val="Heading4"/>
+      </w:pPr>
+      <w:r>
+        <w:rPr>
+          <w:rFonts w:ascii="Montserrat" w:hAnsi="Montserrat" w:eastAsia="Outfit"/>
+        </w:rPr>
+        <w:t>What is an industrial plant? Types of process plants</w:t>
+      </w:r>
+    </w:p>
+    <w:p>
+      <w:r>
+        <w:rPr>
+          <w:rFonts w:ascii="Roboto" w:hAnsi="Roboto" w:eastAsia="Roboto"/>
+        </w:rPr>
+        <w:t>How industrial and process plants are classified by product and process.</w:t>
+      </w:r>
+    </w:p>
+    <w:p>
+      <w:r>
+        <w:rPr>
+          <w:rFonts w:ascii="Roboto" w:hAnsi="Roboto" w:eastAsia="Roboto"/>
+        </w:rPr>
+        <w:t>Read article ↗</w:t>
+      </w:r>
+    </w:p>
+    <w:p>
+      <w:hyperlink r:id="rId33">
+        <w:r>
+          <w:rPr>
+            <w:rFonts w:ascii="Roboto" w:hAnsi="Roboto"/>
+            <w:color w:val="0563C1"/>
+            <w:u w:val="single"/>
+          </w:rPr>
+          <w:t xml:space="preserve">Source / details</w:t>
+        </w:r>
+      </w:hyperlink>
+    </w:p>
+    <w:p>
+      <w:r>
+        <w:rPr>
+          <w:rFonts w:ascii="Roboto" w:hAnsi="Roboto" w:eastAsia="Roboto"/>
+        </w:rPr>
+        <w:t>Guide</w:t>
+      </w:r>
+    </w:p>
+    <w:p>
+      <w:pPr>
+        <w:pStyle w:val="Heading4"/>
+      </w:pPr>
+      <w:r>
+        <w:rPr>
+          <w:rFonts w:ascii="Montserrat" w:hAnsi="Montserrat" w:eastAsia="Outfit"/>
+        </w:rPr>
+        <w:t>What is a glass-lined reactor?</w:t>
+      </w:r>
+    </w:p>
+    <w:p>
+      <w:r>
+        <w:rPr>
+          <w:rFonts w:ascii="Roboto" w:hAnsi="Roboto" w:eastAsia="Roboto"/>
+        </w:rPr>
+        <w:t>How a glass lining protects reactors in corrosive chemical and pharmaceutical service.</w:t>
+      </w:r>
+    </w:p>
+    <w:p>
+      <w:r>
+        <w:rPr>
+          <w:rFonts w:ascii="Roboto" w:hAnsi="Roboto" w:eastAsia="Roboto"/>
+        </w:rPr>
+        <w:t>Read article ↗</w:t>
+      </w:r>
+    </w:p>
+    <w:p>
+      <w:hyperlink r:id="rId34">
+        <w:r>
+          <w:rPr>
+            <w:rFonts w:ascii="Roboto" w:hAnsi="Roboto"/>
+            <w:color w:val="0563C1"/>
+            <w:u w:val="single"/>
+          </w:rPr>
+          <w:t xml:space="preserve">Source / details</w:t>
+        </w:r>
+      </w:hyperlink>
+    </w:p>
+    <w:p>
+      <w:r>
+        <w:rPr>
+          <w:rFonts w:ascii="Roboto" w:hAnsi="Roboto" w:eastAsia="Roboto"/>
+        </w:rPr>
+        <w:t>Guide</w:t>
+      </w:r>
+    </w:p>
+    <w:p>
+      <w:pPr>
+        <w:pStyle w:val="Heading4"/>
+      </w:pPr>
+      <w:r>
+        <w:rPr>
+          <w:rFonts w:ascii="Montserrat" w:hAnsi="Montserrat" w:eastAsia="Outfit"/>
+        </w:rPr>
+        <w:t>What is a chemical reactor?</w:t>
+      </w:r>
+    </w:p>
+    <w:p>
+      <w:r>
+        <w:rPr>
+          <w:rFonts w:ascii="Roboto" w:hAnsi="Roboto" w:eastAsia="Roboto"/>
+        </w:rPr>
+        <w:t>How chemical reactors work, with the main reactor types.</w:t>
+      </w:r>
+    </w:p>
+    <w:p>
+      <w:r>
+        <w:rPr>
+          <w:rFonts w:ascii="Roboto" w:hAnsi="Roboto" w:eastAsia="Roboto"/>
+        </w:rPr>
+        <w:t>Read article ↗</w:t>
+      </w:r>
+    </w:p>
+    <w:p>
+      <w:hyperlink r:id="rId35">
+        <w:r>
+          <w:rPr>
+            <w:rFonts w:ascii="Roboto" w:hAnsi="Roboto"/>
+            <w:color w:val="0563C1"/>
+            <w:u w:val="single"/>
+          </w:rPr>
+          <w:t xml:space="preserve">Source / details</w:t>
+        </w:r>
+      </w:hyperlink>
+    </w:p>
+    <w:p>
+      <w:r>
+        <w:rPr>
+          <w:rFonts w:ascii="Roboto" w:hAnsi="Roboto" w:eastAsia="Roboto"/>
+        </w:rPr>
+        <w:t>Guide</w:t>
+      </w:r>
+    </w:p>
+    <w:p>
+      <w:pPr>
+        <w:pStyle w:val="Heading4"/>
+      </w:pPr>
+      <w:r>
+        <w:rPr>
+          <w:rFonts w:ascii="Montserrat" w:hAnsi="Montserrat" w:eastAsia="Outfit"/>
+        </w:rPr>
+        <w:t>What is petrochemical process equipment?</w:t>
+      </w:r>
+    </w:p>
+    <w:p>
+      <w:r>
+        <w:rPr>
+          <w:rFonts w:ascii="Roboto" w:hAnsi="Roboto" w:eastAsia="Roboto"/>
+        </w:rPr>
+        <w:t>The equipment that converts oil and gas feedstocks into petrochemicals.</w:t>
+      </w:r>
+    </w:p>
+    <w:p>
+      <w:r>
+        <w:rPr>
+          <w:rFonts w:ascii="Roboto" w:hAnsi="Roboto" w:eastAsia="Roboto"/>
+        </w:rPr>
+        <w:t>Read article ↗</w:t>
+      </w:r>
+    </w:p>
+    <w:p>
+      <w:hyperlink r:id="rId36">
+        <w:r>
+          <w:rPr>
+            <w:rFonts w:ascii="Roboto" w:hAnsi="Roboto"/>
+            <w:color w:val="0563C1"/>
+            <w:u w:val="single"/>
+          </w:rPr>
+          <w:t xml:space="preserve">Source / details</w:t>
+        </w:r>
+      </w:hyperlink>
+    </w:p>
+    <w:p>
+      <w:r>
+        <w:rPr>
+          <w:rFonts w:ascii="Roboto" w:hAnsi="Roboto" w:eastAsia="Roboto"/>
+        </w:rPr>
+        <w:t>For sellers</w:t>
+      </w:r>
+    </w:p>
+    <w:p>
+      <w:pPr>
+        <w:pStyle w:val="Heading4"/>
+      </w:pPr>
+      <w:r>
+        <w:rPr>
+          <w:rFonts w:ascii="Montserrat" w:hAnsi="Montserrat" w:eastAsia="Outfit"/>
+        </w:rPr>
+        <w:t>Plant decommissioning with IPP</w:t>
+      </w:r>
+    </w:p>
+    <w:p>
+      <w:r>
+        <w:rPr>
+          <w:rFonts w:ascii="Roboto" w:hAnsi="Roboto" w:eastAsia="Roboto"/>
+        </w:rPr>
+        <w:t>Why plant owners choose IPP for decommissioning and dismantling.</w:t>
+      </w:r>
+    </w:p>
+    <w:p>
+      <w:r>
+        <w:rPr>
+          <w:rFonts w:ascii="Roboto" w:hAnsi="Roboto" w:eastAsia="Roboto"/>
+        </w:rPr>
+        <w:t>Read article ↗</w:t>
+      </w:r>
+    </w:p>
+    <w:p>
+      <w:hyperlink r:id="rId37">
+        <w:r>
+          <w:rPr>
+            <w:rFonts w:ascii="Roboto" w:hAnsi="Roboto"/>
+            <w:color w:val="0563C1"/>
+            <w:u w:val="single"/>
+          </w:rPr>
+          <w:t xml:space="preserve">Source / details</w:t>
+        </w:r>
+      </w:hyperlink>
+    </w:p>
+    <w:p>
+      <w:r>
+        <w:rPr>
+          <w:rFonts w:ascii="Roboto" w:hAnsi="Roboto" w:eastAsia="Roboto"/>
+        </w:rPr>
+        <w:t>Tell us what you need</w:t>
       </w:r>
     </w:p>
     <w:p>
@@ -4466,7 +4925,7 @@
         <w:rPr>
           <w:rFonts w:ascii="Montserrat" w:hAnsi="Montserrat" w:eastAsia="Outfit"/>
         </w:rPr>
-        <w:t>Chemical Process Plants Resources</w:t>
+        <w:t>Find the right plant or equipment for your project</w:t>
       </w:r>
     </w:p>
     <w:p>
@@ -4474,110 +4933,7 @@
         <w:rPr>
           <w:rFonts w:ascii="Roboto" w:hAnsi="Roboto" w:eastAsia="Roboto"/>
         </w:rPr>
-        <w:t>What is chemical process plant equipment?</w:t>
-      </w:r>
-      <w:r>
-        <w:rPr>
-          <w:rFonts w:ascii="Roboto" w:hAnsi="Roboto" w:eastAsia="Roboto"/>
-        </w:rPr>
-        <w:t>↗</w:t>
-      </w:r>
-    </w:p>
-    <w:p>
-      <w:r>
-        <w:rPr>
-          <w:rFonts w:ascii="Roboto" w:hAnsi="Roboto" w:eastAsia="Roboto"/>
-        </w:rPr>
-        <w:t>What is an industrial plant? Types of process plants</w:t>
-      </w:r>
-      <w:r>
-        <w:rPr>
-          <w:rFonts w:ascii="Roboto" w:hAnsi="Roboto" w:eastAsia="Roboto"/>
-        </w:rPr>
-        <w:t>↗</w:t>
-      </w:r>
-    </w:p>
-    <w:p>
-      <w:r>
-        <w:rPr>
-          <w:rFonts w:ascii="Roboto" w:hAnsi="Roboto" w:eastAsia="Roboto"/>
-        </w:rPr>
-        <w:t>What is a glass-lined reactor?</w:t>
-      </w:r>
-      <w:r>
-        <w:rPr>
-          <w:rFonts w:ascii="Roboto" w:hAnsi="Roboto" w:eastAsia="Roboto"/>
-        </w:rPr>
-        <w:t>↗</w:t>
-      </w:r>
-    </w:p>
-    <w:p>
-      <w:r>
-        <w:rPr>
-          <w:rFonts w:ascii="Roboto" w:hAnsi="Roboto" w:eastAsia="Roboto"/>
-        </w:rPr>
-        <w:t>What is a chemical reactor?</w:t>
-      </w:r>
-      <w:r>
-        <w:rPr>
-          <w:rFonts w:ascii="Roboto" w:hAnsi="Roboto" w:eastAsia="Roboto"/>
-        </w:rPr>
-        <w:t>↗</w:t>
-      </w:r>
-    </w:p>
-    <w:p>
-      <w:r>
-        <w:rPr>
-          <w:rFonts w:ascii="Roboto" w:hAnsi="Roboto" w:eastAsia="Roboto"/>
-        </w:rPr>
-        <w:t>What is petrochemical process equipment?</w:t>
-      </w:r>
-      <w:r>
-        <w:rPr>
-          <w:rFonts w:ascii="Roboto" w:hAnsi="Roboto" w:eastAsia="Roboto"/>
-        </w:rPr>
-        <w:t>↗</w:t>
-      </w:r>
-    </w:p>
-    <w:p>
-      <w:r>
-        <w:rPr>
-          <w:rFonts w:ascii="Roboto" w:hAnsi="Roboto" w:eastAsia="Roboto"/>
-        </w:rPr>
-        <w:t>Plant decommissioning with IPP</w:t>
-      </w:r>
-      <w:r>
-        <w:rPr>
-          <w:rFonts w:ascii="Roboto" w:hAnsi="Roboto" w:eastAsia="Roboto"/>
-        </w:rPr>
-        <w:t>↗</w:t>
-      </w:r>
-    </w:p>
-    <w:p>
-      <w:r>
-        <w:rPr>
-          <w:rFonts w:ascii="Roboto" w:hAnsi="Roboto" w:eastAsia="Roboto"/>
-        </w:rPr>
-        <w:t>Tell us what you need</w:t>
-      </w:r>
-    </w:p>
-    <w:p>
-      <w:pPr>
-        <w:pStyle w:val="Heading2"/>
-      </w:pPr>
-      <w:r>
-        <w:rPr>
-          <w:rFonts w:ascii="Montserrat" w:hAnsi="Montserrat" w:eastAsia="Outfit"/>
-        </w:rPr>
-        <w:t>Find the right plant or equipment for your project</w:t>
-      </w:r>
-    </w:p>
-    <w:p>
-      <w:r>
-        <w:rPr>
-          <w:rFonts w:ascii="Roboto" w:hAnsi="Roboto" w:eastAsia="Roboto"/>
-        </w:rPr>
-        <w:t>Request specifications or schedule a video inspection with IPP’s team. Tell us which equipment or full plant package you need.</w:t>
+        <w:t>Send your process, capacity and destination. IPP’s sourcing team searches its inventory and the global market for candidate plants and equipment, then arranges specifications and inspections.</w:t>
       </w:r>
     </w:p>
     <w:p>

</xml_diff>

<commit_message>
Chemical page: company intro in reactor format; remove label lines
- Rewrite "Buy used chemical plants and equipment from International
  Process Plants (IPP)" in the reactor hub intro format, covering both
  sides: what IPP sells and to which producers, stock and ranges,
  conditions with UGE and GPS, what IPP buys from plant owners, and one
  action each for sellers and buyers. Brand, predicate, object in every
  sentence; query-frame roles lead (Seller, Goods, Buyer).
- Remove all eyebrow labels, the hero note, the seller image caption,
  the inventory date stamp and the source and as-of note lines.
- Validator adds intro and no-label checks (107 pass); semantic role
  table, README, Word copy, preview and images refreshed.

Co-Authored-By: Claude Opus 5.5 <noreply@anthropic.com>
</commit_message>
<xml_diff>
--- a/docs/chemical-build/deliverables/used-chemical-process-plants-for-sale-content.docx
+++ b/docs/chemical-build/deliverables/used-chemical-process-plants-for-sale-content.docx
@@ -43,14 +43,6 @@
       </w:r>
     </w:p>
     <w:p>
-      <w:r>
-        <w:rPr>
-          <w:rFonts w:ascii="Roboto" w:hAnsi="Roboto" w:eastAsia="Roboto"/>
-        </w:rPr>
-        <w:t>Complete plants. Process lines. Individual equipment.</w:t>
-      </w:r>
-    </w:p>
-    <w:p>
       <w:pPr>
         <w:pStyle w:val="Heading1"/>
       </w:pPr>
@@ -114,14 +106,6 @@
       </w:r>
     </w:p>
     <w:p>
-      <w:r>
-        <w:rPr>
-          <w:rFonts w:ascii="Roboto" w:hAnsi="Roboto" w:eastAsia="Roboto"/>
-        </w:rPr>
-        <w:t>Specifications. Video or on-site inspections. Global relocation support.</w:t>
-      </w:r>
-    </w:p>
-    <w:p>
       <w:pPr>
         <w:pStyle w:val="Heading2"/>
       </w:pPr>
@@ -310,11 +294,46 @@
       </w:r>
     </w:p>
     <w:p>
-      <w:r>
-        <w:rPr>
-          <w:rFonts w:ascii="Roboto" w:hAnsi="Roboto" w:eastAsia="Roboto"/>
-        </w:rPr>
-        <w:t xml:space="preserve">Customers featured by </w:t>
+      <w:pPr>
+        <w:pStyle w:val="Heading2"/>
+      </w:pPr>
+      <w:r>
+        <w:rPr>
+          <w:rFonts w:ascii="Montserrat" w:hAnsi="Montserrat" w:eastAsia="Outfit"/>
+        </w:rPr>
+        <w:t>Buy used chemical plants and equipment from International Process Plants (IPP)</w:t>
+      </w:r>
+    </w:p>
+    <w:p>
+      <w:r>
+        <w:rPr>
+          <w:rFonts w:ascii="Roboto" w:hAnsi="Roboto" w:eastAsia="Roboto"/>
+        </w:rPr>
+        <w:t>International Process Plants (IPP) sells used chemical process plants and equipment to chemical, petrochemical, fertilizer, polymer, agrochemical and specialty chemical producers worldwide. IPP stocks complete plants, process lines and individual reactors, heat exchangers, centrifuges, dryers, filters, distillation columns and tanks from Pfaudler, De Dietrich, Alfa Laval, Krauss Maffei, Westfalia and other OEM manufacturers. Purchasing used from IPP can save up to 50% of capital and 90% of lead time versus buying new. IPP has supplied process equipment worldwide since 1980.</w:t>
+      </w:r>
+    </w:p>
+    <w:p>
+      <w:r>
+        <w:rPr>
+          <w:rFonts w:ascii="Roboto" w:hAnsi="Roboto" w:eastAsia="Roboto"/>
+        </w:rPr>
+        <w:t>International Process Plants (IPP) is the world’s largest seller of used process plants and equipment, with 15,000+ pieces of inventory and nearly five decades of experience. IPP owns 20 complete process plant sites. Materials of construction include glass-lined, stainless steel 316, 316L, 304 and 321, Hastelloy C-22 and C-276, titanium, graphite and polypropylene. Capacities range from 2 L (0.5 gal) reactors to 565,000 L (149,258 gal) tanks. Reactor pressure ratings reach 358.7 bar (5,203 psi).</w:t>
+      </w:r>
+    </w:p>
+    <w:p>
+      <w:r>
+        <w:rPr>
+          <w:rFonts w:ascii="Roboto" w:hAnsi="Roboto" w:eastAsia="Roboto"/>
+        </w:rPr>
+        <w:t>Condition options include used, unused, refurbished, re-glassed and new. IPP offers re-glassed glass-lined equipment through Universal Glasteel Equipment (UGE) and new stainless steel equipment through Gale Process Solutions (GPS). IPP’s reactor inventory includes ASME, National Board, CRN, CE and PED coded vessels.</w:t>
+      </w:r>
+    </w:p>
+    <w:p>
+      <w:r>
+        <w:rPr>
+          <w:rFonts w:ascii="Roboto" w:hAnsi="Roboto" w:eastAsia="Roboto"/>
+        </w:rPr>
+        <w:t xml:space="preserve">IPP buys shutdown chemical plants, idle process lines and surplus equipment from plant owners and asset managers. IPP values each asset at the seller’s site. IPP handles decommissioning, dismantling and removal. Plant owners start a sale through the </w:t>
       </w:r>
       <w:hyperlink r:id="rId9">
         <w:r>
@@ -323,81 +342,14 @@
             <w:color w:val="0563C1"/>
             <w:u w:val="single"/>
           </w:rPr>
-          <w:t xml:space="preserve">International Process Plants</w:t>
+          <w:t xml:space="preserve">sell-a-plant</w:t>
         </w:r>
       </w:hyperlink>
       <w:r>
         <w:rPr>
           <w:rFonts w:ascii="Roboto" w:hAnsi="Roboto" w:eastAsia="Roboto"/>
         </w:rPr>
-        <w:t>.</w:t>
-      </w:r>
-    </w:p>
-    <w:p>
-      <w:r>
-        <w:rPr>
-          <w:rFonts w:ascii="Roboto" w:hAnsi="Roboto" w:eastAsia="Roboto"/>
-        </w:rPr>
-        <w:t>Chemical manufacturing assets</w:t>
-      </w:r>
-    </w:p>
-    <w:p>
-      <w:pPr>
-        <w:pStyle w:val="Heading2"/>
-      </w:pPr>
-      <w:r>
-        <w:rPr>
-          <w:rFonts w:ascii="Montserrat" w:hAnsi="Montserrat" w:eastAsia="Outfit"/>
-        </w:rPr>
-        <w:t>Buy used chemical plants and equipment from International Process Plants (IPP)</w:t>
-      </w:r>
-    </w:p>
-    <w:p>
-      <w:r>
-        <w:rPr>
-          <w:rFonts w:ascii="Roboto" w:hAnsi="Roboto" w:eastAsia="Roboto"/>
-        </w:rPr>
-        <w:t>International Process Plants (IPP) is the world’s largest seller of used process plants and equipment, with 15,000+ pieces of inventory and nearly five decades of experience. Our extensive stock of chemical process equipment includes reactors, heat exchangers, dryers, centrifuges, tanks, filters and complete plant lines, sourced from decommissioned, idled and restructured sites worldwide.</w:t>
-      </w:r>
-    </w:p>
-    <w:p>
-      <w:r>
-        <w:rPr>
-          <w:rFonts w:ascii="Roboto" w:hAnsi="Roboto" w:eastAsia="Roboto"/>
-        </w:rPr>
-        <w:t>With operations in 15 countries and 20 complete process plant sites under ownership, we help chemical manufacturers of all sizes reduce capital risk, avoid long lead times and ramp up production capacity fast.</w:t>
-      </w:r>
-    </w:p>
-    <w:p>
-      <w:r>
-        <w:rPr>
-          <w:rFonts w:ascii="Roboto" w:hAnsi="Roboto" w:eastAsia="Roboto"/>
-        </w:rPr>
-        <w:t>IPP acquires complete plants, process lines and surplus equipment from producers that restructure their operations. IPP redeploys those assets to manufacturers worldwide. IPP has served 160,000+ customers.</w:t>
-      </w:r>
-    </w:p>
-    <w:p>
-      <w:r>
-        <w:rPr>
-          <w:rFonts w:ascii="Roboto" w:hAnsi="Roboto" w:eastAsia="Roboto"/>
-        </w:rPr>
-        <w:t xml:space="preserve">Company-wide figures published by </w:t>
-      </w:r>
-      <w:hyperlink r:id="rId9">
-        <w:r>
-          <w:rPr>
-            <w:rFonts w:ascii="Roboto" w:hAnsi="Roboto"/>
-            <w:color w:val="0563C1"/>
-            <w:u w:val="single"/>
-          </w:rPr>
-          <w:t xml:space="preserve">IPP</w:t>
-        </w:r>
-      </w:hyperlink>
-      <w:r>
-        <w:rPr>
-          <w:rFonts w:ascii="Roboto" w:hAnsi="Roboto" w:eastAsia="Roboto"/>
-        </w:rPr>
-        <w:t xml:space="preserve">, checked October 7, 2026. </w:t>
+        <w:t xml:space="preserve"> or </w:t>
       </w:r>
       <w:hyperlink r:id="rId10">
         <w:r>
@@ -406,22 +358,30 @@
             <w:color w:val="0563C1"/>
             <w:u w:val="single"/>
           </w:rPr>
-          <w:t xml:space="preserve">Company profile and scale: SOCMA</w:t>
+          <w:t xml:space="preserve">sell-equipment</w:t>
         </w:r>
       </w:hyperlink>
       <w:r>
         <w:rPr>
           <w:rFonts w:ascii="Roboto" w:hAnsi="Roboto" w:eastAsia="Roboto"/>
         </w:rPr>
+        <w:t xml:space="preserve"> form. Buyers request specifications, inspections and quotations from </w:t>
+      </w:r>
+      <w:hyperlink r:id="rId11">
+        <w:r>
+          <w:rPr>
+            <w:rFonts w:ascii="Roboto" w:hAnsi="Roboto"/>
+            <w:color w:val="0563C1"/>
+            <w:u w:val="single"/>
+          </w:rPr>
+          <w:t xml:space="preserve">IPP’s team</w:t>
+        </w:r>
+      </w:hyperlink>
+      <w:r>
+        <w:rPr>
+          <w:rFonts w:ascii="Roboto" w:hAnsi="Roboto" w:eastAsia="Roboto"/>
+        </w:rPr>
         <w:t>.</w:t>
-      </w:r>
-    </w:p>
-    <w:p>
-      <w:r>
-        <w:rPr>
-          <w:rFonts w:ascii="Roboto" w:hAnsi="Roboto" w:eastAsia="Roboto"/>
-        </w:rPr>
-        <w:t>Find your next asset</w:t>
       </w:r>
     </w:p>
     <w:p>
@@ -2636,14 +2596,6 @@
       </w:r>
     </w:p>
     <w:p>
-      <w:r>
-        <w:rPr>
-          <w:rFonts w:ascii="Roboto" w:hAnsi="Roboto" w:eastAsia="Roboto"/>
-        </w:rPr>
-        <w:t>From reaction to separation and storage</w:t>
-      </w:r>
-    </w:p>
-    <w:p>
       <w:pPr>
         <w:pStyle w:val="Heading2"/>
       </w:pPr>
@@ -3092,14 +3044,6 @@
       </w:r>
     </w:p>
     <w:p>
-      <w:r>
-        <w:rPr>
-          <w:rFonts w:ascii="Roboto" w:hAnsi="Roboto" w:eastAsia="Roboto"/>
-        </w:rPr>
-        <w:t>Makers checked October 6, 2026; materials and ranges checked October 8, 2026, from the filters in IPP’s inventory.</w:t>
-      </w:r>
-    </w:p>
-    <w:p>
       <w:pPr>
         <w:pStyle w:val="Heading2"/>
       </w:pPr>
@@ -3116,27 +3060,6 @@
           <w:rFonts w:ascii="Roboto" w:hAnsi="Roboto" w:eastAsia="Roboto"/>
         </w:rPr>
         <w:t>IPP’s chemical process inventory carries equipment from the manufacturers below. Each link opens that manufacturer’s listings in IPP’s inventory.</w:t>
-      </w:r>
-    </w:p>
-    <w:p>
-      <w:pPr>
-        <w:pStyle w:val="ListBullet"/>
-      </w:pPr>
-      <w:hyperlink r:id="rId11">
-        <w:r>
-          <w:rPr>
-            <w:rFonts w:ascii="Roboto" w:hAnsi="Roboto"/>
-            <w:color w:val="0563C1"/>
-            <w:u w:val="single"/>
-          </w:rPr>
-          <w:t xml:space="preserve">Pfaudler ↗</w:t>
-        </w:r>
-      </w:hyperlink>
-      <w:r>
-        <w:rPr>
-          <w:rFonts w:ascii="Roboto" w:hAnsi="Roboto" w:eastAsia="Roboto"/>
-        </w:rPr>
-        <w:t>Glass-lined reactors, tanks and agitators</w:t>
       </w:r>
     </w:p>
     <w:p>
@@ -3150,14 +3073,14 @@
             <w:color w:val="0563C1"/>
             <w:u w:val="single"/>
           </w:rPr>
-          <w:t xml:space="preserve">De Dietrich ↗</w:t>
+          <w:t xml:space="preserve">Pfaudler ↗</w:t>
         </w:r>
       </w:hyperlink>
       <w:r>
         <w:rPr>
           <w:rFonts w:ascii="Roboto" w:hAnsi="Roboto" w:eastAsia="Roboto"/>
         </w:rPr>
-        <w:t>Glass-lined reactors and tanks</w:t>
+        <w:t>Glass-lined reactors, tanks and agitators</w:t>
       </w:r>
     </w:p>
     <w:p>
@@ -3171,14 +3094,14 @@
             <w:color w:val="0563C1"/>
             <w:u w:val="single"/>
           </w:rPr>
-          <w:t xml:space="preserve">Alfa Laval ↗</w:t>
+          <w:t xml:space="preserve">De Dietrich ↗</w:t>
         </w:r>
       </w:hyperlink>
       <w:r>
         <w:rPr>
           <w:rFonts w:ascii="Roboto" w:hAnsi="Roboto" w:eastAsia="Roboto"/>
         </w:rPr>
-        <w:t>Heat exchangers and centrifuges</w:t>
+        <w:t>Glass-lined reactors and tanks</w:t>
       </w:r>
     </w:p>
     <w:p>
@@ -3192,14 +3115,14 @@
             <w:color w:val="0563C1"/>
             <w:u w:val="single"/>
           </w:rPr>
-          <w:t xml:space="preserve">Krauss Maffei ↗</w:t>
+          <w:t xml:space="preserve">Alfa Laval ↗</w:t>
         </w:r>
       </w:hyperlink>
       <w:r>
         <w:rPr>
           <w:rFonts w:ascii="Roboto" w:hAnsi="Roboto" w:eastAsia="Roboto"/>
         </w:rPr>
-        <w:t>Centrifuges</w:t>
+        <w:t>Heat exchangers and centrifuges</w:t>
       </w:r>
     </w:p>
     <w:p>
@@ -3213,7 +3136,7 @@
             <w:color w:val="0563C1"/>
             <w:u w:val="single"/>
           </w:rPr>
-          <w:t xml:space="preserve">Westfalia ↗</w:t>
+          <w:t xml:space="preserve">Krauss Maffei ↗</w:t>
         </w:r>
       </w:hyperlink>
       <w:r>
@@ -3234,14 +3157,14 @@
             <w:color w:val="0563C1"/>
             <w:u w:val="single"/>
           </w:rPr>
-          <w:t xml:space="preserve">Gale Process Solutions ↗</w:t>
+          <w:t xml:space="preserve">Westfalia ↗</w:t>
         </w:r>
       </w:hyperlink>
       <w:r>
         <w:rPr>
           <w:rFonts w:ascii="Roboto" w:hAnsi="Roboto" w:eastAsia="Roboto"/>
         </w:rPr>
-        <w:t>New stainless steel equipment from the IPP group</w:t>
+        <w:t>Centrifuges</w:t>
       </w:r>
     </w:p>
     <w:p>
@@ -3255,6 +3178,27 @@
             <w:color w:val="0563C1"/>
             <w:u w:val="single"/>
           </w:rPr>
+          <w:t xml:space="preserve">Gale Process Solutions ↗</w:t>
+        </w:r>
+      </w:hyperlink>
+      <w:r>
+        <w:rPr>
+          <w:rFonts w:ascii="Roboto" w:hAnsi="Roboto" w:eastAsia="Roboto"/>
+        </w:rPr>
+        <w:t>New stainless steel equipment from the IPP group</w:t>
+      </w:r>
+    </w:p>
+    <w:p>
+      <w:pPr>
+        <w:pStyle w:val="ListBullet"/>
+      </w:pPr>
+      <w:hyperlink r:id="rId18">
+        <w:r>
+          <w:rPr>
+            <w:rFonts w:ascii="Roboto" w:hAnsi="Roboto"/>
+            <w:color w:val="0563C1"/>
+            <w:u w:val="single"/>
+          </w:rPr>
           <w:t xml:space="preserve">Universal Glasteel Equipment ↗</w:t>
         </w:r>
       </w:hyperlink>
@@ -3266,22 +3210,6 @@
       </w:r>
     </w:p>
     <w:p>
-      <w:r>
-        <w:rPr>
-          <w:rFonts w:ascii="Roboto" w:hAnsi="Roboto" w:eastAsia="Roboto"/>
-        </w:rPr>
-        <w:t>Leading manufacturers by listings in IPP’s inventory filters, checked October 8, 2026.</w:t>
-      </w:r>
-    </w:p>
-    <w:p>
-      <w:r>
-        <w:rPr>
-          <w:rFonts w:ascii="Roboto" w:hAnsi="Roboto" w:eastAsia="Roboto"/>
-        </w:rPr>
-        <w:t>Experience that keeps industry moving</w:t>
-      </w:r>
-    </w:p>
-    <w:p>
       <w:pPr>
         <w:pStyle w:val="Heading2"/>
       </w:pPr>
@@ -3428,7 +3356,7 @@
       </w:r>
     </w:p>
     <w:p>
-      <w:hyperlink r:id="rId18">
+      <w:hyperlink r:id="rId19">
         <w:r>
           <w:rPr>
             <w:rFonts w:ascii="Roboto" w:hAnsi="Roboto"/>
@@ -3444,7 +3372,7 @@
         </w:rPr>
         <w:t xml:space="preserve">, an IPP group company, fabricates new stainless steel process equipment with 12 to 16 week average delivery. </w:t>
       </w:r>
-      <w:hyperlink r:id="rId19">
+      <w:hyperlink r:id="rId20">
         <w:r>
           <w:rPr>
             <w:rFonts w:ascii="Roboto" w:hAnsi="Roboto"/>
@@ -3470,14 +3398,6 @@
       </w:r>
     </w:p>
     <w:p>
-      <w:r>
-        <w:rPr>
-          <w:rFonts w:ascii="Roboto" w:hAnsi="Roboto" w:eastAsia="Roboto"/>
-        </w:rPr>
-        <w:t>Customer reviews</w:t>
-      </w:r>
-    </w:p>
-    <w:p>
       <w:pPr>
         <w:pStyle w:val="Heading2"/>
       </w:pPr>
@@ -3528,14 +3448,6 @@
           <w:rFonts w:ascii="Roboto" w:hAnsi="Roboto" w:eastAsia="Roboto"/>
         </w:rPr>
         <w:t>↗</w:t>
-      </w:r>
-    </w:p>
-    <w:p>
-      <w:r>
-        <w:rPr>
-          <w:rFonts w:ascii="Roboto" w:hAnsi="Roboto" w:eastAsia="Roboto"/>
-        </w:rPr>
-        <w:t>From your brief to your site</w:t>
       </w:r>
     </w:p>
     <w:p>
@@ -3619,7 +3531,7 @@
         </w:rPr>
         <w:t xml:space="preserve">Confirm the equipment included, commercial terms and services required. </w:t>
       </w:r>
-      <w:hyperlink r:id="rId20">
+      <w:hyperlink r:id="rId11">
         <w:r>
           <w:rPr>
             <w:rFonts w:ascii="Roboto" w:hAnsi="Roboto"/>
@@ -3679,46 +3591,6 @@
       </w:r>
     </w:p>
     <w:p>
-      <w:r>
-        <w:rPr>
-          <w:rFonts w:ascii="Roboto" w:hAnsi="Roboto" w:eastAsia="Roboto"/>
-        </w:rPr>
-        <w:t xml:space="preserve">Services vary by asset and agreed scope. </w:t>
-      </w:r>
-      <w:hyperlink r:id="rId21">
-        <w:r>
-          <w:rPr>
-            <w:rFonts w:ascii="Roboto" w:hAnsi="Roboto"/>
-            <w:color w:val="0563C1"/>
-            <w:u w:val="single"/>
-          </w:rPr>
-          <w:t xml:space="preserve">More about buying from IPP</w:t>
-        </w:r>
-      </w:hyperlink>
-      <w:r>
-        <w:rPr>
-          <w:rFonts w:ascii="Roboto" w:hAnsi="Roboto" w:eastAsia="Roboto"/>
-        </w:rPr>
-        <w:t>.</w:t>
-      </w:r>
-    </w:p>
-    <w:p>
-      <w:r>
-        <w:rPr>
-          <w:rFonts w:ascii="Roboto" w:hAnsi="Roboto" w:eastAsia="Roboto"/>
-        </w:rPr>
-        <w:t>Complete sites. Process lines. Surplus equipment.</w:t>
-      </w:r>
-    </w:p>
-    <w:p>
-      <w:r>
-        <w:rPr>
-          <w:rFonts w:ascii="Roboto" w:hAnsi="Roboto" w:eastAsia="Roboto"/>
-        </w:rPr>
-        <w:t>Put your assets back to work</w:t>
-      </w:r>
-    </w:p>
-    <w:p>
       <w:pPr>
         <w:pStyle w:val="Heading2"/>
       </w:pPr>
@@ -3846,70 +3718,6 @@
       </w:r>
     </w:p>
     <w:p>
-      <w:r>
-        <w:rPr>
-          <w:rFonts w:ascii="Roboto" w:hAnsi="Roboto" w:eastAsia="Roboto"/>
-        </w:rPr>
-        <w:t xml:space="preserve">Seller terms vary by asset and site. Sources: </w:t>
-      </w:r>
-      <w:hyperlink r:id="rId22">
-        <w:r>
-          <w:rPr>
-            <w:rFonts w:ascii="Roboto" w:hAnsi="Roboto"/>
-            <w:color w:val="0563C1"/>
-            <w:u w:val="single"/>
-          </w:rPr>
-          <w:t xml:space="preserve">Sell to IPP</w:t>
-        </w:r>
-      </w:hyperlink>
-      <w:r>
-        <w:rPr>
-          <w:rFonts w:ascii="Roboto" w:hAnsi="Roboto" w:eastAsia="Roboto"/>
-        </w:rPr>
-        <w:t xml:space="preserve">, </w:t>
-      </w:r>
-      <w:hyperlink r:id="rId23">
-        <w:r>
-          <w:rPr>
-            <w:rFonts w:ascii="Roboto" w:hAnsi="Roboto"/>
-            <w:color w:val="0563C1"/>
-            <w:u w:val="single"/>
-          </w:rPr>
-          <w:t xml:space="preserve">Sell plants</w:t>
-        </w:r>
-      </w:hyperlink>
-      <w:r>
-        <w:rPr>
-          <w:rFonts w:ascii="Roboto" w:hAnsi="Roboto" w:eastAsia="Roboto"/>
-        </w:rPr>
-        <w:t xml:space="preserve"> and </w:t>
-      </w:r>
-      <w:hyperlink r:id="rId24">
-        <w:r>
-          <w:rPr>
-            <w:rFonts w:ascii="Roboto" w:hAnsi="Roboto"/>
-            <w:color w:val="0563C1"/>
-            <w:u w:val="single"/>
-          </w:rPr>
-          <w:t xml:space="preserve">Sell equipment</w:t>
-        </w:r>
-      </w:hyperlink>
-      <w:r>
-        <w:rPr>
-          <w:rFonts w:ascii="Roboto" w:hAnsi="Roboto" w:eastAsia="Roboto"/>
-        </w:rPr>
-        <w:t>.</w:t>
-      </w:r>
-    </w:p>
-    <w:p>
-      <w:r>
-        <w:rPr>
-          <w:rFonts w:ascii="Roboto" w:hAnsi="Roboto" w:eastAsia="Roboto"/>
-        </w:rPr>
-        <w:t>Chemical manufacturing</w:t>
-      </w:r>
-    </w:p>
-    <w:p>
       <w:pPr>
         <w:pStyle w:val="Heading2"/>
       </w:pPr>
@@ -3995,14 +3803,6 @@
       </w:r>
     </w:p>
     <w:p>
-      <w:r>
-        <w:rPr>
-          <w:rFonts w:ascii="Roboto" w:hAnsi="Roboto" w:eastAsia="Roboto"/>
-        </w:rPr>
-        <w:t>A worldwide asset network</w:t>
-      </w:r>
-    </w:p>
-    <w:p>
       <w:pPr>
         <w:pStyle w:val="Heading2"/>
       </w:pPr>
@@ -4138,38 +3938,6 @@
       </w:r>
     </w:p>
     <w:p>
-      <w:r>
-        <w:rPr>
-          <w:rFonts w:ascii="Roboto" w:hAnsi="Roboto" w:eastAsia="Roboto"/>
-        </w:rPr>
-        <w:t xml:space="preserve">Warehouse locations published on IPP’s </w:t>
-      </w:r>
-      <w:hyperlink r:id="rId21">
-        <w:r>
-          <w:rPr>
-            <w:rFonts w:ascii="Roboto" w:hAnsi="Roboto"/>
-            <w:color w:val="0563C1"/>
-            <w:u w:val="single"/>
-          </w:rPr>
-          <w:t xml:space="preserve">Buy Used page</w:t>
-        </w:r>
-      </w:hyperlink>
-      <w:r>
-        <w:rPr>
-          <w:rFonts w:ascii="Roboto" w:hAnsi="Roboto" w:eastAsia="Roboto"/>
-        </w:rPr>
-        <w:t>. Individual assets may be located at other sites; confirm the location with your quotation.</w:t>
-      </w:r>
-    </w:p>
-    <w:p>
-      <w:r>
-        <w:rPr>
-          <w:rFonts w:ascii="Roboto" w:hAnsi="Roboto" w:eastAsia="Roboto"/>
-        </w:rPr>
-        <w:t>Chemical industry experience</w:t>
-      </w:r>
-    </w:p>
-    <w:p>
       <w:pPr>
         <w:pStyle w:val="Heading2"/>
       </w:pPr>
@@ -4216,7 +3984,7 @@
       </w:r>
     </w:p>
     <w:p>
-      <w:hyperlink r:id="rId25">
+      <w:hyperlink r:id="rId21">
         <w:r>
           <w:rPr>
             <w:rFonts w:ascii="Roboto" w:hAnsi="Roboto"/>
@@ -4263,7 +4031,7 @@
       </w:r>
     </w:p>
     <w:p>
-      <w:hyperlink r:id="rId26">
+      <w:hyperlink r:id="rId22">
         <w:r>
           <w:rPr>
             <w:rFonts w:ascii="Roboto" w:hAnsi="Roboto"/>
@@ -4310,7 +4078,7 @@
       </w:r>
     </w:p>
     <w:p>
-      <w:hyperlink r:id="rId27">
+      <w:hyperlink r:id="rId23">
         <w:r>
           <w:rPr>
             <w:rFonts w:ascii="Roboto" w:hAnsi="Roboto"/>
@@ -4357,7 +4125,7 @@
       </w:r>
     </w:p>
     <w:p>
-      <w:hyperlink r:id="rId28">
+      <w:hyperlink r:id="rId24">
         <w:r>
           <w:rPr>
             <w:rFonts w:ascii="Roboto" w:hAnsi="Roboto"/>
@@ -4382,7 +4150,7 @@
         </w:rPr>
         <w:t xml:space="preserve"> </w:t>
       </w:r>
-      <w:hyperlink r:id="rId10">
+      <w:hyperlink r:id="rId25">
         <w:r>
           <w:rPr>
             <w:rFonts w:ascii="Roboto" w:hAnsi="Roboto"/>
@@ -4413,7 +4181,7 @@
         </w:rPr>
         <w:t xml:space="preserve"> </w:t>
       </w:r>
-      <w:hyperlink r:id="rId29">
+      <w:hyperlink r:id="rId26">
         <w:r>
           <w:rPr>
             <w:rFonts w:ascii="Roboto" w:hAnsi="Roboto"/>
@@ -4444,7 +4212,7 @@
         </w:rPr>
         <w:t xml:space="preserve"> </w:t>
       </w:r>
-      <w:hyperlink r:id="rId30">
+      <w:hyperlink r:id="rId27">
         <w:r>
           <w:rPr>
             <w:rFonts w:ascii="Roboto" w:hAnsi="Roboto"/>
@@ -4460,7 +4228,7 @@
         </w:rPr>
         <w:t xml:space="preserve"> and </w:t>
       </w:r>
-      <w:hyperlink r:id="rId31">
+      <w:hyperlink r:id="rId28">
         <w:r>
           <w:rPr>
             <w:rFonts w:ascii="Roboto" w:hAnsi="Roboto"/>
@@ -4546,7 +4314,7 @@
         </w:rPr>
         <w:t>Ross Gale, IPP’s vice president, wrote “</w:t>
       </w:r>
-      <w:hyperlink r:id="rId31">
+      <w:hyperlink r:id="rId28">
         <w:r>
           <w:rPr>
             <w:rFonts w:ascii="Roboto" w:hAnsi="Roboto"/>
@@ -4616,7 +4384,7 @@
         </w:rPr>
         <w:t xml:space="preserve">Yes. In addition to individual equipment, we sell </w:t>
       </w:r>
-      <w:hyperlink r:id="rId32">
+      <w:hyperlink r:id="rId29">
         <w:r>
           <w:rPr>
             <w:rFonts w:ascii="Roboto" w:hAnsi="Roboto"/>
@@ -4651,7 +4419,7 @@
         </w:rPr>
         <w:t xml:space="preserve">Yes. IPP offers on-site and video inspections for most equipment. </w:t>
       </w:r>
-      <w:hyperlink r:id="rId20">
+      <w:hyperlink r:id="rId11">
         <w:r>
           <w:rPr>
             <w:rFonts w:ascii="Roboto" w:hAnsi="Roboto"/>
@@ -4705,7 +4473,7 @@
         </w:rPr>
         <w:t xml:space="preserve">Chemical process plant equipment is the set of reactors, heat exchangers, centrifuges, dryers, filters, columns and tanks that converts raw materials into chemical products. Read IPP’s </w:t>
       </w:r>
-      <w:hyperlink r:id="rId33">
+      <w:hyperlink r:id="rId30">
         <w:r>
           <w:rPr>
             <w:rFonts w:ascii="Roboto" w:hAnsi="Roboto"/>
@@ -4740,7 +4508,7 @@
         </w:rPr>
         <w:t xml:space="preserve">IPP quotes each plant and unit individually. </w:t>
       </w:r>
-      <w:hyperlink r:id="rId20">
+      <w:hyperlink r:id="rId11">
         <w:r>
           <w:rPr>
             <w:rFonts w:ascii="Roboto" w:hAnsi="Roboto"/>
@@ -4813,7 +4581,7 @@
         </w:rPr>
         <w:t xml:space="preserve">Yes. IPP advertises financing for its plants and equipment. </w:t>
       </w:r>
-      <w:hyperlink r:id="rId20">
+      <w:hyperlink r:id="rId11">
         <w:r>
           <w:rPr>
             <w:rFonts w:ascii="Roboto" w:hAnsi="Roboto"/>
@@ -4848,7 +4616,7 @@
         </w:rPr>
         <w:t xml:space="preserve">Yes. </w:t>
       </w:r>
-      <w:hyperlink r:id="rId18">
+      <w:hyperlink r:id="rId19">
         <w:r>
           <w:rPr>
             <w:rFonts w:ascii="Roboto" w:hAnsi="Roboto"/>
@@ -4864,7 +4632,7 @@
         </w:rPr>
         <w:t xml:space="preserve">, an IPP group company, fabricates new stainless steel process equipment with 12 to 16 week average delivery. </w:t>
       </w:r>
-      <w:hyperlink r:id="rId19">
+      <w:hyperlink r:id="rId20">
         <w:r>
           <w:rPr>
             <w:rFonts w:ascii="Roboto" w:hAnsi="Roboto"/>
@@ -4899,7 +4667,7 @@
         </w:rPr>
         <w:t xml:space="preserve">Yes. IPP buys complete plants, process lines and individual equipment from shutdown, idled and restructured sites. Start with the </w:t>
       </w:r>
-      <w:hyperlink r:id="rId23">
+      <w:hyperlink r:id="rId9">
         <w:r>
           <w:rPr>
             <w:rFonts w:ascii="Roboto" w:hAnsi="Roboto"/>
@@ -4915,7 +4683,7 @@
         </w:rPr>
         <w:t xml:space="preserve"> or </w:t>
       </w:r>
-      <w:hyperlink r:id="rId24">
+      <w:hyperlink r:id="rId10">
         <w:r>
           <w:rPr>
             <w:rFonts w:ascii="Roboto" w:hAnsi="Roboto"/>
@@ -4950,7 +4718,7 @@
         </w:rPr>
         <w:t xml:space="preserve">Provide an asset list, photographs, the plant location, available technical documents and your removal deadline. </w:t>
       </w:r>
-      <w:hyperlink r:id="rId20">
+      <w:hyperlink r:id="rId11">
         <w:r>
           <w:rPr>
             <w:rFonts w:ascii="Roboto" w:hAnsi="Roboto"/>
@@ -4985,7 +4753,7 @@
         </w:rPr>
         <w:t xml:space="preserve">Yes. IPP purchases complete plant sites, including the land, buildings, equipment and intellectual property. IPP also buys individual process units and equipment systems within a site. </w:t>
       </w:r>
-      <w:hyperlink r:id="rId22">
+      <w:hyperlink r:id="rId31">
         <w:r>
           <w:rPr>
             <w:rFonts w:ascii="Roboto" w:hAnsi="Roboto"/>
@@ -5020,7 +4788,7 @@
         </w:rPr>
         <w:t xml:space="preserve">Yes, in some acquisitions. IPP buys sites with known contamination and assumes site cleanup and regulatory compliance obligations as the buyer. IPP’s remediation partners work with local environmental authorities on each site. </w:t>
       </w:r>
-      <w:hyperlink r:id="rId23">
+      <w:hyperlink r:id="rId9">
         <w:r>
           <w:rPr>
             <w:rFonts w:ascii="Roboto" w:hAnsi="Roboto"/>
@@ -5100,6 +4868,100 @@
           <w:rFonts w:ascii="Roboto" w:hAnsi="Roboto" w:eastAsia="Roboto"/>
         </w:rPr>
         <w:t>The reactors, heat exchangers, separators and dryers inside a chemical process plant.</w:t>
+      </w:r>
+    </w:p>
+    <w:p>
+      <w:r>
+        <w:rPr>
+          <w:rFonts w:ascii="Roboto" w:hAnsi="Roboto" w:eastAsia="Roboto"/>
+        </w:rPr>
+        <w:t>Read article ↗</w:t>
+      </w:r>
+    </w:p>
+    <w:p>
+      <w:hyperlink r:id="rId30">
+        <w:r>
+          <w:rPr>
+            <w:rFonts w:ascii="Roboto" w:hAnsi="Roboto"/>
+            <w:color w:val="0563C1"/>
+            <w:u w:val="single"/>
+          </w:rPr>
+          <w:t xml:space="preserve">Source / details</w:t>
+        </w:r>
+      </w:hyperlink>
+    </w:p>
+    <w:p>
+      <w:r>
+        <w:rPr>
+          <w:rFonts w:ascii="Roboto" w:hAnsi="Roboto" w:eastAsia="Roboto"/>
+        </w:rPr>
+        <w:t>Guide</w:t>
+      </w:r>
+    </w:p>
+    <w:p>
+      <w:pPr>
+        <w:pStyle w:val="Heading4"/>
+      </w:pPr>
+      <w:r>
+        <w:rPr>
+          <w:rFonts w:ascii="Montserrat" w:hAnsi="Montserrat" w:eastAsia="Outfit"/>
+        </w:rPr>
+        <w:t>What is an industrial plant? Types of process plants</w:t>
+      </w:r>
+    </w:p>
+    <w:p>
+      <w:r>
+        <w:rPr>
+          <w:rFonts w:ascii="Roboto" w:hAnsi="Roboto" w:eastAsia="Roboto"/>
+        </w:rPr>
+        <w:t>How industrial and process plants are classified by product and process.</w:t>
+      </w:r>
+    </w:p>
+    <w:p>
+      <w:r>
+        <w:rPr>
+          <w:rFonts w:ascii="Roboto" w:hAnsi="Roboto" w:eastAsia="Roboto"/>
+        </w:rPr>
+        <w:t>Read article ↗</w:t>
+      </w:r>
+    </w:p>
+    <w:p>
+      <w:hyperlink r:id="rId32">
+        <w:r>
+          <w:rPr>
+            <w:rFonts w:ascii="Roboto" w:hAnsi="Roboto"/>
+            <w:color w:val="0563C1"/>
+            <w:u w:val="single"/>
+          </w:rPr>
+          <w:t xml:space="preserve">Source / details</w:t>
+        </w:r>
+      </w:hyperlink>
+    </w:p>
+    <w:p>
+      <w:r>
+        <w:rPr>
+          <w:rFonts w:ascii="Roboto" w:hAnsi="Roboto" w:eastAsia="Roboto"/>
+        </w:rPr>
+        <w:t>Guide</w:t>
+      </w:r>
+    </w:p>
+    <w:p>
+      <w:pPr>
+        <w:pStyle w:val="Heading4"/>
+      </w:pPr>
+      <w:r>
+        <w:rPr>
+          <w:rFonts w:ascii="Montserrat" w:hAnsi="Montserrat" w:eastAsia="Outfit"/>
+        </w:rPr>
+        <w:t>What is a glass-lined reactor?</w:t>
+      </w:r>
+    </w:p>
+    <w:p>
+      <w:r>
+        <w:rPr>
+          <w:rFonts w:ascii="Roboto" w:hAnsi="Roboto" w:eastAsia="Roboto"/>
+        </w:rPr>
+        <w:t>How a glass lining protects reactors in corrosive chemical and pharmaceutical service.</w:t>
       </w:r>
     </w:p>
     <w:p>
@@ -5138,15 +5000,15 @@
         <w:rPr>
           <w:rFonts w:ascii="Montserrat" w:hAnsi="Montserrat" w:eastAsia="Outfit"/>
         </w:rPr>
-        <w:t>What is an industrial plant? Types of process plants</w:t>
-      </w:r>
-    </w:p>
-    <w:p>
-      <w:r>
-        <w:rPr>
-          <w:rFonts w:ascii="Roboto" w:hAnsi="Roboto" w:eastAsia="Roboto"/>
-        </w:rPr>
-        <w:t>How industrial and process plants are classified by product and process.</w:t>
+        <w:t>What is a chemical reactor?</w:t>
+      </w:r>
+    </w:p>
+    <w:p>
+      <w:r>
+        <w:rPr>
+          <w:rFonts w:ascii="Roboto" w:hAnsi="Roboto" w:eastAsia="Roboto"/>
+        </w:rPr>
+        <w:t>How chemical reactors work, with the main reactor types.</w:t>
       </w:r>
     </w:p>
     <w:p>
@@ -5185,15 +5047,15 @@
         <w:rPr>
           <w:rFonts w:ascii="Montserrat" w:hAnsi="Montserrat" w:eastAsia="Outfit"/>
         </w:rPr>
-        <w:t>What is a glass-lined reactor?</w:t>
-      </w:r>
-    </w:p>
-    <w:p>
-      <w:r>
-        <w:rPr>
-          <w:rFonts w:ascii="Roboto" w:hAnsi="Roboto" w:eastAsia="Roboto"/>
-        </w:rPr>
-        <w:t>How a glass lining protects reactors in corrosive chemical and pharmaceutical service.</w:t>
+        <w:t>What is petrochemical process equipment?</w:t>
+      </w:r>
+    </w:p>
+    <w:p>
+      <w:r>
+        <w:rPr>
+          <w:rFonts w:ascii="Roboto" w:hAnsi="Roboto" w:eastAsia="Roboto"/>
+        </w:rPr>
+        <w:t>The equipment that converts oil and gas feedstocks into petrochemicals.</w:t>
       </w:r>
     </w:p>
     <w:p>
@@ -5221,7 +5083,7 @@
         <w:rPr>
           <w:rFonts w:ascii="Roboto" w:hAnsi="Roboto" w:eastAsia="Roboto"/>
         </w:rPr>
-        <w:t>Guide</w:t>
+        <w:t>For sellers</w:t>
       </w:r>
     </w:p>
     <w:p>
@@ -5232,15 +5094,15 @@
         <w:rPr>
           <w:rFonts w:ascii="Montserrat" w:hAnsi="Montserrat" w:eastAsia="Outfit"/>
         </w:rPr>
-        <w:t>What is a chemical reactor?</w:t>
-      </w:r>
-    </w:p>
-    <w:p>
-      <w:r>
-        <w:rPr>
-          <w:rFonts w:ascii="Roboto" w:hAnsi="Roboto" w:eastAsia="Roboto"/>
-        </w:rPr>
-        <w:t>How chemical reactors work, with the main reactor types.</w:t>
+        <w:t>Plant decommissioning with IPP</w:t>
+      </w:r>
+    </w:p>
+    <w:p>
+      <w:r>
+        <w:rPr>
+          <w:rFonts w:ascii="Roboto" w:hAnsi="Roboto" w:eastAsia="Roboto"/>
+        </w:rPr>
+        <w:t>Why plant owners choose IPP for decommissioning and dismantling.</w:t>
       </w:r>
     </w:p>
     <w:p>
@@ -5252,7 +5114,7 @@
       </w:r>
     </w:p>
     <w:p>
-      <w:hyperlink r:id="rId36">
+      <w:hyperlink r:id="rId24">
         <w:r>
           <w:rPr>
             <w:rFonts w:ascii="Roboto" w:hAnsi="Roboto"/>
@@ -5264,108 +5126,6 @@
       </w:hyperlink>
     </w:p>
     <w:p>
-      <w:r>
-        <w:rPr>
-          <w:rFonts w:ascii="Roboto" w:hAnsi="Roboto" w:eastAsia="Roboto"/>
-        </w:rPr>
-        <w:t>Guide</w:t>
-      </w:r>
-    </w:p>
-    <w:p>
-      <w:pPr>
-        <w:pStyle w:val="Heading4"/>
-      </w:pPr>
-      <w:r>
-        <w:rPr>
-          <w:rFonts w:ascii="Montserrat" w:hAnsi="Montserrat" w:eastAsia="Outfit"/>
-        </w:rPr>
-        <w:t>What is petrochemical process equipment?</w:t>
-      </w:r>
-    </w:p>
-    <w:p>
-      <w:r>
-        <w:rPr>
-          <w:rFonts w:ascii="Roboto" w:hAnsi="Roboto" w:eastAsia="Roboto"/>
-        </w:rPr>
-        <w:t>The equipment that converts oil and gas feedstocks into petrochemicals.</w:t>
-      </w:r>
-    </w:p>
-    <w:p>
-      <w:r>
-        <w:rPr>
-          <w:rFonts w:ascii="Roboto" w:hAnsi="Roboto" w:eastAsia="Roboto"/>
-        </w:rPr>
-        <w:t>Read article ↗</w:t>
-      </w:r>
-    </w:p>
-    <w:p>
-      <w:hyperlink r:id="rId37">
-        <w:r>
-          <w:rPr>
-            <w:rFonts w:ascii="Roboto" w:hAnsi="Roboto"/>
-            <w:color w:val="0563C1"/>
-            <w:u w:val="single"/>
-          </w:rPr>
-          <w:t xml:space="preserve">Source / details</w:t>
-        </w:r>
-      </w:hyperlink>
-    </w:p>
-    <w:p>
-      <w:r>
-        <w:rPr>
-          <w:rFonts w:ascii="Roboto" w:hAnsi="Roboto" w:eastAsia="Roboto"/>
-        </w:rPr>
-        <w:t>For sellers</w:t>
-      </w:r>
-    </w:p>
-    <w:p>
-      <w:pPr>
-        <w:pStyle w:val="Heading4"/>
-      </w:pPr>
-      <w:r>
-        <w:rPr>
-          <w:rFonts w:ascii="Montserrat" w:hAnsi="Montserrat" w:eastAsia="Outfit"/>
-        </w:rPr>
-        <w:t>Plant decommissioning with IPP</w:t>
-      </w:r>
-    </w:p>
-    <w:p>
-      <w:r>
-        <w:rPr>
-          <w:rFonts w:ascii="Roboto" w:hAnsi="Roboto" w:eastAsia="Roboto"/>
-        </w:rPr>
-        <w:t>Why plant owners choose IPP for decommissioning and dismantling.</w:t>
-      </w:r>
-    </w:p>
-    <w:p>
-      <w:r>
-        <w:rPr>
-          <w:rFonts w:ascii="Roboto" w:hAnsi="Roboto" w:eastAsia="Roboto"/>
-        </w:rPr>
-        <w:t>Read article ↗</w:t>
-      </w:r>
-    </w:p>
-    <w:p>
-      <w:hyperlink r:id="rId28">
-        <w:r>
-          <w:rPr>
-            <w:rFonts w:ascii="Roboto" w:hAnsi="Roboto"/>
-            <w:color w:val="0563C1"/>
-            <w:u w:val="single"/>
-          </w:rPr>
-          <w:t xml:space="preserve">Source / details</w:t>
-        </w:r>
-      </w:hyperlink>
-    </w:p>
-    <w:p>
-      <w:r>
-        <w:rPr>
-          <w:rFonts w:ascii="Roboto" w:hAnsi="Roboto" w:eastAsia="Roboto"/>
-        </w:rPr>
-        <w:t>Tell us what you need</w:t>
-      </w:r>
-    </w:p>
-    <w:p>
       <w:pPr>
         <w:pStyle w:val="Heading2"/>
       </w:pPr>
@@ -5414,7 +5174,7 @@
         </w:rPr>
         <w:t xml:space="preserve"> · </w:t>
       </w:r>
-      <w:hyperlink r:id="rId38">
+      <w:hyperlink r:id="rId36">
         <w:r>
           <w:rPr>
             <w:rFonts w:ascii="Roboto" w:hAnsi="Roboto"/>

</xml_diff>

<commit_message>
Chemical page: vary brand voice; expand Why IPP and project cards
- Brand name opens each section and carries attributed claims; follow-up
  sentences use "we" and "our" (35 brand-led, 49 first-person sentences).
  Preserved originals and the locked buying steps are unchanged.
- Why IPP gains a context-bound opener and lead-in to its five cards.
- Project cards carry three sourced sentences each: BASF Ludwigshafen
  plants and capacities, the Grimsby site and its equipment, the CDMO
  API plant moved to Eastover, decommissions and the Nuol transfer.
- Validator accepts first-person type-card openers (118 pass); semantic
  role table, README, Word copy and standalone preview refreshed.

Co-Authored-By: Claude Opus 5.5 <noreply@anthropic.com>
</commit_message>
<xml_diff>
--- a/docs/chemical-build/deliverables/used-chemical-process-plants-for-sale-content.docx
+++ b/docs/chemical-build/deliverables/used-chemical-process-plants-for-sale-content.docx
@@ -309,31 +309,31 @@
         <w:rPr>
           <w:rFonts w:ascii="Roboto" w:hAnsi="Roboto" w:eastAsia="Roboto"/>
         </w:rPr>
-        <w:t>International Process Plants (IPP) sells used chemical process plants and equipment to chemical, petrochemical, fertilizer, polymer, agrochemical and specialty chemical producers worldwide. IPP stocks complete plants, process lines and individual reactors, heat exchangers, centrifuges, dryers, filters, distillation columns and tanks from Pfaudler, De Dietrich, Alfa Laval, Krauss Maffei, Westfalia and other OEM manufacturers. Purchasing used from IPP can save up to 50% of capital and 90% of lead time versus buying new. IPP has supplied process equipment worldwide since 1980.</w:t>
-      </w:r>
-    </w:p>
-    <w:p>
-      <w:r>
-        <w:rPr>
-          <w:rFonts w:ascii="Roboto" w:hAnsi="Roboto" w:eastAsia="Roboto"/>
-        </w:rPr>
-        <w:t>International Process Plants (IPP) is the world’s largest seller of used process plants and equipment, with 15,000+ pieces of inventory and nearly five decades of experience. IPP owns 20 complete process plant sites. Materials of construction include glass-lined, stainless steel 316, 316L, 304 and 321, Hastelloy C-22 and C-276, titanium, graphite and polypropylene. Capacities range from 2 L (0.5 gal) reactors to 565,000 L (149,258 gal) tanks. Reactor pressure ratings reach 358.7 bar (5,203 psi).</w:t>
-      </w:r>
-    </w:p>
-    <w:p>
-      <w:r>
-        <w:rPr>
-          <w:rFonts w:ascii="Roboto" w:hAnsi="Roboto" w:eastAsia="Roboto"/>
-        </w:rPr>
-        <w:t>Condition options include used, unused, refurbished, re-glassed and new. IPP offers re-glassed glass-lined equipment through Universal Glasteel Equipment (UGE) and new stainless steel equipment through Gale Process Solutions (GPS). IPP’s reactor inventory includes ASME, National Board, CRN, CE and PED coded vessels.</w:t>
-      </w:r>
-    </w:p>
-    <w:p>
-      <w:r>
-        <w:rPr>
-          <w:rFonts w:ascii="Roboto" w:hAnsi="Roboto" w:eastAsia="Roboto"/>
-        </w:rPr>
-        <w:t xml:space="preserve">IPP buys shutdown chemical plants, idle process lines and surplus equipment from plant owners and asset managers. IPP values each asset at the seller’s site. IPP handles decommissioning, dismantling and removal. Plant owners start a sale through the </w:t>
+        <w:t>International Process Plants (IPP) sells used chemical process plants and equipment to chemical, petrochemical, fertilizer, polymer, agrochemical and specialty chemical producers worldwide. We stock complete plants, process lines and individual reactors, heat exchangers, centrifuges, dryers, filters, distillation columns and tanks from Pfaudler, De Dietrich, Alfa Laval, Krauss Maffei, Westfalia and other OEM manufacturers. Purchasing used from IPP can save up to 50% of capital and 90% of lead time versus buying new. We have supplied process equipment worldwide since 1980.</w:t>
+      </w:r>
+    </w:p>
+    <w:p>
+      <w:r>
+        <w:rPr>
+          <w:rFonts w:ascii="Roboto" w:hAnsi="Roboto" w:eastAsia="Roboto"/>
+        </w:rPr>
+        <w:t>International Process Plants (IPP) is the world’s largest seller of used process plants and equipment, with 15,000+ pieces of inventory and nearly five decades of experience. Our holdings include 20 complete process plant sites. Materials of construction include glass-lined, stainless steel 316, 316L, 304 and 321, Hastelloy C-22 and C-276, titanium, graphite and polypropylene. Capacities range from 2 L (0.5 gal) reactors to 565,000 L (149,258 gal) tanks. Reactor pressure ratings reach 358.7 bar (5,203 psi).</w:t>
+      </w:r>
+    </w:p>
+    <w:p>
+      <w:r>
+        <w:rPr>
+          <w:rFonts w:ascii="Roboto" w:hAnsi="Roboto" w:eastAsia="Roboto"/>
+        </w:rPr>
+        <w:t>Condition options include used, unused, refurbished, re-glassed and new. We offer re-glassed glass-lined equipment through Universal Glasteel Equipment (UGE) and new stainless steel equipment through Gale Process Solutions (GPS). Our reactor inventory includes ASME, National Board, CRN, CE and PED coded vessels.</w:t>
+      </w:r>
+    </w:p>
+    <w:p>
+      <w:r>
+        <w:rPr>
+          <w:rFonts w:ascii="Roboto" w:hAnsi="Roboto" w:eastAsia="Roboto"/>
+        </w:rPr>
+        <w:t xml:space="preserve">IPP buys shutdown chemical plants, idle process lines and surplus equipment from plant owners and asset managers. We value each asset at the seller’s site. Our team handles decommissioning, dismantling and removal. Plant owners start a sale through the </w:t>
       </w:r>
       <w:hyperlink r:id="rId9">
         <w:r>
@@ -400,7 +400,7 @@
         <w:rPr>
           <w:rFonts w:ascii="Roboto" w:hAnsi="Roboto" w:eastAsia="Roboto"/>
         </w:rPr>
-        <w:t>Plant listings show capacity, technology, feedstock and location. Equipment listings show material, condition, pressure and temperature. Each listing opens the full specifications and photographs.</w:t>
+        <w:t>IPP features six used chemical plants and eight units of process equipment from its inventory for sale. Plant listings show capacity, technology, feedstock and location. Equipment listings show material, condition, pressure and temperature. Each listing opens the full specifications and photographs in IPP’s inventory.</w:t>
       </w:r>
     </w:p>
     <w:p>
@@ -2611,7 +2611,7 @@
         <w:rPr>
           <w:rFonts w:ascii="Roboto" w:hAnsi="Roboto" w:eastAsia="Roboto"/>
         </w:rPr>
-        <w:t>IPP stocks used chemical process equipment as individual units and connected systems for reaction, heat transfer, separation, drying, filtration, distillation and storage.</w:t>
+        <w:t>IPP stocks used chemical process equipment as individual units and connected systems for reaction, heat transfer, separation, drying, filtration, distillation and storage. Chemical producers buy these units to add capacity or replace process units.</w:t>
       </w:r>
     </w:p>
     <w:p>
@@ -2630,15 +2630,70 @@
         <w:rPr>
           <w:rFonts w:ascii="Roboto" w:hAnsi="Roboto" w:eastAsia="Roboto"/>
         </w:rPr>
-        <w:t>Precision-controlled systems for chemical synthesis, available in glass-lined, stainless and specialty alloys.</w:t>
-      </w:r>
-    </w:p>
-    <w:p>
-      <w:r>
-        <w:rPr>
-          <w:rFonts w:ascii="Roboto" w:hAnsi="Roboto" w:eastAsia="Roboto"/>
-        </w:rPr>
-        <w:t>Makers in IPP’s inventory include Pfaudler, De Dietrich, UGE and Gale Process Solutions.</w:t>
+        <w:t>Precision-controlled systems for chemical synthesis, available in glass-lined, stainless and specialty alloys. IPP supplies used reactors from Pfaudler, De Dietrich, UGE and Gale Process Solutions to chemical producers for batch and continuous synthesis.</w:t>
+      </w:r>
+    </w:p>
+    <w:p>
+      <w:r>
+        <w:rPr>
+          <w:rFonts w:ascii="Roboto" w:hAnsi="Roboto" w:eastAsia="Roboto"/>
+        </w:rPr>
+        <w:t>Our used reactor inventory includes:</w:t>
+      </w:r>
+    </w:p>
+    <w:p>
+      <w:pPr>
+        <w:pStyle w:val="ListBullet"/>
+      </w:pPr>
+      <w:r>
+        <w:rPr>
+          <w:rFonts w:ascii="Roboto" w:hAnsi="Roboto" w:eastAsia="Roboto"/>
+        </w:rPr>
+        <w:t>Batch-type agitated reactors with complete agitation</w:t>
+      </w:r>
+    </w:p>
+    <w:p>
+      <w:pPr>
+        <w:pStyle w:val="ListBullet"/>
+      </w:pPr>
+      <w:r>
+        <w:rPr>
+          <w:rFonts w:ascii="Roboto" w:hAnsi="Roboto" w:eastAsia="Roboto"/>
+        </w:rPr>
+        <w:t>Batch type body only reactor shells</w:t>
+      </w:r>
+    </w:p>
+    <w:p>
+      <w:pPr>
+        <w:pStyle w:val="ListBullet"/>
+      </w:pPr>
+      <w:r>
+        <w:rPr>
+          <w:rFonts w:ascii="Roboto" w:hAnsi="Roboto" w:eastAsia="Roboto"/>
+        </w:rPr>
+        <w:t>Hydrogenation reactors</w:t>
+      </w:r>
+    </w:p>
+    <w:p>
+      <w:pPr>
+        <w:pStyle w:val="ListBullet"/>
+      </w:pPr>
+      <w:r>
+        <w:rPr>
+          <w:rFonts w:ascii="Roboto" w:hAnsi="Roboto" w:eastAsia="Roboto"/>
+        </w:rPr>
+        <w:t>Fixed bed catalytic reactors</w:t>
+      </w:r>
+    </w:p>
+    <w:p>
+      <w:pPr>
+        <w:pStyle w:val="ListBullet"/>
+      </w:pPr>
+      <w:r>
+        <w:rPr>
+          <w:rFonts w:ascii="Roboto" w:hAnsi="Roboto" w:eastAsia="Roboto"/>
+        </w:rPr>
+        <w:t>Tubular continuous-flow reactors</w:t>
       </w:r>
     </w:p>
     <w:p>
@@ -2662,15 +2717,15 @@
         <w:rPr>
           <w:rFonts w:ascii="Roboto" w:hAnsi="Roboto" w:eastAsia="Roboto"/>
         </w:rPr>
+        <w:t>Each reactor listing states capacity, internal pressure, temperature, material and condition.</w:t>
+      </w:r>
+    </w:p>
+    <w:p>
+      <w:r>
+        <w:rPr>
+          <w:rFonts w:ascii="Roboto" w:hAnsi="Roboto" w:eastAsia="Roboto"/>
+        </w:rPr>
         <w:t>Featured listing: stainless steel 316L batch-type agitated reactor.</w:t>
-      </w:r>
-    </w:p>
-    <w:p>
-      <w:r>
-        <w:rPr>
-          <w:rFonts w:ascii="Roboto" w:hAnsi="Roboto" w:eastAsia="Roboto"/>
-        </w:rPr>
-        <w:t>Reactors guide</w:t>
       </w:r>
     </w:p>
     <w:p>
@@ -2697,15 +2752,81 @@
         <w:rPr>
           <w:rFonts w:ascii="Roboto" w:hAnsi="Roboto" w:eastAsia="Roboto"/>
         </w:rPr>
-        <w:t>Shell-and-tube and plate exchangers for thermal control and energy recovery.</w:t>
-      </w:r>
-    </w:p>
-    <w:p>
-      <w:r>
-        <w:rPr>
-          <w:rFonts w:ascii="Roboto" w:hAnsi="Roboto" w:eastAsia="Roboto"/>
-        </w:rPr>
-        <w:t>Makers in IPP’s inventory include Alfa Laval, Vicarb, Ralph Coidan and Graham.</w:t>
+        <w:t>Shell-and-tube and plate exchangers for thermal control and energy recovery. We supply used heat exchangers from Alfa Laval, Vicarb, Ralph Coidan and Graham to chemical plants for heating, cooling and condensing process streams.</w:t>
+      </w:r>
+    </w:p>
+    <w:p>
+      <w:r>
+        <w:rPr>
+          <w:rFonts w:ascii="Roboto" w:hAnsi="Roboto" w:eastAsia="Roboto"/>
+        </w:rPr>
+        <w:t>IPP’s used heat exchanger inventory includes:</w:t>
+      </w:r>
+    </w:p>
+    <w:p>
+      <w:pPr>
+        <w:pStyle w:val="ListBullet"/>
+      </w:pPr>
+      <w:r>
+        <w:rPr>
+          <w:rFonts w:ascii="Roboto" w:hAnsi="Roboto" w:eastAsia="Roboto"/>
+        </w:rPr>
+        <w:t>Shell-and-tube heat exchangers</w:t>
+      </w:r>
+    </w:p>
+    <w:p>
+      <w:pPr>
+        <w:pStyle w:val="ListBullet"/>
+      </w:pPr>
+      <w:r>
+        <w:rPr>
+          <w:rFonts w:ascii="Roboto" w:hAnsi="Roboto" w:eastAsia="Roboto"/>
+        </w:rPr>
+        <w:t>Plate-and-frame heat exchangers</w:t>
+      </w:r>
+    </w:p>
+    <w:p>
+      <w:pPr>
+        <w:pStyle w:val="ListBullet"/>
+      </w:pPr>
+      <w:r>
+        <w:rPr>
+          <w:rFonts w:ascii="Roboto" w:hAnsi="Roboto" w:eastAsia="Roboto"/>
+        </w:rPr>
+        <w:t>Spiral heat exchangers</w:t>
+      </w:r>
+    </w:p>
+    <w:p>
+      <w:pPr>
+        <w:pStyle w:val="ListBullet"/>
+      </w:pPr>
+      <w:r>
+        <w:rPr>
+          <w:rFonts w:ascii="Roboto" w:hAnsi="Roboto" w:eastAsia="Roboto"/>
+        </w:rPr>
+        <w:t>Graphite block heat exchangers</w:t>
+      </w:r>
+    </w:p>
+    <w:p>
+      <w:pPr>
+        <w:pStyle w:val="ListBullet"/>
+      </w:pPr>
+      <w:r>
+        <w:rPr>
+          <w:rFonts w:ascii="Roboto" w:hAnsi="Roboto" w:eastAsia="Roboto"/>
+        </w:rPr>
+        <w:t>Welded plate heat exchangers</w:t>
+      </w:r>
+    </w:p>
+    <w:p>
+      <w:pPr>
+        <w:pStyle w:val="ListBullet"/>
+      </w:pPr>
+      <w:r>
+        <w:rPr>
+          <w:rFonts w:ascii="Roboto" w:hAnsi="Roboto" w:eastAsia="Roboto"/>
+        </w:rPr>
+        <w:t>Air fin coolers</w:t>
       </w:r>
     </w:p>
     <w:p>
@@ -2729,15 +2850,15 @@
         <w:rPr>
           <w:rFonts w:ascii="Roboto" w:hAnsi="Roboto" w:eastAsia="Roboto"/>
         </w:rPr>
+        <w:t>Each heat exchanger listing states heat transfer area, shell and tube pressure, temperature and material.</w:t>
+      </w:r>
+    </w:p>
+    <w:p>
+      <w:r>
+        <w:rPr>
+          <w:rFonts w:ascii="Roboto" w:hAnsi="Roboto" w:eastAsia="Roboto"/>
+        </w:rPr>
         <w:t>Featured listing: shell, tubes and tubesheet in stainless steel 316L.</w:t>
-      </w:r>
-    </w:p>
-    <w:p>
-      <w:r>
-        <w:rPr>
-          <w:rFonts w:ascii="Roboto" w:hAnsi="Roboto" w:eastAsia="Roboto"/>
-        </w:rPr>
-        <w:t>Heat exchangers guide</w:t>
       </w:r>
     </w:p>
     <w:p>
@@ -2764,15 +2885,89 @@
         <w:rPr>
           <w:rFonts w:ascii="Roboto" w:hAnsi="Roboto" w:eastAsia="Roboto"/>
         </w:rPr>
-        <w:t>Used for purification, separation and crystallization. Basket, inverting and peeler models available.</w:t>
-      </w:r>
-    </w:p>
-    <w:p>
-      <w:r>
-        <w:rPr>
-          <w:rFonts w:ascii="Roboto" w:hAnsi="Roboto" w:eastAsia="Roboto"/>
-        </w:rPr>
-        <w:t>Makers in IPP’s inventory include Krauss Maffei, Alfa Laval, Westfalia and Sharples.</w:t>
+        <w:t>Used for purification, separation and crystallization. Basket, inverting and peeler models available. Our centrifuge stock carries Krauss Maffei, Alfa Laval, Westfalia and Sharples machines for solid-liquid separation in chemical and pharmaceutical plants.</w:t>
+      </w:r>
+    </w:p>
+    <w:p>
+      <w:r>
+        <w:rPr>
+          <w:rFonts w:ascii="Roboto" w:hAnsi="Roboto" w:eastAsia="Roboto"/>
+        </w:rPr>
+        <w:t>Centrifuge types in our inventory include:</w:t>
+      </w:r>
+    </w:p>
+    <w:p>
+      <w:pPr>
+        <w:pStyle w:val="ListBullet"/>
+      </w:pPr>
+      <w:r>
+        <w:rPr>
+          <w:rFonts w:ascii="Roboto" w:hAnsi="Roboto" w:eastAsia="Roboto"/>
+        </w:rPr>
+        <w:t>Bottom-discharge basket centrifuges</w:t>
+      </w:r>
+    </w:p>
+    <w:p>
+      <w:pPr>
+        <w:pStyle w:val="ListBullet"/>
+      </w:pPr>
+      <w:r>
+        <w:rPr>
+          <w:rFonts w:ascii="Roboto" w:hAnsi="Roboto" w:eastAsia="Roboto"/>
+        </w:rPr>
+        <w:t>Top-discharge basket centrifuges</w:t>
+      </w:r>
+    </w:p>
+    <w:p>
+      <w:pPr>
+        <w:pStyle w:val="ListBullet"/>
+      </w:pPr>
+      <w:r>
+        <w:rPr>
+          <w:rFonts w:ascii="Roboto" w:hAnsi="Roboto" w:eastAsia="Roboto"/>
+        </w:rPr>
+        <w:t>Peeler centrifuges</w:t>
+      </w:r>
+    </w:p>
+    <w:p>
+      <w:pPr>
+        <w:pStyle w:val="ListBullet"/>
+      </w:pPr>
+      <w:r>
+        <w:rPr>
+          <w:rFonts w:ascii="Roboto" w:hAnsi="Roboto" w:eastAsia="Roboto"/>
+        </w:rPr>
+        <w:t>Inverting filter centrifuges</w:t>
+      </w:r>
+    </w:p>
+    <w:p>
+      <w:pPr>
+        <w:pStyle w:val="ListBullet"/>
+      </w:pPr>
+      <w:r>
+        <w:rPr>
+          <w:rFonts w:ascii="Roboto" w:hAnsi="Roboto" w:eastAsia="Roboto"/>
+        </w:rPr>
+        <w:t>Disc bowl centrifuges</w:t>
+      </w:r>
+    </w:p>
+    <w:p>
+      <w:pPr>
+        <w:pStyle w:val="ListBullet"/>
+      </w:pPr>
+      <w:r>
+        <w:rPr>
+          <w:rFonts w:ascii="Roboto" w:hAnsi="Roboto" w:eastAsia="Roboto"/>
+        </w:rPr>
+        <w:t>Solid bowl decanter centrifuges</w:t>
+      </w:r>
+    </w:p>
+    <w:p>
+      <w:r>
+        <w:rPr>
+          <w:rFonts w:ascii="Roboto" w:hAnsi="Roboto" w:eastAsia="Roboto"/>
+        </w:rPr>
+        <w:t>Each centrifuge listing states basket or bowl size, material, filtration area and motor power.</w:t>
       </w:r>
     </w:p>
     <w:p>
@@ -2781,14 +2976,6 @@
           <w:rFonts w:ascii="Roboto" w:hAnsi="Roboto" w:eastAsia="Roboto"/>
         </w:rPr>
         <w:t>Featured listing: Hastelloy C22 peeler centrifuge with a 630 mm (24.8 in) basket.</w:t>
-      </w:r>
-    </w:p>
-    <w:p>
-      <w:r>
-        <w:rPr>
-          <w:rFonts w:ascii="Roboto" w:hAnsi="Roboto" w:eastAsia="Roboto"/>
-        </w:rPr>
-        <w:t>Centrifuges guide</w:t>
       </w:r>
     </w:p>
     <w:p>
@@ -2815,15 +3002,89 @@
         <w:rPr>
           <w:rFonts w:ascii="Roboto" w:hAnsi="Roboto" w:eastAsia="Roboto"/>
         </w:rPr>
-        <w:t>Moisture removal solutions including rotary, vacuum and disc dryers.</w:t>
-      </w:r>
-    </w:p>
-    <w:p>
-      <w:r>
-        <w:rPr>
-          <w:rFonts w:ascii="Roboto" w:hAnsi="Roboto" w:eastAsia="Roboto"/>
-        </w:rPr>
-        <w:t>Makers in IPP’s inventory include Gale Process Solutions, Glatt, Niro and Pfaudler.</w:t>
+        <w:t>Moisture removal solutions including rotary, vacuum and disc dryers. IPP supplies used dryers from Gale Process Solutions, Glatt, Niro and Pfaudler to chemical plants for removing moisture and solvents from powders, pastes and slurries.</w:t>
+      </w:r>
+    </w:p>
+    <w:p>
+      <w:r>
+        <w:rPr>
+          <w:rFonts w:ascii="Roboto" w:hAnsi="Roboto" w:eastAsia="Roboto"/>
+        </w:rPr>
+        <w:t>Our used dryer inventory includes:</w:t>
+      </w:r>
+    </w:p>
+    <w:p>
+      <w:pPr>
+        <w:pStyle w:val="ListBullet"/>
+      </w:pPr>
+      <w:r>
+        <w:rPr>
+          <w:rFonts w:ascii="Roboto" w:hAnsi="Roboto" w:eastAsia="Roboto"/>
+        </w:rPr>
+        <w:t>Rotary vacuum dryers</w:t>
+      </w:r>
+    </w:p>
+    <w:p>
+      <w:pPr>
+        <w:pStyle w:val="ListBullet"/>
+      </w:pPr>
+      <w:r>
+        <w:rPr>
+          <w:rFonts w:ascii="Roboto" w:hAnsi="Roboto" w:eastAsia="Roboto"/>
+        </w:rPr>
+        <w:t>Double cone and twin shell dryers</w:t>
+      </w:r>
+    </w:p>
+    <w:p>
+      <w:pPr>
+        <w:pStyle w:val="ListBullet"/>
+      </w:pPr>
+      <w:r>
+        <w:rPr>
+          <w:rFonts w:ascii="Roboto" w:hAnsi="Roboto" w:eastAsia="Roboto"/>
+        </w:rPr>
+        <w:t>Fluid bed dryers</w:t>
+      </w:r>
+    </w:p>
+    <w:p>
+      <w:pPr>
+        <w:pStyle w:val="ListBullet"/>
+      </w:pPr>
+      <w:r>
+        <w:rPr>
+          <w:rFonts w:ascii="Roboto" w:hAnsi="Roboto" w:eastAsia="Roboto"/>
+        </w:rPr>
+        <w:t>Spray dryers</w:t>
+      </w:r>
+    </w:p>
+    <w:p>
+      <w:pPr>
+        <w:pStyle w:val="ListBullet"/>
+      </w:pPr>
+      <w:r>
+        <w:rPr>
+          <w:rFonts w:ascii="Roboto" w:hAnsi="Roboto" w:eastAsia="Roboto"/>
+        </w:rPr>
+        <w:t>Paddle and ribbon dryers</w:t>
+      </w:r>
+    </w:p>
+    <w:p>
+      <w:pPr>
+        <w:pStyle w:val="ListBullet"/>
+      </w:pPr>
+      <w:r>
+        <w:rPr>
+          <w:rFonts w:ascii="Roboto" w:hAnsi="Roboto" w:eastAsia="Roboto"/>
+        </w:rPr>
+        <w:t>Porcupine and screw dryers</w:t>
+      </w:r>
+    </w:p>
+    <w:p>
+      <w:r>
+        <w:rPr>
+          <w:rFonts w:ascii="Roboto" w:hAnsi="Roboto" w:eastAsia="Roboto"/>
+        </w:rPr>
+        <w:t>Each dryer listing states chamber size, evaporation rate, inlet temperature and material.</w:t>
       </w:r>
     </w:p>
     <w:p>
@@ -2832,14 +3093,6 @@
           <w:rFonts w:ascii="Roboto" w:hAnsi="Roboto" w:eastAsia="Roboto"/>
         </w:rPr>
         <w:t>Featured listing: stainless steel 316 spray dryer with 31.8 kg/h (70 lb/h) evaporation.</w:t>
-      </w:r>
-    </w:p>
-    <w:p>
-      <w:r>
-        <w:rPr>
-          <w:rFonts w:ascii="Roboto" w:hAnsi="Roboto" w:eastAsia="Roboto"/>
-        </w:rPr>
-        <w:t>Dryers guide</w:t>
       </w:r>
     </w:p>
     <w:p>
@@ -2866,15 +3119,59 @@
         <w:rPr>
           <w:rFonts w:ascii="Roboto" w:hAnsi="Roboto" w:eastAsia="Roboto"/>
         </w:rPr>
-        <w:t>Pressure and vacuum systems to remove particulates or recover solids.</w:t>
-      </w:r>
-    </w:p>
-    <w:p>
-      <w:r>
-        <w:rPr>
-          <w:rFonts w:ascii="Roboto" w:hAnsi="Roboto" w:eastAsia="Roboto"/>
-        </w:rPr>
-        <w:t>Makers in IPP’s inventory include Schenk, Cogeim, Chemap and Rosenmund.</w:t>
+        <w:t>Pressure and vacuum systems to remove particulates or recover solids. We supply used filters from Schenk, Cogeim, Chemap and Rosenmund to chemical plants for clarifying liquids and recovering solids.</w:t>
+      </w:r>
+    </w:p>
+    <w:p>
+      <w:r>
+        <w:rPr>
+          <w:rFonts w:ascii="Roboto" w:hAnsi="Roboto" w:eastAsia="Roboto"/>
+        </w:rPr>
+        <w:t>IPP’s used filter inventory includes:</w:t>
+      </w:r>
+    </w:p>
+    <w:p>
+      <w:pPr>
+        <w:pStyle w:val="ListBullet"/>
+      </w:pPr>
+      <w:r>
+        <w:rPr>
+          <w:rFonts w:ascii="Roboto" w:hAnsi="Roboto" w:eastAsia="Roboto"/>
+        </w:rPr>
+        <w:t>Filter presses</w:t>
+      </w:r>
+    </w:p>
+    <w:p>
+      <w:pPr>
+        <w:pStyle w:val="ListBullet"/>
+      </w:pPr>
+      <w:r>
+        <w:rPr>
+          <w:rFonts w:ascii="Roboto" w:hAnsi="Roboto" w:eastAsia="Roboto"/>
+        </w:rPr>
+        <w:t>Rosenmund and Cogeim filter dryers</w:t>
+      </w:r>
+    </w:p>
+    <w:p>
+      <w:pPr>
+        <w:pStyle w:val="ListBullet"/>
+      </w:pPr>
+      <w:r>
+        <w:rPr>
+          <w:rFonts w:ascii="Roboto" w:hAnsi="Roboto" w:eastAsia="Roboto"/>
+        </w:rPr>
+        <w:t>Nutsche filters</w:t>
+      </w:r>
+    </w:p>
+    <w:p>
+      <w:pPr>
+        <w:pStyle w:val="ListBullet"/>
+      </w:pPr>
+      <w:r>
+        <w:rPr>
+          <w:rFonts w:ascii="Roboto" w:hAnsi="Roboto" w:eastAsia="Roboto"/>
+        </w:rPr>
+        <w:t>Pressure leaf filters</w:t>
       </w:r>
     </w:p>
     <w:p>
@@ -2898,15 +3195,15 @@
         <w:rPr>
           <w:rFonts w:ascii="Roboto" w:hAnsi="Roboto" w:eastAsia="Roboto"/>
         </w:rPr>
+        <w:t>Each filter listing states filtration area, pressure, temperature and material.</w:t>
+      </w:r>
+    </w:p>
+    <w:p>
+      <w:r>
+        <w:rPr>
+          <w:rFonts w:ascii="Roboto" w:hAnsi="Roboto" w:eastAsia="Roboto"/>
+        </w:rPr>
         <w:t>Featured listing: polypropylene plate-and-frame filter press.</w:t>
-      </w:r>
-    </w:p>
-    <w:p>
-      <w:r>
-        <w:rPr>
-          <w:rFonts w:ascii="Roboto" w:hAnsi="Roboto" w:eastAsia="Roboto"/>
-        </w:rPr>
-        <w:t>Filters guide</w:t>
       </w:r>
     </w:p>
     <w:p>
@@ -2933,15 +3230,59 @@
         <w:rPr>
           <w:rFonts w:ascii="Roboto" w:hAnsi="Roboto" w:eastAsia="Roboto"/>
         </w:rPr>
-        <w:t>For purification, solvent recovery and fractional separation.</w:t>
-      </w:r>
-    </w:p>
-    <w:p>
-      <w:r>
-        <w:rPr>
-          <w:rFonts w:ascii="Roboto" w:hAnsi="Roboto" w:eastAsia="Roboto"/>
-        </w:rPr>
-        <w:t>Makers in IPP’s inventory include Pfaudler, De Dietrich, Kühni and Schott.</w:t>
+        <w:t>For purification, solvent recovery and fractional separation. Our used distillation columns include Pfaudler, De Dietrich, Kühni and Schott units for solvent recovery and product purification in chemical plants.</w:t>
+      </w:r>
+    </w:p>
+    <w:p>
+      <w:r>
+        <w:rPr>
+          <w:rFonts w:ascii="Roboto" w:hAnsi="Roboto" w:eastAsia="Roboto"/>
+        </w:rPr>
+        <w:t>Column types in our inventory include:</w:t>
+      </w:r>
+    </w:p>
+    <w:p>
+      <w:pPr>
+        <w:pStyle w:val="ListBullet"/>
+      </w:pPr>
+      <w:r>
+        <w:rPr>
+          <w:rFonts w:ascii="Roboto" w:hAnsi="Roboto" w:eastAsia="Roboto"/>
+        </w:rPr>
+        <w:t>Packed columns</w:t>
+      </w:r>
+    </w:p>
+    <w:p>
+      <w:pPr>
+        <w:pStyle w:val="ListBullet"/>
+      </w:pPr>
+      <w:r>
+        <w:rPr>
+          <w:rFonts w:ascii="Roboto" w:hAnsi="Roboto" w:eastAsia="Roboto"/>
+        </w:rPr>
+        <w:t>Tray columns</w:t>
+      </w:r>
+    </w:p>
+    <w:p>
+      <w:pPr>
+        <w:pStyle w:val="ListBullet"/>
+      </w:pPr>
+      <w:r>
+        <w:rPr>
+          <w:rFonts w:ascii="Roboto" w:hAnsi="Roboto" w:eastAsia="Roboto"/>
+        </w:rPr>
+        <w:t>Combination columns</w:t>
+      </w:r>
+    </w:p>
+    <w:p>
+      <w:pPr>
+        <w:pStyle w:val="ListBullet"/>
+      </w:pPr>
+      <w:r>
+        <w:rPr>
+          <w:rFonts w:ascii="Roboto" w:hAnsi="Roboto" w:eastAsia="Roboto"/>
+        </w:rPr>
+        <w:t>Contactor columns</w:t>
       </w:r>
     </w:p>
     <w:p>
@@ -2958,6 +3299,14 @@
           <w:rFonts w:ascii="Roboto" w:hAnsi="Roboto" w:eastAsia="Roboto"/>
         </w:rPr>
         <w:t>Column diameters range from 76 mm (3 in) to 8,000 mm (315 in).</w:t>
+      </w:r>
+    </w:p>
+    <w:p>
+      <w:r>
+        <w:rPr>
+          <w:rFonts w:ascii="Roboto" w:hAnsi="Roboto" w:eastAsia="Roboto"/>
+        </w:rPr>
+        <w:t>Each column listing states diameter, length, pressure and temperature.</w:t>
       </w:r>
     </w:p>
     <w:p>
@@ -2992,15 +3341,70 @@
         <w:rPr>
           <w:rFonts w:ascii="Roboto" w:hAnsi="Roboto" w:eastAsia="Roboto"/>
         </w:rPr>
-        <w:t>For storage, blending and transfer. Jacketed and non-jacketed tanks available.</w:t>
-      </w:r>
-    </w:p>
-    <w:p>
-      <w:r>
-        <w:rPr>
-          <w:rFonts w:ascii="Roboto" w:hAnsi="Roboto" w:eastAsia="Roboto"/>
-        </w:rPr>
-        <w:t>Makers in IPP’s inventory include Pfaudler, De Dietrich, Grundy and Sinclair Stainless Fabrications.</w:t>
+        <w:t>For storage, blending and transfer. Jacketed and non-jacketed tanks available. IPP supplies used tanks from Pfaudler, De Dietrich, Grundy and Sinclair Stainless Fabrications to chemical plants for raw material storage, blending and product transfer.</w:t>
+      </w:r>
+    </w:p>
+    <w:p>
+      <w:r>
+        <w:rPr>
+          <w:rFonts w:ascii="Roboto" w:hAnsi="Roboto" w:eastAsia="Roboto"/>
+        </w:rPr>
+        <w:t>Our used tank inventory includes:</w:t>
+      </w:r>
+    </w:p>
+    <w:p>
+      <w:pPr>
+        <w:pStyle w:val="ListBullet"/>
+      </w:pPr>
+      <w:r>
+        <w:rPr>
+          <w:rFonts w:ascii="Roboto" w:hAnsi="Roboto" w:eastAsia="Roboto"/>
+        </w:rPr>
+        <w:t>Glass-lined tanks</w:t>
+      </w:r>
+    </w:p>
+    <w:p>
+      <w:pPr>
+        <w:pStyle w:val="ListBullet"/>
+      </w:pPr>
+      <w:r>
+        <w:rPr>
+          <w:rFonts w:ascii="Roboto" w:hAnsi="Roboto" w:eastAsia="Roboto"/>
+        </w:rPr>
+        <w:t>Stainless steel 304, 316 and 316L tanks</w:t>
+      </w:r>
+    </w:p>
+    <w:p>
+      <w:pPr>
+        <w:pStyle w:val="ListBullet"/>
+      </w:pPr>
+      <w:r>
+        <w:rPr>
+          <w:rFonts w:ascii="Roboto" w:hAnsi="Roboto" w:eastAsia="Roboto"/>
+        </w:rPr>
+        <w:t>Jacketed process tanks</w:t>
+      </w:r>
+    </w:p>
+    <w:p>
+      <w:pPr>
+        <w:pStyle w:val="ListBullet"/>
+      </w:pPr>
+      <w:r>
+        <w:rPr>
+          <w:rFonts w:ascii="Roboto" w:hAnsi="Roboto" w:eastAsia="Roboto"/>
+        </w:rPr>
+        <w:t>Non-jacketed storage tanks</w:t>
+      </w:r>
+    </w:p>
+    <w:p>
+      <w:pPr>
+        <w:pStyle w:val="ListBullet"/>
+      </w:pPr>
+      <w:r>
+        <w:rPr>
+          <w:rFonts w:ascii="Roboto" w:hAnsi="Roboto" w:eastAsia="Roboto"/>
+        </w:rPr>
+        <w:t>Carbon steel and fiberglass tanks</w:t>
       </w:r>
     </w:p>
     <w:p>
@@ -3024,15 +3428,15 @@
         <w:rPr>
           <w:rFonts w:ascii="Roboto" w:hAnsi="Roboto" w:eastAsia="Roboto"/>
         </w:rPr>
+        <w:t>Each tank listing states capacity, internal pressure, temperature and material.</w:t>
+      </w:r>
+    </w:p>
+    <w:p>
+      <w:r>
+        <w:rPr>
+          <w:rFonts w:ascii="Roboto" w:hAnsi="Roboto" w:eastAsia="Roboto"/>
+        </w:rPr>
         <w:t>Featured listing: stainless steel 316L vertical tank.</w:t>
-      </w:r>
-    </w:p>
-    <w:p>
-      <w:r>
-        <w:rPr>
-          <w:rFonts w:ascii="Roboto" w:hAnsi="Roboto" w:eastAsia="Roboto"/>
-        </w:rPr>
-        <w:t>Tanks guide</w:t>
       </w:r>
     </w:p>
     <w:p>
@@ -3059,7 +3463,15 @@
         <w:rPr>
           <w:rFonts w:ascii="Roboto" w:hAnsi="Roboto" w:eastAsia="Roboto"/>
         </w:rPr>
-        <w:t>IPP’s chemical process inventory carries equipment from the manufacturers below. Each link opens that manufacturer’s listings in IPP’s inventory.</w:t>
+        <w:t>IPP’s chemical process inventory carries reactors, heat exchangers, centrifuges, tanks and columns from the original manufacturers that built them. Buyers search a maker’s units directly through IPP’s inventory filters.</w:t>
+      </w:r>
+    </w:p>
+    <w:p>
+      <w:r>
+        <w:rPr>
+          <w:rFonts w:ascii="Roboto" w:hAnsi="Roboto" w:eastAsia="Roboto"/>
+        </w:rPr>
+        <w:t>Leading manufacturers in IPP’s chemical inventory include:</w:t>
       </w:r>
     </w:p>
     <w:p>
@@ -3210,6 +3622,14 @@
       </w:r>
     </w:p>
     <w:p>
+      <w:r>
+        <w:rPr>
+          <w:rFonts w:ascii="Roboto" w:hAnsi="Roboto" w:eastAsia="Roboto"/>
+        </w:rPr>
+        <w:t>Each link opens that manufacturer’s listings in IPP’s inventory, filtered by equipment type. Our sourcing team searches our global network for a maker or model not listed.</w:t>
+      </w:r>
+    </w:p>
+    <w:p>
       <w:pPr>
         <w:pStyle w:val="Heading2"/>
       </w:pPr>
@@ -3225,6 +3645,14 @@
         <w:rPr>
           <w:rFonts w:ascii="Roboto" w:hAnsi="Roboto" w:eastAsia="Roboto"/>
         </w:rPr>
+        <w:t>Chemical manufacturers choose International Process Plants (IPP) when added capacity or a replacement unit cannot wait for new-build lead times. We match each project with inventory that ships now, equipment with a documented operating history and a quote tied to the exact stock number. Five advantages define how we serve chemical producers:</w:t>
+      </w:r>
+    </w:p>
+    <w:p>
+      <w:r>
+        <w:rPr>
+          <w:rFonts w:ascii="Roboto" w:hAnsi="Roboto" w:eastAsia="Roboto"/>
+        </w:rPr>
         <w:t>01</w:t>
       </w:r>
     </w:p>
@@ -3244,7 +3672,7 @@
         <w:rPr>
           <w:rFonts w:ascii="Roboto" w:hAnsi="Roboto" w:eastAsia="Roboto"/>
         </w:rPr>
-        <w:t>In-stock equipment from IPP is ready to ship. IPP confirms the release date for each stock number.</w:t>
+        <w:t>In-stock equipment from IPP is ready to ship. We confirm the release date for each stock number. We store units at company-owned warehouses and workshops in South Carolina, England and Germany.</w:t>
       </w:r>
     </w:p>
     <w:p>
@@ -3271,7 +3699,7 @@
         <w:rPr>
           <w:rFonts w:ascii="Roboto" w:hAnsi="Roboto" w:eastAsia="Roboto"/>
         </w:rPr>
-        <w:t>IPP stocks chemical process equipment from Pfaudler, De Dietrich, Alfa Laval, Westfalia and other original manufacturers, alongside complete plant lines.</w:t>
+        <w:t>IPP stocks chemical process equipment from Pfaudler, De Dietrich, Alfa Laval, Westfalia and other original manufacturers, alongside complete plant lines. Chemical buyers compare reactors, heat exchangers, centrifuges, dryers, filters, columns and tanks in one inventory. Our plant listings state capacity, technology and feedstock for each complete plant.</w:t>
       </w:r>
     </w:p>
     <w:p>
@@ -3298,7 +3726,7 @@
         <w:rPr>
           <w:rFonts w:ascii="Roboto" w:hAnsi="Roboto" w:eastAsia="Roboto"/>
         </w:rPr>
-        <w:t>IPP operates offices in 15 countries, including the United States, the United Kingdom, Germany, India and Brazil. IPP has served 160,000+ customers worldwide.</w:t>
+        <w:t>We operate offices in 15 countries, including the United States, the United Kingdom, Germany, India and Brazil. IPP has served 160,000+ customers worldwide. We arrange international shipping, or buyers arrange their own.</w:t>
       </w:r>
     </w:p>
     <w:p>
@@ -3325,7 +3753,7 @@
         <w:rPr>
           <w:rFonts w:ascii="Roboto" w:hAnsi="Roboto" w:eastAsia="Roboto"/>
         </w:rPr>
-        <w:t>IPP sources equipment from operating plants with known history. IPP supplies the records available for each stock number.</w:t>
+        <w:t>IPP sources equipment from operating plants with known history. We supply the records available for each stock number. Buyers review photographs, drawings and inspection records before purchase.</w:t>
       </w:r>
     </w:p>
     <w:p>
@@ -3352,7 +3780,7 @@
         <w:rPr>
           <w:rFonts w:ascii="Roboto" w:hAnsi="Roboto" w:eastAsia="Roboto"/>
         </w:rPr>
-        <w:t>Purchasing used chemical process equipment from IPP can save up to 50% of capital and 90% of lead time versus buying new. The exact savings depend on manufacturer, capacity, material of construction, and condition.</w:t>
+        <w:t>Purchasing used chemical process equipment from IPP can save up to 50% of capital and 90% of lead time versus buying new. The exact savings depend on manufacturer, capacity, material of construction, and condition. We provide a detailed quote for each stock number on request.</w:t>
       </w:r>
     </w:p>
     <w:p>
@@ -3413,41 +3841,151 @@
         <w:rPr>
           <w:rFonts w:ascii="Roboto" w:hAnsi="Roboto" w:eastAsia="Roboto"/>
         </w:rPr>
-        <w:t>IPP publishes video interviews in which customers describe working with its team. The series features customers from across IPP’s process-industry network.</w:t>
-      </w:r>
-    </w:p>
-    <w:p>
-      <w:r>
-        <w:rPr>
-          <w:rFonts w:ascii="Roboto" w:hAnsi="Roboto" w:eastAsia="Roboto"/>
-        </w:rPr>
-        <w:t>Watch IPP customer stories on YouTube ↗</w:t>
-      </w:r>
-    </w:p>
-    <w:p>
-      <w:r>
-        <w:rPr>
-          <w:rFonts w:ascii="Roboto" w:hAnsi="Roboto" w:eastAsia="Roboto"/>
-        </w:rPr>
-        <w:t>▶</w:t>
-      </w:r>
-      <w:r>
-        <w:rPr>
-          <w:rFonts w:ascii="Roboto" w:hAnsi="Roboto" w:eastAsia="Roboto"/>
-        </w:rPr>
-        <w:t>In their words.</w:t>
-      </w:r>
-      <w:r>
-        <w:rPr>
-          <w:rFonts w:ascii="Roboto" w:hAnsi="Roboto" w:eastAsia="Roboto"/>
-        </w:rPr>
-        <w:t xml:space="preserve">IPP customer stories </w:t>
-      </w:r>
-      <w:r>
-        <w:rPr>
-          <w:rFonts w:ascii="Roboto" w:hAnsi="Roboto" w:eastAsia="Roboto"/>
-        </w:rPr>
-        <w:t>↗</w:t>
+        <w:t>Chemical manufacturers describe working with IPP in four video interviews recorded at the SOCMA 2024 show in Nashville. Customers from Seatex, Hoyer Global, Chemicals Incorporated and ChemDesign Products speak about IPP’s customer commitment, communication and long-term business relationships. We publish the full interviews in our Customer Testimonials playlist.</w:t>
+      </w:r>
+    </w:p>
+    <w:p>
+      <w:r>
+        <w:rPr>
+          <w:rFonts w:ascii="Roboto" w:hAnsi="Roboto" w:eastAsia="Roboto"/>
+        </w:rPr>
+        <w:t>Watch the Customer Testimonials playlist ↗</w:t>
+      </w:r>
+    </w:p>
+    <w:p>
+      <w:pPr>
+        <w:pStyle w:val="ListBullet"/>
+      </w:pPr>
+      <w:hyperlink r:id="rId21">
+        <w:r>
+          <w:rPr>
+            <w:rFonts w:ascii="Roboto" w:hAnsi="Roboto"/>
+            <w:color w:val="0563C1"/>
+            <w:u w:val="single"/>
+          </w:rPr>
+          <w:t xml:space="preserve">▶</w:t>
+        </w:r>
+      </w:hyperlink>
+      <w:r>
+        <w:rPr>
+          <w:rFonts w:ascii="Roboto" w:hAnsi="Roboto" w:eastAsia="Roboto"/>
+        </w:rPr>
+        <w:t>“The International Process Plants team is outstanding! They understand my business”</w:t>
+      </w:r>
+      <w:r>
+        <w:rPr>
+          <w:rFonts w:ascii="Roboto" w:hAnsi="Roboto" w:eastAsia="Roboto"/>
+          <w:b/>
+        </w:rPr>
+        <w:t>Chuck Castley</w:t>
+      </w:r>
+      <w:r>
+        <w:rPr>
+          <w:rFonts w:ascii="Roboto" w:hAnsi="Roboto" w:eastAsia="Roboto"/>
+        </w:rPr>
+        <w:t>Commercial vice president, Chemicals Incorporated, Baytown, Texas</w:t>
+      </w:r>
+    </w:p>
+    <w:p>
+      <w:pPr>
+        <w:pStyle w:val="ListBullet"/>
+      </w:pPr>
+      <w:hyperlink r:id="rId22">
+        <w:r>
+          <w:rPr>
+            <w:rFonts w:ascii="Roboto" w:hAnsi="Roboto"/>
+            <w:color w:val="0563C1"/>
+            <w:u w:val="single"/>
+          </w:rPr>
+          <w:t xml:space="preserve">▶</w:t>
+        </w:r>
+      </w:hyperlink>
+      <w:r>
+        <w:rPr>
+          <w:rFonts w:ascii="Roboto" w:hAnsi="Roboto" w:eastAsia="Roboto"/>
+        </w:rPr>
+        <w:t>“If somebody asked me to rate IPP 1-10, I’d give them a 10 every time!”</w:t>
+      </w:r>
+      <w:r>
+        <w:rPr>
+          <w:rFonts w:ascii="Roboto" w:hAnsi="Roboto" w:eastAsia="Roboto"/>
+          <w:b/>
+        </w:rPr>
+        <w:t>Joel Salzman</w:t>
+      </w:r>
+      <w:r>
+        <w:rPr>
+          <w:rFonts w:ascii="Roboto" w:hAnsi="Roboto" w:eastAsia="Roboto"/>
+        </w:rPr>
+        <w:t>VP of Operations, ChemDesign Products, Inc., Marinette, Wisconsin</w:t>
+      </w:r>
+    </w:p>
+    <w:p>
+      <w:pPr>
+        <w:pStyle w:val="ListBullet"/>
+      </w:pPr>
+      <w:hyperlink r:id="rId23">
+        <w:r>
+          <w:rPr>
+            <w:rFonts w:ascii="Roboto" w:hAnsi="Roboto"/>
+            <w:color w:val="0563C1"/>
+            <w:u w:val="single"/>
+          </w:rPr>
+          <w:t xml:space="preserve">▶</w:t>
+        </w:r>
+      </w:hyperlink>
+      <w:r>
+        <w:rPr>
+          <w:rFonts w:ascii="Roboto" w:hAnsi="Roboto" w:eastAsia="Roboto"/>
+        </w:rPr>
+        <w:t>The power of partnership: A testimonial to International Process Plants’ customer commitment</w:t>
+      </w:r>
+      <w:r>
+        <w:rPr>
+          <w:rFonts w:ascii="Roboto" w:hAnsi="Roboto" w:eastAsia="Roboto"/>
+          <w:b/>
+        </w:rPr>
+        <w:t>Clay Pace</w:t>
+      </w:r>
+      <w:r>
+        <w:rPr>
+          <w:rFonts w:ascii="Roboto" w:hAnsi="Roboto" w:eastAsia="Roboto"/>
+        </w:rPr>
+        <w:t>President of Commercial &amp; Technology, Seatex, LLC, Houston</w:t>
+      </w:r>
+    </w:p>
+    <w:p>
+      <w:pPr>
+        <w:pStyle w:val="ListBullet"/>
+      </w:pPr>
+      <w:hyperlink r:id="rId24">
+        <w:r>
+          <w:rPr>
+            <w:rFonts w:ascii="Roboto" w:hAnsi="Roboto"/>
+            <w:color w:val="0563C1"/>
+            <w:u w:val="single"/>
+          </w:rPr>
+          <w:t xml:space="preserve">▶</w:t>
+        </w:r>
+      </w:hyperlink>
+      <w:r>
+        <w:rPr>
+          <w:rFonts w:ascii="Roboto" w:hAnsi="Roboto" w:eastAsia="Roboto"/>
+        </w:rPr>
+        <w:t>Communication and quick customer response are what sets IPP apart</w:t>
+      </w:r>
+      <w:r>
+        <w:rPr>
+          <w:rFonts w:ascii="Roboto" w:hAnsi="Roboto" w:eastAsia="Roboto"/>
+          <w:b/>
+        </w:rPr>
+        <w:t>Anna Nguyen</w:t>
+      </w:r>
+      <w:r>
+        <w:rPr>
+          <w:rFonts w:ascii="Roboto" w:hAnsi="Roboto" w:eastAsia="Roboto"/>
+        </w:rPr>
+        <w:t>Commercial Sales &amp; Operations Manager, Hoyer Global</w:t>
       </w:r>
     </w:p>
     <w:p>
@@ -3606,7 +4144,7 @@
         <w:rPr>
           <w:rFonts w:ascii="Roboto" w:hAnsi="Roboto" w:eastAsia="Roboto"/>
         </w:rPr>
-        <w:t>IPP buys complete chemical plants, process lines and individual surplus equipment from shutdown, idled and restructured facilities. Its team handles intact, mothballed and partially dismantled plant sites.</w:t>
+        <w:t>IPP buys complete chemical plants, process lines and individual surplus equipment from shutdown, idled and restructured facilities. Our team handles intact, mothballed and partially dismantled plant sites.</w:t>
       </w:r>
     </w:p>
     <w:p>
@@ -3651,7 +4189,7 @@
         <w:rPr>
           <w:rFonts w:ascii="Roboto" w:hAnsi="Roboto" w:eastAsia="Roboto"/>
         </w:rPr>
-        <w:t>Send the asset list, photographs, plant location, available technical documents and removal deadline. IPP’s forms to sell a plant or sell equipment collect each item.</w:t>
+        <w:t>Send the asset list, photographs, plant location, available technical documents and removal deadline. Our forms to sell a plant or sell equipment collect each item. Plant owners, asset managers and corporate teams use the same forms for a complete site or a single surplus unit.</w:t>
       </w:r>
     </w:p>
     <w:p>
@@ -3672,7 +4210,7 @@
         <w:rPr>
           <w:rFonts w:ascii="Roboto" w:hAnsi="Roboto" w:eastAsia="Roboto"/>
         </w:rPr>
-        <w:t>IPP reviews the information and inspects the plant site where needed. IPP then values the assets for an outright purchase or for marketing to its global buyer network.</w:t>
+        <w:t>We review the information and inspect the plant site where needed. IPP then values the assets for an outright purchase or for marketing to its global buyer network. We evaluate equipment too large, too specialized or too site-bound for traditional resellers, such as specialty alloy reactors and custom drying and distillation systems.</w:t>
       </w:r>
     </w:p>
     <w:p>
@@ -3693,7 +4231,7 @@
         <w:rPr>
           <w:rFonts w:ascii="Roboto" w:hAnsi="Roboto" w:eastAsia="Roboto"/>
         </w:rPr>
-        <w:t>IPP buys equipment as-is, where-is, as a principal buyer rather than a broker. A complete plant sale can include the land, buildings, equipment and intellectual property.</w:t>
+        <w:t>IPP buys equipment as-is, where-is, as a principal buyer rather than a broker. A complete plant sale can include the land, buildings, equipment and intellectual property. We offer flexible purchase structures for a warehouse clearance, a plant closure or a portfolio sale.</w:t>
       </w:r>
     </w:p>
     <w:p>
@@ -3714,7 +4252,7 @@
         <w:rPr>
           <w:rFonts w:ascii="Roboto" w:hAnsi="Roboto" w:eastAsia="Roboto"/>
         </w:rPr>
-        <w:t>IPP coordinates plant decommissioning, dismantling, packaging, freight and export. IPP’s team works with the owner’s EHS team on permit closure, emissions compliance and utility shutoffs.</w:t>
+        <w:t>IPP coordinates plant decommissioning, dismantling, packaging, freight and export. Our team works with the owner’s EHS team on permit closure, emissions compliance and utility shutoffs. We prepare the plant site for its next use, either returning it to the owner or transferring it to a new operator.</w:t>
       </w:r>
     </w:p>
     <w:p>
@@ -3733,7 +4271,23 @@
         <w:rPr>
           <w:rFonts w:ascii="Roboto" w:hAnsi="Roboto" w:eastAsia="Roboto"/>
         </w:rPr>
-        <w:t>IPP buys and supplies chemical plants and process equipment across these sectors.</w:t>
+        <w:t>IPP buys and supplies chemical plants and process equipment across these sectors. Our plant listings include formaldehyde, nitric acid, ammonium nitrate, methanol and sodium metabisulfite plants.</w:t>
+      </w:r>
+    </w:p>
+    <w:p>
+      <w:r>
+        <w:rPr>
+          <w:rFonts w:ascii="Roboto" w:hAnsi="Roboto" w:eastAsia="Roboto"/>
+        </w:rPr>
+        <w:t>Producers in these sectors also sell idle plants and surplus equipment to IPP.</w:t>
+      </w:r>
+    </w:p>
+    <w:p>
+      <w:r>
+        <w:rPr>
+          <w:rFonts w:ascii="Roboto" w:hAnsi="Roboto" w:eastAsia="Roboto"/>
+        </w:rPr>
+        <w:t>Chemical sectors IPP serves include:</w:t>
       </w:r>
     </w:p>
     <w:p>
@@ -3810,31 +4364,23 @@
         <w:rPr>
           <w:rFonts w:ascii="Montserrat" w:hAnsi="Montserrat" w:eastAsia="Outfit"/>
         </w:rPr>
-        <w:t>Global inventory. Local support.</w:t>
-      </w:r>
-    </w:p>
-    <w:p>
-      <w:r>
-        <w:rPr>
-          <w:rFonts w:ascii="Roboto" w:hAnsi="Roboto" w:eastAsia="Roboto"/>
-        </w:rPr>
-        <w:t>IPP stores equipment at company-owned warehouses and workshops in South Carolina, England and Germany.</w:t>
-      </w:r>
-    </w:p>
-    <w:p>
-      <w:r>
-        <w:rPr>
-          <w:rFonts w:ascii="Roboto" w:hAnsi="Roboto" w:eastAsia="Roboto"/>
-        </w:rPr>
-        <w:t>Contact a global office ↗</w:t>
-      </w:r>
-    </w:p>
-    <w:p>
-      <w:r>
-        <w:rPr>
-          <w:rFonts w:ascii="Roboto" w:hAnsi="Roboto" w:eastAsia="Roboto"/>
-        </w:rPr>
-        <w:t>United States</w:t>
+        <w:t>Chemical plant projects and industry recognition</w:t>
+      </w:r>
+    </w:p>
+    <w:p>
+      <w:r>
+        <w:rPr>
+          <w:rFonts w:ascii="Roboto" w:hAnsi="Roboto" w:eastAsia="Roboto"/>
+        </w:rPr>
+        <w:t>Our chemical plant projects cover both sides of the market. Producers sell plants and sites through IPP, and buyers redeploy those assets in new production.</w:t>
+      </w:r>
+    </w:p>
+    <w:p>
+      <w:r>
+        <w:rPr>
+          <w:rFonts w:ascii="Roboto" w:hAnsi="Roboto" w:eastAsia="Roboto"/>
+        </w:rPr>
+        <w:t>BASF · May 2024</w:t>
       </w:r>
     </w:p>
     <w:p>
@@ -3845,125 +4391,6 @@
         <w:rPr>
           <w:rFonts w:ascii="Montserrat" w:hAnsi="Montserrat" w:eastAsia="Outfit"/>
         </w:rPr>
-        <w:t>Eastover, South Carolina</w:t>
-      </w:r>
-    </w:p>
-    <w:p>
-      <w:r>
-        <w:rPr>
-          <w:rFonts w:ascii="Roboto" w:hAnsi="Roboto" w:eastAsia="Roboto"/>
-        </w:rPr>
-        <w:t>2059 Congaree Road</w:t>
-      </w:r>
-      <w:r>
-        <w:br/>
-      </w:r>
-      <w:r>
-        <w:rPr>
-          <w:rFonts w:ascii="Roboto" w:hAnsi="Roboto" w:eastAsia="Roboto"/>
-        </w:rPr>
-        <w:t>Eastover, SC 29044</w:t>
-      </w:r>
-    </w:p>
-    <w:p>
-      <w:r>
-        <w:rPr>
-          <w:rFonts w:ascii="Roboto" w:hAnsi="Roboto" w:eastAsia="Roboto"/>
-        </w:rPr>
-        <w:t>United Kingdom</w:t>
-      </w:r>
-    </w:p>
-    <w:p>
-      <w:pPr>
-        <w:pStyle w:val="Heading3"/>
-      </w:pPr>
-      <w:r>
-        <w:rPr>
-          <w:rFonts w:ascii="Montserrat" w:hAnsi="Montserrat" w:eastAsia="Outfit"/>
-        </w:rPr>
-        <w:t>Billingham, England</w:t>
-      </w:r>
-    </w:p>
-    <w:p>
-      <w:r>
-        <w:rPr>
-          <w:rFonts w:ascii="Roboto" w:hAnsi="Roboto" w:eastAsia="Roboto"/>
-        </w:rPr>
-        <w:t>14 Haverton Hill Road</w:t>
-      </w:r>
-      <w:r>
-        <w:br/>
-      </w:r>
-      <w:r>
-        <w:rPr>
-          <w:rFonts w:ascii="Roboto" w:hAnsi="Roboto" w:eastAsia="Roboto"/>
-        </w:rPr>
-        <w:t>Billingham, TS23 1QA</w:t>
-      </w:r>
-    </w:p>
-    <w:p>
-      <w:r>
-        <w:rPr>
-          <w:rFonts w:ascii="Roboto" w:hAnsi="Roboto" w:eastAsia="Roboto"/>
-        </w:rPr>
-        <w:t>Germany</w:t>
-      </w:r>
-    </w:p>
-    <w:p>
-      <w:pPr>
-        <w:pStyle w:val="Heading3"/>
-      </w:pPr>
-      <w:r>
-        <w:rPr>
-          <w:rFonts w:ascii="Montserrat" w:hAnsi="Montserrat" w:eastAsia="Outfit"/>
-        </w:rPr>
-        <w:t>Bitterfeld-Wolfen</w:t>
-      </w:r>
-    </w:p>
-    <w:p>
-      <w:r>
-        <w:rPr>
-          <w:rFonts w:ascii="Roboto" w:hAnsi="Roboto" w:eastAsia="Roboto"/>
-        </w:rPr>
-        <w:t>Zörbiger Straße 56</w:t>
-      </w:r>
-      <w:r>
-        <w:br/>
-      </w:r>
-      <w:r>
-        <w:rPr>
-          <w:rFonts w:ascii="Roboto" w:hAnsi="Roboto" w:eastAsia="Roboto"/>
-        </w:rPr>
-        <w:t>06749 Bitterfeld-Wolfen</w:t>
-      </w:r>
-    </w:p>
-    <w:p>
-      <w:pPr>
-        <w:pStyle w:val="Heading2"/>
-      </w:pPr>
-      <w:r>
-        <w:rPr>
-          <w:rFonts w:ascii="Montserrat" w:hAnsi="Montserrat" w:eastAsia="Outfit"/>
-        </w:rPr>
-        <w:t>Chemical plant projects and industry recognition</w:t>
-      </w:r>
-    </w:p>
-    <w:p>
-      <w:r>
-        <w:rPr>
-          <w:rFonts w:ascii="Roboto" w:hAnsi="Roboto" w:eastAsia="Roboto"/>
-        </w:rPr>
-        <w:t>BASF · May 2024</w:t>
-      </w:r>
-    </w:p>
-    <w:p>
-      <w:pPr>
-        <w:pStyle w:val="Heading3"/>
-      </w:pPr>
-      <w:r>
-        <w:rPr>
-          <w:rFonts w:ascii="Montserrat" w:hAnsi="Montserrat" w:eastAsia="Outfit"/>
-        </w:rPr>
         <w:t>Marketing major chemical plants</w:t>
       </w:r>
     </w:p>
@@ -3972,7 +4399,7 @@
         <w:rPr>
           <w:rFonts w:ascii="Roboto" w:hAnsi="Roboto" w:eastAsia="Roboto"/>
         </w:rPr>
-        <w:t>IPP announced an agreement with BASF to market ammonia, methanol and melamine plants at Ludwigshafen, Germany.</w:t>
+        <w:t>IPP and BASF agreed in May 2024 to market the ammonia, methanol and melamine plants at BASF’s Verbund site in Ludwigshafen, Germany. The integrated assets produce 380,000 metric tons of ammonia, 165,000 metric tons of methanol and 51,000 metric tons of melamine a year. We offer the plants for relocation and sale to buyers seeking lower capex and faster project execution.</w:t>
       </w:r>
     </w:p>
     <w:p>
@@ -3984,7 +4411,7 @@
       </w:r>
     </w:p>
     <w:p>
-      <w:hyperlink r:id="rId21">
+      <w:hyperlink r:id="rId25">
         <w:r>
           <w:rPr>
             <w:rFonts w:ascii="Roboto" w:hAnsi="Roboto"/>
@@ -4019,7 +4446,7 @@
         <w:rPr>
           <w:rFonts w:ascii="Roboto" w:hAnsi="Roboto" w:eastAsia="Roboto"/>
         </w:rPr>
-        <w:t>IPP affiliate Humber Industrials announced an agreement to acquire Novartis UK’s Grimsby API manufacturing site and assets.</w:t>
+        <w:t>Humber Industrials, an IPP affiliate, agreed in January 2024 to purchase Novartis UK’s 170-acre API manufacturing site and assets in Grimsby. The site holds 90 reaction suites with 900 m³ (237,755 gal) of total capacity, 17 centrifuges, 26 dryer systems and 10 solvent recovery systems. Our Grimsby redevelopment project transitions the shuttered site into a viable future asset.</w:t>
       </w:r>
     </w:p>
     <w:p>
@@ -4031,7 +4458,7 @@
       </w:r>
     </w:p>
     <w:p>
-      <w:hyperlink r:id="rId22">
+      <w:hyperlink r:id="rId26">
         <w:r>
           <w:rPr>
             <w:rFonts w:ascii="Roboto" w:hAnsi="Roboto"/>
@@ -4066,7 +4493,7 @@
         <w:rPr>
           <w:rFonts w:ascii="Roboto" w:hAnsi="Roboto" w:eastAsia="Roboto"/>
         </w:rPr>
-        <w:t>IPP describes the acquisition, dismantling and relocation of a CDMO’s API process plant equipment to its Eastover facility.</w:t>
+        <w:t>IPP bought a U.S. API plant from a CDMO headquartered in Europe and dismantled it on an expedited schedule to meet the seller’s timeline. We moved 18 reactors, 20 tanks, four filter dryers, centrifuges, vacuum dryers and heat exchangers in Hastelloy, glass-lined steel, stainless steel and Karbate to our Eastover, South Carolina facility. The emptied building now serves as a warehouse.</w:t>
       </w:r>
     </w:p>
     <w:p>
@@ -4078,7 +4505,7 @@
       </w:r>
     </w:p>
     <w:p>
-      <w:hyperlink r:id="rId23">
+      <w:hyperlink r:id="rId27">
         <w:r>
           <w:rPr>
             <w:rFonts w:ascii="Roboto" w:hAnsi="Roboto"/>
@@ -4113,7 +4540,7 @@
         <w:rPr>
           <w:rFonts w:ascii="Roboto" w:hAnsi="Roboto" w:eastAsia="Roboto"/>
         </w:rPr>
-        <w:t>IPP holds ISN RAVS Plus verification for plant decommissioning. IPP enabled the transfer of a shuttered biobased chemicals plant in Minnesota to Nuol Green Chemistry, a deal SOCMA highlighted.</w:t>
+        <w:t>IPP holds ISN RAVS Plus verification for plant decommissioning. We have completed full-scale decommissions in Ohio, Alabama, Louisiana, the United Kingdom and Germany. Our team helped transfer a shuttered biobased chemicals plant in Minnesota to Nuol Green Chemistry, a deal SOCMA highlighted.</w:t>
       </w:r>
     </w:p>
     <w:p>
@@ -4125,7 +4552,7 @@
       </w:r>
     </w:p>
     <w:p>
-      <w:hyperlink r:id="rId24">
+      <w:hyperlink r:id="rId28">
         <w:r>
           <w:rPr>
             <w:rFonts w:ascii="Roboto" w:hAnsi="Roboto"/>
@@ -4137,113 +4564,64 @@
       </w:hyperlink>
     </w:p>
     <w:p>
-      <w:r>
-        <w:rPr>
-          <w:rFonts w:ascii="Roboto" w:hAnsi="Roboto" w:eastAsia="Roboto"/>
-          <w:b/>
-        </w:rPr>
-        <w:t>Site repurposing:</w:t>
-      </w:r>
-      <w:r>
-        <w:rPr>
-          <w:rFonts w:ascii="Roboto" w:hAnsi="Roboto" w:eastAsia="Roboto"/>
-        </w:rPr>
-        <w:t xml:space="preserve"> </w:t>
-      </w:r>
-      <w:hyperlink r:id="rId25">
+      <w:pPr>
+        <w:pStyle w:val="ListBullet"/>
+      </w:pPr>
+      <w:hyperlink r:id="rId29">
         <w:r>
           <w:rPr>
             <w:rFonts w:ascii="Roboto" w:hAnsi="Roboto"/>
             <w:color w:val="0563C1"/>
             <w:u w:val="single"/>
           </w:rPr>
-          <w:t xml:space="preserve">SOCMA’s coverage of IPP’s GEO Specialty Chemicals site acquisition</w:t>
+          <w:t xml:space="preserve">SOCMAGEO Specialty Chemicals site acquisition</w:t>
         </w:r>
       </w:hyperlink>
-      <w:r>
-        <w:rPr>
-          <w:rFonts w:ascii="Roboto" w:hAnsi="Roboto" w:eastAsia="Roboto"/>
-        </w:rPr>
-        <w:t>.</w:t>
-      </w:r>
-    </w:p>
-    <w:p>
-      <w:r>
-        <w:rPr>
-          <w:rFonts w:ascii="Roboto" w:hAnsi="Roboto" w:eastAsia="Roboto"/>
-          <w:b/>
-        </w:rPr>
-        <w:t>Decommissioning:</w:t>
-      </w:r>
-      <w:r>
-        <w:rPr>
-          <w:rFonts w:ascii="Roboto" w:hAnsi="Roboto" w:eastAsia="Roboto"/>
-        </w:rPr>
-        <w:t xml:space="preserve"> </w:t>
-      </w:r>
-      <w:hyperlink r:id="rId26">
+    </w:p>
+    <w:p>
+      <w:pPr>
+        <w:pStyle w:val="ListBullet"/>
+      </w:pPr>
+      <w:hyperlink r:id="rId30">
         <w:r>
           <w:rPr>
             <w:rFonts w:ascii="Roboto" w:hAnsi="Roboto"/>
             <w:color w:val="0563C1"/>
             <w:u w:val="single"/>
           </w:rPr>
-          <w:t xml:space="preserve">IPP’s August 2024 announcement of its ISN RAVS Plus designation</w:t>
+          <w:t xml:space="preserve">ISN RAVS PlusDecommissioning designation, August 2024</w:t>
         </w:r>
       </w:hyperlink>
-      <w:r>
-        <w:rPr>
-          <w:rFonts w:ascii="Roboto" w:hAnsi="Roboto" w:eastAsia="Roboto"/>
-        </w:rPr>
-        <w:t>.</w:t>
-      </w:r>
-    </w:p>
-    <w:p>
-      <w:r>
-        <w:rPr>
-          <w:rFonts w:ascii="Roboto" w:hAnsi="Roboto" w:eastAsia="Roboto"/>
-          <w:b/>
-        </w:rPr>
-        <w:t>Industry perspective, Ross Gale:</w:t>
-      </w:r>
-      <w:r>
-        <w:rPr>
-          <w:rFonts w:ascii="Roboto" w:hAnsi="Roboto" w:eastAsia="Roboto"/>
-        </w:rPr>
-        <w:t xml:space="preserve"> </w:t>
-      </w:r>
-      <w:hyperlink r:id="rId27">
+    </w:p>
+    <w:p>
+      <w:pPr>
+        <w:pStyle w:val="ListBullet"/>
+      </w:pPr>
+      <w:hyperlink r:id="rId31">
         <w:r>
           <w:rPr>
             <w:rFonts w:ascii="Roboto" w:hAnsi="Roboto"/>
             <w:color w:val="0563C1"/>
             <w:u w:val="single"/>
           </w:rPr>
-          <w:t xml:space="preserve">Chemical Processing’s coverage of IPP’s chemical plant work</w:t>
+          <w:t xml:space="preserve">Chemical ProcessingRoss Gale on IPP’s chemical plant work</w:t>
         </w:r>
       </w:hyperlink>
-      <w:r>
-        <w:rPr>
-          <w:rFonts w:ascii="Roboto" w:hAnsi="Roboto" w:eastAsia="Roboto"/>
-        </w:rPr>
-        <w:t xml:space="preserve"> and </w:t>
-      </w:r>
-      <w:hyperlink r:id="rId28">
+    </w:p>
+    <w:p>
+      <w:pPr>
+        <w:pStyle w:val="ListBullet"/>
+      </w:pPr>
+      <w:hyperlink r:id="rId32">
         <w:r>
           <w:rPr>
             <w:rFonts w:ascii="Roboto" w:hAnsi="Roboto"/>
             <w:color w:val="0563C1"/>
             <w:u w:val="single"/>
           </w:rPr>
-          <w:t xml:space="preserve">Chemical Engineering on previously owned process equipment</w:t>
+          <w:t xml:space="preserve">Chemical EngineeringRoss Gale, December 2024</w:t>
         </w:r>
       </w:hyperlink>
-      <w:r>
-        <w:rPr>
-          <w:rFonts w:ascii="Roboto" w:hAnsi="Roboto" w:eastAsia="Roboto"/>
-        </w:rPr>
-        <w:t>.</w:t>
-      </w:r>
     </w:p>
     <w:p>
       <w:pPr>
@@ -4280,15 +4658,15 @@
         <w:rPr>
           <w:rFonts w:ascii="Roboto" w:hAnsi="Roboto" w:eastAsia="Roboto"/>
         </w:rPr>
-        <w:t>IPP operates offices in 15 countries: Brazil, Canada, China, the Czech Republic, France, Germany, India, Italy, Mexico, Pakistan, Portugal, Romania, Turkey, the United Kingdom and the United States. IPP has served 160,000+ customers worldwide.</w:t>
-      </w:r>
-    </w:p>
-    <w:p>
-      <w:r>
-        <w:rPr>
-          <w:rFonts w:ascii="Roboto" w:hAnsi="Roboto" w:eastAsia="Roboto"/>
-        </w:rPr>
-        <w:t>IPP’s chemical inventory covers complete plants, process lines and individual equipment such as reactors, heat exchangers, centrifuges, dryers, filters, distillation columns and tanks. IPP sources these assets from multinational chemical producers, toll manufacturers and decommissioned or restructured facilities.</w:t>
+        <w:t>We operate offices in 15 countries: Brazil, Canada, China, the Czech Republic, France, Germany, India, Italy, Mexico, Pakistan, Portugal, Romania, Turkey, the United Kingdom and the United States. IPP has served 160,000+ customers worldwide.</w:t>
+      </w:r>
+    </w:p>
+    <w:p>
+      <w:r>
+        <w:rPr>
+          <w:rFonts w:ascii="Roboto" w:hAnsi="Roboto" w:eastAsia="Roboto"/>
+        </w:rPr>
+        <w:t>Our chemical inventory covers complete plants, process lines and individual equipment such as reactors, heat exchangers, centrifuges, dryers, filters, distillation columns and tanks. IPP sources these assets from multinational chemical producers, toll manufacturers and decommissioned or restructured facilities.</w:t>
       </w:r>
     </w:p>
     <w:p>
@@ -4314,7 +4692,7 @@
         </w:rPr>
         <w:t>Ross Gale, IPP’s vice president, wrote “</w:t>
       </w:r>
-      <w:hyperlink r:id="rId28">
+      <w:hyperlink r:id="rId32">
         <w:r>
           <w:rPr>
             <w:rFonts w:ascii="Roboto" w:hAnsi="Roboto"/>
@@ -4355,7 +4733,7 @@
         <w:rPr>
           <w:rFonts w:ascii="Roboto" w:hAnsi="Roboto" w:eastAsia="Roboto"/>
         </w:rPr>
-        <w:t>IPP answers questions from buyers of second-hand chemical equipment and from sellers of used chemical machinery. Discuss a specific stock number, plant package or surplus asset with IPP.</w:t>
+        <w:t>We answer questions from buyers of second-hand chemical equipment and from sellers of used chemical machinery. Discuss a specific stock number, plant package or surplus asset with IPP.</w:t>
       </w:r>
     </w:p>
     <w:p>
@@ -4384,7 +4762,7 @@
         </w:rPr>
         <w:t xml:space="preserve">Yes. In addition to individual equipment, we sell </w:t>
       </w:r>
-      <w:hyperlink r:id="rId29">
+      <w:hyperlink r:id="rId33">
         <w:r>
           <w:rPr>
             <w:rFonts w:ascii="Roboto" w:hAnsi="Roboto"/>
@@ -4473,7 +4851,7 @@
         </w:rPr>
         <w:t xml:space="preserve">Chemical process plant equipment is the set of reactors, heat exchangers, centrifuges, dryers, filters, columns and tanks that converts raw materials into chemical products. Read IPP’s </w:t>
       </w:r>
-      <w:hyperlink r:id="rId30">
+      <w:hyperlink r:id="rId34">
         <w:r>
           <w:rPr>
             <w:rFonts w:ascii="Roboto" w:hAnsi="Roboto"/>
@@ -4506,7 +4884,7 @@
         <w:rPr>
           <w:rFonts w:ascii="Roboto" w:hAnsi="Roboto" w:eastAsia="Roboto"/>
         </w:rPr>
-        <w:t xml:space="preserve">IPP quotes each plant and unit individually. </w:t>
+        <w:t xml:space="preserve">We quote each plant and unit individually. </w:t>
       </w:r>
       <w:hyperlink r:id="rId11">
         <w:r>
@@ -4541,7 +4919,7 @@
         <w:rPr>
           <w:rFonts w:ascii="Roboto" w:hAnsi="Roboto" w:eastAsia="Roboto"/>
         </w:rPr>
-        <w:t>Yes. IPP coordinates packaging, crating, freight and delivery, or buyers can arrange their own shipping. Confirm the asset location, loading requirements and destination when you request a quotation.</w:t>
+        <w:t>Yes. We coordinate packaging, crating, freight and delivery, or buyers can arrange their own shipping. Confirm the asset location, loading requirements and destination when you request a quotation.</w:t>
       </w:r>
     </w:p>
     <w:p>
@@ -4560,7 +4938,7 @@
         <w:rPr>
           <w:rFonts w:ascii="Roboto" w:hAnsi="Roboto" w:eastAsia="Roboto"/>
         </w:rPr>
-        <w:t>Documentation varies by asset. IPP shares the equipment lists, drawings, process descriptions and inspection records available for each plant or stock number.</w:t>
+        <w:t>Documentation varies by asset. We share the equipment lists, drawings, process descriptions and inspection records available for each plant or stock number.</w:t>
       </w:r>
     </w:p>
     <w:p>
@@ -4665,7 +5043,7 @@
         <w:rPr>
           <w:rFonts w:ascii="Roboto" w:hAnsi="Roboto" w:eastAsia="Roboto"/>
         </w:rPr>
-        <w:t xml:space="preserve">Yes. IPP buys complete plants, process lines and individual equipment from shutdown, idled and restructured sites. Start with the </w:t>
+        <w:t xml:space="preserve">Yes. We buy complete plants, process lines and individual equipment from shutdown, idled and restructured sites. Start with the </w:t>
       </w:r>
       <w:hyperlink r:id="rId9">
         <w:r>
@@ -4725,7 +5103,7 @@
             <w:color w:val="0563C1"/>
             <w:u w:val="single"/>
           </w:rPr>
-          <w:t xml:space="preserve">IPP’s team</w:t>
+          <w:t xml:space="preserve">Our team</w:t>
         </w:r>
       </w:hyperlink>
       <w:r>
@@ -4751,9 +5129,9 @@
         <w:rPr>
           <w:rFonts w:ascii="Roboto" w:hAnsi="Roboto" w:eastAsia="Roboto"/>
         </w:rPr>
-        <w:t xml:space="preserve">Yes. IPP purchases complete plant sites, including the land, buildings, equipment and intellectual property. IPP also buys individual process units and equipment systems within a site. </w:t>
-      </w:r>
-      <w:hyperlink r:id="rId31">
+        <w:t xml:space="preserve">Yes. IPP purchases complete plant sites, including the land, buildings, equipment and intellectual property. We also buy individual process units and equipment systems within a site. </w:t>
+      </w:r>
+      <w:hyperlink r:id="rId35">
         <w:r>
           <w:rPr>
             <w:rFonts w:ascii="Roboto" w:hAnsi="Roboto"/>
@@ -4786,7 +5164,7 @@
         <w:rPr>
           <w:rFonts w:ascii="Roboto" w:hAnsi="Roboto" w:eastAsia="Roboto"/>
         </w:rPr>
-        <w:t xml:space="preserve">Yes, in some acquisitions. IPP buys sites with known contamination and assumes site cleanup and regulatory compliance obligations as the buyer. IPP’s remediation partners work with local environmental authorities on each site. </w:t>
+        <w:t xml:space="preserve">Yes, in some acquisitions. IPP buys sites with known contamination and assumes site cleanup and regulatory compliance obligations as the buyer. Our remediation partners work with local environmental authorities on each site. </w:t>
       </w:r>
       <w:hyperlink r:id="rId9">
         <w:r>
@@ -4821,7 +5199,7 @@
         <w:rPr>
           <w:rFonts w:ascii="Roboto" w:hAnsi="Roboto" w:eastAsia="Roboto"/>
         </w:rPr>
-        <w:t>The purchase agreement defines the outcome. A sale can cover equipment for removal or the entire site, and IPP’s published projects include equipment relocation and site repurposing.</w:t>
+        <w:t>The purchase agreement defines the outcome. A sale can cover equipment for removal or the entire site, and our published projects include equipment relocation and site repurposing.</w:t>
       </w:r>
     </w:p>
     <w:p>
@@ -4868,147 +5246,6 @@
           <w:rFonts w:ascii="Roboto" w:hAnsi="Roboto" w:eastAsia="Roboto"/>
         </w:rPr>
         <w:t>The reactors, heat exchangers, separators and dryers inside a chemical process plant.</w:t>
-      </w:r>
-    </w:p>
-    <w:p>
-      <w:r>
-        <w:rPr>
-          <w:rFonts w:ascii="Roboto" w:hAnsi="Roboto" w:eastAsia="Roboto"/>
-        </w:rPr>
-        <w:t>Read article ↗</w:t>
-      </w:r>
-    </w:p>
-    <w:p>
-      <w:hyperlink r:id="rId30">
-        <w:r>
-          <w:rPr>
-            <w:rFonts w:ascii="Roboto" w:hAnsi="Roboto"/>
-            <w:color w:val="0563C1"/>
-            <w:u w:val="single"/>
-          </w:rPr>
-          <w:t xml:space="preserve">Source / details</w:t>
-        </w:r>
-      </w:hyperlink>
-    </w:p>
-    <w:p>
-      <w:r>
-        <w:rPr>
-          <w:rFonts w:ascii="Roboto" w:hAnsi="Roboto" w:eastAsia="Roboto"/>
-        </w:rPr>
-        <w:t>Guide</w:t>
-      </w:r>
-    </w:p>
-    <w:p>
-      <w:pPr>
-        <w:pStyle w:val="Heading4"/>
-      </w:pPr>
-      <w:r>
-        <w:rPr>
-          <w:rFonts w:ascii="Montserrat" w:hAnsi="Montserrat" w:eastAsia="Outfit"/>
-        </w:rPr>
-        <w:t>What is an industrial plant? Types of process plants</w:t>
-      </w:r>
-    </w:p>
-    <w:p>
-      <w:r>
-        <w:rPr>
-          <w:rFonts w:ascii="Roboto" w:hAnsi="Roboto" w:eastAsia="Roboto"/>
-        </w:rPr>
-        <w:t>How industrial and process plants are classified by product and process.</w:t>
-      </w:r>
-    </w:p>
-    <w:p>
-      <w:r>
-        <w:rPr>
-          <w:rFonts w:ascii="Roboto" w:hAnsi="Roboto" w:eastAsia="Roboto"/>
-        </w:rPr>
-        <w:t>Read article ↗</w:t>
-      </w:r>
-    </w:p>
-    <w:p>
-      <w:hyperlink r:id="rId32">
-        <w:r>
-          <w:rPr>
-            <w:rFonts w:ascii="Roboto" w:hAnsi="Roboto"/>
-            <w:color w:val="0563C1"/>
-            <w:u w:val="single"/>
-          </w:rPr>
-          <w:t xml:space="preserve">Source / details</w:t>
-        </w:r>
-      </w:hyperlink>
-    </w:p>
-    <w:p>
-      <w:r>
-        <w:rPr>
-          <w:rFonts w:ascii="Roboto" w:hAnsi="Roboto" w:eastAsia="Roboto"/>
-        </w:rPr>
-        <w:t>Guide</w:t>
-      </w:r>
-    </w:p>
-    <w:p>
-      <w:pPr>
-        <w:pStyle w:val="Heading4"/>
-      </w:pPr>
-      <w:r>
-        <w:rPr>
-          <w:rFonts w:ascii="Montserrat" w:hAnsi="Montserrat" w:eastAsia="Outfit"/>
-        </w:rPr>
-        <w:t>What is a glass-lined reactor?</w:t>
-      </w:r>
-    </w:p>
-    <w:p>
-      <w:r>
-        <w:rPr>
-          <w:rFonts w:ascii="Roboto" w:hAnsi="Roboto" w:eastAsia="Roboto"/>
-        </w:rPr>
-        <w:t>How a glass lining protects reactors in corrosive chemical and pharmaceutical service.</w:t>
-      </w:r>
-    </w:p>
-    <w:p>
-      <w:r>
-        <w:rPr>
-          <w:rFonts w:ascii="Roboto" w:hAnsi="Roboto" w:eastAsia="Roboto"/>
-        </w:rPr>
-        <w:t>Read article ↗</w:t>
-      </w:r>
-    </w:p>
-    <w:p>
-      <w:hyperlink r:id="rId33">
-        <w:r>
-          <w:rPr>
-            <w:rFonts w:ascii="Roboto" w:hAnsi="Roboto"/>
-            <w:color w:val="0563C1"/>
-            <w:u w:val="single"/>
-          </w:rPr>
-          <w:t xml:space="preserve">Source / details</w:t>
-        </w:r>
-      </w:hyperlink>
-    </w:p>
-    <w:p>
-      <w:r>
-        <w:rPr>
-          <w:rFonts w:ascii="Roboto" w:hAnsi="Roboto" w:eastAsia="Roboto"/>
-        </w:rPr>
-        <w:t>Guide</w:t>
-      </w:r>
-    </w:p>
-    <w:p>
-      <w:pPr>
-        <w:pStyle w:val="Heading4"/>
-      </w:pPr>
-      <w:r>
-        <w:rPr>
-          <w:rFonts w:ascii="Montserrat" w:hAnsi="Montserrat" w:eastAsia="Outfit"/>
-        </w:rPr>
-        <w:t>What is a chemical reactor?</w:t>
-      </w:r>
-    </w:p>
-    <w:p>
-      <w:r>
-        <w:rPr>
-          <w:rFonts w:ascii="Roboto" w:hAnsi="Roboto" w:eastAsia="Roboto"/>
-        </w:rPr>
-        <w:t>How chemical reactors work, with the main reactor types.</w:t>
       </w:r>
     </w:p>
     <w:p>
@@ -5047,15 +5284,15 @@
         <w:rPr>
           <w:rFonts w:ascii="Montserrat" w:hAnsi="Montserrat" w:eastAsia="Outfit"/>
         </w:rPr>
-        <w:t>What is petrochemical process equipment?</w:t>
-      </w:r>
-    </w:p>
-    <w:p>
-      <w:r>
-        <w:rPr>
-          <w:rFonts w:ascii="Roboto" w:hAnsi="Roboto" w:eastAsia="Roboto"/>
-        </w:rPr>
-        <w:t>The equipment that converts oil and gas feedstocks into petrochemicals.</w:t>
+        <w:t>What is an industrial plant? Types of process plants</w:t>
+      </w:r>
+    </w:p>
+    <w:p>
+      <w:r>
+        <w:rPr>
+          <w:rFonts w:ascii="Roboto" w:hAnsi="Roboto" w:eastAsia="Roboto"/>
+        </w:rPr>
+        <w:t>How industrial and process plants are classified by product and process.</w:t>
       </w:r>
     </w:p>
     <w:p>
@@ -5067,7 +5304,7 @@
       </w:r>
     </w:p>
     <w:p>
-      <w:hyperlink r:id="rId35">
+      <w:hyperlink r:id="rId36">
         <w:r>
           <w:rPr>
             <w:rFonts w:ascii="Roboto" w:hAnsi="Roboto"/>
@@ -5083,7 +5320,7 @@
         <w:rPr>
           <w:rFonts w:ascii="Roboto" w:hAnsi="Roboto" w:eastAsia="Roboto"/>
         </w:rPr>
-        <w:t>For sellers</w:t>
+        <w:t>Guide</w:t>
       </w:r>
     </w:p>
     <w:p>
@@ -5094,15 +5331,15 @@
         <w:rPr>
           <w:rFonts w:ascii="Montserrat" w:hAnsi="Montserrat" w:eastAsia="Outfit"/>
         </w:rPr>
-        <w:t>Plant decommissioning with IPP</w:t>
-      </w:r>
-    </w:p>
-    <w:p>
-      <w:r>
-        <w:rPr>
-          <w:rFonts w:ascii="Roboto" w:hAnsi="Roboto" w:eastAsia="Roboto"/>
-        </w:rPr>
-        <w:t>Why plant owners choose IPP for decommissioning and dismantling.</w:t>
+        <w:t>What is a glass-lined reactor?</w:t>
+      </w:r>
+    </w:p>
+    <w:p>
+      <w:r>
+        <w:rPr>
+          <w:rFonts w:ascii="Roboto" w:hAnsi="Roboto" w:eastAsia="Roboto"/>
+        </w:rPr>
+        <w:t>How a glass lining protects reactors in corrosive chemical and pharmaceutical service.</w:t>
       </w:r>
     </w:p>
     <w:p>
@@ -5114,7 +5351,7 @@
       </w:r>
     </w:p>
     <w:p>
-      <w:hyperlink r:id="rId24">
+      <w:hyperlink r:id="rId37">
         <w:r>
           <w:rPr>
             <w:rFonts w:ascii="Roboto" w:hAnsi="Roboto"/>
@@ -5126,6 +5363,147 @@
       </w:hyperlink>
     </w:p>
     <w:p>
+      <w:r>
+        <w:rPr>
+          <w:rFonts w:ascii="Roboto" w:hAnsi="Roboto" w:eastAsia="Roboto"/>
+        </w:rPr>
+        <w:t>Guide</w:t>
+      </w:r>
+    </w:p>
+    <w:p>
+      <w:pPr>
+        <w:pStyle w:val="Heading4"/>
+      </w:pPr>
+      <w:r>
+        <w:rPr>
+          <w:rFonts w:ascii="Montserrat" w:hAnsi="Montserrat" w:eastAsia="Outfit"/>
+        </w:rPr>
+        <w:t>What is a chemical reactor?</w:t>
+      </w:r>
+    </w:p>
+    <w:p>
+      <w:r>
+        <w:rPr>
+          <w:rFonts w:ascii="Roboto" w:hAnsi="Roboto" w:eastAsia="Roboto"/>
+        </w:rPr>
+        <w:t>How chemical reactors work, with the main reactor types.</w:t>
+      </w:r>
+    </w:p>
+    <w:p>
+      <w:r>
+        <w:rPr>
+          <w:rFonts w:ascii="Roboto" w:hAnsi="Roboto" w:eastAsia="Roboto"/>
+        </w:rPr>
+        <w:t>Read article ↗</w:t>
+      </w:r>
+    </w:p>
+    <w:p>
+      <w:hyperlink r:id="rId38">
+        <w:r>
+          <w:rPr>
+            <w:rFonts w:ascii="Roboto" w:hAnsi="Roboto"/>
+            <w:color w:val="0563C1"/>
+            <w:u w:val="single"/>
+          </w:rPr>
+          <w:t xml:space="preserve">Source / details</w:t>
+        </w:r>
+      </w:hyperlink>
+    </w:p>
+    <w:p>
+      <w:r>
+        <w:rPr>
+          <w:rFonts w:ascii="Roboto" w:hAnsi="Roboto" w:eastAsia="Roboto"/>
+        </w:rPr>
+        <w:t>Guide</w:t>
+      </w:r>
+    </w:p>
+    <w:p>
+      <w:pPr>
+        <w:pStyle w:val="Heading4"/>
+      </w:pPr>
+      <w:r>
+        <w:rPr>
+          <w:rFonts w:ascii="Montserrat" w:hAnsi="Montserrat" w:eastAsia="Outfit"/>
+        </w:rPr>
+        <w:t>What is petrochemical process equipment?</w:t>
+      </w:r>
+    </w:p>
+    <w:p>
+      <w:r>
+        <w:rPr>
+          <w:rFonts w:ascii="Roboto" w:hAnsi="Roboto" w:eastAsia="Roboto"/>
+        </w:rPr>
+        <w:t>The equipment that converts oil and gas feedstocks into petrochemicals.</w:t>
+      </w:r>
+    </w:p>
+    <w:p>
+      <w:r>
+        <w:rPr>
+          <w:rFonts w:ascii="Roboto" w:hAnsi="Roboto" w:eastAsia="Roboto"/>
+        </w:rPr>
+        <w:t>Read article ↗</w:t>
+      </w:r>
+    </w:p>
+    <w:p>
+      <w:hyperlink r:id="rId39">
+        <w:r>
+          <w:rPr>
+            <w:rFonts w:ascii="Roboto" w:hAnsi="Roboto"/>
+            <w:color w:val="0563C1"/>
+            <w:u w:val="single"/>
+          </w:rPr>
+          <w:t xml:space="preserve">Source / details</w:t>
+        </w:r>
+      </w:hyperlink>
+    </w:p>
+    <w:p>
+      <w:r>
+        <w:rPr>
+          <w:rFonts w:ascii="Roboto" w:hAnsi="Roboto" w:eastAsia="Roboto"/>
+        </w:rPr>
+        <w:t>For sellers</w:t>
+      </w:r>
+    </w:p>
+    <w:p>
+      <w:pPr>
+        <w:pStyle w:val="Heading4"/>
+      </w:pPr>
+      <w:r>
+        <w:rPr>
+          <w:rFonts w:ascii="Montserrat" w:hAnsi="Montserrat" w:eastAsia="Outfit"/>
+        </w:rPr>
+        <w:t>Plant decommissioning with IPP</w:t>
+      </w:r>
+    </w:p>
+    <w:p>
+      <w:r>
+        <w:rPr>
+          <w:rFonts w:ascii="Roboto" w:hAnsi="Roboto" w:eastAsia="Roboto"/>
+        </w:rPr>
+        <w:t>Why plant owners choose IPP for decommissioning and dismantling.</w:t>
+      </w:r>
+    </w:p>
+    <w:p>
+      <w:r>
+        <w:rPr>
+          <w:rFonts w:ascii="Roboto" w:hAnsi="Roboto" w:eastAsia="Roboto"/>
+        </w:rPr>
+        <w:t>Read article ↗</w:t>
+      </w:r>
+    </w:p>
+    <w:p>
+      <w:hyperlink r:id="rId28">
+        <w:r>
+          <w:rPr>
+            <w:rFonts w:ascii="Roboto" w:hAnsi="Roboto"/>
+            <w:color w:val="0563C1"/>
+            <w:u w:val="single"/>
+          </w:rPr>
+          <w:t xml:space="preserve">Source / details</w:t>
+        </w:r>
+      </w:hyperlink>
+    </w:p>
+    <w:p>
       <w:pPr>
         <w:pStyle w:val="Heading2"/>
       </w:pPr>
@@ -5141,7 +5519,7 @@
         <w:rPr>
           <w:rFonts w:ascii="Roboto" w:hAnsi="Roboto" w:eastAsia="Roboto"/>
         </w:rPr>
-        <w:t>Buyers send the process, capacity and destination. IPP’s sourcing team searches its inventory and the global market for candidate plants and equipment.</w:t>
+        <w:t>Buyers send the process, capacity and destination. Our sourcing team searches our inventory and the global market for candidate plants and equipment.</w:t>
       </w:r>
     </w:p>
     <w:p>
@@ -5174,7 +5552,7 @@
         </w:rPr>
         <w:t xml:space="preserve"> · </w:t>
       </w:r>
-      <w:hyperlink r:id="rId36">
+      <w:hyperlink r:id="rId40">
         <w:r>
           <w:rPr>
             <w:rFonts w:ascii="Roboto" w:hAnsi="Roboto"/>

</xml_diff>

<commit_message>
Chemical page: equipment types in the reference service-section format
- Centered question heading, vertical tabs for the seven equipment types and one full panel per type, following the reference service section.
- Each panel: preserved original sentence, two-sentence context opener (what IPP supplies, to which plants, from which makers), lead-in, descriptive items, and a closing paragraph with listing fields, leading materials, IMS range and pricing factors with the quote and inspection offer (IPP publishes no prices). 148 to 206 words each.
- Tab script drives both tab groups with arrow, Home and End keys; without JavaScript every panel renders.
- Validator adds panel-shape, tab and heading checks (120 pass); outline, role table, README, Word copy and standalone preview updated.

Co-Authored-By: Claude Opus 5.5 <noreply@anthropic.com>
</commit_message>
<xml_diff>
--- a/docs/chemical-build/deliverables/used-chemical-process-plants-for-sale-content.docx
+++ b/docs/chemical-build/deliverables/used-chemical-process-plants-for-sale-content.docx
@@ -2603,7 +2603,7 @@
         <w:rPr>
           <w:rFonts w:ascii="Montserrat" w:hAnsi="Montserrat" w:eastAsia="Outfit"/>
         </w:rPr>
-        <w:t>Available chemical plant equipment types</w:t>
+        <w:t>What used chemical process equipment do we supply?</w:t>
       </w:r>
     </w:p>
     <w:p>
@@ -2630,15 +2630,23 @@
         <w:rPr>
           <w:rFonts w:ascii="Roboto" w:hAnsi="Roboto" w:eastAsia="Roboto"/>
         </w:rPr>
-        <w:t>Precision-controlled systems for chemical synthesis, available in glass-lined, stainless and specialty alloys. IPP supplies used reactors from Pfaudler, De Dietrich, UGE and Gale Process Solutions to chemical producers for batch and continuous synthesis.</w:t>
-      </w:r>
-    </w:p>
-    <w:p>
-      <w:r>
-        <w:rPr>
-          <w:rFonts w:ascii="Roboto" w:hAnsi="Roboto" w:eastAsia="Roboto"/>
-        </w:rPr>
-        <w:t>Our used reactor inventory includes:</w:t>
+        <w:t>Precision-controlled systems for chemical synthesis, available in glass-lined, stainless and specialty alloys.</w:t>
+      </w:r>
+    </w:p>
+    <w:p>
+      <w:r>
+        <w:rPr>
+          <w:rFonts w:ascii="Roboto" w:hAnsi="Roboto" w:eastAsia="Roboto"/>
+        </w:rPr>
+        <w:t>We supply used reactors to chemical plants that need batch or continuous synthesis capacity for reaction, mixing and heat transfer under controlled pressure and temperature. As a supplier chemical producers trust worldwide, IPP sources reactors from Pfaudler, De Dietrich, UGE and Gale Process Solutions, documents each stock number and coordinates removal, shipping and start-up support through one team.</w:t>
+      </w:r>
+    </w:p>
+    <w:p>
+      <w:r>
+        <w:rPr>
+          <w:rFonts w:ascii="Roboto" w:hAnsi="Roboto" w:eastAsia="Roboto"/>
+        </w:rPr>
+        <w:t>Our used reactor inventory covers:</w:t>
       </w:r>
     </w:p>
     <w:p>
@@ -2649,7 +2657,7 @@
         <w:rPr>
           <w:rFonts w:ascii="Roboto" w:hAnsi="Roboto" w:eastAsia="Roboto"/>
         </w:rPr>
-        <w:t>Batch-type agitated reactors with complete agitation</w:t>
+        <w:t>Batch-type agitated reactors with complete agitation systems</w:t>
       </w:r>
     </w:p>
     <w:p>
@@ -2660,7 +2668,7 @@
         <w:rPr>
           <w:rFonts w:ascii="Roboto" w:hAnsi="Roboto" w:eastAsia="Roboto"/>
         </w:rPr>
-        <w:t>Batch type body only reactor shells</w:t>
+        <w:t>Batch type body only reactor shells for buyers with existing drives</w:t>
       </w:r>
     </w:p>
     <w:p>
@@ -2671,7 +2679,7 @@
         <w:rPr>
           <w:rFonts w:ascii="Roboto" w:hAnsi="Roboto" w:eastAsia="Roboto"/>
         </w:rPr>
-        <w:t>Hydrogenation reactors</w:t>
+        <w:t>Hydrogenation reactors for high-pressure hydrogen service</w:t>
       </w:r>
     </w:p>
     <w:p>
@@ -2682,7 +2690,7 @@
         <w:rPr>
           <w:rFonts w:ascii="Roboto" w:hAnsi="Roboto" w:eastAsia="Roboto"/>
         </w:rPr>
-        <w:t>Fixed bed catalytic reactors</w:t>
+        <w:t>Fixed bed catalytic and tubular continuous-flow reactors</w:t>
       </w:r>
     </w:p>
     <w:p>
@@ -2693,31 +2701,15 @@
         <w:rPr>
           <w:rFonts w:ascii="Roboto" w:hAnsi="Roboto" w:eastAsia="Roboto"/>
         </w:rPr>
-        <w:t>Tubular continuous-flow reactors</w:t>
-      </w:r>
-    </w:p>
-    <w:p>
-      <w:r>
-        <w:rPr>
-          <w:rFonts w:ascii="Roboto" w:hAnsi="Roboto" w:eastAsia="Roboto"/>
-        </w:rPr>
-        <w:t>Glass-lined units lead the reactor inventory, alongside stainless steel 316, 316L and 304, Hastelloy C-276 and C-22, and titanium.</w:t>
-      </w:r>
-    </w:p>
-    <w:p>
-      <w:r>
-        <w:rPr>
-          <w:rFonts w:ascii="Roboto" w:hAnsi="Roboto" w:eastAsia="Roboto"/>
-        </w:rPr>
-        <w:t>Reactor capacities range from 2 L to 80,000 L (0.5 to 21,134 gal).</w:t>
-      </w:r>
-    </w:p>
-    <w:p>
-      <w:r>
-        <w:rPr>
-          <w:rFonts w:ascii="Roboto" w:hAnsi="Roboto" w:eastAsia="Roboto"/>
-        </w:rPr>
-        <w:t>Each reactor listing states capacity, internal pressure, temperature, material and condition.</w:t>
+        <w:t>Glass-lined reactors re-glassed through Universal Glasteel Equipment</w:t>
+      </w:r>
+    </w:p>
+    <w:p>
+      <w:r>
+        <w:rPr>
+          <w:rFonts w:ascii="Roboto" w:hAnsi="Roboto" w:eastAsia="Roboto"/>
+        </w:rPr>
+        <w:t>Each reactor listing states capacity, internal pressure, temperature, material and condition, so process engineers can match a unit to the reaction before an inspection. Glass-lined units lead our reactor inventory, alongside stainless steel 316, 316L and 304, Hastelloy C-276 and C-22 and titanium, with capacities from 2 L to 80,000 L (0.5 to 21,134 gal). Pricing depends on manufacturer, capacity, material of construction and condition, and IPP quotes each stock number individually with a video or on-site inspection on request.</w:t>
       </w:r>
     </w:p>
     <w:p>
@@ -2752,15 +2744,23 @@
         <w:rPr>
           <w:rFonts w:ascii="Roboto" w:hAnsi="Roboto" w:eastAsia="Roboto"/>
         </w:rPr>
-        <w:t>Shell-and-tube and plate exchangers for thermal control and energy recovery. We supply used heat exchangers from Alfa Laval, Vicarb, Ralph Coidan and Graham to chemical plants for heating, cooling and condensing process streams.</w:t>
-      </w:r>
-    </w:p>
-    <w:p>
-      <w:r>
-        <w:rPr>
-          <w:rFonts w:ascii="Roboto" w:hAnsi="Roboto" w:eastAsia="Roboto"/>
-        </w:rPr>
-        <w:t>IPP’s used heat exchanger inventory includes:</w:t>
+        <w:t>Shell-and-tube and plate exchangers for thermal control and energy recovery.</w:t>
+      </w:r>
+    </w:p>
+    <w:p>
+      <w:r>
+        <w:rPr>
+          <w:rFonts w:ascii="Roboto" w:hAnsi="Roboto" w:eastAsia="Roboto"/>
+        </w:rPr>
+        <w:t>IPP supplies used heat exchangers to chemical plants for heating, cooling, condensing and heat recovery across process streams. With exchangers from Alfa Laval, Vicarb, Ralph Coidan and Graham in stock, our team matches shell, tube and plate configurations to the thermal duty each buyer specifies.</w:t>
+      </w:r>
+    </w:p>
+    <w:p>
+      <w:r>
+        <w:rPr>
+          <w:rFonts w:ascii="Roboto" w:hAnsi="Roboto" w:eastAsia="Roboto"/>
+        </w:rPr>
+        <w:t>Our used heat exchanger inventory covers:</w:t>
       </w:r>
     </w:p>
     <w:p>
@@ -2771,7 +2771,7 @@
         <w:rPr>
           <w:rFonts w:ascii="Roboto" w:hAnsi="Roboto" w:eastAsia="Roboto"/>
         </w:rPr>
-        <w:t>Shell-and-tube heat exchangers</w:t>
+        <w:t>Shell-and-tube heat exchangers for process heating and cooling</w:t>
       </w:r>
     </w:p>
     <w:p>
@@ -2782,7 +2782,7 @@
         <w:rPr>
           <w:rFonts w:ascii="Roboto" w:hAnsi="Roboto" w:eastAsia="Roboto"/>
         </w:rPr>
-        <w:t>Plate-and-frame heat exchangers</w:t>
+        <w:t>Plate-and-frame heat exchangers for compact thermal duty</w:t>
       </w:r>
     </w:p>
     <w:p>
@@ -2793,7 +2793,7 @@
         <w:rPr>
           <w:rFonts w:ascii="Roboto" w:hAnsi="Roboto" w:eastAsia="Roboto"/>
         </w:rPr>
-        <w:t>Spiral heat exchangers</w:t>
+        <w:t>Graphite block heat exchangers for corrosive process streams</w:t>
       </w:r>
     </w:p>
     <w:p>
@@ -2804,7 +2804,7 @@
         <w:rPr>
           <w:rFonts w:ascii="Roboto" w:hAnsi="Roboto" w:eastAsia="Roboto"/>
         </w:rPr>
-        <w:t>Graphite block heat exchangers</w:t>
+        <w:t>Spiral and welded plate heat exchangers</w:t>
       </w:r>
     </w:p>
     <w:p>
@@ -2815,7 +2815,66 @@
         <w:rPr>
           <w:rFonts w:ascii="Roboto" w:hAnsi="Roboto" w:eastAsia="Roboto"/>
         </w:rPr>
-        <w:t>Welded plate heat exchangers</w:t>
+        <w:t>Air fin coolers for process stream cooling</w:t>
+      </w:r>
+    </w:p>
+    <w:p>
+      <w:r>
+        <w:rPr>
+          <w:rFonts w:ascii="Roboto" w:hAnsi="Roboto" w:eastAsia="Roboto"/>
+        </w:rPr>
+        <w:t>Each heat exchanger listing states heat transfer area, shell and tube pressure, temperature and material. Stainless steel 316 and graphite lead our heat exchanger inventory, alongside stainless steel 304 and 316L, carbon steel, titanium and Hastelloy C-276, with heat transfer areas up to 2,124 m² (22,863 ft²). Pricing depends on manufacturer, heat transfer area, material of construction and condition, and our team quotes each stock number individually.</w:t>
+      </w:r>
+    </w:p>
+    <w:p>
+      <w:r>
+        <w:rPr>
+          <w:rFonts w:ascii="Roboto" w:hAnsi="Roboto" w:eastAsia="Roboto"/>
+        </w:rPr>
+        <w:t>Featured listing: shell, tubes and tubesheet in stainless steel 316L.</w:t>
+      </w:r>
+    </w:p>
+    <w:p>
+      <w:r>
+        <w:rPr>
+          <w:rFonts w:ascii="Roboto" w:hAnsi="Roboto" w:eastAsia="Roboto"/>
+        </w:rPr>
+        <w:t>Browse used heat exchangers ↗</w:t>
+      </w:r>
+    </w:p>
+    <w:p>
+      <w:pPr>
+        <w:pStyle w:val="Heading3"/>
+      </w:pPr>
+      <w:r>
+        <w:rPr>
+          <w:rFonts w:ascii="Montserrat" w:hAnsi="Montserrat" w:eastAsia="Outfit"/>
+        </w:rPr>
+        <w:t>Centrifuges</w:t>
+      </w:r>
+    </w:p>
+    <w:p>
+      <w:r>
+        <w:rPr>
+          <w:rFonts w:ascii="Roboto" w:hAnsi="Roboto" w:eastAsia="Roboto"/>
+        </w:rPr>
+        <w:t>Used for purification, separation and crystallization. Basket, inverting and peeler models available.</w:t>
+      </w:r>
+    </w:p>
+    <w:p>
+      <w:r>
+        <w:rPr>
+          <w:rFonts w:ascii="Roboto" w:hAnsi="Roboto" w:eastAsia="Roboto"/>
+        </w:rPr>
+        <w:t>We supply used centrifuges to chemical and pharmaceutical plants for solid-liquid separation, crystal recovery and product purification. As a source process engineers trust for separation equipment, IPP stocks Krauss Maffei, Alfa Laval, Westfalia and Sharples machines and records the basket or bowl size, material and motor power for each stock number.</w:t>
+      </w:r>
+    </w:p>
+    <w:p>
+      <w:r>
+        <w:rPr>
+          <w:rFonts w:ascii="Roboto" w:hAnsi="Roboto" w:eastAsia="Roboto"/>
+        </w:rPr>
+        <w:t>Centrifuge types in our inventory cover:</w:t>
       </w:r>
     </w:p>
     <w:p>
@@ -2826,47 +2885,75 @@
         <w:rPr>
           <w:rFonts w:ascii="Roboto" w:hAnsi="Roboto" w:eastAsia="Roboto"/>
         </w:rPr>
-        <w:t>Air fin coolers</w:t>
-      </w:r>
-    </w:p>
-    <w:p>
-      <w:r>
-        <w:rPr>
-          <w:rFonts w:ascii="Roboto" w:hAnsi="Roboto" w:eastAsia="Roboto"/>
-        </w:rPr>
-        <w:t>Stainless steel 316 and graphite lead the heat exchanger inventory, alongside stainless steel 304 and 316L, carbon steel, titanium and Hastelloy C-276.</w:t>
-      </w:r>
-    </w:p>
-    <w:p>
-      <w:r>
-        <w:rPr>
-          <w:rFonts w:ascii="Roboto" w:hAnsi="Roboto" w:eastAsia="Roboto"/>
-        </w:rPr>
-        <w:t>Heat transfer areas reach 2,124 m² (22,863 ft²).</w:t>
-      </w:r>
-    </w:p>
-    <w:p>
-      <w:r>
-        <w:rPr>
-          <w:rFonts w:ascii="Roboto" w:hAnsi="Roboto" w:eastAsia="Roboto"/>
-        </w:rPr>
-        <w:t>Each heat exchanger listing states heat transfer area, shell and tube pressure, temperature and material.</w:t>
-      </w:r>
-    </w:p>
-    <w:p>
-      <w:r>
-        <w:rPr>
-          <w:rFonts w:ascii="Roboto" w:hAnsi="Roboto" w:eastAsia="Roboto"/>
-        </w:rPr>
-        <w:t>Featured listing: shell, tubes and tubesheet in stainless steel 316L.</w:t>
-      </w:r>
-    </w:p>
-    <w:p>
-      <w:r>
-        <w:rPr>
-          <w:rFonts w:ascii="Roboto" w:hAnsi="Roboto" w:eastAsia="Roboto"/>
-        </w:rPr>
-        <w:t>Browse used heat exchangers ↗</w:t>
+        <w:t>Bottom-discharge and top-discharge basket centrifuges</w:t>
+      </w:r>
+    </w:p>
+    <w:p>
+      <w:pPr>
+        <w:pStyle w:val="ListBullet"/>
+      </w:pPr>
+      <w:r>
+        <w:rPr>
+          <w:rFonts w:ascii="Roboto" w:hAnsi="Roboto" w:eastAsia="Roboto"/>
+        </w:rPr>
+        <w:t>Peeler centrifuges, including Hastelloy units</w:t>
+      </w:r>
+    </w:p>
+    <w:p>
+      <w:pPr>
+        <w:pStyle w:val="ListBullet"/>
+      </w:pPr>
+      <w:r>
+        <w:rPr>
+          <w:rFonts w:ascii="Roboto" w:hAnsi="Roboto" w:eastAsia="Roboto"/>
+        </w:rPr>
+        <w:t>Inverting filter centrifuges</w:t>
+      </w:r>
+    </w:p>
+    <w:p>
+      <w:pPr>
+        <w:pStyle w:val="ListBullet"/>
+      </w:pPr>
+      <w:r>
+        <w:rPr>
+          <w:rFonts w:ascii="Roboto" w:hAnsi="Roboto" w:eastAsia="Roboto"/>
+        </w:rPr>
+        <w:t>Disc bowl centrifuges for liquid clarification</w:t>
+      </w:r>
+    </w:p>
+    <w:p>
+      <w:pPr>
+        <w:pStyle w:val="ListBullet"/>
+      </w:pPr>
+      <w:r>
+        <w:rPr>
+          <w:rFonts w:ascii="Roboto" w:hAnsi="Roboto" w:eastAsia="Roboto"/>
+        </w:rPr>
+        <w:t>Solid bowl decanter centrifuges for continuous separation</w:t>
+      </w:r>
+    </w:p>
+    <w:p>
+      <w:r>
+        <w:rPr>
+          <w:rFonts w:ascii="Roboto" w:hAnsi="Roboto" w:eastAsia="Roboto"/>
+        </w:rPr>
+        <w:t>Each centrifuge listing states basket or bowl size, material, filtration area and motor power. Our featured Krauss Maffei peeler centrifuge carries 0.6 m² (6.5 ft²) of filtration area and an 18 kW (24.1 hp) motor. Pricing depends on manufacturer, model, material of construction and condition, and IPP quotes each stock number individually with a video or on-site inspection on request.</w:t>
+      </w:r>
+    </w:p>
+    <w:p>
+      <w:r>
+        <w:rPr>
+          <w:rFonts w:ascii="Roboto" w:hAnsi="Roboto" w:eastAsia="Roboto"/>
+        </w:rPr>
+        <w:t>Featured listing: Hastelloy C22 peeler centrifuge with a 630 mm (24.8 in) basket.</w:t>
+      </w:r>
+    </w:p>
+    <w:p>
+      <w:r>
+        <w:rPr>
+          <w:rFonts w:ascii="Roboto" w:hAnsi="Roboto" w:eastAsia="Roboto"/>
+        </w:rPr>
+        <w:t>Browse used centrifuges ↗</w:t>
       </w:r>
     </w:p>
     <w:p>
@@ -2877,23 +2964,31 @@
         <w:rPr>
           <w:rFonts w:ascii="Montserrat" w:hAnsi="Montserrat" w:eastAsia="Outfit"/>
         </w:rPr>
-        <w:t>Centrifuges</w:t>
-      </w:r>
-    </w:p>
-    <w:p>
-      <w:r>
-        <w:rPr>
-          <w:rFonts w:ascii="Roboto" w:hAnsi="Roboto" w:eastAsia="Roboto"/>
-        </w:rPr>
-        <w:t>Used for purification, separation and crystallization. Basket, inverting and peeler models available. Our centrifuge stock carries Krauss Maffei, Alfa Laval, Westfalia and Sharples machines for solid-liquid separation in chemical and pharmaceutical plants.</w:t>
-      </w:r>
-    </w:p>
-    <w:p>
-      <w:r>
-        <w:rPr>
-          <w:rFonts w:ascii="Roboto" w:hAnsi="Roboto" w:eastAsia="Roboto"/>
-        </w:rPr>
-        <w:t>Centrifuge types in our inventory include:</w:t>
+        <w:t>Dryers</w:t>
+      </w:r>
+    </w:p>
+    <w:p>
+      <w:r>
+        <w:rPr>
+          <w:rFonts w:ascii="Roboto" w:hAnsi="Roboto" w:eastAsia="Roboto"/>
+        </w:rPr>
+        <w:t>Moisture removal solutions including rotary, vacuum and disc dryers.</w:t>
+      </w:r>
+    </w:p>
+    <w:p>
+      <w:r>
+        <w:rPr>
+          <w:rFonts w:ascii="Roboto" w:hAnsi="Roboto" w:eastAsia="Roboto"/>
+        </w:rPr>
+        <w:t>IPP supplies used dryers to chemical plants that remove moisture and solvents from powders, pastes, crystals and slurries. With dryers from Gale Process Solutions, Glatt, Niro and Pfaudler in stock, we match the drying principle, chamber size and material to each product.</w:t>
+      </w:r>
+    </w:p>
+    <w:p>
+      <w:r>
+        <w:rPr>
+          <w:rFonts w:ascii="Roboto" w:hAnsi="Roboto" w:eastAsia="Roboto"/>
+        </w:rPr>
+        <w:t>Our used dryer inventory covers:</w:t>
       </w:r>
     </w:p>
     <w:p>
@@ -2904,7 +2999,7 @@
         <w:rPr>
           <w:rFonts w:ascii="Roboto" w:hAnsi="Roboto" w:eastAsia="Roboto"/>
         </w:rPr>
-        <w:t>Bottom-discharge basket centrifuges</w:t>
+        <w:t>Rotary vacuum dryers</w:t>
       </w:r>
     </w:p>
     <w:p>
@@ -2915,7 +3010,7 @@
         <w:rPr>
           <w:rFonts w:ascii="Roboto" w:hAnsi="Roboto" w:eastAsia="Roboto"/>
         </w:rPr>
-        <w:t>Top-discharge basket centrifuges</w:t>
+        <w:t>Double cone and twin shell dryers</w:t>
       </w:r>
     </w:p>
     <w:p>
@@ -2926,7 +3021,7 @@
         <w:rPr>
           <w:rFonts w:ascii="Roboto" w:hAnsi="Roboto" w:eastAsia="Roboto"/>
         </w:rPr>
-        <w:t>Peeler centrifuges</w:t>
+        <w:t>Fluid bed dryers for granular products</w:t>
       </w:r>
     </w:p>
     <w:p>
@@ -2937,7 +3032,7 @@
         <w:rPr>
           <w:rFonts w:ascii="Roboto" w:hAnsi="Roboto" w:eastAsia="Roboto"/>
         </w:rPr>
-        <w:t>Inverting filter centrifuges</w:t>
+        <w:t>Spray dryers for liquid feeds</w:t>
       </w:r>
     </w:p>
     <w:p>
@@ -2948,7 +3043,66 @@
         <w:rPr>
           <w:rFonts w:ascii="Roboto" w:hAnsi="Roboto" w:eastAsia="Roboto"/>
         </w:rPr>
-        <w:t>Disc bowl centrifuges</w:t>
+        <w:t>Paddle, ribbon, porcupine and screw dryers</w:t>
+      </w:r>
+    </w:p>
+    <w:p>
+      <w:r>
+        <w:rPr>
+          <w:rFonts w:ascii="Roboto" w:hAnsi="Roboto" w:eastAsia="Roboto"/>
+        </w:rPr>
+        <w:t>Each dryer listing states chamber size, evaporation rate, inlet temperature and material. Our featured APV Anhydro spray dryer evaporates 31.8 kg/h (70 lb/h) at a 354.4 °C (670 °F) inlet temperature in stainless steel 316. Pricing depends on manufacturer, drying capacity, material of construction and condition, and our team quotes each stock number individually.</w:t>
+      </w:r>
+    </w:p>
+    <w:p>
+      <w:r>
+        <w:rPr>
+          <w:rFonts w:ascii="Roboto" w:hAnsi="Roboto" w:eastAsia="Roboto"/>
+        </w:rPr>
+        <w:t>Featured listing: stainless steel 316 spray dryer with 31.8 kg/h (70 lb/h) evaporation.</w:t>
+      </w:r>
+    </w:p>
+    <w:p>
+      <w:r>
+        <w:rPr>
+          <w:rFonts w:ascii="Roboto" w:hAnsi="Roboto" w:eastAsia="Roboto"/>
+        </w:rPr>
+        <w:t>Browse used dryers ↗</w:t>
+      </w:r>
+    </w:p>
+    <w:p>
+      <w:pPr>
+        <w:pStyle w:val="Heading3"/>
+      </w:pPr>
+      <w:r>
+        <w:rPr>
+          <w:rFonts w:ascii="Montserrat" w:hAnsi="Montserrat" w:eastAsia="Outfit"/>
+        </w:rPr>
+        <w:t>Filters</w:t>
+      </w:r>
+    </w:p>
+    <w:p>
+      <w:r>
+        <w:rPr>
+          <w:rFonts w:ascii="Roboto" w:hAnsi="Roboto" w:eastAsia="Roboto"/>
+        </w:rPr>
+        <w:t>Pressure and vacuum systems to remove particulates or recover solids.</w:t>
+      </w:r>
+    </w:p>
+    <w:p>
+      <w:r>
+        <w:rPr>
+          <w:rFonts w:ascii="Roboto" w:hAnsi="Roboto" w:eastAsia="Roboto"/>
+        </w:rPr>
+        <w:t>We supply used filters to chemical plants that clarify process liquids, recover solids and wash and dry filter cake. As a supplier chemical producers trust for solid-liquid separation, IPP sources filters from Schenk, Cogeim, Chemap and Rosenmund and lists filtration area, pressure and material for each stock number.</w:t>
+      </w:r>
+    </w:p>
+    <w:p>
+      <w:r>
+        <w:rPr>
+          <w:rFonts w:ascii="Roboto" w:hAnsi="Roboto" w:eastAsia="Roboto"/>
+        </w:rPr>
+        <w:t>Our used filter inventory covers:</w:t>
       </w:r>
     </w:p>
     <w:p>
@@ -2959,31 +3113,64 @@
         <w:rPr>
           <w:rFonts w:ascii="Roboto" w:hAnsi="Roboto" w:eastAsia="Roboto"/>
         </w:rPr>
-        <w:t>Solid bowl decanter centrifuges</w:t>
-      </w:r>
-    </w:p>
-    <w:p>
-      <w:r>
-        <w:rPr>
-          <w:rFonts w:ascii="Roboto" w:hAnsi="Roboto" w:eastAsia="Roboto"/>
-        </w:rPr>
-        <w:t>Each centrifuge listing states basket or bowl size, material, filtration area and motor power.</w:t>
-      </w:r>
-    </w:p>
-    <w:p>
-      <w:r>
-        <w:rPr>
-          <w:rFonts w:ascii="Roboto" w:hAnsi="Roboto" w:eastAsia="Roboto"/>
-        </w:rPr>
-        <w:t>Featured listing: Hastelloy C22 peeler centrifuge with a 630 mm (24.8 in) basket.</w:t>
-      </w:r>
-    </w:p>
-    <w:p>
-      <w:r>
-        <w:rPr>
-          <w:rFonts w:ascii="Roboto" w:hAnsi="Roboto" w:eastAsia="Roboto"/>
-        </w:rPr>
-        <w:t>Browse used centrifuges ↗</w:t>
+        <w:t>Filter presses for high-volume solids recovery</w:t>
+      </w:r>
+    </w:p>
+    <w:p>
+      <w:pPr>
+        <w:pStyle w:val="ListBullet"/>
+      </w:pPr>
+      <w:r>
+        <w:rPr>
+          <w:rFonts w:ascii="Roboto" w:hAnsi="Roboto" w:eastAsia="Roboto"/>
+        </w:rPr>
+        <w:t>Rosenmund and Cogeim filter dryers</w:t>
+      </w:r>
+    </w:p>
+    <w:p>
+      <w:pPr>
+        <w:pStyle w:val="ListBullet"/>
+      </w:pPr>
+      <w:r>
+        <w:rPr>
+          <w:rFonts w:ascii="Roboto" w:hAnsi="Roboto" w:eastAsia="Roboto"/>
+        </w:rPr>
+        <w:t>Nutsche filters for batch filtration</w:t>
+      </w:r>
+    </w:p>
+    <w:p>
+      <w:pPr>
+        <w:pStyle w:val="ListBullet"/>
+      </w:pPr>
+      <w:r>
+        <w:rPr>
+          <w:rFonts w:ascii="Roboto" w:hAnsi="Roboto" w:eastAsia="Roboto"/>
+        </w:rPr>
+        <w:t>Pressure leaf filters for liquid clarification</w:t>
+      </w:r>
+    </w:p>
+    <w:p>
+      <w:r>
+        <w:rPr>
+          <w:rFonts w:ascii="Roboto" w:hAnsi="Roboto" w:eastAsia="Roboto"/>
+        </w:rPr>
+        <w:t>Each filter listing states filtration area, pressure, temperature and material. Stainless steel 316 and polypropylene lead our filter inventory, alongside stainless steel 304, Hastelloy C-22 and C-276 and carbon steel, with filtration areas up to 330 m² (3,557 ft²). Pricing depends on manufacturer, filtration area, material of construction and condition, and IPP quotes each stock number individually with a video or on-site inspection on request.</w:t>
+      </w:r>
+    </w:p>
+    <w:p>
+      <w:r>
+        <w:rPr>
+          <w:rFonts w:ascii="Roboto" w:hAnsi="Roboto" w:eastAsia="Roboto"/>
+        </w:rPr>
+        <w:t>Featured listing: polypropylene plate-and-frame filter press.</w:t>
+      </w:r>
+    </w:p>
+    <w:p>
+      <w:r>
+        <w:rPr>
+          <w:rFonts w:ascii="Roboto" w:hAnsi="Roboto" w:eastAsia="Roboto"/>
+        </w:rPr>
+        <w:t>Browse used filters ↗</w:t>
       </w:r>
     </w:p>
     <w:p>
@@ -2994,23 +3181,31 @@
         <w:rPr>
           <w:rFonts w:ascii="Montserrat" w:hAnsi="Montserrat" w:eastAsia="Outfit"/>
         </w:rPr>
-        <w:t>Dryers</w:t>
-      </w:r>
-    </w:p>
-    <w:p>
-      <w:r>
-        <w:rPr>
-          <w:rFonts w:ascii="Roboto" w:hAnsi="Roboto" w:eastAsia="Roboto"/>
-        </w:rPr>
-        <w:t>Moisture removal solutions including rotary, vacuum and disc dryers. IPP supplies used dryers from Gale Process Solutions, Glatt, Niro and Pfaudler to chemical plants for removing moisture and solvents from powders, pastes and slurries.</w:t>
-      </w:r>
-    </w:p>
-    <w:p>
-      <w:r>
-        <w:rPr>
-          <w:rFonts w:ascii="Roboto" w:hAnsi="Roboto" w:eastAsia="Roboto"/>
-        </w:rPr>
-        <w:t>Our used dryer inventory includes:</w:t>
+        <w:t>Distillation columns</w:t>
+      </w:r>
+    </w:p>
+    <w:p>
+      <w:r>
+        <w:rPr>
+          <w:rFonts w:ascii="Roboto" w:hAnsi="Roboto" w:eastAsia="Roboto"/>
+        </w:rPr>
+        <w:t>For purification, solvent recovery and fractional separation.</w:t>
+      </w:r>
+    </w:p>
+    <w:p>
+      <w:r>
+        <w:rPr>
+          <w:rFonts w:ascii="Roboto" w:hAnsi="Roboto" w:eastAsia="Roboto"/>
+        </w:rPr>
+        <w:t>IPP supplies used distillation columns to chemical plants for solvent recovery, product purification and fractional separation. With Pfaudler, De Dietrich, Kühni and Schott columns in stock, we supply packed and tray designs in glass-lined steel, stainless steel and specialty alloys.</w:t>
+      </w:r>
+    </w:p>
+    <w:p>
+      <w:r>
+        <w:rPr>
+          <w:rFonts w:ascii="Roboto" w:hAnsi="Roboto" w:eastAsia="Roboto"/>
+        </w:rPr>
+        <w:t>Column types in our inventory cover:</w:t>
       </w:r>
     </w:p>
     <w:p>
@@ -3021,7 +3216,7 @@
         <w:rPr>
           <w:rFonts w:ascii="Roboto" w:hAnsi="Roboto" w:eastAsia="Roboto"/>
         </w:rPr>
-        <w:t>Rotary vacuum dryers</w:t>
+        <w:t>Packed columns, including ceramic-packed glass-lined units</w:t>
       </w:r>
     </w:p>
     <w:p>
@@ -3032,7 +3227,7 @@
         <w:rPr>
           <w:rFonts w:ascii="Roboto" w:hAnsi="Roboto" w:eastAsia="Roboto"/>
         </w:rPr>
-        <w:t>Double cone and twin shell dryers</w:t>
+        <w:t>Tray columns</w:t>
       </w:r>
     </w:p>
     <w:p>
@@ -3043,7 +3238,7 @@
         <w:rPr>
           <w:rFonts w:ascii="Roboto" w:hAnsi="Roboto" w:eastAsia="Roboto"/>
         </w:rPr>
-        <w:t>Fluid bed dryers</w:t>
+        <w:t>Combination packed and tray columns</w:t>
       </w:r>
     </w:p>
     <w:p>
@@ -3054,7 +3249,7 @@
         <w:rPr>
           <w:rFonts w:ascii="Roboto" w:hAnsi="Roboto" w:eastAsia="Roboto"/>
         </w:rPr>
-        <w:t>Spray dryers</w:t>
+        <w:t>Contactor columns for liquid-liquid extraction</w:t>
       </w:r>
     </w:p>
     <w:p>
@@ -3065,7 +3260,66 @@
         <w:rPr>
           <w:rFonts w:ascii="Roboto" w:hAnsi="Roboto" w:eastAsia="Roboto"/>
         </w:rPr>
-        <w:t>Paddle and ribbon dryers</w:t>
+        <w:t>Glass-lined columns for corrosive service</w:t>
+      </w:r>
+    </w:p>
+    <w:p>
+      <w:r>
+        <w:rPr>
+          <w:rFonts w:ascii="Roboto" w:hAnsi="Roboto" w:eastAsia="Roboto"/>
+        </w:rPr>
+        <w:t>Each column listing states diameter, length, pressure and temperature. Glass-lined and stainless steel 316 columns lead our column inventory, alongside stainless steel 304, Hastelloy C-276 and graphite, with diameters from 76 mm (3 in) to 8,000 mm (315 in). Pricing depends on manufacturer, diameter, material of construction and condition, and our team quotes each stock number individually.</w:t>
+      </w:r>
+    </w:p>
+    <w:p>
+      <w:r>
+        <w:rPr>
+          <w:rFonts w:ascii="Roboto" w:hAnsi="Roboto" w:eastAsia="Roboto"/>
+        </w:rPr>
+        <w:t>Featured listing: glass-lined packed column with ceramic packing.</w:t>
+      </w:r>
+    </w:p>
+    <w:p>
+      <w:r>
+        <w:rPr>
+          <w:rFonts w:ascii="Roboto" w:hAnsi="Roboto" w:eastAsia="Roboto"/>
+        </w:rPr>
+        <w:t>Browse used distillation columns ↗</w:t>
+      </w:r>
+    </w:p>
+    <w:p>
+      <w:pPr>
+        <w:pStyle w:val="Heading3"/>
+      </w:pPr>
+      <w:r>
+        <w:rPr>
+          <w:rFonts w:ascii="Montserrat" w:hAnsi="Montserrat" w:eastAsia="Outfit"/>
+        </w:rPr>
+        <w:t>Tanks</w:t>
+      </w:r>
+    </w:p>
+    <w:p>
+      <w:r>
+        <w:rPr>
+          <w:rFonts w:ascii="Roboto" w:hAnsi="Roboto" w:eastAsia="Roboto"/>
+        </w:rPr>
+        <w:t>For storage, blending and transfer. Jacketed and non-jacketed tanks available.</w:t>
+      </w:r>
+    </w:p>
+    <w:p>
+      <w:r>
+        <w:rPr>
+          <w:rFonts w:ascii="Roboto" w:hAnsi="Roboto" w:eastAsia="Roboto"/>
+        </w:rPr>
+        <w:t>We supply used tanks to chemical plants for raw material storage, blending and product transfer. As a supplier chemical producers trust for vessel capacity, IPP sources tanks from Pfaudler, De Dietrich, Grundy and Sinclair Stainless Fabrications in jacketed and non-jacketed designs.</w:t>
+      </w:r>
+    </w:p>
+    <w:p>
+      <w:r>
+        <w:rPr>
+          <w:rFonts w:ascii="Roboto" w:hAnsi="Roboto" w:eastAsia="Roboto"/>
+        </w:rPr>
+        <w:t>Our used tank inventory covers:</w:t>
       </w:r>
     </w:p>
     <w:p>
@@ -3076,58 +3330,7 @@
         <w:rPr>
           <w:rFonts w:ascii="Roboto" w:hAnsi="Roboto" w:eastAsia="Roboto"/>
         </w:rPr>
-        <w:t>Porcupine and screw dryers</w:t>
-      </w:r>
-    </w:p>
-    <w:p>
-      <w:r>
-        <w:rPr>
-          <w:rFonts w:ascii="Roboto" w:hAnsi="Roboto" w:eastAsia="Roboto"/>
-        </w:rPr>
-        <w:t>Each dryer listing states chamber size, evaporation rate, inlet temperature and material.</w:t>
-      </w:r>
-    </w:p>
-    <w:p>
-      <w:r>
-        <w:rPr>
-          <w:rFonts w:ascii="Roboto" w:hAnsi="Roboto" w:eastAsia="Roboto"/>
-        </w:rPr>
-        <w:t>Featured listing: stainless steel 316 spray dryer with 31.8 kg/h (70 lb/h) evaporation.</w:t>
-      </w:r>
-    </w:p>
-    <w:p>
-      <w:r>
-        <w:rPr>
-          <w:rFonts w:ascii="Roboto" w:hAnsi="Roboto" w:eastAsia="Roboto"/>
-        </w:rPr>
-        <w:t>Browse used dryers ↗</w:t>
-      </w:r>
-    </w:p>
-    <w:p>
-      <w:pPr>
-        <w:pStyle w:val="Heading3"/>
-      </w:pPr>
-      <w:r>
-        <w:rPr>
-          <w:rFonts w:ascii="Montserrat" w:hAnsi="Montserrat" w:eastAsia="Outfit"/>
-        </w:rPr>
-        <w:t>Filters</w:t>
-      </w:r>
-    </w:p>
-    <w:p>
-      <w:r>
-        <w:rPr>
-          <w:rFonts w:ascii="Roboto" w:hAnsi="Roboto" w:eastAsia="Roboto"/>
-        </w:rPr>
-        <w:t>Pressure and vacuum systems to remove particulates or recover solids. We supply used filters from Schenk, Cogeim, Chemap and Rosenmund to chemical plants for clarifying liquids and recovering solids.</w:t>
-      </w:r>
-    </w:p>
-    <w:p>
-      <w:r>
-        <w:rPr>
-          <w:rFonts w:ascii="Roboto" w:hAnsi="Roboto" w:eastAsia="Roboto"/>
-        </w:rPr>
-        <w:t>IPP’s used filter inventory includes:</w:t>
+        <w:t>Glass-lined tanks for corrosive chemicals</w:t>
       </w:r>
     </w:p>
     <w:p>
@@ -3138,7 +3341,7 @@
         <w:rPr>
           <w:rFonts w:ascii="Roboto" w:hAnsi="Roboto" w:eastAsia="Roboto"/>
         </w:rPr>
-        <w:t>Filter presses</w:t>
+        <w:t>Stainless steel 304, 316 and 316L process tanks</w:t>
       </w:r>
     </w:p>
     <w:p>
@@ -3149,7 +3352,7 @@
         <w:rPr>
           <w:rFonts w:ascii="Roboto" w:hAnsi="Roboto" w:eastAsia="Roboto"/>
         </w:rPr>
-        <w:t>Rosenmund and Cogeim filter dryers</w:t>
+        <w:t>Jacketed tanks for heating and cooling</w:t>
       </w:r>
     </w:p>
     <w:p>
@@ -3160,7 +3363,7 @@
         <w:rPr>
           <w:rFonts w:ascii="Roboto" w:hAnsi="Roboto" w:eastAsia="Roboto"/>
         </w:rPr>
-        <w:t>Nutsche filters</w:t>
+        <w:t>Non-jacketed storage tanks</w:t>
       </w:r>
     </w:p>
     <w:p>
@@ -3171,264 +3374,15 @@
         <w:rPr>
           <w:rFonts w:ascii="Roboto" w:hAnsi="Roboto" w:eastAsia="Roboto"/>
         </w:rPr>
-        <w:t>Pressure leaf filters</w:t>
-      </w:r>
-    </w:p>
-    <w:p>
-      <w:r>
-        <w:rPr>
-          <w:rFonts w:ascii="Roboto" w:hAnsi="Roboto" w:eastAsia="Roboto"/>
-        </w:rPr>
-        <w:t>Stainless steel 316 and polypropylene lead the filter inventory, alongside stainless steel 304, Hastelloy C-22 and C-276, and carbon steel.</w:t>
-      </w:r>
-    </w:p>
-    <w:p>
-      <w:r>
-        <w:rPr>
-          <w:rFonts w:ascii="Roboto" w:hAnsi="Roboto" w:eastAsia="Roboto"/>
-        </w:rPr>
-        <w:t>Filtration areas reach 330 m² (3,557 ft²).</w:t>
-      </w:r>
-    </w:p>
-    <w:p>
-      <w:r>
-        <w:rPr>
-          <w:rFonts w:ascii="Roboto" w:hAnsi="Roboto" w:eastAsia="Roboto"/>
-        </w:rPr>
-        <w:t>Each filter listing states filtration area, pressure, temperature and material.</w:t>
-      </w:r>
-    </w:p>
-    <w:p>
-      <w:r>
-        <w:rPr>
-          <w:rFonts w:ascii="Roboto" w:hAnsi="Roboto" w:eastAsia="Roboto"/>
-        </w:rPr>
-        <w:t>Featured listing: polypropylene plate-and-frame filter press.</w:t>
-      </w:r>
-    </w:p>
-    <w:p>
-      <w:r>
-        <w:rPr>
-          <w:rFonts w:ascii="Roboto" w:hAnsi="Roboto" w:eastAsia="Roboto"/>
-        </w:rPr>
-        <w:t>Browse used filters ↗</w:t>
-      </w:r>
-    </w:p>
-    <w:p>
-      <w:pPr>
-        <w:pStyle w:val="Heading3"/>
-      </w:pPr>
-      <w:r>
-        <w:rPr>
-          <w:rFonts w:ascii="Montserrat" w:hAnsi="Montserrat" w:eastAsia="Outfit"/>
-        </w:rPr>
-        <w:t>Distillation columns</w:t>
-      </w:r>
-    </w:p>
-    <w:p>
-      <w:r>
-        <w:rPr>
-          <w:rFonts w:ascii="Roboto" w:hAnsi="Roboto" w:eastAsia="Roboto"/>
-        </w:rPr>
-        <w:t>For purification, solvent recovery and fractional separation. Our used distillation columns include Pfaudler, De Dietrich, Kühni and Schott units for solvent recovery and product purification in chemical plants.</w:t>
-      </w:r>
-    </w:p>
-    <w:p>
-      <w:r>
-        <w:rPr>
-          <w:rFonts w:ascii="Roboto" w:hAnsi="Roboto" w:eastAsia="Roboto"/>
-        </w:rPr>
-        <w:t>Column types in our inventory include:</w:t>
-      </w:r>
-    </w:p>
-    <w:p>
-      <w:pPr>
-        <w:pStyle w:val="ListBullet"/>
-      </w:pPr>
-      <w:r>
-        <w:rPr>
-          <w:rFonts w:ascii="Roboto" w:hAnsi="Roboto" w:eastAsia="Roboto"/>
-        </w:rPr>
-        <w:t>Packed columns</w:t>
-      </w:r>
-    </w:p>
-    <w:p>
-      <w:pPr>
-        <w:pStyle w:val="ListBullet"/>
-      </w:pPr>
-      <w:r>
-        <w:rPr>
-          <w:rFonts w:ascii="Roboto" w:hAnsi="Roboto" w:eastAsia="Roboto"/>
-        </w:rPr>
-        <w:t>Tray columns</w:t>
-      </w:r>
-    </w:p>
-    <w:p>
-      <w:pPr>
-        <w:pStyle w:val="ListBullet"/>
-      </w:pPr>
-      <w:r>
-        <w:rPr>
-          <w:rFonts w:ascii="Roboto" w:hAnsi="Roboto" w:eastAsia="Roboto"/>
-        </w:rPr>
-        <w:t>Combination columns</w:t>
-      </w:r>
-    </w:p>
-    <w:p>
-      <w:pPr>
-        <w:pStyle w:val="ListBullet"/>
-      </w:pPr>
-      <w:r>
-        <w:rPr>
-          <w:rFonts w:ascii="Roboto" w:hAnsi="Roboto" w:eastAsia="Roboto"/>
-        </w:rPr>
-        <w:t>Contactor columns</w:t>
-      </w:r>
-    </w:p>
-    <w:p>
-      <w:r>
-        <w:rPr>
-          <w:rFonts w:ascii="Roboto" w:hAnsi="Roboto" w:eastAsia="Roboto"/>
-        </w:rPr>
-        <w:t>Glass-lined and stainless steel 316 columns lead the inventory, alongside stainless steel 304, Hastelloy C-276 and graphite.</w:t>
-      </w:r>
-    </w:p>
-    <w:p>
-      <w:r>
-        <w:rPr>
-          <w:rFonts w:ascii="Roboto" w:hAnsi="Roboto" w:eastAsia="Roboto"/>
-        </w:rPr>
-        <w:t>Column diameters range from 76 mm (3 in) to 8,000 mm (315 in).</w:t>
-      </w:r>
-    </w:p>
-    <w:p>
-      <w:r>
-        <w:rPr>
-          <w:rFonts w:ascii="Roboto" w:hAnsi="Roboto" w:eastAsia="Roboto"/>
-        </w:rPr>
-        <w:t>Each column listing states diameter, length, pressure and temperature.</w:t>
-      </w:r>
-    </w:p>
-    <w:p>
-      <w:r>
-        <w:rPr>
-          <w:rFonts w:ascii="Roboto" w:hAnsi="Roboto" w:eastAsia="Roboto"/>
-        </w:rPr>
-        <w:t>Featured listing: glass-lined packed column with ceramic packing.</w:t>
-      </w:r>
-    </w:p>
-    <w:p>
-      <w:r>
-        <w:rPr>
-          <w:rFonts w:ascii="Roboto" w:hAnsi="Roboto" w:eastAsia="Roboto"/>
-        </w:rPr>
-        <w:t>Browse used distillation columns ↗</w:t>
-      </w:r>
-    </w:p>
-    <w:p>
-      <w:pPr>
-        <w:pStyle w:val="Heading3"/>
-      </w:pPr>
-      <w:r>
-        <w:rPr>
-          <w:rFonts w:ascii="Montserrat" w:hAnsi="Montserrat" w:eastAsia="Outfit"/>
-        </w:rPr>
-        <w:t>Tanks</w:t>
-      </w:r>
-    </w:p>
-    <w:p>
-      <w:r>
-        <w:rPr>
-          <w:rFonts w:ascii="Roboto" w:hAnsi="Roboto" w:eastAsia="Roboto"/>
-        </w:rPr>
-        <w:t>For storage, blending and transfer. Jacketed and non-jacketed tanks available. IPP supplies used tanks from Pfaudler, De Dietrich, Grundy and Sinclair Stainless Fabrications to chemical plants for raw material storage, blending and product transfer.</w:t>
-      </w:r>
-    </w:p>
-    <w:p>
-      <w:r>
-        <w:rPr>
-          <w:rFonts w:ascii="Roboto" w:hAnsi="Roboto" w:eastAsia="Roboto"/>
-        </w:rPr>
-        <w:t>Our used tank inventory includes:</w:t>
-      </w:r>
-    </w:p>
-    <w:p>
-      <w:pPr>
-        <w:pStyle w:val="ListBullet"/>
-      </w:pPr>
-      <w:r>
-        <w:rPr>
-          <w:rFonts w:ascii="Roboto" w:hAnsi="Roboto" w:eastAsia="Roboto"/>
-        </w:rPr>
-        <w:t>Glass-lined tanks</w:t>
-      </w:r>
-    </w:p>
-    <w:p>
-      <w:pPr>
-        <w:pStyle w:val="ListBullet"/>
-      </w:pPr>
-      <w:r>
-        <w:rPr>
-          <w:rFonts w:ascii="Roboto" w:hAnsi="Roboto" w:eastAsia="Roboto"/>
-        </w:rPr>
-        <w:t>Stainless steel 304, 316 and 316L tanks</w:t>
-      </w:r>
-    </w:p>
-    <w:p>
-      <w:pPr>
-        <w:pStyle w:val="ListBullet"/>
-      </w:pPr>
-      <w:r>
-        <w:rPr>
-          <w:rFonts w:ascii="Roboto" w:hAnsi="Roboto" w:eastAsia="Roboto"/>
-        </w:rPr>
-        <w:t>Jacketed process tanks</w:t>
-      </w:r>
-    </w:p>
-    <w:p>
-      <w:pPr>
-        <w:pStyle w:val="ListBullet"/>
-      </w:pPr>
-      <w:r>
-        <w:rPr>
-          <w:rFonts w:ascii="Roboto" w:hAnsi="Roboto" w:eastAsia="Roboto"/>
-        </w:rPr>
-        <w:t>Non-jacketed storage tanks</w:t>
-      </w:r>
-    </w:p>
-    <w:p>
-      <w:pPr>
-        <w:pStyle w:val="ListBullet"/>
-      </w:pPr>
-      <w:r>
-        <w:rPr>
-          <w:rFonts w:ascii="Roboto" w:hAnsi="Roboto" w:eastAsia="Roboto"/>
-        </w:rPr>
-        <w:t>Carbon steel and fiberglass tanks</w:t>
-      </w:r>
-    </w:p>
-    <w:p>
-      <w:r>
-        <w:rPr>
-          <w:rFonts w:ascii="Roboto" w:hAnsi="Roboto" w:eastAsia="Roboto"/>
-        </w:rPr>
-        <w:t>Stainless steel 304 and glass-lined tanks lead the inventory, alongside stainless steel 316 and 316L, carbon steel and fiberglass.</w:t>
-      </w:r>
-    </w:p>
-    <w:p>
-      <w:r>
-        <w:rPr>
-          <w:rFonts w:ascii="Roboto" w:hAnsi="Roboto" w:eastAsia="Roboto"/>
-        </w:rPr>
-        <w:t>Tank capacities range from 5 L to 565,000 L (1 to 149,258 gal).</w:t>
-      </w:r>
-    </w:p>
-    <w:p>
-      <w:r>
-        <w:rPr>
-          <w:rFonts w:ascii="Roboto" w:hAnsi="Roboto" w:eastAsia="Roboto"/>
-        </w:rPr>
-        <w:t>Each tank listing states capacity, internal pressure, temperature and material.</w:t>
+        <w:t>Carbon steel and fiberglass storage tanks</w:t>
+      </w:r>
+    </w:p>
+    <w:p>
+      <w:r>
+        <w:rPr>
+          <w:rFonts w:ascii="Roboto" w:hAnsi="Roboto" w:eastAsia="Roboto"/>
+        </w:rPr>
+        <w:t>Each tank listing states capacity, internal pressure, temperature and material. Stainless steel 304 and glass-lined tanks lead our tank inventory, alongside stainless steel 316 and 316L, carbon steel and fiberglass, with capacities from 5 L to 565,000 L (1 to 149,258 gal). Pricing depends on manufacturer, capacity, material of construction and condition, and IPP quotes each stock number individually with a video or on-site inspection on request.</w:t>
       </w:r>
     </w:p>
     <w:p>

</xml_diff>

<commit_message>
Chemical page: Why IPP, seller steps and makers in the reference format
- Why IPP: five benefit labels as vertical tabs, each panel with a two-sentence opener, lead-in, descriptive items and closing paragraph.
- Seller steps: four numbered vertical tabs in the same panel shape (information that starts a sale, valuation, sale structures, decommissioning and removal).
- Manufacturers: list items carry verified models; close adds pricing factors and the quote.
- Industries: opener left; lead-in, list and close right.
- Tab script drives all four tab groups independently; validator adds panel-shape and tab checks (123 pass). Role table, README, Word copy and standalone preview updated.

Co-Authored-By: Claude Opus 5.5 <noreply@anthropic.com>
</commit_message>
<xml_diff>
--- a/docs/chemical-build/deliverables/used-chemical-process-plants-for-sale-content.docx
+++ b/docs/chemical-build/deliverables/used-chemical-process-plants-for-sale-content.docx
@@ -2611,7 +2611,7 @@
         <w:rPr>
           <w:rFonts w:ascii="Roboto" w:hAnsi="Roboto" w:eastAsia="Roboto"/>
         </w:rPr>
-        <w:t>IPP stocks used chemical process equipment as individual units and connected systems for reaction, heat transfer, separation, drying, filtration, distillation and storage. Chemical producers buy these units to add capacity or replace process units.</w:t>
+        <w:t>IPP stocks used chemical process equipment and machinery as individual units and connected systems for reaction, heat transfer, separation, drying, filtration, distillation and storage. Chemical processing plants buy these units to add capacity or replace process units.</w:t>
       </w:r>
     </w:p>
     <w:p>
@@ -3446,7 +3446,7 @@
         <w:rPr>
           <w:rFonts w:ascii="Roboto" w:hAnsi="Roboto" w:eastAsia="Roboto"/>
         </w:rPr>
-        <w:t>Glass-lined reactors, tanks and agitators</w:t>
+        <w:t>Glass-lined reactors (RA, E, BE and ELL models), tanks, agitators and columns</w:t>
       </w:r>
     </w:p>
     <w:p>
@@ -3467,7 +3467,7 @@
         <w:rPr>
           <w:rFonts w:ascii="Roboto" w:hAnsi="Roboto" w:eastAsia="Roboto"/>
         </w:rPr>
-        <w:t>Glass-lined reactors and tanks</w:t>
+        <w:t>Glass-lined reactors (SA, CTJ, STA and CSA models), tanks and columns</w:t>
       </w:r>
     </w:p>
     <w:p>
@@ -3509,7 +3509,7 @@
         <w:rPr>
           <w:rFonts w:ascii="Roboto" w:hAnsi="Roboto" w:eastAsia="Roboto"/>
         </w:rPr>
-        <w:t>Centrifuges</w:t>
+        <w:t>Centrifuges, including Hastelloy C22 peeler units</w:t>
       </w:r>
     </w:p>
     <w:p>
@@ -3551,7 +3551,7 @@
         <w:rPr>
           <w:rFonts w:ascii="Roboto" w:hAnsi="Roboto" w:eastAsia="Roboto"/>
         </w:rPr>
-        <w:t>New stainless steel equipment from the IPP group</w:t>
+        <w:t>New 316L stainless steel and Hastelloy reactors from the IPP group, 12 to 16 week average delivery</w:t>
       </w:r>
     </w:p>
     <w:p>
@@ -3572,15 +3572,15 @@
         <w:rPr>
           <w:rFonts w:ascii="Roboto" w:hAnsi="Roboto" w:eastAsia="Roboto"/>
         </w:rPr>
-        <w:t>New and re-glassed glass-lined equipment from the IPP group</w:t>
-      </w:r>
-    </w:p>
-    <w:p>
-      <w:r>
-        <w:rPr>
-          <w:rFonts w:ascii="Roboto" w:hAnsi="Roboto" w:eastAsia="Roboto"/>
-        </w:rPr>
-        <w:t>Each link opens that manufacturer’s listings in IPP’s inventory, filtered by equipment type. Our sourcing team searches our global network for a maker or model not listed.</w:t>
+        <w:t>New, used, rebuilt and re-glassed glass-lined equipment, including UA-300 and UA-500 reactors</w:t>
+      </w:r>
+    </w:p>
+    <w:p>
+      <w:r>
+        <w:rPr>
+          <w:rFonts w:ascii="Roboto" w:hAnsi="Roboto" w:eastAsia="Roboto"/>
+        </w:rPr>
+        <w:t>Each link opens that manufacturer’s listings in IPP’s inventory, filtered by equipment type. Pricing depends on manufacturer, model, material of construction and condition, and our team quotes each stock number individually. Our sourcing team searches our global network for a maker or model not listed.</w:t>
       </w:r>
     </w:p>
     <w:p>
@@ -3603,14 +3603,6 @@
       </w:r>
     </w:p>
     <w:p>
-      <w:r>
-        <w:rPr>
-          <w:rFonts w:ascii="Roboto" w:hAnsi="Roboto" w:eastAsia="Roboto"/>
-        </w:rPr>
-        <w:t>01</w:t>
-      </w:r>
-    </w:p>
-    <w:p>
       <w:pPr>
         <w:pStyle w:val="Heading3"/>
       </w:pPr>
@@ -3626,15 +3618,78 @@
         <w:rPr>
           <w:rFonts w:ascii="Roboto" w:hAnsi="Roboto" w:eastAsia="Roboto"/>
         </w:rPr>
-        <w:t>In-stock equipment from IPP is ready to ship. We confirm the release date for each stock number. We store units at company-owned warehouses and workshops in South Carolina, England and Germany.</w:t>
-      </w:r>
-    </w:p>
-    <w:p>
-      <w:r>
-        <w:rPr>
-          <w:rFonts w:ascii="Roboto" w:hAnsi="Roboto" w:eastAsia="Roboto"/>
-        </w:rPr>
-        <w:t>02</w:t>
+        <w:t>We ship in-stock chemical process equipment from company-owned warehouses and workshops in Eastover (South Carolina), Billingham (England) and Bitterfeld-Wolfen (Germany). As a supplier chemical producers rely on for short project schedules, IPP confirms the release date for each stock number before purchase.</w:t>
+      </w:r>
+    </w:p>
+    <w:p>
+      <w:r>
+        <w:rPr>
+          <w:rFonts w:ascii="Roboto" w:hAnsi="Roboto" w:eastAsia="Roboto"/>
+        </w:rPr>
+        <w:t>Our availability support covers:</w:t>
+      </w:r>
+    </w:p>
+    <w:p>
+      <w:pPr>
+        <w:pStyle w:val="ListBullet"/>
+      </w:pPr>
+      <w:r>
+        <w:rPr>
+          <w:rFonts w:ascii="Roboto" w:hAnsi="Roboto" w:eastAsia="Roboto"/>
+        </w:rPr>
+        <w:t>Release dates confirmed for each stock number</w:t>
+      </w:r>
+    </w:p>
+    <w:p>
+      <w:pPr>
+        <w:pStyle w:val="ListBullet"/>
+      </w:pPr>
+      <w:r>
+        <w:rPr>
+          <w:rFonts w:ascii="Roboto" w:hAnsi="Roboto" w:eastAsia="Roboto"/>
+        </w:rPr>
+        <w:t>Units held at company-owned warehouses and workshops</w:t>
+      </w:r>
+    </w:p>
+    <w:p>
+      <w:pPr>
+        <w:pStyle w:val="ListBullet"/>
+      </w:pPr>
+      <w:r>
+        <w:rPr>
+          <w:rFonts w:ascii="Roboto" w:hAnsi="Roboto" w:eastAsia="Roboto"/>
+        </w:rPr>
+        <w:t>Complete plants ready to restart in place or relocate</w:t>
+      </w:r>
+    </w:p>
+    <w:p>
+      <w:pPr>
+        <w:pStyle w:val="ListBullet"/>
+      </w:pPr>
+      <w:r>
+        <w:rPr>
+          <w:rFonts w:ascii="Roboto" w:hAnsi="Roboto" w:eastAsia="Roboto"/>
+        </w:rPr>
+        <w:t>Loading and international shipping arranged by IPP</w:t>
+      </w:r>
+    </w:p>
+    <w:p>
+      <w:pPr>
+        <w:pStyle w:val="ListBullet"/>
+      </w:pPr>
+      <w:r>
+        <w:rPr>
+          <w:rFonts w:ascii="Roboto" w:hAnsi="Roboto" w:eastAsia="Roboto"/>
+        </w:rPr>
+        <w:t>New stainless steel equipment from GPS with 12 to 16 week average delivery</w:t>
+      </w:r>
+    </w:p>
+    <w:p>
+      <w:r>
+        <w:rPr>
+          <w:rFonts w:ascii="Roboto" w:hAnsi="Roboto" w:eastAsia="Roboto"/>
+        </w:rPr>
+        <w:t>Delivery timing depends on the asset location, dismantling scope and shipping route. Our quotation states each of these elements for the stock number a buyer selects.</w:t>
       </w:r>
     </w:p>
     <w:p>
@@ -3653,15 +3708,78 @@
         <w:rPr>
           <w:rFonts w:ascii="Roboto" w:hAnsi="Roboto" w:eastAsia="Roboto"/>
         </w:rPr>
-        <w:t>IPP stocks chemical process equipment from Pfaudler, De Dietrich, Alfa Laval, Westfalia and other original manufacturers, alongside complete plant lines. Chemical buyers compare reactors, heat exchangers, centrifuges, dryers, filters, columns and tanks in one inventory. Our plant listings state capacity, technology and feedstock for each complete plant.</w:t>
-      </w:r>
-    </w:p>
-    <w:p>
-      <w:r>
-        <w:rPr>
-          <w:rFonts w:ascii="Roboto" w:hAnsi="Roboto" w:eastAsia="Roboto"/>
-        </w:rPr>
-        <w:t>03</w:t>
+        <w:t>IPP stocks chemical process equipment from Pfaudler, De Dietrich, Alfa Laval, Westfalia and other original manufacturers, alongside complete plant lines. Our inventory holds 15,000+ pieces of equipment and 20 complete process plant sites, so chemical buyers compare reactors, heat exchangers, centrifuges, dryers, filters, columns and tanks in one place.</w:t>
+      </w:r>
+    </w:p>
+    <w:p>
+      <w:r>
+        <w:rPr>
+          <w:rFonts w:ascii="Roboto" w:hAnsi="Roboto" w:eastAsia="Roboto"/>
+        </w:rPr>
+        <w:t>Our chemical inventory covers:</w:t>
+      </w:r>
+    </w:p>
+    <w:p>
+      <w:pPr>
+        <w:pStyle w:val="ListBullet"/>
+      </w:pPr>
+      <w:r>
+        <w:rPr>
+          <w:rFonts w:ascii="Roboto" w:hAnsi="Roboto" w:eastAsia="Roboto"/>
+        </w:rPr>
+        <w:t>Complete chemical plants for relocation or restart</w:t>
+      </w:r>
+    </w:p>
+    <w:p>
+      <w:pPr>
+        <w:pStyle w:val="ListBullet"/>
+      </w:pPr>
+      <w:r>
+        <w:rPr>
+          <w:rFonts w:ascii="Roboto" w:hAnsi="Roboto" w:eastAsia="Roboto"/>
+        </w:rPr>
+        <w:t>Process lines and connected systems</w:t>
+      </w:r>
+    </w:p>
+    <w:p>
+      <w:pPr>
+        <w:pStyle w:val="ListBullet"/>
+      </w:pPr>
+      <w:r>
+        <w:rPr>
+          <w:rFonts w:ascii="Roboto" w:hAnsi="Roboto" w:eastAsia="Roboto"/>
+        </w:rPr>
+        <w:t>Reactors, heat exchangers and centrifuges</w:t>
+      </w:r>
+    </w:p>
+    <w:p>
+      <w:pPr>
+        <w:pStyle w:val="ListBullet"/>
+      </w:pPr>
+      <w:r>
+        <w:rPr>
+          <w:rFonts w:ascii="Roboto" w:hAnsi="Roboto" w:eastAsia="Roboto"/>
+        </w:rPr>
+        <w:t>Dryers, filters, distillation columns and tanks</w:t>
+      </w:r>
+    </w:p>
+    <w:p>
+      <w:pPr>
+        <w:pStyle w:val="ListBullet"/>
+      </w:pPr>
+      <w:r>
+        <w:rPr>
+          <w:rFonts w:ascii="Roboto" w:hAnsi="Roboto" w:eastAsia="Roboto"/>
+        </w:rPr>
+        <w:t>Re-glassed equipment from UGE and new equipment from GPS</w:t>
+      </w:r>
+    </w:p>
+    <w:p>
+      <w:r>
+        <w:rPr>
+          <w:rFonts w:ascii="Roboto" w:hAnsi="Roboto" w:eastAsia="Roboto"/>
+        </w:rPr>
+        <w:t>Buyers filter the inventory by equipment type, material, condition and manufacturer. Our plant listings state capacity, technology and feedstock for each complete plant.</w:t>
       </w:r>
     </w:p>
     <w:p>
@@ -3680,15 +3798,78 @@
         <w:rPr>
           <w:rFonts w:ascii="Roboto" w:hAnsi="Roboto" w:eastAsia="Roboto"/>
         </w:rPr>
-        <w:t>We operate offices in 15 countries, including the United States, the United Kingdom, Germany, India and Brazil. IPP has served 160,000+ customers worldwide. We arrange international shipping, or buyers arrange their own.</w:t>
-      </w:r>
-    </w:p>
-    <w:p>
-      <w:r>
-        <w:rPr>
-          <w:rFonts w:ascii="Roboto" w:hAnsi="Roboto" w:eastAsia="Roboto"/>
-        </w:rPr>
-        <w:t>04</w:t>
+        <w:t>We operate offices in 15 countries, including the United States, the United Kingdom, Germany, India and Brazil. IPP has served 160,000+ customers worldwide and supports each buyer from inspection through delivery at the destination site.</w:t>
+      </w:r>
+    </w:p>
+    <w:p>
+      <w:r>
+        <w:rPr>
+          <w:rFonts w:ascii="Roboto" w:hAnsi="Roboto" w:eastAsia="Roboto"/>
+        </w:rPr>
+        <w:t>Our global project support covers:</w:t>
+      </w:r>
+    </w:p>
+    <w:p>
+      <w:pPr>
+        <w:pStyle w:val="ListBullet"/>
+      </w:pPr>
+      <w:r>
+        <w:rPr>
+          <w:rFonts w:ascii="Roboto" w:hAnsi="Roboto" w:eastAsia="Roboto"/>
+        </w:rPr>
+        <w:t>Video or on-site inspections at the asset location</w:t>
+      </w:r>
+    </w:p>
+    <w:p>
+      <w:pPr>
+        <w:pStyle w:val="ListBullet"/>
+      </w:pPr>
+      <w:r>
+        <w:rPr>
+          <w:rFonts w:ascii="Roboto" w:hAnsi="Roboto" w:eastAsia="Roboto"/>
+        </w:rPr>
+        <w:t>Dismantling and relocation coordination</w:t>
+      </w:r>
+    </w:p>
+    <w:p>
+      <w:pPr>
+        <w:pStyle w:val="ListBullet"/>
+      </w:pPr>
+      <w:r>
+        <w:rPr>
+          <w:rFonts w:ascii="Roboto" w:hAnsi="Roboto" w:eastAsia="Roboto"/>
+        </w:rPr>
+        <w:t>Packaging, crating and international freight</w:t>
+      </w:r>
+    </w:p>
+    <w:p>
+      <w:pPr>
+        <w:pStyle w:val="ListBullet"/>
+      </w:pPr>
+      <w:r>
+        <w:rPr>
+          <w:rFonts w:ascii="Roboto" w:hAnsi="Roboto" w:eastAsia="Roboto"/>
+        </w:rPr>
+        <w:t>Export arrangements for complete plants and individual units</w:t>
+      </w:r>
+    </w:p>
+    <w:p>
+      <w:pPr>
+        <w:pStyle w:val="ListBullet"/>
+      </w:pPr>
+      <w:r>
+        <w:rPr>
+          <w:rFonts w:ascii="Roboto" w:hAnsi="Roboto" w:eastAsia="Roboto"/>
+        </w:rPr>
+        <w:t>Installation and start-up support scoped for each project</w:t>
+      </w:r>
+    </w:p>
+    <w:p>
+      <w:r>
+        <w:rPr>
+          <w:rFonts w:ascii="Roboto" w:hAnsi="Roboto" w:eastAsia="Roboto"/>
+        </w:rPr>
+        <w:t>IPP arranges international shipping, or buyers arrange their own. Our quotation lists the services included in each project.</w:t>
       </w:r>
     </w:p>
     <w:p>
@@ -3707,15 +3888,78 @@
         <w:rPr>
           <w:rFonts w:ascii="Roboto" w:hAnsi="Roboto" w:eastAsia="Roboto"/>
         </w:rPr>
-        <w:t>IPP sources equipment from operating plants with known history. We supply the records available for each stock number. Buyers review photographs, drawings and inspection records before purchase.</w:t>
-      </w:r>
-    </w:p>
-    <w:p>
-      <w:r>
-        <w:rPr>
-          <w:rFonts w:ascii="Roboto" w:hAnsi="Roboto" w:eastAsia="Roboto"/>
-        </w:rPr>
-        <w:t>05</w:t>
+        <w:t>IPP sources equipment from operating plants with known history, including multinational chemical producers, toll manufacturers and restructured facilities. We supply the records available for each stock number, so engineering and quality teams review an asset before purchase.</w:t>
+      </w:r>
+    </w:p>
+    <w:p>
+      <w:r>
+        <w:rPr>
+          <w:rFonts w:ascii="Roboto" w:hAnsi="Roboto" w:eastAsia="Roboto"/>
+        </w:rPr>
+        <w:t>Records available for review include:</w:t>
+      </w:r>
+    </w:p>
+    <w:p>
+      <w:pPr>
+        <w:pStyle w:val="ListBullet"/>
+      </w:pPr>
+      <w:r>
+        <w:rPr>
+          <w:rFonts w:ascii="Roboto" w:hAnsi="Roboto" w:eastAsia="Roboto"/>
+        </w:rPr>
+        <w:t>Photographs of each unit</w:t>
+      </w:r>
+    </w:p>
+    <w:p>
+      <w:pPr>
+        <w:pStyle w:val="ListBullet"/>
+      </w:pPr>
+      <w:r>
+        <w:rPr>
+          <w:rFonts w:ascii="Roboto" w:hAnsi="Roboto" w:eastAsia="Roboto"/>
+        </w:rPr>
+        <w:t>Equipment drawings</w:t>
+      </w:r>
+    </w:p>
+    <w:p>
+      <w:pPr>
+        <w:pStyle w:val="ListBullet"/>
+      </w:pPr>
+      <w:r>
+        <w:rPr>
+          <w:rFonts w:ascii="Roboto" w:hAnsi="Roboto" w:eastAsia="Roboto"/>
+        </w:rPr>
+        <w:t>Process descriptions for complete plants</w:t>
+      </w:r>
+    </w:p>
+    <w:p>
+      <w:pPr>
+        <w:pStyle w:val="ListBullet"/>
+      </w:pPr>
+      <w:r>
+        <w:rPr>
+          <w:rFonts w:ascii="Roboto" w:hAnsi="Roboto" w:eastAsia="Roboto"/>
+        </w:rPr>
+        <w:t>Inspection records</w:t>
+      </w:r>
+    </w:p>
+    <w:p>
+      <w:pPr>
+        <w:pStyle w:val="ListBullet"/>
+      </w:pPr>
+      <w:r>
+        <w:rPr>
+          <w:rFonts w:ascii="Roboto" w:hAnsi="Roboto" w:eastAsia="Roboto"/>
+        </w:rPr>
+        <w:t>Equipment lists for plants and process lines</w:t>
+      </w:r>
+    </w:p>
+    <w:p>
+      <w:r>
+        <w:rPr>
+          <w:rFonts w:ascii="Roboto" w:hAnsi="Roboto" w:eastAsia="Roboto"/>
+        </w:rPr>
+        <w:t>The records available differ by asset, and our team confirms them for each stock number. Buyers arrange a video or on-site inspection to verify the unit in person.</w:t>
       </w:r>
     </w:p>
     <w:p>
@@ -3734,7 +3978,83 @@
         <w:rPr>
           <w:rFonts w:ascii="Roboto" w:hAnsi="Roboto" w:eastAsia="Roboto"/>
         </w:rPr>
-        <w:t>Purchasing used chemical process equipment from IPP can save up to 50% of capital and 90% of lead time versus buying new. The exact savings depend on manufacturer, capacity, material of construction, and condition. We provide a detailed quote for each stock number on request.</w:t>
+        <w:t>Purchasing used chemical process equipment from IPP can save up to 50% of capital and 90% of lead time versus buying new. The exact savings depend on manufacturer, capacity, material of construction, and condition.</w:t>
+      </w:r>
+    </w:p>
+    <w:p>
+      <w:r>
+        <w:rPr>
+          <w:rFonts w:ascii="Roboto" w:hAnsi="Roboto" w:eastAsia="Roboto"/>
+        </w:rPr>
+        <w:t>Our cost and quotation support covers:</w:t>
+      </w:r>
+    </w:p>
+    <w:p>
+      <w:pPr>
+        <w:pStyle w:val="ListBullet"/>
+      </w:pPr>
+      <w:r>
+        <w:rPr>
+          <w:rFonts w:ascii="Roboto" w:hAnsi="Roboto" w:eastAsia="Roboto"/>
+        </w:rPr>
+        <w:t>Detailed quotes for each stock number on request</w:t>
+      </w:r>
+    </w:p>
+    <w:p>
+      <w:pPr>
+        <w:pStyle w:val="ListBullet"/>
+      </w:pPr>
+      <w:r>
+        <w:rPr>
+          <w:rFonts w:ascii="Roboto" w:hAnsi="Roboto" w:eastAsia="Roboto"/>
+        </w:rPr>
+        <w:t>Quotations that define the assets and services included</w:t>
+      </w:r>
+    </w:p>
+    <w:p>
+      <w:pPr>
+        <w:pStyle w:val="ListBullet"/>
+      </w:pPr>
+      <w:r>
+        <w:rPr>
+          <w:rFonts w:ascii="Roboto" w:hAnsi="Roboto" w:eastAsia="Roboto"/>
+        </w:rPr>
+        <w:t>Dismantling, loading and shipping scoped in one quotation</w:t>
+      </w:r>
+    </w:p>
+    <w:p>
+      <w:pPr>
+        <w:pStyle w:val="ListBullet"/>
+      </w:pPr>
+      <w:r>
+        <w:rPr>
+          <w:rFonts w:ascii="Roboto" w:hAnsi="Roboto" w:eastAsia="Roboto"/>
+        </w:rPr>
+        <w:t>Financing for plants and equipment</w:t>
+      </w:r>
+    </w:p>
+    <w:p>
+      <w:r>
+        <w:rPr>
+          <w:rFonts w:ascii="Roboto" w:hAnsi="Roboto" w:eastAsia="Roboto"/>
+        </w:rPr>
+        <w:t xml:space="preserve">We provide a detailed quote for each stock number on request. </w:t>
+      </w:r>
+      <w:hyperlink r:id="rId11">
+        <w:r>
+          <w:rPr>
+            <w:rFonts w:ascii="Roboto" w:hAnsi="Roboto"/>
+            <w:color w:val="0563C1"/>
+            <w:u w:val="single"/>
+          </w:rPr>
+          <w:t xml:space="preserve">Contact IPP</w:t>
+        </w:r>
+      </w:hyperlink>
+      <w:r>
+        <w:rPr>
+          <w:rFonts w:ascii="Roboto" w:hAnsi="Roboto" w:eastAsia="Roboto"/>
+        </w:rPr>
+        <w:t xml:space="preserve"> with the stock number or process requirements to start a quotation.</w:t>
       </w:r>
     </w:p>
     <w:p>
@@ -4127,86 +4447,394 @@
     </w:p>
     <w:p>
       <w:pPr>
-        <w:pStyle w:val="ListNumber"/>
-        <w:numPr>
-          <w:ilvl w:val="0"/>
-          <w:numId w:val="11"/>
-        </w:numPr>
-      </w:pPr>
-      <w:r>
-        <w:rPr>
-          <w:rFonts w:ascii="Roboto" w:hAnsi="Roboto" w:eastAsia="Roboto"/>
+        <w:pStyle w:val="Heading3"/>
+      </w:pPr>
+      <w:r>
+        <w:rPr>
+          <w:rFonts w:ascii="Montserrat" w:hAnsi="Montserrat" w:eastAsia="Outfit"/>
         </w:rPr>
         <w:t>Send your asset information</w:t>
       </w:r>
-      <w:r>
-        <w:rPr>
-          <w:rFonts w:ascii="Roboto" w:hAnsi="Roboto" w:eastAsia="Roboto"/>
-        </w:rPr>
-        <w:t>Send the asset list, photographs, plant location, available technical documents and removal deadline. Our forms to sell a plant or sell equipment collect each item. Plant owners, asset managers and corporate teams use the same forms for a complete site or a single surplus unit.</w:t>
-      </w:r>
-    </w:p>
-    <w:p>
-      <w:pPr>
-        <w:pStyle w:val="ListNumber"/>
-        <w:numPr>
-          <w:ilvl w:val="0"/>
-          <w:numId w:val="11"/>
-        </w:numPr>
-      </w:pPr>
-      <w:r>
-        <w:rPr>
-          <w:rFonts w:ascii="Roboto" w:hAnsi="Roboto" w:eastAsia="Roboto"/>
+    </w:p>
+    <w:p>
+      <w:r>
+        <w:rPr>
+          <w:rFonts w:ascii="Roboto" w:hAnsi="Roboto" w:eastAsia="Roboto"/>
+        </w:rPr>
+        <w:t>Plant owners, asset managers and corporate teams start a sale by sending their asset information to IPP. Our forms to sell a plant or sell equipment collect each item for a complete site or a single surplus unit.</w:t>
+      </w:r>
+    </w:p>
+    <w:p>
+      <w:r>
+        <w:rPr>
+          <w:rFonts w:ascii="Roboto" w:hAnsi="Roboto" w:eastAsia="Roboto"/>
+        </w:rPr>
+        <w:t>Information that starts a sale includes:</w:t>
+      </w:r>
+    </w:p>
+    <w:p>
+      <w:pPr>
+        <w:pStyle w:val="ListBullet"/>
+      </w:pPr>
+      <w:r>
+        <w:rPr>
+          <w:rFonts w:ascii="Roboto" w:hAnsi="Roboto" w:eastAsia="Roboto"/>
+        </w:rPr>
+        <w:t>The asset list for the plant, line or unit</w:t>
+      </w:r>
+    </w:p>
+    <w:p>
+      <w:pPr>
+        <w:pStyle w:val="ListBullet"/>
+      </w:pPr>
+      <w:r>
+        <w:rPr>
+          <w:rFonts w:ascii="Roboto" w:hAnsi="Roboto" w:eastAsia="Roboto"/>
+        </w:rPr>
+        <w:t>Photographs of the equipment and site</w:t>
+      </w:r>
+    </w:p>
+    <w:p>
+      <w:pPr>
+        <w:pStyle w:val="ListBullet"/>
+      </w:pPr>
+      <w:r>
+        <w:rPr>
+          <w:rFonts w:ascii="Roboto" w:hAnsi="Roboto" w:eastAsia="Roboto"/>
+        </w:rPr>
+        <w:t>The plant location</w:t>
+      </w:r>
+    </w:p>
+    <w:p>
+      <w:pPr>
+        <w:pStyle w:val="ListBullet"/>
+      </w:pPr>
+      <w:r>
+        <w:rPr>
+          <w:rFonts w:ascii="Roboto" w:hAnsi="Roboto" w:eastAsia="Roboto"/>
+        </w:rPr>
+        <w:t>Available technical documents</w:t>
+      </w:r>
+    </w:p>
+    <w:p>
+      <w:pPr>
+        <w:pStyle w:val="ListBullet"/>
+      </w:pPr>
+      <w:r>
+        <w:rPr>
+          <w:rFonts w:ascii="Roboto" w:hAnsi="Roboto" w:eastAsia="Roboto"/>
+        </w:rPr>
+        <w:t>The removal deadline</w:t>
+      </w:r>
+    </w:p>
+    <w:p>
+      <w:r>
+        <w:rPr>
+          <w:rFonts w:ascii="Roboto" w:hAnsi="Roboto" w:eastAsia="Roboto"/>
+        </w:rPr>
+        <w:t xml:space="preserve">Our team reviews the information and confirms the next steps. Sellers send the details through the </w:t>
+      </w:r>
+      <w:hyperlink r:id="rId9">
+        <w:r>
+          <w:rPr>
+            <w:rFonts w:ascii="Roboto" w:hAnsi="Roboto"/>
+            <w:color w:val="0563C1"/>
+            <w:u w:val="single"/>
+          </w:rPr>
+          <w:t xml:space="preserve">sell-a-plant</w:t>
+        </w:r>
+      </w:hyperlink>
+      <w:r>
+        <w:rPr>
+          <w:rFonts w:ascii="Roboto" w:hAnsi="Roboto" w:eastAsia="Roboto"/>
+        </w:rPr>
+        <w:t xml:space="preserve"> or </w:t>
+      </w:r>
+      <w:hyperlink r:id="rId10">
+        <w:r>
+          <w:rPr>
+            <w:rFonts w:ascii="Roboto" w:hAnsi="Roboto"/>
+            <w:color w:val="0563C1"/>
+            <w:u w:val="single"/>
+          </w:rPr>
+          <w:t xml:space="preserve">sell-equipment</w:t>
+        </w:r>
+      </w:hyperlink>
+      <w:r>
+        <w:rPr>
+          <w:rFonts w:ascii="Roboto" w:hAnsi="Roboto" w:eastAsia="Roboto"/>
+        </w:rPr>
+        <w:t xml:space="preserve"> form.</w:t>
+      </w:r>
+    </w:p>
+    <w:p>
+      <w:pPr>
+        <w:pStyle w:val="Heading3"/>
+      </w:pPr>
+      <w:r>
+        <w:rPr>
+          <w:rFonts w:ascii="Montserrat" w:hAnsi="Montserrat" w:eastAsia="Outfit"/>
         </w:rPr>
         <w:t>IPP values the assets</w:t>
       </w:r>
-      <w:r>
-        <w:rPr>
-          <w:rFonts w:ascii="Roboto" w:hAnsi="Roboto" w:eastAsia="Roboto"/>
-        </w:rPr>
-        <w:t>We review the information and inspect the plant site where needed. IPP then values the assets for an outright purchase or for marketing to its global buyer network. We evaluate equipment too large, too specialized or too site-bound for traditional resellers, such as specialty alloy reactors and custom drying and distillation systems.</w:t>
-      </w:r>
-    </w:p>
-    <w:p>
-      <w:pPr>
-        <w:pStyle w:val="ListNumber"/>
-        <w:numPr>
-          <w:ilvl w:val="0"/>
-          <w:numId w:val="11"/>
-        </w:numPr>
-      </w:pPr>
-      <w:r>
-        <w:rPr>
-          <w:rFonts w:ascii="Roboto" w:hAnsi="Roboto" w:eastAsia="Roboto"/>
+    </w:p>
+    <w:p>
+      <w:r>
+        <w:rPr>
+          <w:rFonts w:ascii="Roboto" w:hAnsi="Roboto" w:eastAsia="Roboto"/>
+        </w:rPr>
+        <w:t>We review the information and inspect the plant site where needed. IPP then values the assets for an outright purchase or for marketing to its global buyer network.</w:t>
+      </w:r>
+    </w:p>
+    <w:p>
+      <w:r>
+        <w:rPr>
+          <w:rFonts w:ascii="Roboto" w:hAnsi="Roboto" w:eastAsia="Roboto"/>
+        </w:rPr>
+        <w:t>Our valuation covers:</w:t>
+      </w:r>
+    </w:p>
+    <w:p>
+      <w:pPr>
+        <w:pStyle w:val="ListBullet"/>
+      </w:pPr>
+      <w:r>
+        <w:rPr>
+          <w:rFonts w:ascii="Roboto" w:hAnsi="Roboto" w:eastAsia="Roboto"/>
+        </w:rPr>
+        <w:t>Complete plant sites with land, buildings, equipment and intellectual property</w:t>
+      </w:r>
+    </w:p>
+    <w:p>
+      <w:pPr>
+        <w:pStyle w:val="ListBullet"/>
+      </w:pPr>
+      <w:r>
+        <w:rPr>
+          <w:rFonts w:ascii="Roboto" w:hAnsi="Roboto" w:eastAsia="Roboto"/>
+        </w:rPr>
+        <w:t>Process units and equipment systems within a site</w:t>
+      </w:r>
+    </w:p>
+    <w:p>
+      <w:pPr>
+        <w:pStyle w:val="ListBullet"/>
+      </w:pPr>
+      <w:r>
+        <w:rPr>
+          <w:rFonts w:ascii="Roboto" w:hAnsi="Roboto" w:eastAsia="Roboto"/>
+        </w:rPr>
+        <w:t>Specialty alloy reactors and custom drying and distillation systems</w:t>
+      </w:r>
+    </w:p>
+    <w:p>
+      <w:pPr>
+        <w:pStyle w:val="ListBullet"/>
+      </w:pPr>
+      <w:r>
+        <w:rPr>
+          <w:rFonts w:ascii="Roboto" w:hAnsi="Roboto" w:eastAsia="Roboto"/>
+        </w:rPr>
+        <w:t>Equipment too large, too specialized or too site-bound for traditional resellers</w:t>
+      </w:r>
+    </w:p>
+    <w:p>
+      <w:pPr>
+        <w:pStyle w:val="ListBullet"/>
+      </w:pPr>
+      <w:r>
+        <w:rPr>
+          <w:rFonts w:ascii="Roboto" w:hAnsi="Roboto" w:eastAsia="Roboto"/>
+        </w:rPr>
+        <w:t>Intact, mothballed and partially dismantled plant sites</w:t>
+      </w:r>
+    </w:p>
+    <w:p>
+      <w:r>
+        <w:rPr>
+          <w:rFonts w:ascii="Roboto" w:hAnsi="Roboto" w:eastAsia="Roboto"/>
+        </w:rPr>
+        <w:t>IPP then proposes a purchase or a marketing arrangement for the assets. The proposal reflects the asset type, condition, documentation and removal scope.</w:t>
+      </w:r>
+    </w:p>
+    <w:p>
+      <w:pPr>
+        <w:pStyle w:val="Heading3"/>
+      </w:pPr>
+      <w:r>
+        <w:rPr>
+          <w:rFonts w:ascii="Montserrat" w:hAnsi="Montserrat" w:eastAsia="Outfit"/>
         </w:rPr>
         <w:t>Agree the sale structure</w:t>
       </w:r>
-      <w:r>
-        <w:rPr>
-          <w:rFonts w:ascii="Roboto" w:hAnsi="Roboto" w:eastAsia="Roboto"/>
-        </w:rPr>
-        <w:t>IPP buys equipment as-is, where-is, as a principal buyer rather than a broker. A complete plant sale can include the land, buildings, equipment and intellectual property. We offer flexible purchase structures for a warehouse clearance, a plant closure or a portfolio sale.</w:t>
-      </w:r>
-    </w:p>
-    <w:p>
-      <w:pPr>
-        <w:pStyle w:val="ListNumber"/>
-        <w:numPr>
-          <w:ilvl w:val="0"/>
-          <w:numId w:val="11"/>
-        </w:numPr>
-      </w:pPr>
-      <w:r>
-        <w:rPr>
-          <w:rFonts w:ascii="Roboto" w:hAnsi="Roboto" w:eastAsia="Roboto"/>
+    </w:p>
+    <w:p>
+      <w:r>
+        <w:rPr>
+          <w:rFonts w:ascii="Roboto" w:hAnsi="Roboto" w:eastAsia="Roboto"/>
+        </w:rPr>
+        <w:t>IPP buys equipment as-is, where-is, as a principal buyer rather than a broker. We offer flexible purchase structures for a warehouse clearance, a plant closure or a portfolio sale.</w:t>
+      </w:r>
+    </w:p>
+    <w:p>
+      <w:r>
+        <w:rPr>
+          <w:rFonts w:ascii="Roboto" w:hAnsi="Roboto" w:eastAsia="Roboto"/>
+        </w:rPr>
+        <w:t>Sale structures we offer include:</w:t>
+      </w:r>
+    </w:p>
+    <w:p>
+      <w:pPr>
+        <w:pStyle w:val="ListBullet"/>
+      </w:pPr>
+      <w:r>
+        <w:rPr>
+          <w:rFonts w:ascii="Roboto" w:hAnsi="Roboto" w:eastAsia="Roboto"/>
+        </w:rPr>
+        <w:t>Outright purchase of equipment as-is, where-is</w:t>
+      </w:r>
+    </w:p>
+    <w:p>
+      <w:pPr>
+        <w:pStyle w:val="ListBullet"/>
+      </w:pPr>
+      <w:r>
+        <w:rPr>
+          <w:rFonts w:ascii="Roboto" w:hAnsi="Roboto" w:eastAsia="Roboto"/>
+        </w:rPr>
+        <w:t>Complete plant sales including land, buildings, equipment and intellectual property</w:t>
+      </w:r>
+    </w:p>
+    <w:p>
+      <w:pPr>
+        <w:pStyle w:val="ListBullet"/>
+      </w:pPr>
+      <w:r>
+        <w:rPr>
+          <w:rFonts w:ascii="Roboto" w:hAnsi="Roboto" w:eastAsia="Roboto"/>
+        </w:rPr>
+        <w:t>Marketing to IPP’s global buyer network</w:t>
+      </w:r>
+    </w:p>
+    <w:p>
+      <w:pPr>
+        <w:pStyle w:val="ListBullet"/>
+      </w:pPr>
+      <w:r>
+        <w:rPr>
+          <w:rFonts w:ascii="Roboto" w:hAnsi="Roboto" w:eastAsia="Roboto"/>
+        </w:rPr>
+        <w:t>Site acquisitions where IPP assumes cleanup and compliance obligations</w:t>
+      </w:r>
+    </w:p>
+    <w:p>
+      <w:pPr>
+        <w:pStyle w:val="ListBullet"/>
+      </w:pPr>
+      <w:r>
+        <w:rPr>
+          <w:rFonts w:ascii="Roboto" w:hAnsi="Roboto" w:eastAsia="Roboto"/>
+        </w:rPr>
+        <w:t>Portfolio sales covering more than one site</w:t>
+      </w:r>
+    </w:p>
+    <w:p>
+      <w:r>
+        <w:rPr>
+          <w:rFonts w:ascii="Roboto" w:hAnsi="Roboto" w:eastAsia="Roboto"/>
+        </w:rPr>
+        <w:t>The purchase agreement defines the assets included, the outcome for the site and the removal schedule. Our team confirms each term before removal begins.</w:t>
+      </w:r>
+    </w:p>
+    <w:p>
+      <w:pPr>
+        <w:pStyle w:val="Heading3"/>
+      </w:pPr>
+      <w:r>
+        <w:rPr>
+          <w:rFonts w:ascii="Montserrat" w:hAnsi="Montserrat" w:eastAsia="Outfit"/>
         </w:rPr>
         <w:t>Decommissioning, dismantling and removal</w:t>
       </w:r>
-      <w:r>
-        <w:rPr>
-          <w:rFonts w:ascii="Roboto" w:hAnsi="Roboto" w:eastAsia="Roboto"/>
-        </w:rPr>
-        <w:t>IPP coordinates plant decommissioning, dismantling, packaging, freight and export. Our team works with the owner’s EHS team on permit closure, emissions compliance and utility shutoffs. We prepare the plant site for its next use, either returning it to the owner or transferring it to a new operator.</w:t>
+    </w:p>
+    <w:p>
+      <w:r>
+        <w:rPr>
+          <w:rFonts w:ascii="Roboto" w:hAnsi="Roboto" w:eastAsia="Roboto"/>
+        </w:rPr>
+        <w:t>IPP coordinates plant decommissioning, dismantling, packaging, freight and export. Our team works with the owner’s EHS team on permit closure, emissions compliance and utility shutoffs.</w:t>
+      </w:r>
+    </w:p>
+    <w:p>
+      <w:r>
+        <w:rPr>
+          <w:rFonts w:ascii="Roboto" w:hAnsi="Roboto" w:eastAsia="Roboto"/>
+        </w:rPr>
+        <w:t>Our decommissioning and removal work covers:</w:t>
+      </w:r>
+    </w:p>
+    <w:p>
+      <w:pPr>
+        <w:pStyle w:val="ListBullet"/>
+      </w:pPr>
+      <w:r>
+        <w:rPr>
+          <w:rFonts w:ascii="Roboto" w:hAnsi="Roboto" w:eastAsia="Roboto"/>
+        </w:rPr>
+        <w:t>Permit closure and emissions compliance with the owner’s EHS team</w:t>
+      </w:r>
+    </w:p>
+    <w:p>
+      <w:pPr>
+        <w:pStyle w:val="ListBullet"/>
+      </w:pPr>
+      <w:r>
+        <w:rPr>
+          <w:rFonts w:ascii="Roboto" w:hAnsi="Roboto" w:eastAsia="Roboto"/>
+        </w:rPr>
+        <w:t>Utility shutoffs</w:t>
+      </w:r>
+    </w:p>
+    <w:p>
+      <w:pPr>
+        <w:pStyle w:val="ListBullet"/>
+      </w:pPr>
+      <w:r>
+        <w:rPr>
+          <w:rFonts w:ascii="Roboto" w:hAnsi="Roboto" w:eastAsia="Roboto"/>
+        </w:rPr>
+        <w:t>Dismantling and removal of process equipment</w:t>
+      </w:r>
+    </w:p>
+    <w:p>
+      <w:pPr>
+        <w:pStyle w:val="ListBullet"/>
+      </w:pPr>
+      <w:r>
+        <w:rPr>
+          <w:rFonts w:ascii="Roboto" w:hAnsi="Roboto" w:eastAsia="Roboto"/>
+        </w:rPr>
+        <w:t>Packaging, freight and export</w:t>
+      </w:r>
+    </w:p>
+    <w:p>
+      <w:pPr>
+        <w:pStyle w:val="ListBullet"/>
+      </w:pPr>
+      <w:r>
+        <w:rPr>
+          <w:rFonts w:ascii="Roboto" w:hAnsi="Roboto" w:eastAsia="Roboto"/>
+        </w:rPr>
+        <w:t>Site preparation for return to the owner or transfer to a new operator</w:t>
+      </w:r>
+    </w:p>
+    <w:p>
+      <w:r>
+        <w:rPr>
+          <w:rFonts w:ascii="Roboto" w:hAnsi="Roboto" w:eastAsia="Roboto"/>
+        </w:rPr>
+        <w:t>IPP’s decommissioning work carries ISN RAVS Plus verification. Our team plans dismantling around the seller’s removal deadline.</w:t>
       </w:r>
     </w:p>
     <w:p>
@@ -4233,81 +4861,81 @@
         <w:rPr>
           <w:rFonts w:ascii="Roboto" w:hAnsi="Roboto" w:eastAsia="Roboto"/>
         </w:rPr>
+        <w:t>Chemical sectors IPP serves include:</w:t>
+      </w:r>
+    </w:p>
+    <w:p>
+      <w:pPr>
+        <w:pStyle w:val="ListBullet"/>
+      </w:pPr>
+      <w:r>
+        <w:rPr>
+          <w:rFonts w:ascii="Roboto" w:hAnsi="Roboto" w:eastAsia="Roboto"/>
+        </w:rPr>
+        <w:t>Petrochemicals</w:t>
+      </w:r>
+    </w:p>
+    <w:p>
+      <w:pPr>
+        <w:pStyle w:val="ListBullet"/>
+      </w:pPr>
+      <w:r>
+        <w:rPr>
+          <w:rFonts w:ascii="Roboto" w:hAnsi="Roboto" w:eastAsia="Roboto"/>
+        </w:rPr>
+        <w:t>Fertilizers</w:t>
+      </w:r>
+    </w:p>
+    <w:p>
+      <w:pPr>
+        <w:pStyle w:val="ListBullet"/>
+      </w:pPr>
+      <w:r>
+        <w:rPr>
+          <w:rFonts w:ascii="Roboto" w:hAnsi="Roboto" w:eastAsia="Roboto"/>
+        </w:rPr>
+        <w:t>Polymers and plastics</w:t>
+      </w:r>
+    </w:p>
+    <w:p>
+      <w:pPr>
+        <w:pStyle w:val="ListBullet"/>
+      </w:pPr>
+      <w:r>
+        <w:rPr>
+          <w:rFonts w:ascii="Roboto" w:hAnsi="Roboto" w:eastAsia="Roboto"/>
+        </w:rPr>
+        <w:t>Solvents, resins and adhesives</w:t>
+      </w:r>
+    </w:p>
+    <w:p>
+      <w:pPr>
+        <w:pStyle w:val="ListBullet"/>
+      </w:pPr>
+      <w:r>
+        <w:rPr>
+          <w:rFonts w:ascii="Roboto" w:hAnsi="Roboto" w:eastAsia="Roboto"/>
+        </w:rPr>
+        <w:t>Acids, amines and surfactants</w:t>
+      </w:r>
+    </w:p>
+    <w:p>
+      <w:pPr>
+        <w:pStyle w:val="ListBullet"/>
+      </w:pPr>
+      <w:r>
+        <w:rPr>
+          <w:rFonts w:ascii="Roboto" w:hAnsi="Roboto" w:eastAsia="Roboto"/>
+        </w:rPr>
+        <w:t>Agrochemicals and specialty chemicals</w:t>
+      </w:r>
+    </w:p>
+    <w:p>
+      <w:r>
+        <w:rPr>
+          <w:rFonts w:ascii="Roboto" w:hAnsi="Roboto" w:eastAsia="Roboto"/>
+        </w:rPr>
         <w:t>Producers in these sectors also sell idle plants and surplus equipment to IPP.</w:t>
-      </w:r>
-    </w:p>
-    <w:p>
-      <w:r>
-        <w:rPr>
-          <w:rFonts w:ascii="Roboto" w:hAnsi="Roboto" w:eastAsia="Roboto"/>
-        </w:rPr>
-        <w:t>Chemical sectors IPP serves include:</w:t>
-      </w:r>
-    </w:p>
-    <w:p>
-      <w:pPr>
-        <w:pStyle w:val="ListBullet"/>
-      </w:pPr>
-      <w:r>
-        <w:rPr>
-          <w:rFonts w:ascii="Roboto" w:hAnsi="Roboto" w:eastAsia="Roboto"/>
-        </w:rPr>
-        <w:t>Petrochemicals</w:t>
-      </w:r>
-    </w:p>
-    <w:p>
-      <w:pPr>
-        <w:pStyle w:val="ListBullet"/>
-      </w:pPr>
-      <w:r>
-        <w:rPr>
-          <w:rFonts w:ascii="Roboto" w:hAnsi="Roboto" w:eastAsia="Roboto"/>
-        </w:rPr>
-        <w:t>Fertilizers</w:t>
-      </w:r>
-    </w:p>
-    <w:p>
-      <w:pPr>
-        <w:pStyle w:val="ListBullet"/>
-      </w:pPr>
-      <w:r>
-        <w:rPr>
-          <w:rFonts w:ascii="Roboto" w:hAnsi="Roboto" w:eastAsia="Roboto"/>
-        </w:rPr>
-        <w:t>Polymers and plastics</w:t>
-      </w:r>
-    </w:p>
-    <w:p>
-      <w:pPr>
-        <w:pStyle w:val="ListBullet"/>
-      </w:pPr>
-      <w:r>
-        <w:rPr>
-          <w:rFonts w:ascii="Roboto" w:hAnsi="Roboto" w:eastAsia="Roboto"/>
-        </w:rPr>
-        <w:t>Solvents, resins and adhesives</w:t>
-      </w:r>
-    </w:p>
-    <w:p>
-      <w:pPr>
-        <w:pStyle w:val="ListBullet"/>
-      </w:pPr>
-      <w:r>
-        <w:rPr>
-          <w:rFonts w:ascii="Roboto" w:hAnsi="Roboto" w:eastAsia="Roboto"/>
-        </w:rPr>
-        <w:t>Acids, amines and surfactants</w:t>
-      </w:r>
-    </w:p>
-    <w:p>
-      <w:pPr>
-        <w:pStyle w:val="ListBullet"/>
-      </w:pPr>
-      <w:r>
-        <w:rPr>
-          <w:rFonts w:ascii="Roboto" w:hAnsi="Roboto" w:eastAsia="Roboto"/>
-        </w:rPr>
-        <w:t>Agrochemicals and specialty chemicals</w:t>
       </w:r>
     </w:p>
     <w:p>
@@ -5764,12 +6392,6 @@
     <w:abstractNumId w:val="0"/>
   </w:num>
   <w:num w:numId="10">
-    <w:abstractNumId w:val="7"/>
-    <w:lvlOverride w:ilvl="0">
-      <w:startOverride w:val="1"/>
-    </w:lvlOverride>
-  </w:num>
-  <w:num w:numId="11">
     <w:abstractNumId w:val="7"/>
     <w:lvlOverride w:ilvl="0">
       <w:startOverride w:val="1"/>

</xml_diff>

<commit_message>
Chemical page: balance buy and sell value across the page
- Company intro heading names both roles; paragraph 1 states both,
  then a buyer paragraph (92 words), a seller paragraph (84 words)
  and an action for each side plus the phone line.
- Hero adds a "Sell your plant or equipment" button beside
  "Browse inventory"; buttons run full width on phones.
- Why IPP gains "For buyers" and "For sellers" tabs with five
  advantages each; seller panels follow the buyer panel shape.
- Four seller FAQs bring the set to nine buyer and nine seller.
- Seller claims sourced to IPP's sell pages, FAQ and
  decommissioning article and recorded in content/job.json.
- Role tables, README revision 7, Word copy and preview refreshed.

Co-Authored-By: Claude Opus 5.5 <noreply@anthropic.com>
</commit_message>
<xml_diff>
--- a/docs/chemical-build/deliverables/used-chemical-process-plants-for-sale-content.docx
+++ b/docs/chemical-build/deliverables/used-chemical-process-plants-for-sale-content.docx
@@ -96,8 +96,35 @@
         <w:rPr>
           <w:rFonts w:ascii="Roboto" w:hAnsi="Roboto" w:eastAsia="Roboto"/>
         </w:rPr>
-        <w:t xml:space="preserve">Talk to an expert </w:t>
-      </w:r>
+        <w:t xml:space="preserve">Sell your plant or equipment </w:t>
+      </w:r>
+      <w:r>
+        <w:rPr>
+          <w:rFonts w:ascii="Roboto" w:hAnsi="Roboto" w:eastAsia="Roboto"/>
+        </w:rPr>
+        <w:t>↓</w:t>
+      </w:r>
+    </w:p>
+    <w:p>
+      <w:pPr>
+        <w:pStyle w:val="Heading2"/>
+      </w:pPr>
+      <w:r>
+        <w:rPr>
+          <w:rFonts w:ascii="Montserrat" w:hAnsi="Montserrat" w:eastAsia="Outfit"/>
+        </w:rPr>
+        <w:t>Complete chemical plants</w:t>
+      </w:r>
+    </w:p>
+    <w:p>
+      <w:r>
+        <w:rPr>
+          <w:rFonts w:ascii="Roboto" w:hAnsi="Roboto" w:eastAsia="Roboto"/>
+        </w:rPr>
+        <w:t>Compare capacity, process technology, feedstock and location for each plant.</w:t>
+      </w:r>
+    </w:p>
+    <w:p>
       <w:r>
         <w:rPr>
           <w:rFonts w:ascii="Roboto" w:hAnsi="Roboto" w:eastAsia="Roboto"/>
@@ -106,6 +133,14 @@
       </w:r>
     </w:p>
     <w:p>
+      <w:r>
+        <w:rPr>
+          <w:rFonts w:ascii="Roboto" w:hAnsi="Roboto" w:eastAsia="Roboto"/>
+        </w:rPr>
+        <w:t>Source / details</w:t>
+      </w:r>
+    </w:p>
+    <w:p>
       <w:pPr>
         <w:pStyle w:val="Heading2"/>
       </w:pPr>
@@ -113,15 +148,15 @@
         <w:rPr>
           <w:rFonts w:ascii="Montserrat" w:hAnsi="Montserrat" w:eastAsia="Outfit"/>
         </w:rPr>
-        <w:t>Complete chemical plants</w:t>
-      </w:r>
-    </w:p>
-    <w:p>
-      <w:r>
-        <w:rPr>
-          <w:rFonts w:ascii="Roboto" w:hAnsi="Roboto" w:eastAsia="Roboto"/>
-        </w:rPr>
-        <w:t>Compare capacity, process technology, feedstock and location for each plant.</w:t>
+        <w:t>Equipment for your process</w:t>
+      </w:r>
+    </w:p>
+    <w:p>
+      <w:r>
+        <w:rPr>
+          <w:rFonts w:ascii="Roboto" w:hAnsi="Roboto" w:eastAsia="Roboto"/>
+        </w:rPr>
+        <w:t>Source reactors, heat exchangers, centrifuges, dryers, filters, columns and tanks.</w:t>
       </w:r>
     </w:p>
     <w:p>
@@ -148,15 +183,15 @@
         <w:rPr>
           <w:rFonts w:ascii="Montserrat" w:hAnsi="Montserrat" w:eastAsia="Outfit"/>
         </w:rPr>
-        <w:t>Equipment for your process</w:t>
-      </w:r>
-    </w:p>
-    <w:p>
-      <w:r>
-        <w:rPr>
-          <w:rFonts w:ascii="Roboto" w:hAnsi="Roboto" w:eastAsia="Roboto"/>
-        </w:rPr>
-        <w:t>Source reactors, heat exchangers, centrifuges, dryers, filters, columns and tanks.</w:t>
+        <w:t>Value in your surplus assets</w:t>
+      </w:r>
+    </w:p>
+    <w:p>
+      <w:r>
+        <w:rPr>
+          <w:rFonts w:ascii="Roboto" w:hAnsi="Roboto" w:eastAsia="Roboto"/>
+        </w:rPr>
+        <w:t>Sell a complete plant, a process line or individual equipment to IPP.</w:t>
       </w:r>
     </w:p>
     <w:p>
@@ -177,109 +212,85 @@
     </w:p>
     <w:p>
       <w:pPr>
+        <w:pStyle w:val="ListBullet"/>
+      </w:pPr>
+      <w:r>
+        <w:rPr>
+          <w:rFonts w:ascii="Roboto" w:hAnsi="Roboto" w:eastAsia="Roboto"/>
+          <w:b/>
+        </w:rPr>
+        <w:t>15,000+</w:t>
+      </w:r>
+      <w:r>
+        <w:rPr>
+          <w:rFonts w:ascii="Roboto" w:hAnsi="Roboto" w:eastAsia="Roboto"/>
+        </w:rPr>
+        <w:t>Pieces of inventory</w:t>
+      </w:r>
+    </w:p>
+    <w:p>
+      <w:pPr>
+        <w:pStyle w:val="ListBullet"/>
+      </w:pPr>
+      <w:r>
+        <w:rPr>
+          <w:rFonts w:ascii="Roboto" w:hAnsi="Roboto" w:eastAsia="Roboto"/>
+          <w:b/>
+        </w:rPr>
+        <w:t>20</w:t>
+      </w:r>
+      <w:r>
+        <w:rPr>
+          <w:rFonts w:ascii="Roboto" w:hAnsi="Roboto" w:eastAsia="Roboto"/>
+        </w:rPr>
+        <w:t>Complete plant sites</w:t>
+      </w:r>
+    </w:p>
+    <w:p>
+      <w:pPr>
+        <w:pStyle w:val="ListBullet"/>
+      </w:pPr>
+      <w:r>
+        <w:rPr>
+          <w:rFonts w:ascii="Roboto" w:hAnsi="Roboto" w:eastAsia="Roboto"/>
+          <w:b/>
+        </w:rPr>
+        <w:t>15</w:t>
+      </w:r>
+      <w:r>
+        <w:rPr>
+          <w:rFonts w:ascii="Roboto" w:hAnsi="Roboto" w:eastAsia="Roboto"/>
+        </w:rPr>
+        <w:t>Countries with offices</w:t>
+      </w:r>
+    </w:p>
+    <w:p>
+      <w:pPr>
+        <w:pStyle w:val="ListBullet"/>
+      </w:pPr>
+      <w:r>
+        <w:rPr>
+          <w:rFonts w:ascii="Roboto" w:hAnsi="Roboto" w:eastAsia="Roboto"/>
+          <w:b/>
+        </w:rPr>
+        <w:t>Since 1980</w:t>
+      </w:r>
+      <w:r>
+        <w:rPr>
+          <w:rFonts w:ascii="Roboto" w:hAnsi="Roboto" w:eastAsia="Roboto"/>
+        </w:rPr>
+        <w:t>Supplying process equipment</w:t>
+      </w:r>
+    </w:p>
+    <w:p>
+      <w:pPr>
         <w:pStyle w:val="Heading2"/>
       </w:pPr>
       <w:r>
         <w:rPr>
           <w:rFonts w:ascii="Montserrat" w:hAnsi="Montserrat" w:eastAsia="Outfit"/>
         </w:rPr>
-        <w:t>Value in your surplus assets</w:t>
-      </w:r>
-    </w:p>
-    <w:p>
-      <w:r>
-        <w:rPr>
-          <w:rFonts w:ascii="Roboto" w:hAnsi="Roboto" w:eastAsia="Roboto"/>
-        </w:rPr>
-        <w:t>Sell a complete plant, a process line or individual equipment to IPP.</w:t>
-      </w:r>
-    </w:p>
-    <w:p>
-      <w:r>
-        <w:rPr>
-          <w:rFonts w:ascii="Roboto" w:hAnsi="Roboto" w:eastAsia="Roboto"/>
-        </w:rPr>
-        <w:t>↗</w:t>
-      </w:r>
-    </w:p>
-    <w:p>
-      <w:r>
-        <w:rPr>
-          <w:rFonts w:ascii="Roboto" w:hAnsi="Roboto" w:eastAsia="Roboto"/>
-        </w:rPr>
-        <w:t>Source / details</w:t>
-      </w:r>
-    </w:p>
-    <w:p>
-      <w:pPr>
-        <w:pStyle w:val="ListBullet"/>
-      </w:pPr>
-      <w:r>
-        <w:rPr>
-          <w:rFonts w:ascii="Roboto" w:hAnsi="Roboto" w:eastAsia="Roboto"/>
-          <w:b/>
-        </w:rPr>
-        <w:t>15,000+</w:t>
-      </w:r>
-      <w:r>
-        <w:rPr>
-          <w:rFonts w:ascii="Roboto" w:hAnsi="Roboto" w:eastAsia="Roboto"/>
-        </w:rPr>
-        <w:t>Pieces of inventory</w:t>
-      </w:r>
-    </w:p>
-    <w:p>
-      <w:pPr>
-        <w:pStyle w:val="ListBullet"/>
-      </w:pPr>
-      <w:r>
-        <w:rPr>
-          <w:rFonts w:ascii="Roboto" w:hAnsi="Roboto" w:eastAsia="Roboto"/>
-          <w:b/>
-        </w:rPr>
-        <w:t>20</w:t>
-      </w:r>
-      <w:r>
-        <w:rPr>
-          <w:rFonts w:ascii="Roboto" w:hAnsi="Roboto" w:eastAsia="Roboto"/>
-        </w:rPr>
-        <w:t>Complete plant sites</w:t>
-      </w:r>
-    </w:p>
-    <w:p>
-      <w:pPr>
-        <w:pStyle w:val="ListBullet"/>
-      </w:pPr>
-      <w:r>
-        <w:rPr>
-          <w:rFonts w:ascii="Roboto" w:hAnsi="Roboto" w:eastAsia="Roboto"/>
-          <w:b/>
-        </w:rPr>
-        <w:t>15</w:t>
-      </w:r>
-      <w:r>
-        <w:rPr>
-          <w:rFonts w:ascii="Roboto" w:hAnsi="Roboto" w:eastAsia="Roboto"/>
-        </w:rPr>
-        <w:t>Countries with offices</w:t>
-      </w:r>
-    </w:p>
-    <w:p>
-      <w:pPr>
-        <w:pStyle w:val="ListBullet"/>
-      </w:pPr>
-      <w:r>
-        <w:rPr>
-          <w:rFonts w:ascii="Roboto" w:hAnsi="Roboto" w:eastAsia="Roboto"/>
-          <w:b/>
-        </w:rPr>
-        <w:t>Since 1980</w:t>
-      </w:r>
-      <w:r>
-        <w:rPr>
-          <w:rFonts w:ascii="Roboto" w:hAnsi="Roboto" w:eastAsia="Roboto"/>
-        </w:rPr>
-        <w:t>Supplying process equipment</w:t>
+        <w:t>Trusted around the world by</w:t>
       </w:r>
     </w:p>
     <w:p>
@@ -290,52 +301,57 @@
         <w:rPr>
           <w:rFonts w:ascii="Montserrat" w:hAnsi="Montserrat" w:eastAsia="Outfit"/>
         </w:rPr>
-        <w:t>Trusted around the world by</w:t>
-      </w:r>
-    </w:p>
-    <w:p>
-      <w:pPr>
-        <w:pStyle w:val="Heading2"/>
-      </w:pPr>
-      <w:r>
-        <w:rPr>
-          <w:rFonts w:ascii="Montserrat" w:hAnsi="Montserrat" w:eastAsia="Outfit"/>
-        </w:rPr>
-        <w:t>Buy used chemical plants and equipment from International Process Plants (IPP)</w:t>
-      </w:r>
-    </w:p>
-    <w:p>
-      <w:r>
-        <w:rPr>
-          <w:rFonts w:ascii="Roboto" w:hAnsi="Roboto" w:eastAsia="Roboto"/>
-        </w:rPr>
-        <w:t>International Process Plants (IPP) sells used chemical process plants and equipment to chemical, petrochemical, fertilizer, polymer, agrochemical and specialty chemical producers worldwide. We stock complete plants, process lines and individual reactors, heat exchangers, centrifuges, dryers, filters, distillation columns and tanks from Pfaudler, De Dietrich, Alfa Laval, Krauss Maffei, Westfalia and other OEM manufacturers. Purchasing used from IPP can save up to 50% of capital and 90% of lead time versus buying new. We have supplied process equipment worldwide since 1980.</w:t>
-      </w:r>
-    </w:p>
-    <w:p>
-      <w:r>
-        <w:rPr>
-          <w:rFonts w:ascii="Roboto" w:hAnsi="Roboto" w:eastAsia="Roboto"/>
-        </w:rPr>
-        <w:t>International Process Plants (IPP) is the world’s largest seller of used process plants and equipment, with 15,000+ pieces of inventory and nearly five decades of experience. Our holdings include 20 complete process plant sites. Materials of construction include glass-lined, stainless steel 316, 316L, 304 and 321, Hastelloy C-22 and C-276, titanium, graphite and polypropylene. Capacities range from 2 L (0.5 gal) reactors to 565,000 L (149,258 gal) tanks. Reactor pressure ratings reach 358.7 bar (5,203 psi).</w:t>
-      </w:r>
-    </w:p>
-    <w:p>
-      <w:r>
-        <w:rPr>
-          <w:rFonts w:ascii="Roboto" w:hAnsi="Roboto" w:eastAsia="Roboto"/>
-        </w:rPr>
-        <w:t>Condition options include used, unused, refurbished, re-glassed and new. We offer re-glassed glass-lined equipment through Universal Glasteel Equipment (UGE) and new stainless steel equipment through Gale Process Solutions (GPS). Our reactor inventory includes ASME, National Board, CRN, CE and PED coded vessels.</w:t>
-      </w:r>
-    </w:p>
-    <w:p>
-      <w:r>
-        <w:rPr>
-          <w:rFonts w:ascii="Roboto" w:hAnsi="Roboto" w:eastAsia="Roboto"/>
-        </w:rPr>
-        <w:t xml:space="preserve">IPP buys shutdown chemical plants, idle process lines and surplus equipment from plant owners and asset managers. We value each asset at the seller’s site. Our team handles decommissioning, dismantling and removal. Plant owners start a sale through the </w:t>
+        <w:t>Buy and sell used chemical plants and equipment with International Process Plants (IPP)</w:t>
+      </w:r>
+    </w:p>
+    <w:p>
+      <w:r>
+        <w:rPr>
+          <w:rFonts w:ascii="Roboto" w:hAnsi="Roboto" w:eastAsia="Roboto"/>
+        </w:rPr>
+        <w:t>International Process Plants (IPP) buys and sells used chemical process plants and equipment. We sell complete plants, process lines and individual units to chemical, petrochemical, fertilizer, polymer, agrochemical and specialty chemical producers. We buy the same assets from plant owners that close, idle or restructure sites, then redeploy them to other producers. IPP has supplied process equipment worldwide since 1980.</w:t>
+      </w:r>
+    </w:p>
+    <w:p>
+      <w:r>
+        <w:rPr>
+          <w:rFonts w:ascii="Roboto" w:hAnsi="Roboto" w:eastAsia="Roboto"/>
+        </w:rPr>
+        <w:t>International Process Plants (IPP) is the world’s largest seller of used process plants and equipment, with 15,000+ pieces of inventory and nearly five decades of experience. Buyers choose reactors, heat exchangers, centrifuges, dryers, filters, distillation columns and tanks from Pfaudler, De Dietrich, Alfa Laval, Krauss Maffei, Westfalia and other OEM manufacturers, in glass-lined, stainless steel, Hastelloy and titanium construction. Capacities range from 2 L (0.5 gal) reactors to 565,000 L (149,258 gal) tanks. Purchasing used from IPP can save up to 50% of capital and 90% of lead time versus buying new.</w:t>
+      </w:r>
+    </w:p>
+    <w:p>
+      <w:r>
+        <w:rPr>
+          <w:rFonts w:ascii="Roboto" w:hAnsi="Roboto" w:eastAsia="Roboto"/>
+        </w:rPr>
+        <w:t>Plant owners sell shutdown chemical plants, idle process lines and surplus equipment to IPP. We act as a principal buyer, not a broker, and purchase complete sites with their land, buildings, equipment and intellectual property or individual units as-is, where-is. Our team values each asset and handles decommissioning, dismantling and removal at the seller’s site. Plant owners receive one payment under one contract instead of selling a site piecemeal. BASF, Novartis and a European CDMO have sold or marketed plants and equipment through IPP.</w:t>
+      </w:r>
+    </w:p>
+    <w:p>
+      <w:r>
+        <w:rPr>
+          <w:rFonts w:ascii="Roboto" w:hAnsi="Roboto" w:eastAsia="Roboto"/>
+        </w:rPr>
+        <w:t xml:space="preserve">Buyers request specifications, inspections and quotations through </w:t>
       </w:r>
       <w:hyperlink r:id="rId9">
+        <w:r>
+          <w:rPr>
+            <w:rFonts w:ascii="Roboto" w:hAnsi="Roboto"/>
+            <w:color w:val="0563C1"/>
+            <w:u w:val="single"/>
+          </w:rPr>
+          <w:t xml:space="preserve">IPP’s team</w:t>
+        </w:r>
+      </w:hyperlink>
+      <w:r>
+        <w:rPr>
+          <w:rFonts w:ascii="Roboto" w:hAnsi="Roboto" w:eastAsia="Roboto"/>
+        </w:rPr>
+        <w:t xml:space="preserve">. Plant owners start a sale through the </w:t>
+      </w:r>
+      <w:hyperlink r:id="rId10">
         <w:r>
           <w:rPr>
             <w:rFonts w:ascii="Roboto" w:hAnsi="Roboto"/>
@@ -351,7 +367,7 @@
         </w:rPr>
         <w:t xml:space="preserve"> or </w:t>
       </w:r>
-      <w:hyperlink r:id="rId10">
+      <w:hyperlink r:id="rId11">
         <w:r>
           <w:rPr>
             <w:rFonts w:ascii="Roboto" w:hAnsi="Roboto"/>
@@ -365,23 +381,19 @@
         <w:rPr>
           <w:rFonts w:ascii="Roboto" w:hAnsi="Roboto" w:eastAsia="Roboto"/>
         </w:rPr>
-        <w:t xml:space="preserve"> form. Buyers request specifications, inspections and quotations from </w:t>
-      </w:r>
-      <w:hyperlink r:id="rId11">
-        <w:r>
-          <w:rPr>
-            <w:rFonts w:ascii="Roboto" w:hAnsi="Roboto"/>
-            <w:color w:val="0563C1"/>
-            <w:u w:val="single"/>
-          </w:rPr>
-          <w:t xml:space="preserve">IPP’s team</w:t>
-        </w:r>
-      </w:hyperlink>
-      <w:r>
-        <w:rPr>
-          <w:rFonts w:ascii="Roboto" w:hAnsi="Roboto" w:eastAsia="Roboto"/>
-        </w:rPr>
-        <w:t>.</w:t>
+        <w:t xml:space="preserve"> form. Call </w:t>
+      </w:r>
+      <w:r>
+        <w:rPr>
+          <w:rFonts w:ascii="Roboto" w:hAnsi="Roboto" w:eastAsia="Roboto"/>
+        </w:rPr>
+        <w:t>+1 609-586-8004</w:t>
+      </w:r>
+      <w:r>
+        <w:rPr>
+          <w:rFonts w:ascii="Roboto" w:hAnsi="Roboto" w:eastAsia="Roboto"/>
+        </w:rPr>
+        <w:t xml:space="preserve"> to discuss a purchase or a sale with our team.</w:t>
       </w:r>
     </w:p>
     <w:p>
@@ -3599,7 +3611,7 @@
         <w:rPr>
           <w:rFonts w:ascii="Roboto" w:hAnsi="Roboto" w:eastAsia="Roboto"/>
         </w:rPr>
-        <w:t>Chemical manufacturers choose International Process Plants (IPP) when added capacity or a replacement unit cannot wait for new-build lead times. We match each project with inventory that ships now, equipment with a documented operating history and a quote tied to the exact stock number. Five advantages define how we serve chemical producers:</w:t>
+        <w:t>Chemical manufacturers choose International Process Plants (IPP) on both sides of a plant transaction. Producers buy from IPP when added capacity cannot wait for new-build lead times, and plant owners sell to IPP when a closing site needs one accountable buyer. Five advantages apply to each side:</w:t>
       </w:r>
     </w:p>
     <w:p>
@@ -4040,7 +4052,7 @@
         </w:rPr>
         <w:t xml:space="preserve">We provide a detailed quote for each stock number on request. </w:t>
       </w:r>
-      <w:hyperlink r:id="rId11">
+      <w:hyperlink r:id="rId9">
         <w:r>
           <w:rPr>
             <w:rFonts w:ascii="Roboto" w:hAnsi="Roboto"/>
@@ -4055,6 +4067,488 @@
           <w:rFonts w:ascii="Roboto" w:hAnsi="Roboto" w:eastAsia="Roboto"/>
         </w:rPr>
         <w:t xml:space="preserve"> with the stock number or process requirements to start a quotation.</w:t>
+      </w:r>
+    </w:p>
+    <w:p>
+      <w:pPr>
+        <w:pStyle w:val="Heading3"/>
+      </w:pPr>
+      <w:r>
+        <w:rPr>
+          <w:rFonts w:ascii="Montserrat" w:hAnsi="Montserrat" w:eastAsia="Outfit"/>
+        </w:rPr>
+        <w:t>One buyer for the whole site</w:t>
+      </w:r>
+    </w:p>
+    <w:p>
+      <w:r>
+        <w:rPr>
+          <w:rFonts w:ascii="Roboto" w:hAnsi="Roboto" w:eastAsia="Roboto"/>
+        </w:rPr>
+        <w:t>IPP buys complete plant sites, process units and surplus equipment in one transaction, so a seller signs one contract instead of breaking a site up piecemeal. We purchase the land, buildings, equipment and intellectual property when the sale covers the whole site.</w:t>
+      </w:r>
+    </w:p>
+    <w:p>
+      <w:r>
+        <w:rPr>
+          <w:rFonts w:ascii="Roboto" w:hAnsi="Roboto" w:eastAsia="Roboto"/>
+        </w:rPr>
+        <w:t>A single sale to IPP can cover:</w:t>
+      </w:r>
+    </w:p>
+    <w:p>
+      <w:pPr>
+        <w:pStyle w:val="ListBullet"/>
+      </w:pPr>
+      <w:r>
+        <w:rPr>
+          <w:rFonts w:ascii="Roboto" w:hAnsi="Roboto" w:eastAsia="Roboto"/>
+        </w:rPr>
+        <w:t>Complete plant sites with land and buildings</w:t>
+      </w:r>
+    </w:p>
+    <w:p>
+      <w:pPr>
+        <w:pStyle w:val="ListBullet"/>
+      </w:pPr>
+      <w:r>
+        <w:rPr>
+          <w:rFonts w:ascii="Roboto" w:hAnsi="Roboto" w:eastAsia="Roboto"/>
+        </w:rPr>
+        <w:t>Process units and equipment systems within a site</w:t>
+      </w:r>
+    </w:p>
+    <w:p>
+      <w:pPr>
+        <w:pStyle w:val="ListBullet"/>
+      </w:pPr>
+      <w:r>
+        <w:rPr>
+          <w:rFonts w:ascii="Roboto" w:hAnsi="Roboto" w:eastAsia="Roboto"/>
+        </w:rPr>
+        <w:t>Individual surplus and idled equipment</w:t>
+      </w:r>
+    </w:p>
+    <w:p>
+      <w:pPr>
+        <w:pStyle w:val="ListBullet"/>
+      </w:pPr>
+      <w:r>
+        <w:rPr>
+          <w:rFonts w:ascii="Roboto" w:hAnsi="Roboto" w:eastAsia="Roboto"/>
+        </w:rPr>
+        <w:t>Intellectual property tied to the plant</w:t>
+      </w:r>
+    </w:p>
+    <w:p>
+      <w:pPr>
+        <w:pStyle w:val="ListBullet"/>
+      </w:pPr>
+      <w:r>
+        <w:rPr>
+          <w:rFonts w:ascii="Roboto" w:hAnsi="Roboto" w:eastAsia="Roboto"/>
+        </w:rPr>
+        <w:t>Equipment too large, specialized or site-bound for traditional resellers</w:t>
+      </w:r>
+    </w:p>
+    <w:p>
+      <w:r>
+        <w:rPr>
+          <w:rFonts w:ascii="Roboto" w:hAnsi="Roboto" w:eastAsia="Roboto"/>
+        </w:rPr>
+        <w:t xml:space="preserve">Our team confirms the assets included in the purchase agreement. Plant owners start the sale through the </w:t>
+      </w:r>
+      <w:hyperlink r:id="rId10">
+        <w:r>
+          <w:rPr>
+            <w:rFonts w:ascii="Roboto" w:hAnsi="Roboto"/>
+            <w:color w:val="0563C1"/>
+            <w:u w:val="single"/>
+          </w:rPr>
+          <w:t xml:space="preserve">sell-a-plant</w:t>
+        </w:r>
+      </w:hyperlink>
+      <w:r>
+        <w:rPr>
+          <w:rFonts w:ascii="Roboto" w:hAnsi="Roboto" w:eastAsia="Roboto"/>
+        </w:rPr>
+        <w:t xml:space="preserve"> or </w:t>
+      </w:r>
+      <w:hyperlink r:id="rId11">
+        <w:r>
+          <w:rPr>
+            <w:rFonts w:ascii="Roboto" w:hAnsi="Roboto"/>
+            <w:color w:val="0563C1"/>
+            <w:u w:val="single"/>
+          </w:rPr>
+          <w:t xml:space="preserve">sell-equipment</w:t>
+        </w:r>
+      </w:hyperlink>
+      <w:r>
+        <w:rPr>
+          <w:rFonts w:ascii="Roboto" w:hAnsi="Roboto" w:eastAsia="Roboto"/>
+        </w:rPr>
+        <w:t xml:space="preserve"> form.</w:t>
+      </w:r>
+    </w:p>
+    <w:p>
+      <w:pPr>
+        <w:pStyle w:val="Heading3"/>
+      </w:pPr>
+      <w:r>
+        <w:rPr>
+          <w:rFonts w:ascii="Montserrat" w:hAnsi="Montserrat" w:eastAsia="Outfit"/>
+        </w:rPr>
+        <w:t>Capital from idle assets</w:t>
+      </w:r>
+    </w:p>
+    <w:p>
+      <w:r>
+        <w:rPr>
+          <w:rFonts w:ascii="Roboto" w:hAnsi="Roboto" w:eastAsia="Roboto"/>
+        </w:rPr>
+        <w:t>We turn idle and surplus chemical process equipment into capital for the seller. IPP resells or redeploys the assets to manufacturers worldwide, so the seller recovers value instead of paying for storage and disposal.</w:t>
+      </w:r>
+    </w:p>
+    <w:p>
+      <w:r>
+        <w:rPr>
+          <w:rFonts w:ascii="Roboto" w:hAnsi="Roboto" w:eastAsia="Roboto"/>
+        </w:rPr>
+        <w:t>Seller value from an IPP sale includes:</w:t>
+      </w:r>
+    </w:p>
+    <w:p>
+      <w:pPr>
+        <w:pStyle w:val="ListBullet"/>
+      </w:pPr>
+      <w:r>
+        <w:rPr>
+          <w:rFonts w:ascii="Roboto" w:hAnsi="Roboto" w:eastAsia="Roboto"/>
+        </w:rPr>
+        <w:t>Capital recovered from unused or surplus assets</w:t>
+      </w:r>
+    </w:p>
+    <w:p>
+      <w:pPr>
+        <w:pStyle w:val="ListBullet"/>
+      </w:pPr>
+      <w:r>
+        <w:rPr>
+          <w:rFonts w:ascii="Roboto" w:hAnsi="Roboto" w:eastAsia="Roboto"/>
+        </w:rPr>
+        <w:t>Long-term storage and maintenance costs removed</w:t>
+      </w:r>
+    </w:p>
+    <w:p>
+      <w:pPr>
+        <w:pStyle w:val="ListBullet"/>
+      </w:pPr>
+      <w:r>
+        <w:rPr>
+          <w:rFonts w:ascii="Roboto" w:hAnsi="Roboto" w:eastAsia="Roboto"/>
+        </w:rPr>
+        <w:t>Decommissioning reserves turned into a positive financial event</w:t>
+      </w:r>
+    </w:p>
+    <w:p>
+      <w:pPr>
+        <w:pStyle w:val="ListBullet"/>
+      </w:pPr>
+      <w:r>
+        <w:rPr>
+          <w:rFonts w:ascii="Roboto" w:hAnsi="Roboto" w:eastAsia="Roboto"/>
+        </w:rPr>
+        <w:t>Assets redeployed rather than scrapped</w:t>
+      </w:r>
+    </w:p>
+    <w:p>
+      <w:pPr>
+        <w:pStyle w:val="ListBullet"/>
+      </w:pPr>
+      <w:r>
+        <w:rPr>
+          <w:rFonts w:ascii="Roboto" w:hAnsi="Roboto" w:eastAsia="Roboto"/>
+        </w:rPr>
+        <w:t>One payment under one contract</w:t>
+      </w:r>
+    </w:p>
+    <w:p>
+      <w:r>
+        <w:rPr>
+          <w:rFonts w:ascii="Roboto" w:hAnsi="Roboto" w:eastAsia="Roboto"/>
+        </w:rPr>
+        <w:t>The value depends on asset type, condition, documentation and removal scope. IPP proposes an outright purchase or a marketing arrangement for each asset list.</w:t>
+      </w:r>
+    </w:p>
+    <w:p>
+      <w:pPr>
+        <w:pStyle w:val="Heading3"/>
+      </w:pPr>
+      <w:r>
+        <w:rPr>
+          <w:rFonts w:ascii="Montserrat" w:hAnsi="Montserrat" w:eastAsia="Outfit"/>
+        </w:rPr>
+        <w:t>Turnkey removal</w:t>
+      </w:r>
+    </w:p>
+    <w:p>
+      <w:r>
+        <w:rPr>
+          <w:rFonts w:ascii="Roboto" w:hAnsi="Roboto" w:eastAsia="Roboto"/>
+        </w:rPr>
+        <w:t>IPP handles each acquisition from the on-site inspection to dismantling coordination, packaging, freight and export. Our team manages every step, so the seller coordinates one buyer instead of separate vendors.</w:t>
+      </w:r>
+    </w:p>
+    <w:p>
+      <w:r>
+        <w:rPr>
+          <w:rFonts w:ascii="Roboto" w:hAnsi="Roboto" w:eastAsia="Roboto"/>
+        </w:rPr>
+        <w:t>Our turnkey removal covers:</w:t>
+      </w:r>
+    </w:p>
+    <w:p>
+      <w:pPr>
+        <w:pStyle w:val="ListBullet"/>
+      </w:pPr>
+      <w:r>
+        <w:rPr>
+          <w:rFonts w:ascii="Roboto" w:hAnsi="Roboto" w:eastAsia="Roboto"/>
+        </w:rPr>
+        <w:t>On-site inspection at the seller’s plant</w:t>
+      </w:r>
+    </w:p>
+    <w:p>
+      <w:pPr>
+        <w:pStyle w:val="ListBullet"/>
+      </w:pPr>
+      <w:r>
+        <w:rPr>
+          <w:rFonts w:ascii="Roboto" w:hAnsi="Roboto" w:eastAsia="Roboto"/>
+        </w:rPr>
+        <w:t>Dismantling coordination</w:t>
+      </w:r>
+    </w:p>
+    <w:p>
+      <w:pPr>
+        <w:pStyle w:val="ListBullet"/>
+      </w:pPr>
+      <w:r>
+        <w:rPr>
+          <w:rFonts w:ascii="Roboto" w:hAnsi="Roboto" w:eastAsia="Roboto"/>
+        </w:rPr>
+        <w:t>Packaging and crating</w:t>
+      </w:r>
+    </w:p>
+    <w:p>
+      <w:pPr>
+        <w:pStyle w:val="ListBullet"/>
+      </w:pPr>
+      <w:r>
+        <w:rPr>
+          <w:rFonts w:ascii="Roboto" w:hAnsi="Roboto" w:eastAsia="Roboto"/>
+        </w:rPr>
+        <w:t>Freight and export</w:t>
+      </w:r>
+    </w:p>
+    <w:p>
+      <w:pPr>
+        <w:pStyle w:val="ListBullet"/>
+      </w:pPr>
+      <w:r>
+        <w:rPr>
+          <w:rFonts w:ascii="Roboto" w:hAnsi="Roboto" w:eastAsia="Roboto"/>
+        </w:rPr>
+        <w:t>Removal on the seller’s schedule</w:t>
+      </w:r>
+    </w:p>
+    <w:p>
+      <w:r>
+        <w:rPr>
+          <w:rFonts w:ascii="Roboto" w:hAnsi="Roboto" w:eastAsia="Roboto"/>
+        </w:rPr>
+        <w:t>IPP buys as-is, where-is and takes ownership of the removal. The purchase agreement sets the removal schedule.</w:t>
+      </w:r>
+    </w:p>
+    <w:p>
+      <w:pPr>
+        <w:pStyle w:val="Heading3"/>
+      </w:pPr>
+      <w:r>
+        <w:rPr>
+          <w:rFonts w:ascii="Montserrat" w:hAnsi="Montserrat" w:eastAsia="Outfit"/>
+        </w:rPr>
+        <w:t>Risk and liability transfer</w:t>
+      </w:r>
+    </w:p>
+    <w:p>
+      <w:r>
+        <w:rPr>
+          <w:rFonts w:ascii="Roboto" w:hAnsi="Roboto" w:eastAsia="Roboto"/>
+        </w:rPr>
+        <w:t>IPP acquires idled, retired and shut down chemical plant sites and other industrial sites, including sites with environmental closure obligations. As the buyer, IPP assumes site cleanup and regulatory compliance obligations in those acquisitions.</w:t>
+      </w:r>
+    </w:p>
+    <w:p>
+      <w:r>
+        <w:rPr>
+          <w:rFonts w:ascii="Roboto" w:hAnsi="Roboto" w:eastAsia="Roboto"/>
+        </w:rPr>
+        <w:t>Obligations IPP can assume include:</w:t>
+      </w:r>
+    </w:p>
+    <w:p>
+      <w:pPr>
+        <w:pStyle w:val="ListBullet"/>
+      </w:pPr>
+      <w:r>
+        <w:rPr>
+          <w:rFonts w:ascii="Roboto" w:hAnsi="Roboto" w:eastAsia="Roboto"/>
+        </w:rPr>
+        <w:t>Site cleanup</w:t>
+      </w:r>
+    </w:p>
+    <w:p>
+      <w:pPr>
+        <w:pStyle w:val="ListBullet"/>
+      </w:pPr>
+      <w:r>
+        <w:rPr>
+          <w:rFonts w:ascii="Roboto" w:hAnsi="Roboto" w:eastAsia="Roboto"/>
+        </w:rPr>
+        <w:t>Regulatory compliance</w:t>
+      </w:r>
+    </w:p>
+    <w:p>
+      <w:pPr>
+        <w:pStyle w:val="ListBullet"/>
+      </w:pPr>
+      <w:r>
+        <w:rPr>
+          <w:rFonts w:ascii="Roboto" w:hAnsi="Roboto" w:eastAsia="Roboto"/>
+        </w:rPr>
+        <w:t>Soil and groundwater remediation planning</w:t>
+      </w:r>
+    </w:p>
+    <w:p>
+      <w:pPr>
+        <w:pStyle w:val="ListBullet"/>
+      </w:pPr>
+      <w:r>
+        <w:rPr>
+          <w:rFonts w:ascii="Roboto" w:hAnsi="Roboto" w:eastAsia="Roboto"/>
+        </w:rPr>
+        <w:t>Environmental closure permitting</w:t>
+      </w:r>
+    </w:p>
+    <w:p>
+      <w:pPr>
+        <w:pStyle w:val="ListBullet"/>
+      </w:pPr>
+      <w:r>
+        <w:rPr>
+          <w:rFonts w:ascii="Roboto" w:hAnsi="Roboto" w:eastAsia="Roboto"/>
+        </w:rPr>
+        <w:t>Coordination with local environmental authorities</w:t>
+      </w:r>
+    </w:p>
+    <w:p>
+      <w:r>
+        <w:rPr>
+          <w:rFonts w:ascii="Roboto" w:hAnsi="Roboto" w:eastAsia="Roboto"/>
+        </w:rPr>
+        <w:t>The purchase agreement defines which obligations transfer to IPP. IPP’s in-house team and remediation partners evaluate the contamination before the work begins.</w:t>
+      </w:r>
+    </w:p>
+    <w:p>
+      <w:pPr>
+        <w:pStyle w:val="Heading3"/>
+      </w:pPr>
+      <w:r>
+        <w:rPr>
+          <w:rFonts w:ascii="Montserrat" w:hAnsi="Montserrat" w:eastAsia="Outfit"/>
+        </w:rPr>
+        <w:t>Global buyer network</w:t>
+      </w:r>
+    </w:p>
+    <w:p>
+      <w:r>
+        <w:rPr>
+          <w:rFonts w:ascii="Roboto" w:hAnsi="Roboto" w:eastAsia="Roboto"/>
+        </w:rPr>
+        <w:t>IPP markets sellers’ plants and equipment to a network of 160,000+ customers through offices in 15 countries. We match surplus assets with global demand, including buyers that relocate complete plants and buyers that reuse a plant on its site for new products.</w:t>
+      </w:r>
+    </w:p>
+    <w:p>
+      <w:r>
+        <w:rPr>
+          <w:rFonts w:ascii="Roboto" w:hAnsi="Roboto" w:eastAsia="Roboto"/>
+        </w:rPr>
+        <w:t>Our marketing reach includes:</w:t>
+      </w:r>
+    </w:p>
+    <w:p>
+      <w:pPr>
+        <w:pStyle w:val="ListBullet"/>
+      </w:pPr>
+      <w:r>
+        <w:rPr>
+          <w:rFonts w:ascii="Roboto" w:hAnsi="Roboto" w:eastAsia="Roboto"/>
+        </w:rPr>
+        <w:t>160,000+ customers worldwide</w:t>
+      </w:r>
+    </w:p>
+    <w:p>
+      <w:pPr>
+        <w:pStyle w:val="ListBullet"/>
+      </w:pPr>
+      <w:r>
+        <w:rPr>
+          <w:rFonts w:ascii="Roboto" w:hAnsi="Roboto" w:eastAsia="Roboto"/>
+        </w:rPr>
+        <w:t>Offices in 15 countries</w:t>
+      </w:r>
+    </w:p>
+    <w:p>
+      <w:pPr>
+        <w:pStyle w:val="ListBullet"/>
+      </w:pPr>
+      <w:r>
+        <w:rPr>
+          <w:rFonts w:ascii="Roboto" w:hAnsi="Roboto" w:eastAsia="Roboto"/>
+        </w:rPr>
+        <w:t>IMS listings with specifications and photographs</w:t>
+      </w:r>
+    </w:p>
+    <w:p>
+      <w:pPr>
+        <w:pStyle w:val="ListBullet"/>
+      </w:pPr>
+      <w:r>
+        <w:rPr>
+          <w:rFonts w:ascii="Roboto" w:hAnsi="Roboto" w:eastAsia="Roboto"/>
+        </w:rPr>
+        <w:t>Buyers that relocate complete plants</w:t>
+      </w:r>
+    </w:p>
+    <w:p>
+      <w:pPr>
+        <w:pStyle w:val="ListBullet"/>
+      </w:pPr>
+      <w:r>
+        <w:rPr>
+          <w:rFonts w:ascii="Roboto" w:hAnsi="Roboto" w:eastAsia="Roboto"/>
+        </w:rPr>
+        <w:t>Buyers that reuse a plant on its site for new products</w:t>
+      </w:r>
+    </w:p>
+    <w:p>
+      <w:r>
+        <w:rPr>
+          <w:rFonts w:ascii="Roboto" w:hAnsi="Roboto" w:eastAsia="Roboto"/>
+        </w:rPr>
+        <w:t>The plant owner chooses between an outright purchase and a marketing arrangement. Our team confirms the choice in the proposal.</w:t>
       </w:r>
     </w:p>
     <w:p>
@@ -4343,7 +4837,7 @@
         </w:rPr>
         <w:t xml:space="preserve">Confirm the equipment included, commercial terms and services required. </w:t>
       </w:r>
-      <w:hyperlink r:id="rId11">
+      <w:hyperlink r:id="rId9">
         <w:r>
           <w:rPr>
             <w:rFonts w:ascii="Roboto" w:hAnsi="Roboto"/>
@@ -4534,7 +5028,7 @@
         </w:rPr>
         <w:t xml:space="preserve">Our team reviews the information and confirms the next steps. Sellers send the details through the </w:t>
       </w:r>
-      <w:hyperlink r:id="rId9">
+      <w:hyperlink r:id="rId10">
         <w:r>
           <w:rPr>
             <w:rFonts w:ascii="Roboto" w:hAnsi="Roboto"/>
@@ -4550,7 +5044,7 @@
         </w:rPr>
         <w:t xml:space="preserve"> or </w:t>
       </w:r>
-      <w:hyperlink r:id="rId10">
+      <w:hyperlink r:id="rId11">
         <w:r>
           <w:rPr>
             <w:rFonts w:ascii="Roboto" w:hAnsi="Roboto"/>
@@ -5379,7 +5873,7 @@
         </w:rPr>
         <w:t xml:space="preserve">Yes. IPP offers on-site and video inspections for most equipment. </w:t>
       </w:r>
-      <w:hyperlink r:id="rId11">
+      <w:hyperlink r:id="rId9">
         <w:r>
           <w:rPr>
             <w:rFonts w:ascii="Roboto" w:hAnsi="Roboto"/>
@@ -5468,7 +5962,7 @@
         </w:rPr>
         <w:t xml:space="preserve">We quote each plant and unit individually. </w:t>
       </w:r>
-      <w:hyperlink r:id="rId11">
+      <w:hyperlink r:id="rId9">
         <w:r>
           <w:rPr>
             <w:rFonts w:ascii="Roboto" w:hAnsi="Roboto"/>
@@ -5541,7 +6035,7 @@
         </w:rPr>
         <w:t xml:space="preserve">Yes. IPP advertises financing for its plants and equipment. </w:t>
       </w:r>
-      <w:hyperlink r:id="rId11">
+      <w:hyperlink r:id="rId9">
         <w:r>
           <w:rPr>
             <w:rFonts w:ascii="Roboto" w:hAnsi="Roboto"/>
@@ -5627,7 +6121,7 @@
         </w:rPr>
         <w:t xml:space="preserve">Yes. We buy complete plants, process lines and individual equipment from shutdown, idled and restructured sites. Start with the </w:t>
       </w:r>
-      <w:hyperlink r:id="rId9">
+      <w:hyperlink r:id="rId10">
         <w:r>
           <w:rPr>
             <w:rFonts w:ascii="Roboto" w:hAnsi="Roboto"/>
@@ -5643,7 +6137,7 @@
         </w:rPr>
         <w:t xml:space="preserve"> or </w:t>
       </w:r>
-      <w:hyperlink r:id="rId10">
+      <w:hyperlink r:id="rId11">
         <w:r>
           <w:rPr>
             <w:rFonts w:ascii="Roboto" w:hAnsi="Roboto"/>
@@ -5678,7 +6172,7 @@
         </w:rPr>
         <w:t xml:space="preserve">Provide an asset list, photographs, the plant location, available technical documents and your removal deadline. </w:t>
       </w:r>
-      <w:hyperlink r:id="rId11">
+      <w:hyperlink r:id="rId9">
         <w:r>
           <w:rPr>
             <w:rFonts w:ascii="Roboto" w:hAnsi="Roboto"/>
@@ -5748,7 +6242,7 @@
         </w:rPr>
         <w:t xml:space="preserve">Yes, in some acquisitions. IPP buys sites with known contamination and assumes site cleanup and regulatory compliance obligations as the buyer. Our remediation partners work with local environmental authorities on each site. </w:t>
       </w:r>
-      <w:hyperlink r:id="rId9">
+      <w:hyperlink r:id="rId10">
         <w:r>
           <w:rPr>
             <w:rFonts w:ascii="Roboto" w:hAnsi="Roboto"/>
@@ -5763,6 +6257,82 @@
           <w:rFonts w:ascii="Roboto" w:hAnsi="Roboto" w:eastAsia="Roboto"/>
         </w:rPr>
         <w:t>.</w:t>
+      </w:r>
+    </w:p>
+    <w:p>
+      <w:pPr>
+        <w:pStyle w:val="Heading3"/>
+      </w:pPr>
+      <w:r>
+        <w:rPr>
+          <w:rFonts w:ascii="Montserrat" w:hAnsi="Montserrat" w:eastAsia="Outfit"/>
+        </w:rPr>
+        <w:t>Which companies sell chemical plants to IPP?</w:t>
+      </w:r>
+    </w:p>
+    <w:p>
+      <w:r>
+        <w:rPr>
+          <w:rFonts w:ascii="Roboto" w:hAnsi="Roboto" w:eastAsia="Roboto"/>
+        </w:rPr>
+        <w:t>Fortune 100 and Fortune 500 companies typically represent 95% of the sellers IPP works with, according to IPP. IPP occasionally buys assets from smaller manufacturers in distressed situations.</w:t>
+      </w:r>
+    </w:p>
+    <w:p>
+      <w:pPr>
+        <w:pStyle w:val="Heading3"/>
+      </w:pPr>
+      <w:r>
+        <w:rPr>
+          <w:rFonts w:ascii="Montserrat" w:hAnsi="Montserrat" w:eastAsia="Outfit"/>
+        </w:rPr>
+        <w:t>Does IPP buy equipment as-is, where-is?</w:t>
+      </w:r>
+    </w:p>
+    <w:p>
+      <w:r>
+        <w:rPr>
+          <w:rFonts w:ascii="Roboto" w:hAnsi="Roboto" w:eastAsia="Roboto"/>
+        </w:rPr>
+        <w:t>Yes. IPP buys used, surplus and idled equipment as-is, where-is, as a principal buyer rather than a broker. Our team arranges inspection, dismantling, packaging, freight and export.</w:t>
+      </w:r>
+    </w:p>
+    <w:p>
+      <w:pPr>
+        <w:pStyle w:val="Heading3"/>
+      </w:pPr>
+      <w:r>
+        <w:rPr>
+          <w:rFonts w:ascii="Montserrat" w:hAnsi="Montserrat" w:eastAsia="Outfit"/>
+        </w:rPr>
+        <w:t>Can IPP market a plant instead of buying it outright?</w:t>
+      </w:r>
+    </w:p>
+    <w:p>
+      <w:r>
+        <w:rPr>
+          <w:rFonts w:ascii="Roboto" w:hAnsi="Roboto" w:eastAsia="Roboto"/>
+        </w:rPr>
+        <w:t>Yes. IPP proposes either an outright purchase or a marketing arrangement that offers the assets to its global buyer network. IPP markets BASF’s ammonia, methanol and melamine plants at Ludwigshafen under such an agreement.</w:t>
+      </w:r>
+    </w:p>
+    <w:p>
+      <w:pPr>
+        <w:pStyle w:val="Heading3"/>
+      </w:pPr>
+      <w:r>
+        <w:rPr>
+          <w:rFonts w:ascii="Montserrat" w:hAnsi="Montserrat" w:eastAsia="Outfit"/>
+        </w:rPr>
+        <w:t>Does IPP handle decommissioning and dismantling?</w:t>
+      </w:r>
+    </w:p>
+    <w:p>
+      <w:r>
+        <w:rPr>
+          <w:rFonts w:ascii="Roboto" w:hAnsi="Roboto" w:eastAsia="Roboto"/>
+        </w:rPr>
+        <w:t>Yes. Our team decommissions and dismantles the plant, then packs, ships and exports the equipment. IPP holds ISN RAVS Plus verification for plant decommissioning work.</w:t>
       </w:r>
     </w:p>
     <w:p>

</xml_diff>

<commit_message>
Chemical page: every IMS chemical processing type, one inventory list
- Equipment types cover all 10 types in IMS Chemical Processing
  Equipment: new agitator, fermenter, evaporator, and glass-lined
  and reactor parts panels; distillation columns now include stills.
  Centrifuges, filters and dryers stay. Eleven tabs in process order,
  each linking to its IMS search page.
- Inventory is one list of 20 featured listings with one plant-or-
  equipment type filter; the plants/equipment switch is removed.
  Six new listings give each IMS type at least one card, and the
  second button follows the selected equipment type into IMS.
- Inventory H2 reads "Chemical process plants and equipment for sale".
- IMS family facets, stock facts, outline rows, role table,
  README revision 8, Word copy and preview updated.

Co-Authored-By: Claude Opus 5.5 <noreply@anthropic.com>
</commit_message>
<xml_diff>
--- a/docs/chemical-build/deliverables/used-chemical-process-plants-for-sale-content.docx
+++ b/docs/chemical-build/deliverables/used-chemical-process-plants-for-sale-content.docx
@@ -404,15 +404,15 @@
         <w:rPr>
           <w:rFonts w:ascii="Montserrat" w:hAnsi="Montserrat" w:eastAsia="Outfit"/>
         </w:rPr>
-        <w:t>Chemical plants and equipment for sale</w:t>
-      </w:r>
-    </w:p>
-    <w:p>
-      <w:r>
-        <w:rPr>
-          <w:rFonts w:ascii="Roboto" w:hAnsi="Roboto" w:eastAsia="Roboto"/>
-        </w:rPr>
-        <w:t>IPP features six used chemical plants and eight units of process equipment from its inventory for sale. Plant listings show capacity, technology, feedstock and location. Equipment listings show material, condition, pressure and temperature. Each listing opens the full specifications and photographs in IPP’s inventory.</w:t>
+        <w:t>Chemical process plants and equipment for sale</w:t>
+      </w:r>
+    </w:p>
+    <w:p>
+      <w:r>
+        <w:rPr>
+          <w:rFonts w:ascii="Roboto" w:hAnsi="Roboto" w:eastAsia="Roboto"/>
+        </w:rPr>
+        <w:t>IPP features six used chemical plants and 14 units of chemical process equipment from its inventory in one list, with at least one listing for each equipment type we supply. Plant listings show capacity, technology, feedstock and location. Equipment listings show material, condition, pressure and temperature. Each listing opens the full specifications and photographs in IPP’s inventory.</w:t>
       </w:r>
     </w:p>
     <w:p>
@@ -1606,6 +1606,334 @@
         <w:rPr>
           <w:rFonts w:ascii="Roboto" w:hAnsi="Roboto" w:eastAsia="Roboto"/>
         </w:rPr>
+        <w:t>IPP STOCK #76524</w:t>
+      </w:r>
+    </w:p>
+    <w:p>
+      <w:pPr>
+        <w:pStyle w:val="Heading3"/>
+      </w:pPr>
+      <w:r>
+        <w:rPr>
+          <w:rFonts w:ascii="Montserrat" w:hAnsi="Montserrat" w:eastAsia="Outfit"/>
+        </w:rPr>
+        <w:t>Pfaudler 4DTW glass drive agitator</w:t>
+      </w:r>
+    </w:p>
+    <w:tbl>
+      <w:tblPr>
+        <w:tblStyle w:val="TableGrid"/>
+        <w:tblW w:type="auto" w:w="0"/>
+        <w:tblLook w:firstColumn="1" w:firstRow="1" w:lastColumn="0" w:lastRow="0" w:noHBand="0" w:noVBand="1" w:val="04A0"/>
+      </w:tblPr>
+      <w:tblGrid>
+        <w:gridCol w:w="4320"/>
+        <w:gridCol w:w="4320"/>
+      </w:tblGrid>
+      <w:tr>
+        <w:tc>
+          <w:tcPr>
+            <w:tcW w:type="dxa" w:w="4320"/>
+          </w:tcPr>
+          <w:p>
+            <w:r>
+              <w:rPr>
+                <w:rFonts w:ascii="Roboto" w:hAnsi="Roboto" w:eastAsia="Roboto"/>
+              </w:rPr>
+              <w:t>Drive power</w:t>
+            </w:r>
+          </w:p>
+        </w:tc>
+        <w:tc>
+          <w:tcPr>
+            <w:tcW w:type="dxa" w:w="4320"/>
+          </w:tcPr>
+          <w:p>
+            <w:r>
+              <w:rPr>
+                <w:rFonts w:ascii="Roboto" w:hAnsi="Roboto" w:eastAsia="Roboto"/>
+              </w:rPr>
+              <w:t>11.6 kW (15.5 hp)</w:t>
+            </w:r>
+          </w:p>
+        </w:tc>
+      </w:tr>
+      <w:tr>
+        <w:tc>
+          <w:tcPr>
+            <w:tcW w:type="dxa" w:w="4320"/>
+          </w:tcPr>
+          <w:p>
+            <w:r>
+              <w:rPr>
+                <w:rFonts w:ascii="Roboto" w:hAnsi="Roboto" w:eastAsia="Roboto"/>
+              </w:rPr>
+              <w:t>Drive speed</w:t>
+            </w:r>
+          </w:p>
+        </w:tc>
+        <w:tc>
+          <w:tcPr>
+            <w:tcW w:type="dxa" w:w="4320"/>
+          </w:tcPr>
+          <w:p>
+            <w:r>
+              <w:rPr>
+                <w:rFonts w:ascii="Roboto" w:hAnsi="Roboto" w:eastAsia="Roboto"/>
+              </w:rPr>
+              <w:t>175 rpm</w:t>
+            </w:r>
+          </w:p>
+        </w:tc>
+      </w:tr>
+      <w:tr>
+        <w:tc>
+          <w:tcPr>
+            <w:tcW w:type="dxa" w:w="4320"/>
+          </w:tcPr>
+          <w:p>
+            <w:r>
+              <w:rPr>
+                <w:rFonts w:ascii="Roboto" w:hAnsi="Roboto" w:eastAsia="Roboto"/>
+              </w:rPr>
+              <w:t>Ratio</w:t>
+            </w:r>
+          </w:p>
+        </w:tc>
+        <w:tc>
+          <w:tcPr>
+            <w:tcW w:type="dxa" w:w="4320"/>
+          </w:tcPr>
+          <w:p>
+            <w:r>
+              <w:rPr>
+                <w:rFonts w:ascii="Roboto" w:hAnsi="Roboto" w:eastAsia="Roboto"/>
+              </w:rPr>
+              <w:t>10:1</w:t>
+            </w:r>
+          </w:p>
+        </w:tc>
+      </w:tr>
+      <w:tr>
+        <w:tc>
+          <w:tcPr>
+            <w:tcW w:type="dxa" w:w="4320"/>
+          </w:tcPr>
+          <w:p>
+            <w:r>
+              <w:rPr>
+                <w:rFonts w:ascii="Roboto" w:hAnsi="Roboto" w:eastAsia="Roboto"/>
+              </w:rPr>
+              <w:t>Transmission</w:t>
+            </w:r>
+          </w:p>
+        </w:tc>
+        <w:tc>
+          <w:tcPr>
+            <w:tcW w:type="dxa" w:w="4320"/>
+          </w:tcPr>
+          <w:p>
+            <w:r>
+              <w:rPr>
+                <w:rFonts w:ascii="Roboto" w:hAnsi="Roboto" w:eastAsia="Roboto"/>
+              </w:rPr>
+              <w:t>Belt</w:t>
+            </w:r>
+          </w:p>
+        </w:tc>
+      </w:tr>
+    </w:tbl>
+    <w:p>
+      <w:r>
+        <w:rPr>
+          <w:rFonts w:ascii="Roboto" w:hAnsi="Roboto" w:eastAsia="Roboto"/>
+        </w:rPr>
+        <w:t xml:space="preserve">View Specs </w:t>
+      </w:r>
+      <w:r>
+        <w:rPr>
+          <w:rFonts w:ascii="Roboto" w:hAnsi="Roboto" w:eastAsia="Roboto"/>
+        </w:rPr>
+        <w:t>↗</w:t>
+      </w:r>
+    </w:p>
+    <w:p>
+      <w:r>
+        <w:rPr>
+          <w:rFonts w:ascii="Roboto" w:hAnsi="Roboto" w:eastAsia="Roboto"/>
+        </w:rPr>
+        <w:t>Enquire ↗</w:t>
+      </w:r>
+    </w:p>
+    <w:p>
+      <w:r>
+        <w:rPr>
+          <w:rFonts w:ascii="Roboto" w:hAnsi="Roboto" w:eastAsia="Roboto"/>
+        </w:rPr>
+        <w:t>IPP STOCK #705876</w:t>
+      </w:r>
+    </w:p>
+    <w:p>
+      <w:pPr>
+        <w:pStyle w:val="Heading3"/>
+      </w:pPr>
+      <w:r>
+        <w:rPr>
+          <w:rFonts w:ascii="Montserrat" w:hAnsi="Montserrat" w:eastAsia="Outfit"/>
+        </w:rPr>
+        <w:t>Tankki OY stainless steel fermenter</w:t>
+      </w:r>
+    </w:p>
+    <w:tbl>
+      <w:tblPr>
+        <w:tblStyle w:val="TableGrid"/>
+        <w:tblW w:type="auto" w:w="0"/>
+        <w:tblLook w:firstColumn="1" w:firstRow="1" w:lastColumn="0" w:lastRow="0" w:noHBand="0" w:noVBand="1" w:val="04A0"/>
+      </w:tblPr>
+      <w:tblGrid>
+        <w:gridCol w:w="4320"/>
+        <w:gridCol w:w="4320"/>
+      </w:tblGrid>
+      <w:tr>
+        <w:tc>
+          <w:tcPr>
+            <w:tcW w:type="dxa" w:w="4320"/>
+          </w:tcPr>
+          <w:p>
+            <w:r>
+              <w:rPr>
+                <w:rFonts w:ascii="Roboto" w:hAnsi="Roboto" w:eastAsia="Roboto"/>
+              </w:rPr>
+              <w:t>Capacity</w:t>
+            </w:r>
+          </w:p>
+        </w:tc>
+        <w:tc>
+          <w:tcPr>
+            <w:tcW w:type="dxa" w:w="4320"/>
+          </w:tcPr>
+          <w:p>
+            <w:r>
+              <w:rPr>
+                <w:rFonts w:ascii="Roboto" w:hAnsi="Roboto" w:eastAsia="Roboto"/>
+              </w:rPr>
+              <w:t>12,500 L (3,300 US gal)</w:t>
+            </w:r>
+          </w:p>
+        </w:tc>
+      </w:tr>
+      <w:tr>
+        <w:tc>
+          <w:tcPr>
+            <w:tcW w:type="dxa" w:w="4320"/>
+          </w:tcPr>
+          <w:p>
+            <w:r>
+              <w:rPr>
+                <w:rFonts w:ascii="Roboto" w:hAnsi="Roboto" w:eastAsia="Roboto"/>
+              </w:rPr>
+              <w:t>Material</w:t>
+            </w:r>
+          </w:p>
+        </w:tc>
+        <w:tc>
+          <w:tcPr>
+            <w:tcW w:type="dxa" w:w="4320"/>
+          </w:tcPr>
+          <w:p>
+            <w:r>
+              <w:rPr>
+                <w:rFonts w:ascii="Roboto" w:hAnsi="Roboto" w:eastAsia="Roboto"/>
+              </w:rPr>
+              <w:t>Stainless steel 316</w:t>
+            </w:r>
+          </w:p>
+        </w:tc>
+      </w:tr>
+      <w:tr>
+        <w:tc>
+          <w:tcPr>
+            <w:tcW w:type="dxa" w:w="4320"/>
+          </w:tcPr>
+          <w:p>
+            <w:r>
+              <w:rPr>
+                <w:rFonts w:ascii="Roboto" w:hAnsi="Roboto" w:eastAsia="Roboto"/>
+              </w:rPr>
+              <w:t>Pressure</w:t>
+            </w:r>
+          </w:p>
+        </w:tc>
+        <w:tc>
+          <w:tcPr>
+            <w:tcW w:type="dxa" w:w="4320"/>
+          </w:tcPr>
+          <w:p>
+            <w:r>
+              <w:rPr>
+                <w:rFonts w:ascii="Roboto" w:hAnsi="Roboto" w:eastAsia="Roboto"/>
+              </w:rPr>
+              <w:t>4 bar (58 psi)</w:t>
+            </w:r>
+          </w:p>
+        </w:tc>
+      </w:tr>
+      <w:tr>
+        <w:tc>
+          <w:tcPr>
+            <w:tcW w:type="dxa" w:w="4320"/>
+          </w:tcPr>
+          <w:p>
+            <w:r>
+              <w:rPr>
+                <w:rFonts w:ascii="Roboto" w:hAnsi="Roboto" w:eastAsia="Roboto"/>
+              </w:rPr>
+              <w:t>Temperature</w:t>
+            </w:r>
+          </w:p>
+        </w:tc>
+        <w:tc>
+          <w:tcPr>
+            <w:tcW w:type="dxa" w:w="4320"/>
+          </w:tcPr>
+          <w:p>
+            <w:r>
+              <w:rPr>
+                <w:rFonts w:ascii="Roboto" w:hAnsi="Roboto" w:eastAsia="Roboto"/>
+              </w:rPr>
+              <w:t>160 °C (320 °F)</w:t>
+            </w:r>
+          </w:p>
+        </w:tc>
+      </w:tr>
+    </w:tbl>
+    <w:p>
+      <w:r>
+        <w:rPr>
+          <w:rFonts w:ascii="Roboto" w:hAnsi="Roboto" w:eastAsia="Roboto"/>
+        </w:rPr>
+        <w:t xml:space="preserve">View Specs </w:t>
+      </w:r>
+      <w:r>
+        <w:rPr>
+          <w:rFonts w:ascii="Roboto" w:hAnsi="Roboto" w:eastAsia="Roboto"/>
+        </w:rPr>
+        <w:t>↗</w:t>
+      </w:r>
+    </w:p>
+    <w:p>
+      <w:r>
+        <w:rPr>
+          <w:rFonts w:ascii="Roboto" w:hAnsi="Roboto" w:eastAsia="Roboto"/>
+        </w:rPr>
+        <w:t>Enquire ↗</w:t>
+      </w:r>
+    </w:p>
+    <w:p>
+      <w:r>
+        <w:rPr>
+          <w:rFonts w:ascii="Roboto" w:hAnsi="Roboto" w:eastAsia="Roboto"/>
+        </w:rPr>
         <w:t>IPP STOCK #242533</w:t>
       </w:r>
     </w:p>
@@ -1770,6 +2098,498 @@
         <w:rPr>
           <w:rFonts w:ascii="Roboto" w:hAnsi="Roboto" w:eastAsia="Roboto"/>
         </w:rPr>
+        <w:t>IPP STOCK #220954</w:t>
+      </w:r>
+    </w:p>
+    <w:p>
+      <w:pPr>
+        <w:pStyle w:val="Heading3"/>
+      </w:pPr>
+      <w:r>
+        <w:rPr>
+          <w:rFonts w:ascii="Montserrat" w:hAnsi="Montserrat" w:eastAsia="Outfit"/>
+        </w:rPr>
+        <w:t>SMS Buss wiped film evaporator</w:t>
+      </w:r>
+    </w:p>
+    <w:tbl>
+      <w:tblPr>
+        <w:tblStyle w:val="TableGrid"/>
+        <w:tblW w:type="auto" w:w="0"/>
+        <w:tblLook w:firstColumn="1" w:firstRow="1" w:lastColumn="0" w:lastRow="0" w:noHBand="0" w:noVBand="1" w:val="04A0"/>
+      </w:tblPr>
+      <w:tblGrid>
+        <w:gridCol w:w="4320"/>
+        <w:gridCol w:w="4320"/>
+      </w:tblGrid>
+      <w:tr>
+        <w:tc>
+          <w:tcPr>
+            <w:tcW w:type="dxa" w:w="4320"/>
+          </w:tcPr>
+          <w:p>
+            <w:r>
+              <w:rPr>
+                <w:rFonts w:ascii="Roboto" w:hAnsi="Roboto" w:eastAsia="Roboto"/>
+              </w:rPr>
+              <w:t>Evaporation</w:t>
+            </w:r>
+          </w:p>
+        </w:tc>
+        <w:tc>
+          <w:tcPr>
+            <w:tcW w:type="dxa" w:w="4320"/>
+          </w:tcPr>
+          <w:p>
+            <w:r>
+              <w:rPr>
+                <w:rFonts w:ascii="Roboto" w:hAnsi="Roboto" w:eastAsia="Roboto"/>
+              </w:rPr>
+              <w:t>340.2 kg/h (750 lb/h)</w:t>
+            </w:r>
+          </w:p>
+        </w:tc>
+      </w:tr>
+      <w:tr>
+        <w:tc>
+          <w:tcPr>
+            <w:tcW w:type="dxa" w:w="4320"/>
+          </w:tcPr>
+          <w:p>
+            <w:r>
+              <w:rPr>
+                <w:rFonts w:ascii="Roboto" w:hAnsi="Roboto" w:eastAsia="Roboto"/>
+              </w:rPr>
+              <w:t>Material</w:t>
+            </w:r>
+          </w:p>
+        </w:tc>
+        <w:tc>
+          <w:tcPr>
+            <w:tcW w:type="dxa" w:w="4320"/>
+          </w:tcPr>
+          <w:p>
+            <w:r>
+              <w:rPr>
+                <w:rFonts w:ascii="Roboto" w:hAnsi="Roboto" w:eastAsia="Roboto"/>
+              </w:rPr>
+              <w:t>Hastelloy C22 clad</w:t>
+            </w:r>
+          </w:p>
+        </w:tc>
+      </w:tr>
+      <w:tr>
+        <w:tc>
+          <w:tcPr>
+            <w:tcW w:type="dxa" w:w="4320"/>
+          </w:tcPr>
+          <w:p>
+            <w:r>
+              <w:rPr>
+                <w:rFonts w:ascii="Roboto" w:hAnsi="Roboto" w:eastAsia="Roboto"/>
+              </w:rPr>
+              <w:t>Surface area</w:t>
+            </w:r>
+          </w:p>
+        </w:tc>
+        <w:tc>
+          <w:tcPr>
+            <w:tcW w:type="dxa" w:w="4320"/>
+          </w:tcPr>
+          <w:p>
+            <w:r>
+              <w:rPr>
+                <w:rFonts w:ascii="Roboto" w:hAnsi="Roboto" w:eastAsia="Roboto"/>
+              </w:rPr>
+              <w:t>14 m² (150.7 ft²)</w:t>
+            </w:r>
+          </w:p>
+        </w:tc>
+      </w:tr>
+      <w:tr>
+        <w:tc>
+          <w:tcPr>
+            <w:tcW w:type="dxa" w:w="4320"/>
+          </w:tcPr>
+          <w:p>
+            <w:r>
+              <w:rPr>
+                <w:rFonts w:ascii="Roboto" w:hAnsi="Roboto" w:eastAsia="Roboto"/>
+              </w:rPr>
+              <w:t>Temperature</w:t>
+            </w:r>
+          </w:p>
+        </w:tc>
+        <w:tc>
+          <w:tcPr>
+            <w:tcW w:type="dxa" w:w="4320"/>
+          </w:tcPr>
+          <w:p>
+            <w:r>
+              <w:rPr>
+                <w:rFonts w:ascii="Roboto" w:hAnsi="Roboto" w:eastAsia="Roboto"/>
+              </w:rPr>
+              <w:t>250 °C (482 °F)</w:t>
+            </w:r>
+          </w:p>
+        </w:tc>
+      </w:tr>
+    </w:tbl>
+    <w:p>
+      <w:r>
+        <w:rPr>
+          <w:rFonts w:ascii="Roboto" w:hAnsi="Roboto" w:eastAsia="Roboto"/>
+        </w:rPr>
+        <w:t xml:space="preserve">View Specs </w:t>
+      </w:r>
+      <w:r>
+        <w:rPr>
+          <w:rFonts w:ascii="Roboto" w:hAnsi="Roboto" w:eastAsia="Roboto"/>
+        </w:rPr>
+        <w:t>↗</w:t>
+      </w:r>
+    </w:p>
+    <w:p>
+      <w:r>
+        <w:rPr>
+          <w:rFonts w:ascii="Roboto" w:hAnsi="Roboto" w:eastAsia="Roboto"/>
+        </w:rPr>
+        <w:t>Enquire ↗</w:t>
+      </w:r>
+    </w:p>
+    <w:p>
+      <w:r>
+        <w:rPr>
+          <w:rFonts w:ascii="Roboto" w:hAnsi="Roboto" w:eastAsia="Roboto"/>
+        </w:rPr>
+        <w:t>IPP STOCK #211545</w:t>
+      </w:r>
+    </w:p>
+    <w:p>
+      <w:pPr>
+        <w:pStyle w:val="Heading3"/>
+      </w:pPr>
+      <w:r>
+        <w:rPr>
+          <w:rFonts w:ascii="Montserrat" w:hAnsi="Montserrat" w:eastAsia="Outfit"/>
+        </w:rPr>
+        <w:t>Estrella glass-lined packed column</w:t>
+      </w:r>
+    </w:p>
+    <w:tbl>
+      <w:tblPr>
+        <w:tblStyle w:val="TableGrid"/>
+        <w:tblW w:type="auto" w:w="0"/>
+        <w:tblLook w:firstColumn="1" w:firstRow="1" w:lastColumn="0" w:lastRow="0" w:noHBand="0" w:noVBand="1" w:val="04A0"/>
+      </w:tblPr>
+      <w:tblGrid>
+        <w:gridCol w:w="4320"/>
+        <w:gridCol w:w="4320"/>
+      </w:tblGrid>
+      <w:tr>
+        <w:tc>
+          <w:tcPr>
+            <w:tcW w:type="dxa" w:w="4320"/>
+          </w:tcPr>
+          <w:p>
+            <w:r>
+              <w:rPr>
+                <w:rFonts w:ascii="Roboto" w:hAnsi="Roboto" w:eastAsia="Roboto"/>
+              </w:rPr>
+              <w:t>Diameter</w:t>
+            </w:r>
+          </w:p>
+        </w:tc>
+        <w:tc>
+          <w:tcPr>
+            <w:tcW w:type="dxa" w:w="4320"/>
+          </w:tcPr>
+          <w:p>
+            <w:r>
+              <w:rPr>
+                <w:rFonts w:ascii="Roboto" w:hAnsi="Roboto" w:eastAsia="Roboto"/>
+              </w:rPr>
+              <w:t>800 mm (31.5 in)</w:t>
+            </w:r>
+          </w:p>
+        </w:tc>
+      </w:tr>
+      <w:tr>
+        <w:tc>
+          <w:tcPr>
+            <w:tcW w:type="dxa" w:w="4320"/>
+          </w:tcPr>
+          <w:p>
+            <w:r>
+              <w:rPr>
+                <w:rFonts w:ascii="Roboto" w:hAnsi="Roboto" w:eastAsia="Roboto"/>
+              </w:rPr>
+              <w:t>Material</w:t>
+            </w:r>
+          </w:p>
+        </w:tc>
+        <w:tc>
+          <w:tcPr>
+            <w:tcW w:type="dxa" w:w="4320"/>
+          </w:tcPr>
+          <w:p>
+            <w:r>
+              <w:rPr>
+                <w:rFonts w:ascii="Roboto" w:hAnsi="Roboto" w:eastAsia="Roboto"/>
+              </w:rPr>
+              <w:t>Glass-lined</w:t>
+            </w:r>
+          </w:p>
+        </w:tc>
+      </w:tr>
+      <w:tr>
+        <w:tc>
+          <w:tcPr>
+            <w:tcW w:type="dxa" w:w="4320"/>
+          </w:tcPr>
+          <w:p>
+            <w:r>
+              <w:rPr>
+                <w:rFonts w:ascii="Roboto" w:hAnsi="Roboto" w:eastAsia="Roboto"/>
+              </w:rPr>
+              <w:t>Pressure</w:t>
+            </w:r>
+          </w:p>
+        </w:tc>
+        <w:tc>
+          <w:tcPr>
+            <w:tcW w:type="dxa" w:w="4320"/>
+          </w:tcPr>
+          <w:p>
+            <w:r>
+              <w:rPr>
+                <w:rFonts w:ascii="Roboto" w:hAnsi="Roboto" w:eastAsia="Roboto"/>
+              </w:rPr>
+              <w:t>2 bar (29 psi)</w:t>
+            </w:r>
+          </w:p>
+        </w:tc>
+      </w:tr>
+      <w:tr>
+        <w:tc>
+          <w:tcPr>
+            <w:tcW w:type="dxa" w:w="4320"/>
+          </w:tcPr>
+          <w:p>
+            <w:r>
+              <w:rPr>
+                <w:rFonts w:ascii="Roboto" w:hAnsi="Roboto" w:eastAsia="Roboto"/>
+              </w:rPr>
+              <w:t>Temperature</w:t>
+            </w:r>
+          </w:p>
+        </w:tc>
+        <w:tc>
+          <w:tcPr>
+            <w:tcW w:type="dxa" w:w="4320"/>
+          </w:tcPr>
+          <w:p>
+            <w:r>
+              <w:rPr>
+                <w:rFonts w:ascii="Roboto" w:hAnsi="Roboto" w:eastAsia="Roboto"/>
+              </w:rPr>
+              <w:t>200 °C (392 °F)</w:t>
+            </w:r>
+          </w:p>
+        </w:tc>
+      </w:tr>
+    </w:tbl>
+    <w:p>
+      <w:r>
+        <w:rPr>
+          <w:rFonts w:ascii="Roboto" w:hAnsi="Roboto" w:eastAsia="Roboto"/>
+        </w:rPr>
+        <w:t xml:space="preserve">View Specs </w:t>
+      </w:r>
+      <w:r>
+        <w:rPr>
+          <w:rFonts w:ascii="Roboto" w:hAnsi="Roboto" w:eastAsia="Roboto"/>
+        </w:rPr>
+        <w:t>↗</w:t>
+      </w:r>
+    </w:p>
+    <w:p>
+      <w:r>
+        <w:rPr>
+          <w:rFonts w:ascii="Roboto" w:hAnsi="Roboto" w:eastAsia="Roboto"/>
+        </w:rPr>
+        <w:t>Enquire ↗</w:t>
+      </w:r>
+    </w:p>
+    <w:p>
+      <w:r>
+        <w:rPr>
+          <w:rFonts w:ascii="Roboto" w:hAnsi="Roboto" w:eastAsia="Roboto"/>
+        </w:rPr>
+        <w:t>IPP STOCK #236163</w:t>
+      </w:r>
+    </w:p>
+    <w:p>
+      <w:pPr>
+        <w:pStyle w:val="Heading3"/>
+      </w:pPr>
+      <w:r>
+        <w:rPr>
+          <w:rFonts w:ascii="Montserrat" w:hAnsi="Montserrat" w:eastAsia="Outfit"/>
+        </w:rPr>
+        <w:t>Doring &amp; Baumer column still</w:t>
+      </w:r>
+    </w:p>
+    <w:tbl>
+      <w:tblPr>
+        <w:tblStyle w:val="TableGrid"/>
+        <w:tblW w:type="auto" w:w="0"/>
+        <w:tblLook w:firstColumn="1" w:firstRow="1" w:lastColumn="0" w:lastRow="0" w:noHBand="0" w:noVBand="1" w:val="04A0"/>
+      </w:tblPr>
+      <w:tblGrid>
+        <w:gridCol w:w="4320"/>
+        <w:gridCol w:w="4320"/>
+      </w:tblGrid>
+      <w:tr>
+        <w:tc>
+          <w:tcPr>
+            <w:tcW w:type="dxa" w:w="4320"/>
+          </w:tcPr>
+          <w:p>
+            <w:r>
+              <w:rPr>
+                <w:rFonts w:ascii="Roboto" w:hAnsi="Roboto" w:eastAsia="Roboto"/>
+              </w:rPr>
+              <w:t>Diameter</w:t>
+            </w:r>
+          </w:p>
+        </w:tc>
+        <w:tc>
+          <w:tcPr>
+            <w:tcW w:type="dxa" w:w="4320"/>
+          </w:tcPr>
+          <w:p>
+            <w:r>
+              <w:rPr>
+                <w:rFonts w:ascii="Roboto" w:hAnsi="Roboto" w:eastAsia="Roboto"/>
+              </w:rPr>
+              <w:t>2,200 mm (86.6 in)</w:t>
+            </w:r>
+          </w:p>
+        </w:tc>
+      </w:tr>
+      <w:tr>
+        <w:tc>
+          <w:tcPr>
+            <w:tcW w:type="dxa" w:w="4320"/>
+          </w:tcPr>
+          <w:p>
+            <w:r>
+              <w:rPr>
+                <w:rFonts w:ascii="Roboto" w:hAnsi="Roboto" w:eastAsia="Roboto"/>
+              </w:rPr>
+              <w:t>Material</w:t>
+            </w:r>
+          </w:p>
+        </w:tc>
+        <w:tc>
+          <w:tcPr>
+            <w:tcW w:type="dxa" w:w="4320"/>
+          </w:tcPr>
+          <w:p>
+            <w:r>
+              <w:rPr>
+                <w:rFonts w:ascii="Roboto" w:hAnsi="Roboto" w:eastAsia="Roboto"/>
+              </w:rPr>
+              <w:t>Stainless steel 321</w:t>
+            </w:r>
+          </w:p>
+        </w:tc>
+      </w:tr>
+      <w:tr>
+        <w:tc>
+          <w:tcPr>
+            <w:tcW w:type="dxa" w:w="4320"/>
+          </w:tcPr>
+          <w:p>
+            <w:r>
+              <w:rPr>
+                <w:rFonts w:ascii="Roboto" w:hAnsi="Roboto" w:eastAsia="Roboto"/>
+              </w:rPr>
+              <w:t>Pressure</w:t>
+            </w:r>
+          </w:p>
+        </w:tc>
+        <w:tc>
+          <w:tcPr>
+            <w:tcW w:type="dxa" w:w="4320"/>
+          </w:tcPr>
+          <w:p>
+            <w:r>
+              <w:rPr>
+                <w:rFonts w:ascii="Roboto" w:hAnsi="Roboto" w:eastAsia="Roboto"/>
+              </w:rPr>
+              <w:t>15 bar (217.6 psi)</w:t>
+            </w:r>
+          </w:p>
+        </w:tc>
+      </w:tr>
+      <w:tr>
+        <w:tc>
+          <w:tcPr>
+            <w:tcW w:type="dxa" w:w="4320"/>
+          </w:tcPr>
+          <w:p>
+            <w:r>
+              <w:rPr>
+                <w:rFonts w:ascii="Roboto" w:hAnsi="Roboto" w:eastAsia="Roboto"/>
+              </w:rPr>
+              <w:t>Temperature</w:t>
+            </w:r>
+          </w:p>
+        </w:tc>
+        <w:tc>
+          <w:tcPr>
+            <w:tcW w:type="dxa" w:w="4320"/>
+          </w:tcPr>
+          <w:p>
+            <w:r>
+              <w:rPr>
+                <w:rFonts w:ascii="Roboto" w:hAnsi="Roboto" w:eastAsia="Roboto"/>
+              </w:rPr>
+              <w:t>300 °C (572 °F)</w:t>
+            </w:r>
+          </w:p>
+        </w:tc>
+      </w:tr>
+    </w:tbl>
+    <w:p>
+      <w:r>
+        <w:rPr>
+          <w:rFonts w:ascii="Roboto" w:hAnsi="Roboto" w:eastAsia="Roboto"/>
+        </w:rPr>
+        <w:t xml:space="preserve">View Specs </w:t>
+      </w:r>
+      <w:r>
+        <w:rPr>
+          <w:rFonts w:ascii="Roboto" w:hAnsi="Roboto" w:eastAsia="Roboto"/>
+        </w:rPr>
+        <w:t>↗</w:t>
+      </w:r>
+    </w:p>
+    <w:p>
+      <w:r>
+        <w:rPr>
+          <w:rFonts w:ascii="Roboto" w:hAnsi="Roboto" w:eastAsia="Roboto"/>
+        </w:rPr>
+        <w:t>Enquire ↗</w:t>
+      </w:r>
+    </w:p>
+    <w:p>
+      <w:r>
+        <w:rPr>
+          <w:rFonts w:ascii="Roboto" w:hAnsi="Roboto" w:eastAsia="Roboto"/>
+        </w:rPr>
         <w:t>IPP STOCK #235730</w:t>
       </w:r>
     </w:p>
@@ -1934,6 +2754,170 @@
         <w:rPr>
           <w:rFonts w:ascii="Roboto" w:hAnsi="Roboto" w:eastAsia="Roboto"/>
         </w:rPr>
+        <w:t>IPP STOCK #225365</w:t>
+      </w:r>
+    </w:p>
+    <w:p>
+      <w:pPr>
+        <w:pStyle w:val="Heading3"/>
+      </w:pPr>
+      <w:r>
+        <w:rPr>
+          <w:rFonts w:ascii="Montserrat" w:hAnsi="Montserrat" w:eastAsia="Outfit"/>
+        </w:rPr>
+        <w:t>Perrin filter press</w:t>
+      </w:r>
+    </w:p>
+    <w:tbl>
+      <w:tblPr>
+        <w:tblStyle w:val="TableGrid"/>
+        <w:tblW w:type="auto" w:w="0"/>
+        <w:tblLook w:firstColumn="1" w:firstRow="1" w:lastColumn="0" w:lastRow="0" w:noHBand="0" w:noVBand="1" w:val="04A0"/>
+      </w:tblPr>
+      <w:tblGrid>
+        <w:gridCol w:w="4320"/>
+        <w:gridCol w:w="4320"/>
+      </w:tblGrid>
+      <w:tr>
+        <w:tc>
+          <w:tcPr>
+            <w:tcW w:type="dxa" w:w="4320"/>
+          </w:tcPr>
+          <w:p>
+            <w:r>
+              <w:rPr>
+                <w:rFonts w:ascii="Roboto" w:hAnsi="Roboto" w:eastAsia="Roboto"/>
+              </w:rPr>
+              <w:t>Filtration area</w:t>
+            </w:r>
+          </w:p>
+        </w:tc>
+        <w:tc>
+          <w:tcPr>
+            <w:tcW w:type="dxa" w:w="4320"/>
+          </w:tcPr>
+          <w:p>
+            <w:r>
+              <w:rPr>
+                <w:rFonts w:ascii="Roboto" w:hAnsi="Roboto" w:eastAsia="Roboto"/>
+              </w:rPr>
+              <w:t>37 m² (398.3 ft²)</w:t>
+            </w:r>
+          </w:p>
+        </w:tc>
+      </w:tr>
+      <w:tr>
+        <w:tc>
+          <w:tcPr>
+            <w:tcW w:type="dxa" w:w="4320"/>
+          </w:tcPr>
+          <w:p>
+            <w:r>
+              <w:rPr>
+                <w:rFonts w:ascii="Roboto" w:hAnsi="Roboto" w:eastAsia="Roboto"/>
+              </w:rPr>
+              <w:t>Material</w:t>
+            </w:r>
+          </w:p>
+        </w:tc>
+        <w:tc>
+          <w:tcPr>
+            <w:tcW w:type="dxa" w:w="4320"/>
+          </w:tcPr>
+          <w:p>
+            <w:r>
+              <w:rPr>
+                <w:rFonts w:ascii="Roboto" w:hAnsi="Roboto" w:eastAsia="Roboto"/>
+              </w:rPr>
+              <w:t>Polypropylene</w:t>
+            </w:r>
+          </w:p>
+        </w:tc>
+      </w:tr>
+      <w:tr>
+        <w:tc>
+          <w:tcPr>
+            <w:tcW w:type="dxa" w:w="4320"/>
+          </w:tcPr>
+          <w:p>
+            <w:r>
+              <w:rPr>
+                <w:rFonts w:ascii="Roboto" w:hAnsi="Roboto" w:eastAsia="Roboto"/>
+              </w:rPr>
+              <w:t>Pressure</w:t>
+            </w:r>
+          </w:p>
+        </w:tc>
+        <w:tc>
+          <w:tcPr>
+            <w:tcW w:type="dxa" w:w="4320"/>
+          </w:tcPr>
+          <w:p>
+            <w:r>
+              <w:rPr>
+                <w:rFonts w:ascii="Roboto" w:hAnsi="Roboto" w:eastAsia="Roboto"/>
+              </w:rPr>
+              <w:t>6.9 bar (100 psi)</w:t>
+            </w:r>
+          </w:p>
+        </w:tc>
+      </w:tr>
+      <w:tr>
+        <w:tc>
+          <w:tcPr>
+            <w:tcW w:type="dxa" w:w="4320"/>
+          </w:tcPr>
+          <w:p>
+            <w:r>
+              <w:rPr>
+                <w:rFonts w:ascii="Roboto" w:hAnsi="Roboto" w:eastAsia="Roboto"/>
+              </w:rPr>
+              <w:t>Temperature</w:t>
+            </w:r>
+          </w:p>
+        </w:tc>
+        <w:tc>
+          <w:tcPr>
+            <w:tcW w:type="dxa" w:w="4320"/>
+          </w:tcPr>
+          <w:p>
+            <w:r>
+              <w:rPr>
+                <w:rFonts w:ascii="Roboto" w:hAnsi="Roboto" w:eastAsia="Roboto"/>
+              </w:rPr>
+              <w:t>21.1 °C (70 °F)</w:t>
+            </w:r>
+          </w:p>
+        </w:tc>
+      </w:tr>
+    </w:tbl>
+    <w:p>
+      <w:r>
+        <w:rPr>
+          <w:rFonts w:ascii="Roboto" w:hAnsi="Roboto" w:eastAsia="Roboto"/>
+        </w:rPr>
+        <w:t xml:space="preserve">View Specs </w:t>
+      </w:r>
+      <w:r>
+        <w:rPr>
+          <w:rFonts w:ascii="Roboto" w:hAnsi="Roboto" w:eastAsia="Roboto"/>
+        </w:rPr>
+        <w:t>↗</w:t>
+      </w:r>
+    </w:p>
+    <w:p>
+      <w:r>
+        <w:rPr>
+          <w:rFonts w:ascii="Roboto" w:hAnsi="Roboto" w:eastAsia="Roboto"/>
+        </w:rPr>
+        <w:t>Enquire ↗</w:t>
+      </w:r>
+    </w:p>
+    <w:p>
+      <w:r>
+        <w:rPr>
+          <w:rFonts w:ascii="Roboto" w:hAnsi="Roboto" w:eastAsia="Roboto"/>
+        </w:rPr>
         <w:t>IPP STOCK #238212</w:t>
       </w:r>
     </w:p>
@@ -2098,334 +3082,6 @@
         <w:rPr>
           <w:rFonts w:ascii="Roboto" w:hAnsi="Roboto" w:eastAsia="Roboto"/>
         </w:rPr>
-        <w:t>IPP STOCK #225365</w:t>
-      </w:r>
-    </w:p>
-    <w:p>
-      <w:pPr>
-        <w:pStyle w:val="Heading3"/>
-      </w:pPr>
-      <w:r>
-        <w:rPr>
-          <w:rFonts w:ascii="Montserrat" w:hAnsi="Montserrat" w:eastAsia="Outfit"/>
-        </w:rPr>
-        <w:t>Perrin filter press</w:t>
-      </w:r>
-    </w:p>
-    <w:tbl>
-      <w:tblPr>
-        <w:tblStyle w:val="TableGrid"/>
-        <w:tblW w:type="auto" w:w="0"/>
-        <w:tblLook w:firstColumn="1" w:firstRow="1" w:lastColumn="0" w:lastRow="0" w:noHBand="0" w:noVBand="1" w:val="04A0"/>
-      </w:tblPr>
-      <w:tblGrid>
-        <w:gridCol w:w="4320"/>
-        <w:gridCol w:w="4320"/>
-      </w:tblGrid>
-      <w:tr>
-        <w:tc>
-          <w:tcPr>
-            <w:tcW w:type="dxa" w:w="4320"/>
-          </w:tcPr>
-          <w:p>
-            <w:r>
-              <w:rPr>
-                <w:rFonts w:ascii="Roboto" w:hAnsi="Roboto" w:eastAsia="Roboto"/>
-              </w:rPr>
-              <w:t>Filtration area</w:t>
-            </w:r>
-          </w:p>
-        </w:tc>
-        <w:tc>
-          <w:tcPr>
-            <w:tcW w:type="dxa" w:w="4320"/>
-          </w:tcPr>
-          <w:p>
-            <w:r>
-              <w:rPr>
-                <w:rFonts w:ascii="Roboto" w:hAnsi="Roboto" w:eastAsia="Roboto"/>
-              </w:rPr>
-              <w:t>37 m² (398.3 ft²)</w:t>
-            </w:r>
-          </w:p>
-        </w:tc>
-      </w:tr>
-      <w:tr>
-        <w:tc>
-          <w:tcPr>
-            <w:tcW w:type="dxa" w:w="4320"/>
-          </w:tcPr>
-          <w:p>
-            <w:r>
-              <w:rPr>
-                <w:rFonts w:ascii="Roboto" w:hAnsi="Roboto" w:eastAsia="Roboto"/>
-              </w:rPr>
-              <w:t>Material</w:t>
-            </w:r>
-          </w:p>
-        </w:tc>
-        <w:tc>
-          <w:tcPr>
-            <w:tcW w:type="dxa" w:w="4320"/>
-          </w:tcPr>
-          <w:p>
-            <w:r>
-              <w:rPr>
-                <w:rFonts w:ascii="Roboto" w:hAnsi="Roboto" w:eastAsia="Roboto"/>
-              </w:rPr>
-              <w:t>Polypropylene</w:t>
-            </w:r>
-          </w:p>
-        </w:tc>
-      </w:tr>
-      <w:tr>
-        <w:tc>
-          <w:tcPr>
-            <w:tcW w:type="dxa" w:w="4320"/>
-          </w:tcPr>
-          <w:p>
-            <w:r>
-              <w:rPr>
-                <w:rFonts w:ascii="Roboto" w:hAnsi="Roboto" w:eastAsia="Roboto"/>
-              </w:rPr>
-              <w:t>Pressure</w:t>
-            </w:r>
-          </w:p>
-        </w:tc>
-        <w:tc>
-          <w:tcPr>
-            <w:tcW w:type="dxa" w:w="4320"/>
-          </w:tcPr>
-          <w:p>
-            <w:r>
-              <w:rPr>
-                <w:rFonts w:ascii="Roboto" w:hAnsi="Roboto" w:eastAsia="Roboto"/>
-              </w:rPr>
-              <w:t>6.9 bar (100 psi)</w:t>
-            </w:r>
-          </w:p>
-        </w:tc>
-      </w:tr>
-      <w:tr>
-        <w:tc>
-          <w:tcPr>
-            <w:tcW w:type="dxa" w:w="4320"/>
-          </w:tcPr>
-          <w:p>
-            <w:r>
-              <w:rPr>
-                <w:rFonts w:ascii="Roboto" w:hAnsi="Roboto" w:eastAsia="Roboto"/>
-              </w:rPr>
-              <w:t>Temperature</w:t>
-            </w:r>
-          </w:p>
-        </w:tc>
-        <w:tc>
-          <w:tcPr>
-            <w:tcW w:type="dxa" w:w="4320"/>
-          </w:tcPr>
-          <w:p>
-            <w:r>
-              <w:rPr>
-                <w:rFonts w:ascii="Roboto" w:hAnsi="Roboto" w:eastAsia="Roboto"/>
-              </w:rPr>
-              <w:t>21.1 °C (70 °F)</w:t>
-            </w:r>
-          </w:p>
-        </w:tc>
-      </w:tr>
-    </w:tbl>
-    <w:p>
-      <w:r>
-        <w:rPr>
-          <w:rFonts w:ascii="Roboto" w:hAnsi="Roboto" w:eastAsia="Roboto"/>
-        </w:rPr>
-        <w:t xml:space="preserve">View Specs </w:t>
-      </w:r>
-      <w:r>
-        <w:rPr>
-          <w:rFonts w:ascii="Roboto" w:hAnsi="Roboto" w:eastAsia="Roboto"/>
-        </w:rPr>
-        <w:t>↗</w:t>
-      </w:r>
-    </w:p>
-    <w:p>
-      <w:r>
-        <w:rPr>
-          <w:rFonts w:ascii="Roboto" w:hAnsi="Roboto" w:eastAsia="Roboto"/>
-        </w:rPr>
-        <w:t>Enquire ↗</w:t>
-      </w:r>
-    </w:p>
-    <w:p>
-      <w:r>
-        <w:rPr>
-          <w:rFonts w:ascii="Roboto" w:hAnsi="Roboto" w:eastAsia="Roboto"/>
-        </w:rPr>
-        <w:t>IPP STOCK #211545</w:t>
-      </w:r>
-    </w:p>
-    <w:p>
-      <w:pPr>
-        <w:pStyle w:val="Heading3"/>
-      </w:pPr>
-      <w:r>
-        <w:rPr>
-          <w:rFonts w:ascii="Montserrat" w:hAnsi="Montserrat" w:eastAsia="Outfit"/>
-        </w:rPr>
-        <w:t>Estrella glass-lined packed column</w:t>
-      </w:r>
-    </w:p>
-    <w:tbl>
-      <w:tblPr>
-        <w:tblStyle w:val="TableGrid"/>
-        <w:tblW w:type="auto" w:w="0"/>
-        <w:tblLook w:firstColumn="1" w:firstRow="1" w:lastColumn="0" w:lastRow="0" w:noHBand="0" w:noVBand="1" w:val="04A0"/>
-      </w:tblPr>
-      <w:tblGrid>
-        <w:gridCol w:w="4320"/>
-        <w:gridCol w:w="4320"/>
-      </w:tblGrid>
-      <w:tr>
-        <w:tc>
-          <w:tcPr>
-            <w:tcW w:type="dxa" w:w="4320"/>
-          </w:tcPr>
-          <w:p>
-            <w:r>
-              <w:rPr>
-                <w:rFonts w:ascii="Roboto" w:hAnsi="Roboto" w:eastAsia="Roboto"/>
-              </w:rPr>
-              <w:t>Diameter</w:t>
-            </w:r>
-          </w:p>
-        </w:tc>
-        <w:tc>
-          <w:tcPr>
-            <w:tcW w:type="dxa" w:w="4320"/>
-          </w:tcPr>
-          <w:p>
-            <w:r>
-              <w:rPr>
-                <w:rFonts w:ascii="Roboto" w:hAnsi="Roboto" w:eastAsia="Roboto"/>
-              </w:rPr>
-              <w:t>800 mm (31.5 in)</w:t>
-            </w:r>
-          </w:p>
-        </w:tc>
-      </w:tr>
-      <w:tr>
-        <w:tc>
-          <w:tcPr>
-            <w:tcW w:type="dxa" w:w="4320"/>
-          </w:tcPr>
-          <w:p>
-            <w:r>
-              <w:rPr>
-                <w:rFonts w:ascii="Roboto" w:hAnsi="Roboto" w:eastAsia="Roboto"/>
-              </w:rPr>
-              <w:t>Material</w:t>
-            </w:r>
-          </w:p>
-        </w:tc>
-        <w:tc>
-          <w:tcPr>
-            <w:tcW w:type="dxa" w:w="4320"/>
-          </w:tcPr>
-          <w:p>
-            <w:r>
-              <w:rPr>
-                <w:rFonts w:ascii="Roboto" w:hAnsi="Roboto" w:eastAsia="Roboto"/>
-              </w:rPr>
-              <w:t>Glass-lined</w:t>
-            </w:r>
-          </w:p>
-        </w:tc>
-      </w:tr>
-      <w:tr>
-        <w:tc>
-          <w:tcPr>
-            <w:tcW w:type="dxa" w:w="4320"/>
-          </w:tcPr>
-          <w:p>
-            <w:r>
-              <w:rPr>
-                <w:rFonts w:ascii="Roboto" w:hAnsi="Roboto" w:eastAsia="Roboto"/>
-              </w:rPr>
-              <w:t>Pressure</w:t>
-            </w:r>
-          </w:p>
-        </w:tc>
-        <w:tc>
-          <w:tcPr>
-            <w:tcW w:type="dxa" w:w="4320"/>
-          </w:tcPr>
-          <w:p>
-            <w:r>
-              <w:rPr>
-                <w:rFonts w:ascii="Roboto" w:hAnsi="Roboto" w:eastAsia="Roboto"/>
-              </w:rPr>
-              <w:t>2 bar (29 psi)</w:t>
-            </w:r>
-          </w:p>
-        </w:tc>
-      </w:tr>
-      <w:tr>
-        <w:tc>
-          <w:tcPr>
-            <w:tcW w:type="dxa" w:w="4320"/>
-          </w:tcPr>
-          <w:p>
-            <w:r>
-              <w:rPr>
-                <w:rFonts w:ascii="Roboto" w:hAnsi="Roboto" w:eastAsia="Roboto"/>
-              </w:rPr>
-              <w:t>Temperature</w:t>
-            </w:r>
-          </w:p>
-        </w:tc>
-        <w:tc>
-          <w:tcPr>
-            <w:tcW w:type="dxa" w:w="4320"/>
-          </w:tcPr>
-          <w:p>
-            <w:r>
-              <w:rPr>
-                <w:rFonts w:ascii="Roboto" w:hAnsi="Roboto" w:eastAsia="Roboto"/>
-              </w:rPr>
-              <w:t>200 °C (392 °F)</w:t>
-            </w:r>
-          </w:p>
-        </w:tc>
-      </w:tr>
-    </w:tbl>
-    <w:p>
-      <w:r>
-        <w:rPr>
-          <w:rFonts w:ascii="Roboto" w:hAnsi="Roboto" w:eastAsia="Roboto"/>
-        </w:rPr>
-        <w:t xml:space="preserve">View Specs </w:t>
-      </w:r>
-      <w:r>
-        <w:rPr>
-          <w:rFonts w:ascii="Roboto" w:hAnsi="Roboto" w:eastAsia="Roboto"/>
-        </w:rPr>
-        <w:t>↗</w:t>
-      </w:r>
-    </w:p>
-    <w:p>
-      <w:r>
-        <w:rPr>
-          <w:rFonts w:ascii="Roboto" w:hAnsi="Roboto" w:eastAsia="Roboto"/>
-        </w:rPr>
-        <w:t>Enquire ↗</w:t>
-      </w:r>
-    </w:p>
-    <w:p>
-      <w:r>
-        <w:rPr>
-          <w:rFonts w:ascii="Roboto" w:hAnsi="Roboto" w:eastAsia="Roboto"/>
-        </w:rPr>
         <w:t>IPP STOCK #242886</w:t>
       </w:r>
     </w:p>
@@ -2590,6 +3246,306 @@
         <w:rPr>
           <w:rFonts w:ascii="Roboto" w:hAnsi="Roboto" w:eastAsia="Roboto"/>
         </w:rPr>
+        <w:t>IPP STOCK #239007</w:t>
+      </w:r>
+    </w:p>
+    <w:p>
+      <w:pPr>
+        <w:pStyle w:val="Heading3"/>
+      </w:pPr>
+      <w:r>
+        <w:rPr>
+          <w:rFonts w:ascii="Montserrat" w:hAnsi="Montserrat" w:eastAsia="Outfit"/>
+        </w:rPr>
+        <w:t>Pfaudler glass-lined agitator</w:t>
+      </w:r>
+    </w:p>
+    <w:tbl>
+      <w:tblPr>
+        <w:tblStyle w:val="TableGrid"/>
+        <w:tblW w:type="auto" w:w="0"/>
+        <w:tblLook w:firstColumn="1" w:firstRow="1" w:lastColumn="0" w:lastRow="0" w:noHBand="0" w:noVBand="1" w:val="04A0"/>
+      </w:tblPr>
+      <w:tblGrid>
+        <w:gridCol w:w="4320"/>
+        <w:gridCol w:w="4320"/>
+      </w:tblGrid>
+      <w:tr>
+        <w:tc>
+          <w:tcPr>
+            <w:tcW w:type="dxa" w:w="4320"/>
+          </w:tcPr>
+          <w:p>
+            <w:r>
+              <w:rPr>
+                <w:rFonts w:ascii="Roboto" w:hAnsi="Roboto" w:eastAsia="Roboto"/>
+              </w:rPr>
+              <w:t>Vessel size</w:t>
+            </w:r>
+          </w:p>
+        </w:tc>
+        <w:tc>
+          <w:tcPr>
+            <w:tcW w:type="dxa" w:w="4320"/>
+          </w:tcPr>
+          <w:p>
+            <w:r>
+              <w:rPr>
+                <w:rFonts w:ascii="Roboto" w:hAnsi="Roboto" w:eastAsia="Roboto"/>
+              </w:rPr>
+              <w:t>1,150 L (300 US gal)</w:t>
+            </w:r>
+          </w:p>
+        </w:tc>
+      </w:tr>
+      <w:tr>
+        <w:tc>
+          <w:tcPr>
+            <w:tcW w:type="dxa" w:w="4320"/>
+          </w:tcPr>
+          <w:p>
+            <w:r>
+              <w:rPr>
+                <w:rFonts w:ascii="Roboto" w:hAnsi="Roboto" w:eastAsia="Roboto"/>
+              </w:rPr>
+              <w:t>Material</w:t>
+            </w:r>
+          </w:p>
+        </w:tc>
+        <w:tc>
+          <w:tcPr>
+            <w:tcW w:type="dxa" w:w="4320"/>
+          </w:tcPr>
+          <w:p>
+            <w:r>
+              <w:rPr>
+                <w:rFonts w:ascii="Roboto" w:hAnsi="Roboto" w:eastAsia="Roboto"/>
+              </w:rPr>
+              <w:t>Glass-lined, re-glassed</w:t>
+            </w:r>
+          </w:p>
+        </w:tc>
+      </w:tr>
+      <w:tr>
+        <w:tc>
+          <w:tcPr>
+            <w:tcW w:type="dxa" w:w="4320"/>
+          </w:tcPr>
+          <w:p>
+            <w:r>
+              <w:rPr>
+                <w:rFonts w:ascii="Roboto" w:hAnsi="Roboto" w:eastAsia="Roboto"/>
+              </w:rPr>
+              <w:t>Agitator type</w:t>
+            </w:r>
+          </w:p>
+        </w:tc>
+        <w:tc>
+          <w:tcPr>
+            <w:tcW w:type="dxa" w:w="4320"/>
+          </w:tcPr>
+          <w:p>
+            <w:r>
+              <w:rPr>
+                <w:rFonts w:ascii="Roboto" w:hAnsi="Roboto" w:eastAsia="Roboto"/>
+              </w:rPr>
+              <w:t>3-blade retreat curve</w:t>
+            </w:r>
+          </w:p>
+        </w:tc>
+      </w:tr>
+      <w:tr>
+        <w:tc>
+          <w:tcPr>
+            <w:tcW w:type="dxa" w:w="4320"/>
+          </w:tcPr>
+          <w:p>
+            <w:r>
+              <w:rPr>
+                <w:rFonts w:ascii="Roboto" w:hAnsi="Roboto" w:eastAsia="Roboto"/>
+              </w:rPr>
+              <w:t>Span</w:t>
+            </w:r>
+          </w:p>
+        </w:tc>
+        <w:tc>
+          <w:tcPr>
+            <w:tcW w:type="dxa" w:w="4320"/>
+          </w:tcPr>
+          <w:p>
+            <w:r>
+              <w:rPr>
+                <w:rFonts w:ascii="Roboto" w:hAnsi="Roboto" w:eastAsia="Roboto"/>
+              </w:rPr>
+              <w:t>914 mm (36 in)</w:t>
+            </w:r>
+          </w:p>
+        </w:tc>
+      </w:tr>
+    </w:tbl>
+    <w:p>
+      <w:r>
+        <w:rPr>
+          <w:rFonts w:ascii="Roboto" w:hAnsi="Roboto" w:eastAsia="Roboto"/>
+        </w:rPr>
+        <w:t xml:space="preserve">View Specs </w:t>
+      </w:r>
+      <w:r>
+        <w:rPr>
+          <w:rFonts w:ascii="Roboto" w:hAnsi="Roboto" w:eastAsia="Roboto"/>
+        </w:rPr>
+        <w:t>↗</w:t>
+      </w:r>
+    </w:p>
+    <w:p>
+      <w:r>
+        <w:rPr>
+          <w:rFonts w:ascii="Roboto" w:hAnsi="Roboto" w:eastAsia="Roboto"/>
+        </w:rPr>
+        <w:t>Enquire ↗</w:t>
+      </w:r>
+    </w:p>
+    <w:p>
+      <w:r>
+        <w:rPr>
+          <w:rFonts w:ascii="Roboto" w:hAnsi="Roboto" w:eastAsia="Roboto"/>
+        </w:rPr>
+        <w:t>IPP STOCK #249252</w:t>
+      </w:r>
+    </w:p>
+    <w:p>
+      <w:pPr>
+        <w:pStyle w:val="Heading3"/>
+      </w:pPr>
+      <w:r>
+        <w:rPr>
+          <w:rFonts w:ascii="Montserrat" w:hAnsi="Montserrat" w:eastAsia="Outfit"/>
+        </w:rPr>
+        <w:t>Hastelloy C22 reactor seal</w:t>
+      </w:r>
+    </w:p>
+    <w:tbl>
+      <w:tblPr>
+        <w:tblStyle w:val="TableGrid"/>
+        <w:tblW w:type="auto" w:w="0"/>
+        <w:tblLook w:firstColumn="1" w:firstRow="1" w:lastColumn="0" w:lastRow="0" w:noHBand="0" w:noVBand="1" w:val="04A0"/>
+      </w:tblPr>
+      <w:tblGrid>
+        <w:gridCol w:w="4320"/>
+        <w:gridCol w:w="4320"/>
+      </w:tblGrid>
+      <w:tr>
+        <w:tc>
+          <w:tcPr>
+            <w:tcW w:type="dxa" w:w="4320"/>
+          </w:tcPr>
+          <w:p>
+            <w:r>
+              <w:rPr>
+                <w:rFonts w:ascii="Roboto" w:hAnsi="Roboto" w:eastAsia="Roboto"/>
+              </w:rPr>
+              <w:t>Part</w:t>
+            </w:r>
+          </w:p>
+        </w:tc>
+        <w:tc>
+          <w:tcPr>
+            <w:tcW w:type="dxa" w:w="4320"/>
+          </w:tcPr>
+          <w:p>
+            <w:r>
+              <w:rPr>
+                <w:rFonts w:ascii="Roboto" w:hAnsi="Roboto" w:eastAsia="Roboto"/>
+              </w:rPr>
+              <w:t>Seal and seal plan</w:t>
+            </w:r>
+          </w:p>
+        </w:tc>
+      </w:tr>
+      <w:tr>
+        <w:tc>
+          <w:tcPr>
+            <w:tcW w:type="dxa" w:w="4320"/>
+          </w:tcPr>
+          <w:p>
+            <w:r>
+              <w:rPr>
+                <w:rFonts w:ascii="Roboto" w:hAnsi="Roboto" w:eastAsia="Roboto"/>
+              </w:rPr>
+              <w:t>Material</w:t>
+            </w:r>
+          </w:p>
+        </w:tc>
+        <w:tc>
+          <w:tcPr>
+            <w:tcW w:type="dxa" w:w="4320"/>
+          </w:tcPr>
+          <w:p>
+            <w:r>
+              <w:rPr>
+                <w:rFonts w:ascii="Roboto" w:hAnsi="Roboto" w:eastAsia="Roboto"/>
+              </w:rPr>
+              <w:t>Hastelloy C22</w:t>
+            </w:r>
+          </w:p>
+        </w:tc>
+      </w:tr>
+      <w:tr>
+        <w:tc>
+          <w:tcPr>
+            <w:tcW w:type="dxa" w:w="4320"/>
+          </w:tcPr>
+          <w:p>
+            <w:r>
+              <w:rPr>
+                <w:rFonts w:ascii="Roboto" w:hAnsi="Roboto" w:eastAsia="Roboto"/>
+              </w:rPr>
+              <w:t>Service</w:t>
+            </w:r>
+          </w:p>
+        </w:tc>
+        <w:tc>
+          <w:tcPr>
+            <w:tcW w:type="dxa" w:w="4320"/>
+          </w:tcPr>
+          <w:p>
+            <w:r>
+              <w:rPr>
+                <w:rFonts w:ascii="Roboto" w:hAnsi="Roboto" w:eastAsia="Roboto"/>
+              </w:rPr>
+              <w:t>Exotic alloy reactors</w:t>
+            </w:r>
+          </w:p>
+        </w:tc>
+      </w:tr>
+    </w:tbl>
+    <w:p>
+      <w:r>
+        <w:rPr>
+          <w:rFonts w:ascii="Roboto" w:hAnsi="Roboto" w:eastAsia="Roboto"/>
+        </w:rPr>
+        <w:t xml:space="preserve">View Specs </w:t>
+      </w:r>
+      <w:r>
+        <w:rPr>
+          <w:rFonts w:ascii="Roboto" w:hAnsi="Roboto" w:eastAsia="Roboto"/>
+        </w:rPr>
+        <w:t>↗</w:t>
+      </w:r>
+    </w:p>
+    <w:p>
+      <w:r>
+        <w:rPr>
+          <w:rFonts w:ascii="Roboto" w:hAnsi="Roboto" w:eastAsia="Roboto"/>
+        </w:rPr>
+        <w:t>Enquire ↗</w:t>
+      </w:r>
+    </w:p>
+    <w:p>
+      <w:r>
+        <w:rPr>
+          <w:rFonts w:ascii="Roboto" w:hAnsi="Roboto" w:eastAsia="Roboto"/>
+        </w:rPr>
         <w:t>Each listing confirms current availability and the equipment included.</w:t>
       </w:r>
     </w:p>
@@ -2608,6 +3564,20 @@
       </w:r>
     </w:p>
     <w:p>
+      <w:r>
+        <w:rPr>
+          <w:rFonts w:ascii="Roboto" w:hAnsi="Roboto" w:eastAsia="Roboto"/>
+        </w:rPr>
+        <w:t xml:space="preserve">View all chemical processing equipment </w:t>
+      </w:r>
+      <w:r>
+        <w:rPr>
+          <w:rFonts w:ascii="Roboto" w:hAnsi="Roboto" w:eastAsia="Roboto"/>
+        </w:rPr>
+        <w:t>↗</w:t>
+      </w:r>
+    </w:p>
+    <w:p>
       <w:pPr>
         <w:pStyle w:val="Heading2"/>
       </w:pPr>
@@ -2623,7 +3593,7 @@
         <w:rPr>
           <w:rFonts w:ascii="Roboto" w:hAnsi="Roboto" w:eastAsia="Roboto"/>
         </w:rPr>
-        <w:t>IPP stocks used chemical process equipment and machinery as individual units and connected systems for reaction, heat transfer, separation, drying, filtration, distillation and storage. Chemical processing plants buy these units to add capacity or replace process units.</w:t>
+        <w:t>IPP stocks used chemical process equipment and machinery as individual units, connected systems and spare parts for reaction, mixing, fermentation, heat transfer, evaporation, distillation, separation, filtration, drying and storage. Chemical processing plants buy these units to add capacity or replace process units.</w:t>
       </w:r>
     </w:p>
     <w:p>
@@ -2748,6 +3718,234 @@
         <w:rPr>
           <w:rFonts w:ascii="Montserrat" w:hAnsi="Montserrat" w:eastAsia="Outfit"/>
         </w:rPr>
+        <w:t>Agitators</w:t>
+      </w:r>
+    </w:p>
+    <w:p>
+      <w:r>
+        <w:rPr>
+          <w:rFonts w:ascii="Roboto" w:hAnsi="Roboto" w:eastAsia="Roboto"/>
+        </w:rPr>
+        <w:t>Glass drives, drive units and shaft mixers for reactors, tanks and blending vessels.</w:t>
+      </w:r>
+    </w:p>
+    <w:p>
+      <w:r>
+        <w:rPr>
+          <w:rFonts w:ascii="Roboto" w:hAnsi="Roboto" w:eastAsia="Roboto"/>
+        </w:rPr>
+        <w:t>IPP supplies used agitators to chemical plants that mix, suspend and disperse materials in reactors, tanks and blending vessels. With agitators from Pfaudler, Lightnin, De Dietrich, Philadelphia and Chemineer in stock, our team matches the drive power, shaft length and impeller to the vessel each buyer runs.</w:t>
+      </w:r>
+    </w:p>
+    <w:p>
+      <w:r>
+        <w:rPr>
+          <w:rFonts w:ascii="Roboto" w:hAnsi="Roboto" w:eastAsia="Roboto"/>
+        </w:rPr>
+        <w:t>Agitator types in our inventory cover:</w:t>
+      </w:r>
+    </w:p>
+    <w:p>
+      <w:pPr>
+        <w:pStyle w:val="ListBullet"/>
+      </w:pPr>
+      <w:r>
+        <w:rPr>
+          <w:rFonts w:ascii="Roboto" w:hAnsi="Roboto" w:eastAsia="Roboto"/>
+        </w:rPr>
+        <w:t>Glass drives for glass-lined reactors</w:t>
+      </w:r>
+    </w:p>
+    <w:p>
+      <w:pPr>
+        <w:pStyle w:val="ListBullet"/>
+      </w:pPr>
+      <w:r>
+        <w:rPr>
+          <w:rFonts w:ascii="Roboto" w:hAnsi="Roboto" w:eastAsia="Roboto"/>
+        </w:rPr>
+        <w:t>Motor and gear drive units for vertical mounting</w:t>
+      </w:r>
+    </w:p>
+    <w:p>
+      <w:pPr>
+        <w:pStyle w:val="ListBullet"/>
+      </w:pPr>
+      <w:r>
+        <w:rPr>
+          <w:rFonts w:ascii="Roboto" w:hAnsi="Roboto" w:eastAsia="Roboto"/>
+        </w:rPr>
+        <w:t>Shaft and mixer assemblies with pitch-blade impellers</w:t>
+      </w:r>
+    </w:p>
+    <w:p>
+      <w:pPr>
+        <w:pStyle w:val="ListBullet"/>
+      </w:pPr>
+      <w:r>
+        <w:rPr>
+          <w:rFonts w:ascii="Roboto" w:hAnsi="Roboto" w:eastAsia="Roboto"/>
+        </w:rPr>
+        <w:t>Hastelloy C-276 shafts for corrosive service</w:t>
+      </w:r>
+    </w:p>
+    <w:p>
+      <w:pPr>
+        <w:pStyle w:val="ListBullet"/>
+      </w:pPr>
+      <w:r>
+        <w:rPr>
+          <w:rFonts w:ascii="Roboto" w:hAnsi="Roboto" w:eastAsia="Roboto"/>
+        </w:rPr>
+        <w:t>Pfaudler DTW and De Dietrich DIN drive models</w:t>
+      </w:r>
+    </w:p>
+    <w:p>
+      <w:r>
+        <w:rPr>
+          <w:rFonts w:ascii="Roboto" w:hAnsi="Roboto" w:eastAsia="Roboto"/>
+        </w:rPr>
+        <w:t>Each agitator listing states drive power, speed, shaft length and impeller type. Glass-lined and carbon steel units lead our agitator inventory, alongside Hastelloy C-276 and stainless steel 316, for vessels from 76 L to 10,031 L (20 to 2,650 gal) and drives up to 101 kW (135 hp). Pricing depends on manufacturer, drive power, material of construction and condition, and our team quotes each stock number individually.</w:t>
+      </w:r>
+    </w:p>
+    <w:p>
+      <w:r>
+        <w:rPr>
+          <w:rFonts w:ascii="Roboto" w:hAnsi="Roboto" w:eastAsia="Roboto"/>
+        </w:rPr>
+        <w:t>Featured listing: Pfaudler 4DTW glass drive with 11.6 kW (15.5 hp) drive power.</w:t>
+      </w:r>
+    </w:p>
+    <w:p>
+      <w:r>
+        <w:rPr>
+          <w:rFonts w:ascii="Roboto" w:hAnsi="Roboto" w:eastAsia="Roboto"/>
+        </w:rPr>
+        <w:t>Browse used agitators ↗</w:t>
+      </w:r>
+    </w:p>
+    <w:p>
+      <w:pPr>
+        <w:pStyle w:val="Heading3"/>
+      </w:pPr>
+      <w:r>
+        <w:rPr>
+          <w:rFonts w:ascii="Montserrat" w:hAnsi="Montserrat" w:eastAsia="Outfit"/>
+        </w:rPr>
+        <w:t>Fermenters</w:t>
+      </w:r>
+    </w:p>
+    <w:p>
+      <w:r>
+        <w:rPr>
+          <w:rFonts w:ascii="Roboto" w:hAnsi="Roboto" w:eastAsia="Roboto"/>
+        </w:rPr>
+        <w:t>Stainless steel fermenters for biochemical, pharmaceutical and fermentation-based chemical production.</w:t>
+      </w:r>
+    </w:p>
+    <w:p>
+      <w:r>
+        <w:rPr>
+          <w:rFonts w:ascii="Roboto" w:hAnsi="Roboto" w:eastAsia="Roboto"/>
+        </w:rPr>
+        <w:t>We supply used fermenters to chemical, pharmaceutical and biotech plants that grow cultures and make fermentation-based products under controlled temperature and pressure. As a source process engineers trust for fermentation capacity, IPP stocks units from ThermoFisher, B. Braun Diessel Biotech, Bujalski, Biolafitte, Chemap and Sartorius.</w:t>
+      </w:r>
+    </w:p>
+    <w:p>
+      <w:r>
+        <w:rPr>
+          <w:rFonts w:ascii="Roboto" w:hAnsi="Roboto" w:eastAsia="Roboto"/>
+        </w:rPr>
+        <w:t>Our used fermenter inventory covers:</w:t>
+      </w:r>
+    </w:p>
+    <w:p>
+      <w:pPr>
+        <w:pStyle w:val="ListBullet"/>
+      </w:pPr>
+      <w:r>
+        <w:rPr>
+          <w:rFonts w:ascii="Roboto" w:hAnsi="Roboto" w:eastAsia="Roboto"/>
+        </w:rPr>
+        <w:t>Agitated stainless steel fermenters</w:t>
+      </w:r>
+    </w:p>
+    <w:p>
+      <w:pPr>
+        <w:pStyle w:val="ListBullet"/>
+      </w:pPr>
+      <w:r>
+        <w:rPr>
+          <w:rFonts w:ascii="Roboto" w:hAnsi="Roboto" w:eastAsia="Roboto"/>
+        </w:rPr>
+        <w:t>Fermenters with standard and dimple jackets</w:t>
+      </w:r>
+    </w:p>
+    <w:p>
+      <w:pPr>
+        <w:pStyle w:val="ListBullet"/>
+      </w:pPr>
+      <w:r>
+        <w:rPr>
+          <w:rFonts w:ascii="Roboto" w:hAnsi="Roboto" w:eastAsia="Roboto"/>
+        </w:rPr>
+        <w:t>Single-use fermenters from ThermoFisher</w:t>
+      </w:r>
+    </w:p>
+    <w:p>
+      <w:pPr>
+        <w:pStyle w:val="ListBullet"/>
+      </w:pPr>
+      <w:r>
+        <w:rPr>
+          <w:rFonts w:ascii="Roboto" w:hAnsi="Roboto" w:eastAsia="Roboto"/>
+        </w:rPr>
+        <w:t>Laboratory and pilot fermenters</w:t>
+      </w:r>
+    </w:p>
+    <w:p>
+      <w:pPr>
+        <w:pStyle w:val="ListBullet"/>
+      </w:pPr>
+      <w:r>
+        <w:rPr>
+          <w:rFonts w:ascii="Roboto" w:hAnsi="Roboto" w:eastAsia="Roboto"/>
+        </w:rPr>
+        <w:t>Unused production-scale fermenters</w:t>
+      </w:r>
+    </w:p>
+    <w:p>
+      <w:r>
+        <w:rPr>
+          <w:rFonts w:ascii="Roboto" w:hAnsi="Roboto" w:eastAsia="Roboto"/>
+        </w:rPr>
+        <w:t>Each fermenter listing states capacity, pressure, temperature, jacket and agitation details. Stainless steel 316 and 304 lead our fermenter inventory, alongside stainless steel 316L, with capacities from 19 L to 65,300 L (5 to 17,250 gal). Pricing depends on manufacturer, capacity, material of construction and condition, and IPP quotes each stock number individually with a video or on-site inspection on request.</w:t>
+      </w:r>
+    </w:p>
+    <w:p>
+      <w:r>
+        <w:rPr>
+          <w:rFonts w:ascii="Roboto" w:hAnsi="Roboto" w:eastAsia="Roboto"/>
+        </w:rPr>
+        <w:t>Featured listing: stainless steel 316 fermenter with 12,500 L (3,300 gal) capacity.</w:t>
+      </w:r>
+    </w:p>
+    <w:p>
+      <w:r>
+        <w:rPr>
+          <w:rFonts w:ascii="Roboto" w:hAnsi="Roboto" w:eastAsia="Roboto"/>
+        </w:rPr>
+        <w:t>Browse used fermenters ↗</w:t>
+      </w:r>
+    </w:p>
+    <w:p>
+      <w:pPr>
+        <w:pStyle w:val="Heading3"/>
+      </w:pPr>
+      <w:r>
+        <w:rPr>
+          <w:rFonts w:ascii="Montserrat" w:hAnsi="Montserrat" w:eastAsia="Outfit"/>
+        </w:rPr>
         <w:t>Heat exchangers</w:t>
       </w:r>
     </w:p>
@@ -2862,6 +4060,242 @@
         <w:rPr>
           <w:rFonts w:ascii="Montserrat" w:hAnsi="Montserrat" w:eastAsia="Outfit"/>
         </w:rPr>
+        <w:t>Evaporators</w:t>
+      </w:r>
+    </w:p>
+    <w:p>
+      <w:r>
+        <w:rPr>
+          <w:rFonts w:ascii="Roboto" w:hAnsi="Roboto" w:eastAsia="Roboto"/>
+        </w:rPr>
+        <w:t>Film, flash and crystallizer evaporators for concentration and solvent removal.</w:t>
+      </w:r>
+    </w:p>
+    <w:p>
+      <w:r>
+        <w:rPr>
+          <w:rFonts w:ascii="Roboto" w:hAnsi="Roboto" w:eastAsia="Roboto"/>
+        </w:rPr>
+        <w:t>We supply used evaporators to chemical plants that concentrate solutions, recover solvents and crystallize products. As a supplier chemical producers trust for evaporation duty, IPP sources units from Luwa SMS, Buss-SMS-Canzler, Buflovak/Blaw Knox and Pfaudler and records evaporation rate and heat transfer area for each stock number.</w:t>
+      </w:r>
+    </w:p>
+    <w:p>
+      <w:r>
+        <w:rPr>
+          <w:rFonts w:ascii="Roboto" w:hAnsi="Roboto" w:eastAsia="Roboto"/>
+        </w:rPr>
+        <w:t>Evaporator types in our inventory cover:</w:t>
+      </w:r>
+    </w:p>
+    <w:p>
+      <w:pPr>
+        <w:pStyle w:val="ListBullet"/>
+      </w:pPr>
+      <w:r>
+        <w:rPr>
+          <w:rFonts w:ascii="Roboto" w:hAnsi="Roboto" w:eastAsia="Roboto"/>
+        </w:rPr>
+        <w:t>Rising and falling film evaporators, including multiple-effect systems</w:t>
+      </w:r>
+    </w:p>
+    <w:p>
+      <w:pPr>
+        <w:pStyle w:val="ListBullet"/>
+      </w:pPr>
+      <w:r>
+        <w:rPr>
+          <w:rFonts w:ascii="Roboto" w:hAnsi="Roboto" w:eastAsia="Roboto"/>
+        </w:rPr>
+        <w:t>Wiped and thin film evaporators</w:t>
+      </w:r>
+    </w:p>
+    <w:p>
+      <w:pPr>
+        <w:pStyle w:val="ListBullet"/>
+      </w:pPr>
+      <w:r>
+        <w:rPr>
+          <w:rFonts w:ascii="Roboto" w:hAnsi="Roboto" w:eastAsia="Roboto"/>
+        </w:rPr>
+        <w:t>Flash evaporators</w:t>
+      </w:r>
+    </w:p>
+    <w:p>
+      <w:pPr>
+        <w:pStyle w:val="ListBullet"/>
+      </w:pPr>
+      <w:r>
+        <w:rPr>
+          <w:rFonts w:ascii="Roboto" w:hAnsi="Roboto" w:eastAsia="Roboto"/>
+        </w:rPr>
+        <w:t>Crystallizer evaporators from zero liquid discharge systems</w:t>
+      </w:r>
+    </w:p>
+    <w:p>
+      <w:pPr>
+        <w:pStyle w:val="ListBullet"/>
+      </w:pPr>
+      <w:r>
+        <w:rPr>
+          <w:rFonts w:ascii="Roboto" w:hAnsi="Roboto" w:eastAsia="Roboto"/>
+        </w:rPr>
+        <w:t>Hastelloy C-22 clad and titanium units for corrosive service</w:t>
+      </w:r>
+    </w:p>
+    <w:p>
+      <w:r>
+        <w:rPr>
+          <w:rFonts w:ascii="Roboto" w:hAnsi="Roboto" w:eastAsia="Roboto"/>
+        </w:rPr>
+        <w:t>Each evaporator listing states evaporation rate, heat transfer area, pressure and temperature. Stainless steel 316 leads our evaporator inventory, alongside stainless steel 304 and 316L, fiberglass, glass-lined steel and titanium, with evaporation rates from 4.5 kg/h to 36,300 kg/h (10 to 80,000 lb/h) and heat transfer areas up to 1,473 m² (15,850 ft²). Pricing depends on manufacturer, evaporation rate, material of construction and condition, and our team quotes each stock number individually.</w:t>
+      </w:r>
+    </w:p>
+    <w:p>
+      <w:r>
+        <w:rPr>
+          <w:rFonts w:ascii="Roboto" w:hAnsi="Roboto" w:eastAsia="Roboto"/>
+        </w:rPr>
+        <w:t>Featured listing: Hastelloy C-22 clad wiped film evaporator with 340 kg/h (750 lb/h) evaporation.</w:t>
+      </w:r>
+    </w:p>
+    <w:p>
+      <w:r>
+        <w:rPr>
+          <w:rFonts w:ascii="Roboto" w:hAnsi="Roboto" w:eastAsia="Roboto"/>
+        </w:rPr>
+        <w:t>Browse used evaporators ↗</w:t>
+      </w:r>
+    </w:p>
+    <w:p>
+      <w:pPr>
+        <w:pStyle w:val="Heading3"/>
+      </w:pPr>
+      <w:r>
+        <w:rPr>
+          <w:rFonts w:ascii="Montserrat" w:hAnsi="Montserrat" w:eastAsia="Outfit"/>
+        </w:rPr>
+        <w:t>Distillation columns and stills</w:t>
+      </w:r>
+    </w:p>
+    <w:p>
+      <w:r>
+        <w:rPr>
+          <w:rFonts w:ascii="Roboto" w:hAnsi="Roboto" w:eastAsia="Roboto"/>
+        </w:rPr>
+        <w:t>For purification, solvent recovery and fractional separation.</w:t>
+      </w:r>
+    </w:p>
+    <w:p>
+      <w:r>
+        <w:rPr>
+          <w:rFonts w:ascii="Roboto" w:hAnsi="Roboto" w:eastAsia="Roboto"/>
+        </w:rPr>
+        <w:t>IPP supplies used distillation columns and stills to chemical and pharmaceutical plants for solvent recovery, product purification and fractional separation. With Pfaudler, De Dietrich, Kühni and Schott columns and Santasalo-Sohlberg, Finn-Aqua and Paul Mueller stills in stock, we supply packed, tray and column still designs in glass-lined steel, stainless steel and specialty alloys.</w:t>
+      </w:r>
+    </w:p>
+    <w:p>
+      <w:r>
+        <w:rPr>
+          <w:rFonts w:ascii="Roboto" w:hAnsi="Roboto" w:eastAsia="Roboto"/>
+        </w:rPr>
+        <w:t>Column and still types in our inventory cover:</w:t>
+      </w:r>
+    </w:p>
+    <w:p>
+      <w:pPr>
+        <w:pStyle w:val="ListBullet"/>
+      </w:pPr>
+      <w:r>
+        <w:rPr>
+          <w:rFonts w:ascii="Roboto" w:hAnsi="Roboto" w:eastAsia="Roboto"/>
+        </w:rPr>
+        <w:t>Packed columns, including ceramic-packed glass-lined units</w:t>
+      </w:r>
+    </w:p>
+    <w:p>
+      <w:pPr>
+        <w:pStyle w:val="ListBullet"/>
+      </w:pPr>
+      <w:r>
+        <w:rPr>
+          <w:rFonts w:ascii="Roboto" w:hAnsi="Roboto" w:eastAsia="Roboto"/>
+        </w:rPr>
+        <w:t>Tray and combination packed and tray columns</w:t>
+      </w:r>
+    </w:p>
+    <w:p>
+      <w:pPr>
+        <w:pStyle w:val="ListBullet"/>
+      </w:pPr>
+      <w:r>
+        <w:rPr>
+          <w:rFonts w:ascii="Roboto" w:hAnsi="Roboto" w:eastAsia="Roboto"/>
+        </w:rPr>
+        <w:t>Contactor columns for liquid-liquid extraction</w:t>
+      </w:r>
+    </w:p>
+    <w:p>
+      <w:pPr>
+        <w:pStyle w:val="ListBullet"/>
+      </w:pPr>
+      <w:r>
+        <w:rPr>
+          <w:rFonts w:ascii="Roboto" w:hAnsi="Roboto" w:eastAsia="Roboto"/>
+        </w:rPr>
+        <w:t>Column stills and pot stills</w:t>
+      </w:r>
+    </w:p>
+    <w:p>
+      <w:pPr>
+        <w:pStyle w:val="ListBullet"/>
+      </w:pPr>
+      <w:r>
+        <w:rPr>
+          <w:rFonts w:ascii="Roboto" w:hAnsi="Roboto" w:eastAsia="Roboto"/>
+        </w:rPr>
+        <w:t>Multiple-effect stills with skid-mounted controls</w:t>
+      </w:r>
+    </w:p>
+    <w:p>
+      <w:r>
+        <w:rPr>
+          <w:rFonts w:ascii="Roboto" w:hAnsi="Roboto" w:eastAsia="Roboto"/>
+        </w:rPr>
+        <w:t>Each column and still listing states diameter, length, pressure and temperature. Glass-lined and stainless steel 316 columns lead our column inventory, alongside stainless steel 304, Hastelloy C-276 and graphite, with diameters from 76 mm (3 in) to 8,000 mm (315 in). Stainless steel 316, 316L and 321 lead our still inventory, with diameters from 229 mm (9 in) to 2,210 mm (87 in). Pricing depends on manufacturer, diameter, material of construction and condition, and our team quotes each stock number individually.</w:t>
+      </w:r>
+    </w:p>
+    <w:p>
+      <w:r>
+        <w:rPr>
+          <w:rFonts w:ascii="Roboto" w:hAnsi="Roboto" w:eastAsia="Roboto"/>
+        </w:rPr>
+        <w:t>Featured listings: glass-lined packed column with ceramic packing and a stainless steel 321 column still.</w:t>
+      </w:r>
+    </w:p>
+    <w:p>
+      <w:r>
+        <w:rPr>
+          <w:rFonts w:ascii="Roboto" w:hAnsi="Roboto" w:eastAsia="Roboto"/>
+        </w:rPr>
+        <w:t>Browse used distillation columns ↗</w:t>
+      </w:r>
+    </w:p>
+    <w:p>
+      <w:r>
+        <w:rPr>
+          <w:rFonts w:ascii="Roboto" w:hAnsi="Roboto" w:eastAsia="Roboto"/>
+        </w:rPr>
+        <w:t>Browse used stills ↗</w:t>
+      </w:r>
+    </w:p>
+    <w:p>
+      <w:pPr>
+        <w:pStyle w:val="Heading3"/>
+      </w:pPr>
+      <w:r>
+        <w:rPr>
+          <w:rFonts w:ascii="Montserrat" w:hAnsi="Montserrat" w:eastAsia="Outfit"/>
+        </w:rPr>
         <w:t>Centrifuges</w:t>
       </w:r>
     </w:p>
@@ -2976,6 +4410,109 @@
         <w:rPr>
           <w:rFonts w:ascii="Montserrat" w:hAnsi="Montserrat" w:eastAsia="Outfit"/>
         </w:rPr>
+        <w:t>Filters</w:t>
+      </w:r>
+    </w:p>
+    <w:p>
+      <w:r>
+        <w:rPr>
+          <w:rFonts w:ascii="Roboto" w:hAnsi="Roboto" w:eastAsia="Roboto"/>
+        </w:rPr>
+        <w:t>Pressure and vacuum systems to remove particulates or recover solids.</w:t>
+      </w:r>
+    </w:p>
+    <w:p>
+      <w:r>
+        <w:rPr>
+          <w:rFonts w:ascii="Roboto" w:hAnsi="Roboto" w:eastAsia="Roboto"/>
+        </w:rPr>
+        <w:t>We supply used filters to chemical plants that clarify process liquids, recover solids and wash and dry filter cake. As a supplier chemical producers trust for solid-liquid separation, IPP sources filters from Schenk, Cogeim, Chemap and Rosenmund and lists filtration area, pressure and material for each stock number.</w:t>
+      </w:r>
+    </w:p>
+    <w:p>
+      <w:r>
+        <w:rPr>
+          <w:rFonts w:ascii="Roboto" w:hAnsi="Roboto" w:eastAsia="Roboto"/>
+        </w:rPr>
+        <w:t>Our used filter inventory covers:</w:t>
+      </w:r>
+    </w:p>
+    <w:p>
+      <w:pPr>
+        <w:pStyle w:val="ListBullet"/>
+      </w:pPr>
+      <w:r>
+        <w:rPr>
+          <w:rFonts w:ascii="Roboto" w:hAnsi="Roboto" w:eastAsia="Roboto"/>
+        </w:rPr>
+        <w:t>Filter presses for high-volume solids recovery</w:t>
+      </w:r>
+    </w:p>
+    <w:p>
+      <w:pPr>
+        <w:pStyle w:val="ListBullet"/>
+      </w:pPr>
+      <w:r>
+        <w:rPr>
+          <w:rFonts w:ascii="Roboto" w:hAnsi="Roboto" w:eastAsia="Roboto"/>
+        </w:rPr>
+        <w:t>Rosenmund and Cogeim filter dryers</w:t>
+      </w:r>
+    </w:p>
+    <w:p>
+      <w:pPr>
+        <w:pStyle w:val="ListBullet"/>
+      </w:pPr>
+      <w:r>
+        <w:rPr>
+          <w:rFonts w:ascii="Roboto" w:hAnsi="Roboto" w:eastAsia="Roboto"/>
+        </w:rPr>
+        <w:t>Nutsche filters for batch filtration</w:t>
+      </w:r>
+    </w:p>
+    <w:p>
+      <w:pPr>
+        <w:pStyle w:val="ListBullet"/>
+      </w:pPr>
+      <w:r>
+        <w:rPr>
+          <w:rFonts w:ascii="Roboto" w:hAnsi="Roboto" w:eastAsia="Roboto"/>
+        </w:rPr>
+        <w:t>Pressure leaf filters for liquid clarification</w:t>
+      </w:r>
+    </w:p>
+    <w:p>
+      <w:r>
+        <w:rPr>
+          <w:rFonts w:ascii="Roboto" w:hAnsi="Roboto" w:eastAsia="Roboto"/>
+        </w:rPr>
+        <w:t>Each filter listing states filtration area, pressure, temperature and material. Stainless steel 316 and polypropylene lead our filter inventory, alongside stainless steel 304, Hastelloy C-22 and C-276 and carbon steel, with filtration areas up to 330 m² (3,557 ft²). Pricing depends on manufacturer, filtration area, material of construction and condition, and IPP quotes each stock number individually with a video or on-site inspection on request.</w:t>
+      </w:r>
+    </w:p>
+    <w:p>
+      <w:r>
+        <w:rPr>
+          <w:rFonts w:ascii="Roboto" w:hAnsi="Roboto" w:eastAsia="Roboto"/>
+        </w:rPr>
+        <w:t>Featured listing: polypropylene plate-and-frame filter press.</w:t>
+      </w:r>
+    </w:p>
+    <w:p>
+      <w:r>
+        <w:rPr>
+          <w:rFonts w:ascii="Roboto" w:hAnsi="Roboto" w:eastAsia="Roboto"/>
+        </w:rPr>
+        <w:t>Browse used filters ↗</w:t>
+      </w:r>
+    </w:p>
+    <w:p>
+      <w:pPr>
+        <w:pStyle w:val="Heading3"/>
+      </w:pPr>
+      <w:r>
+        <w:rPr>
+          <w:rFonts w:ascii="Montserrat" w:hAnsi="Montserrat" w:eastAsia="Outfit"/>
+        </w:rPr>
         <w:t>Dryers</w:t>
       </w:r>
     </w:p>
@@ -3090,31 +4627,31 @@
         <w:rPr>
           <w:rFonts w:ascii="Montserrat" w:hAnsi="Montserrat" w:eastAsia="Outfit"/>
         </w:rPr>
-        <w:t>Filters</w:t>
-      </w:r>
-    </w:p>
-    <w:p>
-      <w:r>
-        <w:rPr>
-          <w:rFonts w:ascii="Roboto" w:hAnsi="Roboto" w:eastAsia="Roboto"/>
-        </w:rPr>
-        <w:t>Pressure and vacuum systems to remove particulates or recover solids.</w:t>
-      </w:r>
-    </w:p>
-    <w:p>
-      <w:r>
-        <w:rPr>
-          <w:rFonts w:ascii="Roboto" w:hAnsi="Roboto" w:eastAsia="Roboto"/>
-        </w:rPr>
-        <w:t>We supply used filters to chemical plants that clarify process liquids, recover solids and wash and dry filter cake. As a supplier chemical producers trust for solid-liquid separation, IPP sources filters from Schenk, Cogeim, Chemap and Rosenmund and lists filtration area, pressure and material for each stock number.</w:t>
-      </w:r>
-    </w:p>
-    <w:p>
-      <w:r>
-        <w:rPr>
-          <w:rFonts w:ascii="Roboto" w:hAnsi="Roboto" w:eastAsia="Roboto"/>
-        </w:rPr>
-        <w:t>Our used filter inventory covers:</w:t>
+        <w:t>Tanks</w:t>
+      </w:r>
+    </w:p>
+    <w:p>
+      <w:r>
+        <w:rPr>
+          <w:rFonts w:ascii="Roboto" w:hAnsi="Roboto" w:eastAsia="Roboto"/>
+        </w:rPr>
+        <w:t>For storage, blending and transfer. Jacketed and non-jacketed tanks available.</w:t>
+      </w:r>
+    </w:p>
+    <w:p>
+      <w:r>
+        <w:rPr>
+          <w:rFonts w:ascii="Roboto" w:hAnsi="Roboto" w:eastAsia="Roboto"/>
+        </w:rPr>
+        <w:t>We supply used tanks to chemical plants for raw material storage, blending and product transfer. As a supplier chemical producers trust for vessel capacity, IPP sources tanks from Pfaudler, De Dietrich, Grundy and Sinclair Stainless Fabrications in jacketed and non-jacketed designs.</w:t>
+      </w:r>
+    </w:p>
+    <w:p>
+      <w:r>
+        <w:rPr>
+          <w:rFonts w:ascii="Roboto" w:hAnsi="Roboto" w:eastAsia="Roboto"/>
+        </w:rPr>
+        <w:t>Our used tank inventory covers:</w:t>
       </w:r>
     </w:p>
     <w:p>
@@ -3125,7 +4662,7 @@
         <w:rPr>
           <w:rFonts w:ascii="Roboto" w:hAnsi="Roboto" w:eastAsia="Roboto"/>
         </w:rPr>
-        <w:t>Filter presses for high-volume solids recovery</w:t>
+        <w:t>Glass-lined tanks for corrosive chemicals</w:t>
       </w:r>
     </w:p>
     <w:p>
@@ -3136,7 +4673,7 @@
         <w:rPr>
           <w:rFonts w:ascii="Roboto" w:hAnsi="Roboto" w:eastAsia="Roboto"/>
         </w:rPr>
-        <w:t>Rosenmund and Cogeim filter dryers</w:t>
+        <w:t>Stainless steel 304, 316 and 316L process tanks</w:t>
       </w:r>
     </w:p>
     <w:p>
@@ -3147,7 +4684,7 @@
         <w:rPr>
           <w:rFonts w:ascii="Roboto" w:hAnsi="Roboto" w:eastAsia="Roboto"/>
         </w:rPr>
-        <w:t>Nutsche filters for batch filtration</w:t>
+        <w:t>Jacketed tanks for heating and cooling</w:t>
       </w:r>
     </w:p>
     <w:p>
@@ -3158,31 +4695,42 @@
         <w:rPr>
           <w:rFonts w:ascii="Roboto" w:hAnsi="Roboto" w:eastAsia="Roboto"/>
         </w:rPr>
-        <w:t>Pressure leaf filters for liquid clarification</w:t>
-      </w:r>
-    </w:p>
-    <w:p>
-      <w:r>
-        <w:rPr>
-          <w:rFonts w:ascii="Roboto" w:hAnsi="Roboto" w:eastAsia="Roboto"/>
-        </w:rPr>
-        <w:t>Each filter listing states filtration area, pressure, temperature and material. Stainless steel 316 and polypropylene lead our filter inventory, alongside stainless steel 304, Hastelloy C-22 and C-276 and carbon steel, with filtration areas up to 330 m² (3,557 ft²). Pricing depends on manufacturer, filtration area, material of construction and condition, and IPP quotes each stock number individually with a video or on-site inspection on request.</w:t>
-      </w:r>
-    </w:p>
-    <w:p>
-      <w:r>
-        <w:rPr>
-          <w:rFonts w:ascii="Roboto" w:hAnsi="Roboto" w:eastAsia="Roboto"/>
-        </w:rPr>
-        <w:t>Featured listing: polypropylene plate-and-frame filter press.</w:t>
-      </w:r>
-    </w:p>
-    <w:p>
-      <w:r>
-        <w:rPr>
-          <w:rFonts w:ascii="Roboto" w:hAnsi="Roboto" w:eastAsia="Roboto"/>
-        </w:rPr>
-        <w:t>Browse used filters ↗</w:t>
+        <w:t>Non-jacketed storage tanks</w:t>
+      </w:r>
+    </w:p>
+    <w:p>
+      <w:pPr>
+        <w:pStyle w:val="ListBullet"/>
+      </w:pPr>
+      <w:r>
+        <w:rPr>
+          <w:rFonts w:ascii="Roboto" w:hAnsi="Roboto" w:eastAsia="Roboto"/>
+        </w:rPr>
+        <w:t>Carbon steel and fiberglass storage tanks</w:t>
+      </w:r>
+    </w:p>
+    <w:p>
+      <w:r>
+        <w:rPr>
+          <w:rFonts w:ascii="Roboto" w:hAnsi="Roboto" w:eastAsia="Roboto"/>
+        </w:rPr>
+        <w:t>Each tank listing states capacity, internal pressure, temperature and material. Stainless steel 304 and glass-lined tanks lead our tank inventory, alongside stainless steel 316 and 316L, carbon steel and fiberglass, with capacities from 5 L to 565,000 L (1 to 149,258 gal). Pricing depends on manufacturer, capacity, material of construction and condition, and IPP quotes each stock number individually with a video or on-site inspection on request.</w:t>
+      </w:r>
+    </w:p>
+    <w:p>
+      <w:r>
+        <w:rPr>
+          <w:rFonts w:ascii="Roboto" w:hAnsi="Roboto" w:eastAsia="Roboto"/>
+        </w:rPr>
+        <w:t>Featured listing: stainless steel 316L vertical tank.</w:t>
+      </w:r>
+    </w:p>
+    <w:p>
+      <w:r>
+        <w:rPr>
+          <w:rFonts w:ascii="Roboto" w:hAnsi="Roboto" w:eastAsia="Roboto"/>
+        </w:rPr>
+        <w:t>Browse used tanks ↗</w:t>
       </w:r>
     </w:p>
     <w:p>
@@ -3193,31 +4741,31 @@
         <w:rPr>
           <w:rFonts w:ascii="Montserrat" w:hAnsi="Montserrat" w:eastAsia="Outfit"/>
         </w:rPr>
-        <w:t>Distillation columns</w:t>
-      </w:r>
-    </w:p>
-    <w:p>
-      <w:r>
-        <w:rPr>
-          <w:rFonts w:ascii="Roboto" w:hAnsi="Roboto" w:eastAsia="Roboto"/>
-        </w:rPr>
-        <w:t>For purification, solvent recovery and fractional separation.</w:t>
-      </w:r>
-    </w:p>
-    <w:p>
-      <w:r>
-        <w:rPr>
-          <w:rFonts w:ascii="Roboto" w:hAnsi="Roboto" w:eastAsia="Roboto"/>
-        </w:rPr>
-        <w:t>IPP supplies used distillation columns to chemical plants for solvent recovery, product purification and fractional separation. With Pfaudler, De Dietrich, Kühni and Schott columns in stock, we supply packed and tray designs in glass-lined steel, stainless steel and specialty alloys.</w:t>
-      </w:r>
-    </w:p>
-    <w:p>
-      <w:r>
-        <w:rPr>
-          <w:rFonts w:ascii="Roboto" w:hAnsi="Roboto" w:eastAsia="Roboto"/>
-        </w:rPr>
-        <w:t>Column types in our inventory cover:</w:t>
+        <w:t>Glass-lined and reactor parts</w:t>
+      </w:r>
+    </w:p>
+    <w:p>
+      <w:r>
+        <w:rPr>
+          <w:rFonts w:ascii="Roboto" w:hAnsi="Roboto" w:eastAsia="Roboto"/>
+        </w:rPr>
+        <w:t>Spare parts that return glass-lined and alloy reactors to service.</w:t>
+      </w:r>
+    </w:p>
+    <w:p>
+      <w:r>
+        <w:rPr>
+          <w:rFonts w:ascii="Roboto" w:hAnsi="Roboto" w:eastAsia="Roboto"/>
+        </w:rPr>
+        <w:t>IPP supplies used, re-glassed and new glass-lined parts to chemical plants that maintain Pfaudler, De Dietrich and other glass-lined reactors and tanks. Glass-lined parts form the largest equipment type in our chemical processing inventory, and we also stock new seals and seal plans for exotic alloy reactors.</w:t>
+      </w:r>
+    </w:p>
+    <w:p>
+      <w:r>
+        <w:rPr>
+          <w:rFonts w:ascii="Roboto" w:hAnsi="Roboto" w:eastAsia="Roboto"/>
+        </w:rPr>
+        <w:t>Glass-lined and reactor parts in our inventory cover:</w:t>
       </w:r>
     </w:p>
     <w:p>
@@ -3228,7 +4776,7 @@
         <w:rPr>
           <w:rFonts w:ascii="Roboto" w:hAnsi="Roboto" w:eastAsia="Roboto"/>
         </w:rPr>
-        <w:t>Packed columns, including ceramic-packed glass-lined units</w:t>
+        <w:t>Glass-lined agitators, including retreat curve and Cryo-Lock blades</w:t>
       </w:r>
     </w:p>
     <w:p>
@@ -3239,7 +4787,7 @@
         <w:rPr>
           <w:rFonts w:ascii="Roboto" w:hAnsi="Roboto" w:eastAsia="Roboto"/>
         </w:rPr>
-        <w:t>Tray columns</w:t>
+        <w:t>Main covers and manway covers</w:t>
       </w:r>
     </w:p>
     <w:p>
@@ -3250,7 +4798,7 @@
         <w:rPr>
           <w:rFonts w:ascii="Roboto" w:hAnsi="Roboto" w:eastAsia="Roboto"/>
         </w:rPr>
-        <w:t>Combination packed and tray columns</w:t>
+        <w:t>Baffles, thermowells and adapter plates</w:t>
       </w:r>
     </w:p>
     <w:p>
@@ -3261,7 +4809,7 @@
         <w:rPr>
           <w:rFonts w:ascii="Roboto" w:hAnsi="Roboto" w:eastAsia="Roboto"/>
         </w:rPr>
-        <w:t>Contactor columns for liquid-liquid extraction</w:t>
+        <w:t>Pro-rings, split flanges and clamps</w:t>
       </w:r>
     </w:p>
     <w:p>
@@ -3272,145 +4820,39 @@
         <w:rPr>
           <w:rFonts w:ascii="Roboto" w:hAnsi="Roboto" w:eastAsia="Roboto"/>
         </w:rPr>
-        <w:t>Glass-lined columns for corrosive service</w:t>
-      </w:r>
-    </w:p>
-    <w:p>
-      <w:r>
-        <w:rPr>
-          <w:rFonts w:ascii="Roboto" w:hAnsi="Roboto" w:eastAsia="Roboto"/>
-        </w:rPr>
-        <w:t>Each column listing states diameter, length, pressure and temperature. Glass-lined and stainless steel 316 columns lead our column inventory, alongside stainless steel 304, Hastelloy C-276 and graphite, with diameters from 76 mm (3 in) to 8,000 mm (315 in). Pricing depends on manufacturer, diameter, material of construction and condition, and our team quotes each stock number individually.</w:t>
-      </w:r>
-    </w:p>
-    <w:p>
-      <w:r>
-        <w:rPr>
-          <w:rFonts w:ascii="Roboto" w:hAnsi="Roboto" w:eastAsia="Roboto"/>
-        </w:rPr>
-        <w:t>Featured listing: glass-lined packed column with ceramic packing.</w:t>
-      </w:r>
-    </w:p>
-    <w:p>
-      <w:r>
-        <w:rPr>
-          <w:rFonts w:ascii="Roboto" w:hAnsi="Roboto" w:eastAsia="Roboto"/>
-        </w:rPr>
-        <w:t>Browse used distillation columns ↗</w:t>
-      </w:r>
-    </w:p>
-    <w:p>
-      <w:pPr>
-        <w:pStyle w:val="Heading3"/>
-      </w:pPr>
-      <w:r>
-        <w:rPr>
-          <w:rFonts w:ascii="Montserrat" w:hAnsi="Montserrat" w:eastAsia="Outfit"/>
-        </w:rPr>
-        <w:t>Tanks</w:t>
-      </w:r>
-    </w:p>
-    <w:p>
-      <w:r>
-        <w:rPr>
-          <w:rFonts w:ascii="Roboto" w:hAnsi="Roboto" w:eastAsia="Roboto"/>
-        </w:rPr>
-        <w:t>For storage, blending and transfer. Jacketed and non-jacketed tanks available.</w:t>
-      </w:r>
-    </w:p>
-    <w:p>
-      <w:r>
-        <w:rPr>
-          <w:rFonts w:ascii="Roboto" w:hAnsi="Roboto" w:eastAsia="Roboto"/>
-        </w:rPr>
-        <w:t>We supply used tanks to chemical plants for raw material storage, blending and product transfer. As a supplier chemical producers trust for vessel capacity, IPP sources tanks from Pfaudler, De Dietrich, Grundy and Sinclair Stainless Fabrications in jacketed and non-jacketed designs.</w:t>
-      </w:r>
-    </w:p>
-    <w:p>
-      <w:r>
-        <w:rPr>
-          <w:rFonts w:ascii="Roboto" w:hAnsi="Roboto" w:eastAsia="Roboto"/>
-        </w:rPr>
-        <w:t>Our used tank inventory covers:</w:t>
-      </w:r>
-    </w:p>
-    <w:p>
-      <w:pPr>
-        <w:pStyle w:val="ListBullet"/>
-      </w:pPr>
-      <w:r>
-        <w:rPr>
-          <w:rFonts w:ascii="Roboto" w:hAnsi="Roboto" w:eastAsia="Roboto"/>
-        </w:rPr>
-        <w:t>Glass-lined tanks for corrosive chemicals</w:t>
-      </w:r>
-    </w:p>
-    <w:p>
-      <w:pPr>
-        <w:pStyle w:val="ListBullet"/>
-      </w:pPr>
-      <w:r>
-        <w:rPr>
-          <w:rFonts w:ascii="Roboto" w:hAnsi="Roboto" w:eastAsia="Roboto"/>
-        </w:rPr>
-        <w:t>Stainless steel 304, 316 and 316L process tanks</w:t>
-      </w:r>
-    </w:p>
-    <w:p>
-      <w:pPr>
-        <w:pStyle w:val="ListBullet"/>
-      </w:pPr>
-      <w:r>
-        <w:rPr>
-          <w:rFonts w:ascii="Roboto" w:hAnsi="Roboto" w:eastAsia="Roboto"/>
-        </w:rPr>
-        <w:t>Jacketed tanks for heating and cooling</w:t>
-      </w:r>
-    </w:p>
-    <w:p>
-      <w:pPr>
-        <w:pStyle w:val="ListBullet"/>
-      </w:pPr>
-      <w:r>
-        <w:rPr>
-          <w:rFonts w:ascii="Roboto" w:hAnsi="Roboto" w:eastAsia="Roboto"/>
-        </w:rPr>
-        <w:t>Non-jacketed storage tanks</w:t>
-      </w:r>
-    </w:p>
-    <w:p>
-      <w:pPr>
-        <w:pStyle w:val="ListBullet"/>
-      </w:pPr>
-      <w:r>
-        <w:rPr>
-          <w:rFonts w:ascii="Roboto" w:hAnsi="Roboto" w:eastAsia="Roboto"/>
-        </w:rPr>
-        <w:t>Carbon steel and fiberglass storage tanks</w:t>
-      </w:r>
-    </w:p>
-    <w:p>
-      <w:r>
-        <w:rPr>
-          <w:rFonts w:ascii="Roboto" w:hAnsi="Roboto" w:eastAsia="Roboto"/>
-        </w:rPr>
-        <w:t>Each tank listing states capacity, internal pressure, temperature and material. Stainless steel 304 and glass-lined tanks lead our tank inventory, alongside stainless steel 316 and 316L, carbon steel and fiberglass, with capacities from 5 L to 565,000 L (1 to 149,258 gal). Pricing depends on manufacturer, capacity, material of construction and condition, and IPP quotes each stock number individually with a video or on-site inspection on request.</w:t>
-      </w:r>
-    </w:p>
-    <w:p>
-      <w:r>
-        <w:rPr>
-          <w:rFonts w:ascii="Roboto" w:hAnsi="Roboto" w:eastAsia="Roboto"/>
-        </w:rPr>
-        <w:t>Featured listing: stainless steel 316L vertical tank.</w:t>
-      </w:r>
-    </w:p>
-    <w:p>
-      <w:r>
-        <w:rPr>
-          <w:rFonts w:ascii="Roboto" w:hAnsi="Roboto" w:eastAsia="Roboto"/>
-        </w:rPr>
-        <w:t>Browse used tanks ↗</w:t>
+        <w:t>Hastelloy C-22 seals and seal plans for exotic alloy reactors</w:t>
+      </w:r>
+    </w:p>
+    <w:p>
+      <w:r>
+        <w:rPr>
+          <w:rFonts w:ascii="Roboto" w:hAnsi="Roboto" w:eastAsia="Roboto"/>
+        </w:rPr>
+        <w:t>Each part listing states the vessel size it fits, diameter, length and whether the part is re-glassed. Pfaudler and De Dietrich parts lead our glass-lined parts inventory, alongside 3V Tech, Schott and UGE, for vessels from 8 L to 37,850 L (2 to 10,000 gal). Pricing depends on manufacturer, vessel size, glass condition and re-glassing, and IPP quotes each stock number individually with a video or on-site inspection on request.</w:t>
+      </w:r>
+    </w:p>
+    <w:p>
+      <w:r>
+        <w:rPr>
+          <w:rFonts w:ascii="Roboto" w:hAnsi="Roboto" w:eastAsia="Roboto"/>
+        </w:rPr>
+        <w:t>Featured listings: re-glassed Pfaudler retreat curve agitator for a 1,150 L (300 gal) vessel and a new Hastelloy C-22 reactor seal.</w:t>
+      </w:r>
+    </w:p>
+    <w:p>
+      <w:r>
+        <w:rPr>
+          <w:rFonts w:ascii="Roboto" w:hAnsi="Roboto" w:eastAsia="Roboto"/>
+        </w:rPr>
+        <w:t>Browse used glass-lined parts ↗</w:t>
+      </w:r>
+    </w:p>
+    <w:p>
+      <w:r>
+        <w:rPr>
+          <w:rFonts w:ascii="Roboto" w:hAnsi="Roboto" w:eastAsia="Roboto"/>
+        </w:rPr>
+        <w:t>Browse reactor parts ↗</w:t>
       </w:r>
     </w:p>
     <w:p>

</xml_diff>

<commit_message>
Chemical page: hero in two paragraphs with the top proof points
- Buyer paragraph: the IPP-form opener names IPP as the world's
  largest seller of used process plants and equipment, then the
  approved savings line word for word.
- Seller paragraph: the seller opener, then principal buyer under one
  contract and the companies IPP has partnered with to purchase and
  decommission plants.
- The AI-quoted live hero sentence moves word for word to the
  inventory intro; the validator guards both.
- Role table, outline, README revision 9, Word copy and preview.

Co-Authored-By: Claude Opus 5.5 <noreply@anthropic.com>
</commit_message>
<xml_diff>
--- a/docs/chemical-build/deliverables/used-chemical-process-plants-for-sale-content.docx
+++ b/docs/chemical-build/deliverables/used-chemical-process-plants-for-sale-content.docx
@@ -58,23 +58,15 @@
         <w:rPr>
           <w:rFonts w:ascii="Roboto" w:hAnsi="Roboto" w:eastAsia="Roboto"/>
         </w:rPr>
-        <w:t>International Process Plants (IPP)’s inventory includes used chemical process plant equipment like reactors, heat exchangers and centrifuges, ready to ship for fast redeployment.</w:t>
-      </w:r>
-    </w:p>
-    <w:p>
-      <w:r>
-        <w:rPr>
-          <w:rFonts w:ascii="Roboto" w:hAnsi="Roboto" w:eastAsia="Roboto"/>
-        </w:rPr>
-        <w:t>Buying used chemical process plants and equipment from IPP establishes reaction, separation, and heat transfer capacity while sidelining issues like OEM lead times and new-build capital costs.</w:t>
-      </w:r>
-    </w:p>
-    <w:p>
-      <w:r>
-        <w:rPr>
-          <w:rFonts w:ascii="Roboto" w:hAnsi="Roboto" w:eastAsia="Roboto"/>
-        </w:rPr>
-        <w:t>Selling shutdown chemical plants and surplus equipment to IPP converts idle assets into capital while shedding storage, carrying and closure costs.</w:t>
+        <w:t>Buying used chemical process plants and equipment from International Process Plants (IPP), the world’s largest seller of used process plants and equipment, establishes reaction, separation, and heat transfer capacity while sidelining issues like OEM lead times and new-build capital costs. Purchasing used from IPP can save up to 50% of capital and 90% of lead time versus buying new.</w:t>
+      </w:r>
+    </w:p>
+    <w:p>
+      <w:r>
+        <w:rPr>
+          <w:rFonts w:ascii="Roboto" w:hAnsi="Roboto" w:eastAsia="Roboto"/>
+        </w:rPr>
+        <w:t>Selling shutdown chemical plants and surplus equipment to IPP converts idle assets into capital while shedding storage, carrying and closure costs. We acquire complete sites or individual units under one contract as a principal buyer, not a broker, and IPP has partnered with BASF, Shell, Eli Lilly, Dow, Air Products and Lonza to purchase and decommission plants.</w:t>
       </w:r>
     </w:p>
     <w:p>
@@ -412,7 +404,7 @@
         <w:rPr>
           <w:rFonts w:ascii="Roboto" w:hAnsi="Roboto" w:eastAsia="Roboto"/>
         </w:rPr>
-        <w:t>IPP features six used chemical plants and 14 units of chemical process equipment from its inventory in one list, with at least one listing for each equipment type we supply. Plant listings show capacity, technology, feedstock and location. Equipment listings show material, condition, pressure and temperature. Each listing opens the full specifications and photographs in IPP’s inventory.</w:t>
+        <w:t>International Process Plants (IPP)’s inventory includes used chemical process plant equipment like reactors, heat exchangers and centrifuges, ready to ship for fast redeployment. This list features six used chemical plants and 14 units of chemical process equipment, with at least one listing for each equipment type we supply. Plant listings show capacity, technology, feedstock and location. Equipment listings show material, condition, pressure and temperature. Each listing opens the full specifications and photographs in IPP’s inventory.</w:t>
       </w:r>
     </w:p>
     <w:p>

</xml_diff>

<commit_message>
Chemical page: clean final Word copy export
The exporter now drops screen-only chrome (breadcrumb, arrows, View
Specs/Enquire, Source/details lines), links each listing, project and
article heading to its target, puts button rows on one line, labels
the For buyers / For sellers panels, and separates stat, maker, badge,
testimonial and buying-step fields.

Co-Authored-By: Claude Opus 5.5 <noreply@anthropic.com>
</commit_message>
<xml_diff>
--- a/docs/chemical-build/deliverables/used-chemical-process-plants-for-sale-content.docx
+++ b/docs/chemical-build/deliverables/used-chemical-process-plants-for-sale-content.docx
@@ -3,46 +3,6 @@
 <w:document xmlns:wpc="http://schemas.microsoft.com/office/word/2010/wordprocessingCanvas" xmlns:mo="http://schemas.microsoft.com/office/mac/office/2008/main" xmlns:mc="http://schemas.openxmlformats.org/markup-compatibility/2006" xmlns:mv="urn:schemas-microsoft-com:mac:vml" xmlns:o="urn:schemas-microsoft-com:office:office" xmlns:r="http://schemas.openxmlformats.org/officeDocument/2006/relationships" xmlns:m="http://schemas.openxmlformats.org/officeDocument/2006/math" xmlns:v="urn:schemas-microsoft-com:vml" xmlns:wp14="http://schemas.microsoft.com/office/word/2010/wordprocessingDrawing" xmlns:wp="http://schemas.openxmlformats.org/drawingml/2006/wordprocessingDrawing" xmlns:w10="urn:schemas-microsoft-com:office:word" xmlns:w="http://schemas.openxmlformats.org/wordprocessingml/2006/main" xmlns:w14="http://schemas.microsoft.com/office/word/2010/wordml" xmlns:wpg="http://schemas.microsoft.com/office/word/2010/wordprocessingGroup" xmlns:wpi="http://schemas.microsoft.com/office/word/2010/wordprocessingInk" xmlns:wne="http://schemas.microsoft.com/office/word/2006/wordml" xmlns:wps="http://schemas.microsoft.com/office/word/2010/wordprocessingShape" mc:Ignorable="w14 wp14">
   <w:body>
     <w:p>
-      <w:r>
-        <w:rPr>
-          <w:rFonts w:ascii="Roboto" w:hAnsi="Roboto" w:eastAsia="Roboto"/>
-        </w:rPr>
-        <w:t>Home</w:t>
-      </w:r>
-    </w:p>
-    <w:p>
-      <w:r>
-        <w:rPr>
-          <w:rFonts w:ascii="Roboto" w:hAnsi="Roboto" w:eastAsia="Roboto"/>
-        </w:rPr>
-        <w:t>/</w:t>
-      </w:r>
-    </w:p>
-    <w:p>
-      <w:r>
-        <w:rPr>
-          <w:rFonts w:ascii="Roboto" w:hAnsi="Roboto" w:eastAsia="Roboto"/>
-        </w:rPr>
-        <w:t>Process plants</w:t>
-      </w:r>
-    </w:p>
-    <w:p>
-      <w:r>
-        <w:rPr>
-          <w:rFonts w:ascii="Roboto" w:hAnsi="Roboto" w:eastAsia="Roboto"/>
-        </w:rPr>
-        <w:t>/</w:t>
-      </w:r>
-    </w:p>
-    <w:p>
-      <w:r>
-        <w:rPr>
-          <w:rFonts w:ascii="Roboto" w:hAnsi="Roboto" w:eastAsia="Roboto"/>
-        </w:rPr>
-        <w:t>Chemical plants &amp; equipment</w:t>
-      </w:r>
-    </w:p>
-    <w:p>
       <w:pPr>
         <w:pStyle w:val="Heading1"/>
       </w:pPr>
@@ -74,27 +34,7 @@
         <w:rPr>
           <w:rFonts w:ascii="Roboto" w:hAnsi="Roboto" w:eastAsia="Roboto"/>
         </w:rPr>
-        <w:t xml:space="preserve">Browse inventory </w:t>
-      </w:r>
-      <w:r>
-        <w:rPr>
-          <w:rFonts w:ascii="Roboto" w:hAnsi="Roboto" w:eastAsia="Roboto"/>
-        </w:rPr>
-        <w:t>↓</w:t>
-      </w:r>
-    </w:p>
-    <w:p>
-      <w:r>
-        <w:rPr>
-          <w:rFonts w:ascii="Roboto" w:hAnsi="Roboto" w:eastAsia="Roboto"/>
-        </w:rPr>
-        <w:t xml:space="preserve">Sell your plant or equipment </w:t>
-      </w:r>
-      <w:r>
-        <w:rPr>
-          <w:rFonts w:ascii="Roboto" w:hAnsi="Roboto" w:eastAsia="Roboto"/>
-        </w:rPr>
-        <w:t>↓</w:t>
+        <w:t>Buttons: Browse inventory · Sell your plant or equipment</w:t>
       </w:r>
     </w:p>
     <w:p>
@@ -117,22 +57,6 @@
       </w:r>
     </w:p>
     <w:p>
-      <w:r>
-        <w:rPr>
-          <w:rFonts w:ascii="Roboto" w:hAnsi="Roboto" w:eastAsia="Roboto"/>
-        </w:rPr>
-        <w:t>↗</w:t>
-      </w:r>
-    </w:p>
-    <w:p>
-      <w:r>
-        <w:rPr>
-          <w:rFonts w:ascii="Roboto" w:hAnsi="Roboto" w:eastAsia="Roboto"/>
-        </w:rPr>
-        <w:t>Source / details</w:t>
-      </w:r>
-    </w:p>
-    <w:p>
       <w:pPr>
         <w:pStyle w:val="Heading2"/>
       </w:pPr>
@@ -152,22 +76,6 @@
       </w:r>
     </w:p>
     <w:p>
-      <w:r>
-        <w:rPr>
-          <w:rFonts w:ascii="Roboto" w:hAnsi="Roboto" w:eastAsia="Roboto"/>
-        </w:rPr>
-        <w:t>↗</w:t>
-      </w:r>
-    </w:p>
-    <w:p>
-      <w:r>
-        <w:rPr>
-          <w:rFonts w:ascii="Roboto" w:hAnsi="Roboto" w:eastAsia="Roboto"/>
-        </w:rPr>
-        <w:t>Source / details</w:t>
-      </w:r>
-    </w:p>
-    <w:p>
       <w:pPr>
         <w:pStyle w:val="Heading2"/>
       </w:pPr>
@@ -187,37 +95,14 @@
       </w:r>
     </w:p>
     <w:p>
-      <w:r>
-        <w:rPr>
-          <w:rFonts w:ascii="Roboto" w:hAnsi="Roboto" w:eastAsia="Roboto"/>
-        </w:rPr>
-        <w:t>↗</w:t>
-      </w:r>
-    </w:p>
-    <w:p>
-      <w:r>
-        <w:rPr>
-          <w:rFonts w:ascii="Roboto" w:hAnsi="Roboto" w:eastAsia="Roboto"/>
-        </w:rPr>
-        <w:t>Source / details</w:t>
-      </w:r>
-    </w:p>
-    <w:p>
       <w:pPr>
         <w:pStyle w:val="ListBullet"/>
       </w:pPr>
       <w:r>
         <w:rPr>
           <w:rFonts w:ascii="Roboto" w:hAnsi="Roboto" w:eastAsia="Roboto"/>
-          <w:b/>
-        </w:rPr>
-        <w:t>15,000+</w:t>
-      </w:r>
-      <w:r>
-        <w:rPr>
-          <w:rFonts w:ascii="Roboto" w:hAnsi="Roboto" w:eastAsia="Roboto"/>
-        </w:rPr>
-        <w:t>Pieces of inventory</w:t>
+        </w:rPr>
+        <w:t>15,000+ pieces of inventory</w:t>
       </w:r>
     </w:p>
     <w:p>
@@ -227,15 +112,8 @@
       <w:r>
         <w:rPr>
           <w:rFonts w:ascii="Roboto" w:hAnsi="Roboto" w:eastAsia="Roboto"/>
-          <w:b/>
-        </w:rPr>
-        <w:t>20</w:t>
-      </w:r>
-      <w:r>
-        <w:rPr>
-          <w:rFonts w:ascii="Roboto" w:hAnsi="Roboto" w:eastAsia="Roboto"/>
-        </w:rPr>
-        <w:t>Complete plant sites</w:t>
+        </w:rPr>
+        <w:t>20 complete plant sites</w:t>
       </w:r>
     </w:p>
     <w:p>
@@ -245,15 +123,8 @@
       <w:r>
         <w:rPr>
           <w:rFonts w:ascii="Roboto" w:hAnsi="Roboto" w:eastAsia="Roboto"/>
-          <w:b/>
-        </w:rPr>
-        <w:t>15</w:t>
-      </w:r>
-      <w:r>
-        <w:rPr>
-          <w:rFonts w:ascii="Roboto" w:hAnsi="Roboto" w:eastAsia="Roboto"/>
-        </w:rPr>
-        <w:t>Countries with offices</w:t>
+        </w:rPr>
+        <w:t>15 countries with offices</w:t>
       </w:r>
     </w:p>
     <w:p>
@@ -263,15 +134,8 @@
       <w:r>
         <w:rPr>
           <w:rFonts w:ascii="Roboto" w:hAnsi="Roboto" w:eastAsia="Roboto"/>
-          <w:b/>
-        </w:rPr>
-        <w:t>Since 1980</w:t>
-      </w:r>
-      <w:r>
-        <w:rPr>
-          <w:rFonts w:ascii="Roboto" w:hAnsi="Roboto" w:eastAsia="Roboto"/>
-        </w:rPr>
-        <w:t>Supplying process equipment</w:t>
+        </w:rPr>
+        <w:t>Since 1980, supplying process equipment</w:t>
       </w:r>
     </w:p>
     <w:p>
@@ -283,6 +147,14 @@
           <w:rFonts w:ascii="Montserrat" w:hAnsi="Montserrat" w:eastAsia="Outfit"/>
         </w:rPr>
         <w:t>Trusted around the world by</w:t>
+      </w:r>
+    </w:p>
+    <w:p>
+      <w:r>
+        <w:rPr>
+          <w:rFonts w:ascii="Roboto" w:hAnsi="Roboto" w:eastAsia="Roboto"/>
+        </w:rPr>
+        <w:t>Shell, Sanofi, Lilly, Dow, Lonza, Air Products</w:t>
       </w:r>
     </w:p>
     <w:p>
@@ -412,13 +284,7 @@
         <w:rPr>
           <w:rFonts w:ascii="Roboto" w:hAnsi="Roboto" w:eastAsia="Roboto"/>
         </w:rPr>
-        <w:t xml:space="preserve">Search all IPP inventory </w:t>
-      </w:r>
-      <w:r>
-        <w:rPr>
-          <w:rFonts w:ascii="Roboto" w:hAnsi="Roboto" w:eastAsia="Roboto"/>
-        </w:rPr>
-        <w:t>↗</w:t>
+        <w:t>Search all IPP inventory</w:t>
       </w:r>
     </w:p>
     <w:p>
@@ -568,28 +434,6 @@
         <w:rPr>
           <w:rFonts w:ascii="Roboto" w:hAnsi="Roboto" w:eastAsia="Roboto"/>
         </w:rPr>
-        <w:t xml:space="preserve">View Specs </w:t>
-      </w:r>
-      <w:r>
-        <w:rPr>
-          <w:rFonts w:ascii="Roboto" w:hAnsi="Roboto" w:eastAsia="Roboto"/>
-        </w:rPr>
-        <w:t>↗</w:t>
-      </w:r>
-    </w:p>
-    <w:p>
-      <w:r>
-        <w:rPr>
-          <w:rFonts w:ascii="Roboto" w:hAnsi="Roboto" w:eastAsia="Roboto"/>
-        </w:rPr>
-        <w:t>Enquire ↗</w:t>
-      </w:r>
-    </w:p>
-    <w:p>
-      <w:r>
-        <w:rPr>
-          <w:rFonts w:ascii="Roboto" w:hAnsi="Roboto" w:eastAsia="Roboto"/>
-        </w:rPr>
         <w:t>IPP STOCK P603039</w:t>
       </w:r>
     </w:p>
@@ -732,28 +576,6 @@
         <w:rPr>
           <w:rFonts w:ascii="Roboto" w:hAnsi="Roboto" w:eastAsia="Roboto"/>
         </w:rPr>
-        <w:t xml:space="preserve">View Specs </w:t>
-      </w:r>
-      <w:r>
-        <w:rPr>
-          <w:rFonts w:ascii="Roboto" w:hAnsi="Roboto" w:eastAsia="Roboto"/>
-        </w:rPr>
-        <w:t>↗</w:t>
-      </w:r>
-    </w:p>
-    <w:p>
-      <w:r>
-        <w:rPr>
-          <w:rFonts w:ascii="Roboto" w:hAnsi="Roboto" w:eastAsia="Roboto"/>
-        </w:rPr>
-        <w:t>Enquire ↗</w:t>
-      </w:r>
-    </w:p>
-    <w:p>
-      <w:r>
-        <w:rPr>
-          <w:rFonts w:ascii="Roboto" w:hAnsi="Roboto" w:eastAsia="Roboto"/>
-        </w:rPr>
         <w:t>IPP STOCK P603040</w:t>
       </w:r>
     </w:p>
@@ -863,28 +685,6 @@
         </w:tc>
       </w:tr>
     </w:tbl>
-    <w:p>
-      <w:r>
-        <w:rPr>
-          <w:rFonts w:ascii="Roboto" w:hAnsi="Roboto" w:eastAsia="Roboto"/>
-        </w:rPr>
-        <w:t xml:space="preserve">View Specs </w:t>
-      </w:r>
-      <w:r>
-        <w:rPr>
-          <w:rFonts w:ascii="Roboto" w:hAnsi="Roboto" w:eastAsia="Roboto"/>
-        </w:rPr>
-        <w:t>↗</w:t>
-      </w:r>
-    </w:p>
-    <w:p>
-      <w:r>
-        <w:rPr>
-          <w:rFonts w:ascii="Roboto" w:hAnsi="Roboto" w:eastAsia="Roboto"/>
-        </w:rPr>
-        <w:t>Enquire ↗</w:t>
-      </w:r>
-    </w:p>
     <w:p>
       <w:r>
         <w:rPr>
@@ -1032,28 +832,6 @@
         <w:rPr>
           <w:rFonts w:ascii="Roboto" w:hAnsi="Roboto" w:eastAsia="Roboto"/>
         </w:rPr>
-        <w:t xml:space="preserve">View Specs </w:t>
-      </w:r>
-      <w:r>
-        <w:rPr>
-          <w:rFonts w:ascii="Roboto" w:hAnsi="Roboto" w:eastAsia="Roboto"/>
-        </w:rPr>
-        <w:t>↗</w:t>
-      </w:r>
-    </w:p>
-    <w:p>
-      <w:r>
-        <w:rPr>
-          <w:rFonts w:ascii="Roboto" w:hAnsi="Roboto" w:eastAsia="Roboto"/>
-        </w:rPr>
-        <w:t>Enquire ↗</w:t>
-      </w:r>
-    </w:p>
-    <w:p>
-      <w:r>
-        <w:rPr>
-          <w:rFonts w:ascii="Roboto" w:hAnsi="Roboto" w:eastAsia="Roboto"/>
-        </w:rPr>
         <w:t>IPP STOCK P601813</w:t>
       </w:r>
     </w:p>
@@ -1140,28 +918,6 @@
         <w:rPr>
           <w:rFonts w:ascii="Roboto" w:hAnsi="Roboto" w:eastAsia="Roboto"/>
         </w:rPr>
-        <w:t xml:space="preserve">View Specs </w:t>
-      </w:r>
-      <w:r>
-        <w:rPr>
-          <w:rFonts w:ascii="Roboto" w:hAnsi="Roboto" w:eastAsia="Roboto"/>
-        </w:rPr>
-        <w:t>↗</w:t>
-      </w:r>
-    </w:p>
-    <w:p>
-      <w:r>
-        <w:rPr>
-          <w:rFonts w:ascii="Roboto" w:hAnsi="Roboto" w:eastAsia="Roboto"/>
-        </w:rPr>
-        <w:t>Enquire ↗</w:t>
-      </w:r>
-    </w:p>
-    <w:p>
-      <w:r>
-        <w:rPr>
-          <w:rFonts w:ascii="Roboto" w:hAnsi="Roboto" w:eastAsia="Roboto"/>
-        </w:rPr>
         <w:t>IPP STOCK P603016</w:t>
       </w:r>
     </w:p>
@@ -1243,28 +999,6 @@
         </w:tc>
       </w:tr>
     </w:tbl>
-    <w:p>
-      <w:r>
-        <w:rPr>
-          <w:rFonts w:ascii="Roboto" w:hAnsi="Roboto" w:eastAsia="Roboto"/>
-        </w:rPr>
-        <w:t xml:space="preserve">View Specs </w:t>
-      </w:r>
-      <w:r>
-        <w:rPr>
-          <w:rFonts w:ascii="Roboto" w:hAnsi="Roboto" w:eastAsia="Roboto"/>
-        </w:rPr>
-        <w:t>↗</w:t>
-      </w:r>
-    </w:p>
-    <w:p>
-      <w:r>
-        <w:rPr>
-          <w:rFonts w:ascii="Roboto" w:hAnsi="Roboto" w:eastAsia="Roboto"/>
-        </w:rPr>
-        <w:t>Enquire ↗</w:t>
-      </w:r>
-    </w:p>
     <w:p>
       <w:r>
         <w:rPr>
@@ -1412,28 +1146,6 @@
         <w:rPr>
           <w:rFonts w:ascii="Roboto" w:hAnsi="Roboto" w:eastAsia="Roboto"/>
         </w:rPr>
-        <w:t xml:space="preserve">View Specs </w:t>
-      </w:r>
-      <w:r>
-        <w:rPr>
-          <w:rFonts w:ascii="Roboto" w:hAnsi="Roboto" w:eastAsia="Roboto"/>
-        </w:rPr>
-        <w:t>↗</w:t>
-      </w:r>
-    </w:p>
-    <w:p>
-      <w:r>
-        <w:rPr>
-          <w:rFonts w:ascii="Roboto" w:hAnsi="Roboto" w:eastAsia="Roboto"/>
-        </w:rPr>
-        <w:t>Enquire ↗</w:t>
-      </w:r>
-    </w:p>
-    <w:p>
-      <w:r>
-        <w:rPr>
-          <w:rFonts w:ascii="Roboto" w:hAnsi="Roboto" w:eastAsia="Roboto"/>
-        </w:rPr>
         <w:t>IPP STOCK #232498</w:t>
       </w:r>
     </w:p>
@@ -1576,28 +1288,6 @@
         <w:rPr>
           <w:rFonts w:ascii="Roboto" w:hAnsi="Roboto" w:eastAsia="Roboto"/>
         </w:rPr>
-        <w:t xml:space="preserve">View Specs </w:t>
-      </w:r>
-      <w:r>
-        <w:rPr>
-          <w:rFonts w:ascii="Roboto" w:hAnsi="Roboto" w:eastAsia="Roboto"/>
-        </w:rPr>
-        <w:t>↗</w:t>
-      </w:r>
-    </w:p>
-    <w:p>
-      <w:r>
-        <w:rPr>
-          <w:rFonts w:ascii="Roboto" w:hAnsi="Roboto" w:eastAsia="Roboto"/>
-        </w:rPr>
-        <w:t>Enquire ↗</w:t>
-      </w:r>
-    </w:p>
-    <w:p>
-      <w:r>
-        <w:rPr>
-          <w:rFonts w:ascii="Roboto" w:hAnsi="Roboto" w:eastAsia="Roboto"/>
-        </w:rPr>
         <w:t>IPP STOCK #76524</w:t>
       </w:r>
     </w:p>
@@ -1740,28 +1430,6 @@
         <w:rPr>
           <w:rFonts w:ascii="Roboto" w:hAnsi="Roboto" w:eastAsia="Roboto"/>
         </w:rPr>
-        <w:t xml:space="preserve">View Specs </w:t>
-      </w:r>
-      <w:r>
-        <w:rPr>
-          <w:rFonts w:ascii="Roboto" w:hAnsi="Roboto" w:eastAsia="Roboto"/>
-        </w:rPr>
-        <w:t>↗</w:t>
-      </w:r>
-    </w:p>
-    <w:p>
-      <w:r>
-        <w:rPr>
-          <w:rFonts w:ascii="Roboto" w:hAnsi="Roboto" w:eastAsia="Roboto"/>
-        </w:rPr>
-        <w:t>Enquire ↗</w:t>
-      </w:r>
-    </w:p>
-    <w:p>
-      <w:r>
-        <w:rPr>
-          <w:rFonts w:ascii="Roboto" w:hAnsi="Roboto" w:eastAsia="Roboto"/>
-        </w:rPr>
         <w:t>IPP STOCK #705876</w:t>
       </w:r>
     </w:p>
@@ -1904,28 +1572,6 @@
         <w:rPr>
           <w:rFonts w:ascii="Roboto" w:hAnsi="Roboto" w:eastAsia="Roboto"/>
         </w:rPr>
-        <w:t xml:space="preserve">View Specs </w:t>
-      </w:r>
-      <w:r>
-        <w:rPr>
-          <w:rFonts w:ascii="Roboto" w:hAnsi="Roboto" w:eastAsia="Roboto"/>
-        </w:rPr>
-        <w:t>↗</w:t>
-      </w:r>
-    </w:p>
-    <w:p>
-      <w:r>
-        <w:rPr>
-          <w:rFonts w:ascii="Roboto" w:hAnsi="Roboto" w:eastAsia="Roboto"/>
-        </w:rPr>
-        <w:t>Enquire ↗</w:t>
-      </w:r>
-    </w:p>
-    <w:p>
-      <w:r>
-        <w:rPr>
-          <w:rFonts w:ascii="Roboto" w:hAnsi="Roboto" w:eastAsia="Roboto"/>
-        </w:rPr>
         <w:t>IPP STOCK #242533</w:t>
       </w:r>
     </w:p>
@@ -2068,28 +1714,6 @@
         <w:rPr>
           <w:rFonts w:ascii="Roboto" w:hAnsi="Roboto" w:eastAsia="Roboto"/>
         </w:rPr>
-        <w:t xml:space="preserve">View Specs </w:t>
-      </w:r>
-      <w:r>
-        <w:rPr>
-          <w:rFonts w:ascii="Roboto" w:hAnsi="Roboto" w:eastAsia="Roboto"/>
-        </w:rPr>
-        <w:t>↗</w:t>
-      </w:r>
-    </w:p>
-    <w:p>
-      <w:r>
-        <w:rPr>
-          <w:rFonts w:ascii="Roboto" w:hAnsi="Roboto" w:eastAsia="Roboto"/>
-        </w:rPr>
-        <w:t>Enquire ↗</w:t>
-      </w:r>
-    </w:p>
-    <w:p>
-      <w:r>
-        <w:rPr>
-          <w:rFonts w:ascii="Roboto" w:hAnsi="Roboto" w:eastAsia="Roboto"/>
-        </w:rPr>
         <w:t>IPP STOCK #220954</w:t>
       </w:r>
     </w:p>
@@ -2232,28 +1856,6 @@
         <w:rPr>
           <w:rFonts w:ascii="Roboto" w:hAnsi="Roboto" w:eastAsia="Roboto"/>
         </w:rPr>
-        <w:t xml:space="preserve">View Specs </w:t>
-      </w:r>
-      <w:r>
-        <w:rPr>
-          <w:rFonts w:ascii="Roboto" w:hAnsi="Roboto" w:eastAsia="Roboto"/>
-        </w:rPr>
-        <w:t>↗</w:t>
-      </w:r>
-    </w:p>
-    <w:p>
-      <w:r>
-        <w:rPr>
-          <w:rFonts w:ascii="Roboto" w:hAnsi="Roboto" w:eastAsia="Roboto"/>
-        </w:rPr>
-        <w:t>Enquire ↗</w:t>
-      </w:r>
-    </w:p>
-    <w:p>
-      <w:r>
-        <w:rPr>
-          <w:rFonts w:ascii="Roboto" w:hAnsi="Roboto" w:eastAsia="Roboto"/>
-        </w:rPr>
         <w:t>IPP STOCK #211545</w:t>
       </w:r>
     </w:p>
@@ -2396,28 +1998,6 @@
         <w:rPr>
           <w:rFonts w:ascii="Roboto" w:hAnsi="Roboto" w:eastAsia="Roboto"/>
         </w:rPr>
-        <w:t xml:space="preserve">View Specs </w:t>
-      </w:r>
-      <w:r>
-        <w:rPr>
-          <w:rFonts w:ascii="Roboto" w:hAnsi="Roboto" w:eastAsia="Roboto"/>
-        </w:rPr>
-        <w:t>↗</w:t>
-      </w:r>
-    </w:p>
-    <w:p>
-      <w:r>
-        <w:rPr>
-          <w:rFonts w:ascii="Roboto" w:hAnsi="Roboto" w:eastAsia="Roboto"/>
-        </w:rPr>
-        <w:t>Enquire ↗</w:t>
-      </w:r>
-    </w:p>
-    <w:p>
-      <w:r>
-        <w:rPr>
-          <w:rFonts w:ascii="Roboto" w:hAnsi="Roboto" w:eastAsia="Roboto"/>
-        </w:rPr>
         <w:t>IPP STOCK #236163</w:t>
       </w:r>
     </w:p>
@@ -2560,28 +2140,6 @@
         <w:rPr>
           <w:rFonts w:ascii="Roboto" w:hAnsi="Roboto" w:eastAsia="Roboto"/>
         </w:rPr>
-        <w:t xml:space="preserve">View Specs </w:t>
-      </w:r>
-      <w:r>
-        <w:rPr>
-          <w:rFonts w:ascii="Roboto" w:hAnsi="Roboto" w:eastAsia="Roboto"/>
-        </w:rPr>
-        <w:t>↗</w:t>
-      </w:r>
-    </w:p>
-    <w:p>
-      <w:r>
-        <w:rPr>
-          <w:rFonts w:ascii="Roboto" w:hAnsi="Roboto" w:eastAsia="Roboto"/>
-        </w:rPr>
-        <w:t>Enquire ↗</w:t>
-      </w:r>
-    </w:p>
-    <w:p>
-      <w:r>
-        <w:rPr>
-          <w:rFonts w:ascii="Roboto" w:hAnsi="Roboto" w:eastAsia="Roboto"/>
-        </w:rPr>
         <w:t>IPP STOCK #235730</w:t>
       </w:r>
     </w:p>
@@ -2724,28 +2282,6 @@
         <w:rPr>
           <w:rFonts w:ascii="Roboto" w:hAnsi="Roboto" w:eastAsia="Roboto"/>
         </w:rPr>
-        <w:t xml:space="preserve">View Specs </w:t>
-      </w:r>
-      <w:r>
-        <w:rPr>
-          <w:rFonts w:ascii="Roboto" w:hAnsi="Roboto" w:eastAsia="Roboto"/>
-        </w:rPr>
-        <w:t>↗</w:t>
-      </w:r>
-    </w:p>
-    <w:p>
-      <w:r>
-        <w:rPr>
-          <w:rFonts w:ascii="Roboto" w:hAnsi="Roboto" w:eastAsia="Roboto"/>
-        </w:rPr>
-        <w:t>Enquire ↗</w:t>
-      </w:r>
-    </w:p>
-    <w:p>
-      <w:r>
-        <w:rPr>
-          <w:rFonts w:ascii="Roboto" w:hAnsi="Roboto" w:eastAsia="Roboto"/>
-        </w:rPr>
         <w:t>IPP STOCK #225365</w:t>
       </w:r>
     </w:p>
@@ -2888,28 +2424,6 @@
         <w:rPr>
           <w:rFonts w:ascii="Roboto" w:hAnsi="Roboto" w:eastAsia="Roboto"/>
         </w:rPr>
-        <w:t xml:space="preserve">View Specs </w:t>
-      </w:r>
-      <w:r>
-        <w:rPr>
-          <w:rFonts w:ascii="Roboto" w:hAnsi="Roboto" w:eastAsia="Roboto"/>
-        </w:rPr>
-        <w:t>↗</w:t>
-      </w:r>
-    </w:p>
-    <w:p>
-      <w:r>
-        <w:rPr>
-          <w:rFonts w:ascii="Roboto" w:hAnsi="Roboto" w:eastAsia="Roboto"/>
-        </w:rPr>
-        <w:t>Enquire ↗</w:t>
-      </w:r>
-    </w:p>
-    <w:p>
-      <w:r>
-        <w:rPr>
-          <w:rFonts w:ascii="Roboto" w:hAnsi="Roboto" w:eastAsia="Roboto"/>
-        </w:rPr>
         <w:t>IPP STOCK #238212</w:t>
       </w:r>
     </w:p>
@@ -3052,28 +2566,6 @@
         <w:rPr>
           <w:rFonts w:ascii="Roboto" w:hAnsi="Roboto" w:eastAsia="Roboto"/>
         </w:rPr>
-        <w:t xml:space="preserve">View Specs </w:t>
-      </w:r>
-      <w:r>
-        <w:rPr>
-          <w:rFonts w:ascii="Roboto" w:hAnsi="Roboto" w:eastAsia="Roboto"/>
-        </w:rPr>
-        <w:t>↗</w:t>
-      </w:r>
-    </w:p>
-    <w:p>
-      <w:r>
-        <w:rPr>
-          <w:rFonts w:ascii="Roboto" w:hAnsi="Roboto" w:eastAsia="Roboto"/>
-        </w:rPr>
-        <w:t>Enquire ↗</w:t>
-      </w:r>
-    </w:p>
-    <w:p>
-      <w:r>
-        <w:rPr>
-          <w:rFonts w:ascii="Roboto" w:hAnsi="Roboto" w:eastAsia="Roboto"/>
-        </w:rPr>
         <w:t>IPP STOCK #242886</w:t>
       </w:r>
     </w:p>
@@ -3216,28 +2708,6 @@
         <w:rPr>
           <w:rFonts w:ascii="Roboto" w:hAnsi="Roboto" w:eastAsia="Roboto"/>
         </w:rPr>
-        <w:t xml:space="preserve">View Specs </w:t>
-      </w:r>
-      <w:r>
-        <w:rPr>
-          <w:rFonts w:ascii="Roboto" w:hAnsi="Roboto" w:eastAsia="Roboto"/>
-        </w:rPr>
-        <w:t>↗</w:t>
-      </w:r>
-    </w:p>
-    <w:p>
-      <w:r>
-        <w:rPr>
-          <w:rFonts w:ascii="Roboto" w:hAnsi="Roboto" w:eastAsia="Roboto"/>
-        </w:rPr>
-        <w:t>Enquire ↗</w:t>
-      </w:r>
-    </w:p>
-    <w:p>
-      <w:r>
-        <w:rPr>
-          <w:rFonts w:ascii="Roboto" w:hAnsi="Roboto" w:eastAsia="Roboto"/>
-        </w:rPr>
         <w:t>IPP STOCK #239007</w:t>
       </w:r>
     </w:p>
@@ -3380,28 +2850,6 @@
         <w:rPr>
           <w:rFonts w:ascii="Roboto" w:hAnsi="Roboto" w:eastAsia="Roboto"/>
         </w:rPr>
-        <w:t xml:space="preserve">View Specs </w:t>
-      </w:r>
-      <w:r>
-        <w:rPr>
-          <w:rFonts w:ascii="Roboto" w:hAnsi="Roboto" w:eastAsia="Roboto"/>
-        </w:rPr>
-        <w:t>↗</w:t>
-      </w:r>
-    </w:p>
-    <w:p>
-      <w:r>
-        <w:rPr>
-          <w:rFonts w:ascii="Roboto" w:hAnsi="Roboto" w:eastAsia="Roboto"/>
-        </w:rPr>
-        <w:t>Enquire ↗</w:t>
-      </w:r>
-    </w:p>
-    <w:p>
-      <w:r>
-        <w:rPr>
-          <w:rFonts w:ascii="Roboto" w:hAnsi="Roboto" w:eastAsia="Roboto"/>
-        </w:rPr>
         <w:t>IPP STOCK #249252</w:t>
       </w:r>
     </w:p>
@@ -3516,1368 +2964,10 @@
         <w:rPr>
           <w:rFonts w:ascii="Roboto" w:hAnsi="Roboto" w:eastAsia="Roboto"/>
         </w:rPr>
-        <w:t xml:space="preserve">View Specs </w:t>
-      </w:r>
-      <w:r>
-        <w:rPr>
-          <w:rFonts w:ascii="Roboto" w:hAnsi="Roboto" w:eastAsia="Roboto"/>
-        </w:rPr>
-        <w:t>↗</w:t>
-      </w:r>
-    </w:p>
-    <w:p>
-      <w:r>
-        <w:rPr>
-          <w:rFonts w:ascii="Roboto" w:hAnsi="Roboto" w:eastAsia="Roboto"/>
-        </w:rPr>
-        <w:t>Enquire ↗</w:t>
-      </w:r>
-    </w:p>
-    <w:p>
-      <w:r>
-        <w:rPr>
-          <w:rFonts w:ascii="Roboto" w:hAnsi="Roboto" w:eastAsia="Roboto"/>
-        </w:rPr>
         <w:t>Each listing confirms current availability and the equipment included.</w:t>
       </w:r>
     </w:p>
     <w:p>
-      <w:r>
-        <w:rPr>
-          <w:rFonts w:ascii="Roboto" w:hAnsi="Roboto" w:eastAsia="Roboto"/>
-        </w:rPr>
-        <w:t xml:space="preserve">View all plant listings </w:t>
-      </w:r>
-      <w:r>
-        <w:rPr>
-          <w:rFonts w:ascii="Roboto" w:hAnsi="Roboto" w:eastAsia="Roboto"/>
-        </w:rPr>
-        <w:t>↗</w:t>
-      </w:r>
-    </w:p>
-    <w:p>
-      <w:r>
-        <w:rPr>
-          <w:rFonts w:ascii="Roboto" w:hAnsi="Roboto" w:eastAsia="Roboto"/>
-        </w:rPr>
-        <w:t xml:space="preserve">View all chemical processing equipment </w:t>
-      </w:r>
-      <w:r>
-        <w:rPr>
-          <w:rFonts w:ascii="Roboto" w:hAnsi="Roboto" w:eastAsia="Roboto"/>
-        </w:rPr>
-        <w:t>↗</w:t>
-      </w:r>
-    </w:p>
-    <w:p>
-      <w:pPr>
-        <w:pStyle w:val="Heading2"/>
-      </w:pPr>
-      <w:r>
-        <w:rPr>
-          <w:rFonts w:ascii="Montserrat" w:hAnsi="Montserrat" w:eastAsia="Outfit"/>
-        </w:rPr>
-        <w:t>What used chemical process equipment do we supply?</w:t>
-      </w:r>
-    </w:p>
-    <w:p>
-      <w:r>
-        <w:rPr>
-          <w:rFonts w:ascii="Roboto" w:hAnsi="Roboto" w:eastAsia="Roboto"/>
-        </w:rPr>
-        <w:t>IPP stocks used chemical process equipment and machinery as individual units, connected systems and spare parts for reaction, mixing, fermentation, heat transfer, evaporation, distillation, separation, filtration, drying and storage. Chemical processing plants buy these units to add capacity or replace process units.</w:t>
-      </w:r>
-    </w:p>
-    <w:p>
-      <w:pPr>
-        <w:pStyle w:val="Heading3"/>
-      </w:pPr>
-      <w:r>
-        <w:rPr>
-          <w:rFonts w:ascii="Montserrat" w:hAnsi="Montserrat" w:eastAsia="Outfit"/>
-        </w:rPr>
-        <w:t>Reactors</w:t>
-      </w:r>
-    </w:p>
-    <w:p>
-      <w:r>
-        <w:rPr>
-          <w:rFonts w:ascii="Roboto" w:hAnsi="Roboto" w:eastAsia="Roboto"/>
-        </w:rPr>
-        <w:t>Precision-controlled systems for chemical synthesis, available in glass-lined, stainless and specialty alloys.</w:t>
-      </w:r>
-    </w:p>
-    <w:p>
-      <w:r>
-        <w:rPr>
-          <w:rFonts w:ascii="Roboto" w:hAnsi="Roboto" w:eastAsia="Roboto"/>
-        </w:rPr>
-        <w:t>We supply used reactors to chemical plants that need batch or continuous synthesis capacity for reaction, mixing and heat transfer under controlled pressure and temperature. As a supplier chemical producers trust worldwide, IPP sources reactors from Pfaudler, De Dietrich, UGE and Gale Process Solutions, documents each stock number and coordinates removal, shipping and start-up support through one team.</w:t>
-      </w:r>
-    </w:p>
-    <w:p>
-      <w:r>
-        <w:rPr>
-          <w:rFonts w:ascii="Roboto" w:hAnsi="Roboto" w:eastAsia="Roboto"/>
-        </w:rPr>
-        <w:t>Our used reactor inventory covers:</w:t>
-      </w:r>
-    </w:p>
-    <w:p>
-      <w:pPr>
-        <w:pStyle w:val="ListBullet"/>
-      </w:pPr>
-      <w:r>
-        <w:rPr>
-          <w:rFonts w:ascii="Roboto" w:hAnsi="Roboto" w:eastAsia="Roboto"/>
-        </w:rPr>
-        <w:t>Batch-type agitated reactors with complete agitation systems</w:t>
-      </w:r>
-    </w:p>
-    <w:p>
-      <w:pPr>
-        <w:pStyle w:val="ListBullet"/>
-      </w:pPr>
-      <w:r>
-        <w:rPr>
-          <w:rFonts w:ascii="Roboto" w:hAnsi="Roboto" w:eastAsia="Roboto"/>
-        </w:rPr>
-        <w:t>Batch type body only reactor shells for buyers with existing drives</w:t>
-      </w:r>
-    </w:p>
-    <w:p>
-      <w:pPr>
-        <w:pStyle w:val="ListBullet"/>
-      </w:pPr>
-      <w:r>
-        <w:rPr>
-          <w:rFonts w:ascii="Roboto" w:hAnsi="Roboto" w:eastAsia="Roboto"/>
-        </w:rPr>
-        <w:t>Hydrogenation reactors for high-pressure hydrogen service</w:t>
-      </w:r>
-    </w:p>
-    <w:p>
-      <w:pPr>
-        <w:pStyle w:val="ListBullet"/>
-      </w:pPr>
-      <w:r>
-        <w:rPr>
-          <w:rFonts w:ascii="Roboto" w:hAnsi="Roboto" w:eastAsia="Roboto"/>
-        </w:rPr>
-        <w:t>Fixed bed catalytic and tubular continuous-flow reactors</w:t>
-      </w:r>
-    </w:p>
-    <w:p>
-      <w:pPr>
-        <w:pStyle w:val="ListBullet"/>
-      </w:pPr>
-      <w:r>
-        <w:rPr>
-          <w:rFonts w:ascii="Roboto" w:hAnsi="Roboto" w:eastAsia="Roboto"/>
-        </w:rPr>
-        <w:t>Glass-lined reactors re-glassed through Universal Glasteel Equipment</w:t>
-      </w:r>
-    </w:p>
-    <w:p>
-      <w:r>
-        <w:rPr>
-          <w:rFonts w:ascii="Roboto" w:hAnsi="Roboto" w:eastAsia="Roboto"/>
-        </w:rPr>
-        <w:t>Each reactor listing states capacity, internal pressure, temperature, material and condition, so process engineers can match a unit to the reaction before an inspection. Glass-lined units lead our reactor inventory, alongside stainless steel 316, 316L and 304, Hastelloy C-276 and C-22 and titanium, with capacities from 2 L to 80,000 L (0.5 to 21,134 gal). Pricing depends on manufacturer, capacity, material of construction and condition, and IPP quotes each stock number individually with a video or on-site inspection on request.</w:t>
-      </w:r>
-    </w:p>
-    <w:p>
-      <w:r>
-        <w:rPr>
-          <w:rFonts w:ascii="Roboto" w:hAnsi="Roboto" w:eastAsia="Roboto"/>
-        </w:rPr>
-        <w:t>Featured listing: stainless steel 316L batch-type agitated reactor.</w:t>
-      </w:r>
-    </w:p>
-    <w:p>
-      <w:r>
-        <w:rPr>
-          <w:rFonts w:ascii="Roboto" w:hAnsi="Roboto" w:eastAsia="Roboto"/>
-        </w:rPr>
-        <w:t>Browse used reactors ↗</w:t>
-      </w:r>
-    </w:p>
-    <w:p>
-      <w:pPr>
-        <w:pStyle w:val="Heading3"/>
-      </w:pPr>
-      <w:r>
-        <w:rPr>
-          <w:rFonts w:ascii="Montserrat" w:hAnsi="Montserrat" w:eastAsia="Outfit"/>
-        </w:rPr>
-        <w:t>Agitators</w:t>
-      </w:r>
-    </w:p>
-    <w:p>
-      <w:r>
-        <w:rPr>
-          <w:rFonts w:ascii="Roboto" w:hAnsi="Roboto" w:eastAsia="Roboto"/>
-        </w:rPr>
-        <w:t>Glass drives, drive units and shaft mixers for reactors, tanks and blending vessels.</w:t>
-      </w:r>
-    </w:p>
-    <w:p>
-      <w:r>
-        <w:rPr>
-          <w:rFonts w:ascii="Roboto" w:hAnsi="Roboto" w:eastAsia="Roboto"/>
-        </w:rPr>
-        <w:t>IPP supplies used agitators to chemical plants that mix, suspend and disperse materials in reactors, tanks and blending vessels. With agitators from Pfaudler, Lightnin, De Dietrich, Philadelphia and Chemineer in stock, our team matches the drive power, shaft length and impeller to the vessel each buyer runs.</w:t>
-      </w:r>
-    </w:p>
-    <w:p>
-      <w:r>
-        <w:rPr>
-          <w:rFonts w:ascii="Roboto" w:hAnsi="Roboto" w:eastAsia="Roboto"/>
-        </w:rPr>
-        <w:t>Agitator types in our inventory cover:</w:t>
-      </w:r>
-    </w:p>
-    <w:p>
-      <w:pPr>
-        <w:pStyle w:val="ListBullet"/>
-      </w:pPr>
-      <w:r>
-        <w:rPr>
-          <w:rFonts w:ascii="Roboto" w:hAnsi="Roboto" w:eastAsia="Roboto"/>
-        </w:rPr>
-        <w:t>Glass drives for glass-lined reactors</w:t>
-      </w:r>
-    </w:p>
-    <w:p>
-      <w:pPr>
-        <w:pStyle w:val="ListBullet"/>
-      </w:pPr>
-      <w:r>
-        <w:rPr>
-          <w:rFonts w:ascii="Roboto" w:hAnsi="Roboto" w:eastAsia="Roboto"/>
-        </w:rPr>
-        <w:t>Motor and gear drive units for vertical mounting</w:t>
-      </w:r>
-    </w:p>
-    <w:p>
-      <w:pPr>
-        <w:pStyle w:val="ListBullet"/>
-      </w:pPr>
-      <w:r>
-        <w:rPr>
-          <w:rFonts w:ascii="Roboto" w:hAnsi="Roboto" w:eastAsia="Roboto"/>
-        </w:rPr>
-        <w:t>Shaft and mixer assemblies with pitch-blade impellers</w:t>
-      </w:r>
-    </w:p>
-    <w:p>
-      <w:pPr>
-        <w:pStyle w:val="ListBullet"/>
-      </w:pPr>
-      <w:r>
-        <w:rPr>
-          <w:rFonts w:ascii="Roboto" w:hAnsi="Roboto" w:eastAsia="Roboto"/>
-        </w:rPr>
-        <w:t>Hastelloy C-276 shafts for corrosive service</w:t>
-      </w:r>
-    </w:p>
-    <w:p>
-      <w:pPr>
-        <w:pStyle w:val="ListBullet"/>
-      </w:pPr>
-      <w:r>
-        <w:rPr>
-          <w:rFonts w:ascii="Roboto" w:hAnsi="Roboto" w:eastAsia="Roboto"/>
-        </w:rPr>
-        <w:t>Pfaudler DTW and De Dietrich DIN drive models</w:t>
-      </w:r>
-    </w:p>
-    <w:p>
-      <w:r>
-        <w:rPr>
-          <w:rFonts w:ascii="Roboto" w:hAnsi="Roboto" w:eastAsia="Roboto"/>
-        </w:rPr>
-        <w:t>Each agitator listing states drive power, speed, shaft length and impeller type. Glass-lined and carbon steel units lead our agitator inventory, alongside Hastelloy C-276 and stainless steel 316, for vessels from 76 L to 10,031 L (20 to 2,650 gal) and drives up to 101 kW (135 hp). Pricing depends on manufacturer, drive power, material of construction and condition, and our team quotes each stock number individually.</w:t>
-      </w:r>
-    </w:p>
-    <w:p>
-      <w:r>
-        <w:rPr>
-          <w:rFonts w:ascii="Roboto" w:hAnsi="Roboto" w:eastAsia="Roboto"/>
-        </w:rPr>
-        <w:t>Featured listing: Pfaudler 4DTW glass drive with 11.6 kW (15.5 hp) drive power.</w:t>
-      </w:r>
-    </w:p>
-    <w:p>
-      <w:r>
-        <w:rPr>
-          <w:rFonts w:ascii="Roboto" w:hAnsi="Roboto" w:eastAsia="Roboto"/>
-        </w:rPr>
-        <w:t>Browse used agitators ↗</w:t>
-      </w:r>
-    </w:p>
-    <w:p>
-      <w:pPr>
-        <w:pStyle w:val="Heading3"/>
-      </w:pPr>
-      <w:r>
-        <w:rPr>
-          <w:rFonts w:ascii="Montserrat" w:hAnsi="Montserrat" w:eastAsia="Outfit"/>
-        </w:rPr>
-        <w:t>Fermenters</w:t>
-      </w:r>
-    </w:p>
-    <w:p>
-      <w:r>
-        <w:rPr>
-          <w:rFonts w:ascii="Roboto" w:hAnsi="Roboto" w:eastAsia="Roboto"/>
-        </w:rPr>
-        <w:t>Stainless steel fermenters for biochemical, pharmaceutical and fermentation-based chemical production.</w:t>
-      </w:r>
-    </w:p>
-    <w:p>
-      <w:r>
-        <w:rPr>
-          <w:rFonts w:ascii="Roboto" w:hAnsi="Roboto" w:eastAsia="Roboto"/>
-        </w:rPr>
-        <w:t>We supply used fermenters to chemical, pharmaceutical and biotech plants that grow cultures and make fermentation-based products under controlled temperature and pressure. As a source process engineers trust for fermentation capacity, IPP stocks units from ThermoFisher, B. Braun Diessel Biotech, Bujalski, Biolafitte, Chemap and Sartorius.</w:t>
-      </w:r>
-    </w:p>
-    <w:p>
-      <w:r>
-        <w:rPr>
-          <w:rFonts w:ascii="Roboto" w:hAnsi="Roboto" w:eastAsia="Roboto"/>
-        </w:rPr>
-        <w:t>Our used fermenter inventory covers:</w:t>
-      </w:r>
-    </w:p>
-    <w:p>
-      <w:pPr>
-        <w:pStyle w:val="ListBullet"/>
-      </w:pPr>
-      <w:r>
-        <w:rPr>
-          <w:rFonts w:ascii="Roboto" w:hAnsi="Roboto" w:eastAsia="Roboto"/>
-        </w:rPr>
-        <w:t>Agitated stainless steel fermenters</w:t>
-      </w:r>
-    </w:p>
-    <w:p>
-      <w:pPr>
-        <w:pStyle w:val="ListBullet"/>
-      </w:pPr>
-      <w:r>
-        <w:rPr>
-          <w:rFonts w:ascii="Roboto" w:hAnsi="Roboto" w:eastAsia="Roboto"/>
-        </w:rPr>
-        <w:t>Fermenters with standard and dimple jackets</w:t>
-      </w:r>
-    </w:p>
-    <w:p>
-      <w:pPr>
-        <w:pStyle w:val="ListBullet"/>
-      </w:pPr>
-      <w:r>
-        <w:rPr>
-          <w:rFonts w:ascii="Roboto" w:hAnsi="Roboto" w:eastAsia="Roboto"/>
-        </w:rPr>
-        <w:t>Single-use fermenters from ThermoFisher</w:t>
-      </w:r>
-    </w:p>
-    <w:p>
-      <w:pPr>
-        <w:pStyle w:val="ListBullet"/>
-      </w:pPr>
-      <w:r>
-        <w:rPr>
-          <w:rFonts w:ascii="Roboto" w:hAnsi="Roboto" w:eastAsia="Roboto"/>
-        </w:rPr>
-        <w:t>Laboratory and pilot fermenters</w:t>
-      </w:r>
-    </w:p>
-    <w:p>
-      <w:pPr>
-        <w:pStyle w:val="ListBullet"/>
-      </w:pPr>
-      <w:r>
-        <w:rPr>
-          <w:rFonts w:ascii="Roboto" w:hAnsi="Roboto" w:eastAsia="Roboto"/>
-        </w:rPr>
-        <w:t>Unused production-scale fermenters</w:t>
-      </w:r>
-    </w:p>
-    <w:p>
-      <w:r>
-        <w:rPr>
-          <w:rFonts w:ascii="Roboto" w:hAnsi="Roboto" w:eastAsia="Roboto"/>
-        </w:rPr>
-        <w:t>Each fermenter listing states capacity, pressure, temperature, jacket and agitation details. Stainless steel 316 and 304 lead our fermenter inventory, alongside stainless steel 316L, with capacities from 19 L to 65,300 L (5 to 17,250 gal). Pricing depends on manufacturer, capacity, material of construction and condition, and IPP quotes each stock number individually with a video or on-site inspection on request.</w:t>
-      </w:r>
-    </w:p>
-    <w:p>
-      <w:r>
-        <w:rPr>
-          <w:rFonts w:ascii="Roboto" w:hAnsi="Roboto" w:eastAsia="Roboto"/>
-        </w:rPr>
-        <w:t>Featured listing: stainless steel 316 fermenter with 12,500 L (3,300 gal) capacity.</w:t>
-      </w:r>
-    </w:p>
-    <w:p>
-      <w:r>
-        <w:rPr>
-          <w:rFonts w:ascii="Roboto" w:hAnsi="Roboto" w:eastAsia="Roboto"/>
-        </w:rPr>
-        <w:t>Browse used fermenters ↗</w:t>
-      </w:r>
-    </w:p>
-    <w:p>
-      <w:pPr>
-        <w:pStyle w:val="Heading3"/>
-      </w:pPr>
-      <w:r>
-        <w:rPr>
-          <w:rFonts w:ascii="Montserrat" w:hAnsi="Montserrat" w:eastAsia="Outfit"/>
-        </w:rPr>
-        <w:t>Heat exchangers</w:t>
-      </w:r>
-    </w:p>
-    <w:p>
-      <w:r>
-        <w:rPr>
-          <w:rFonts w:ascii="Roboto" w:hAnsi="Roboto" w:eastAsia="Roboto"/>
-        </w:rPr>
-        <w:t>Shell-and-tube and plate exchangers for thermal control and energy recovery.</w:t>
-      </w:r>
-    </w:p>
-    <w:p>
-      <w:r>
-        <w:rPr>
-          <w:rFonts w:ascii="Roboto" w:hAnsi="Roboto" w:eastAsia="Roboto"/>
-        </w:rPr>
-        <w:t>IPP supplies used heat exchangers to chemical plants for heating, cooling, condensing and heat recovery across process streams. With exchangers from Alfa Laval, Vicarb, Ralph Coidan and Graham in stock, our team matches shell, tube and plate configurations to the thermal duty each buyer specifies.</w:t>
-      </w:r>
-    </w:p>
-    <w:p>
-      <w:r>
-        <w:rPr>
-          <w:rFonts w:ascii="Roboto" w:hAnsi="Roboto" w:eastAsia="Roboto"/>
-        </w:rPr>
-        <w:t>Our used heat exchanger inventory covers:</w:t>
-      </w:r>
-    </w:p>
-    <w:p>
-      <w:pPr>
-        <w:pStyle w:val="ListBullet"/>
-      </w:pPr>
-      <w:r>
-        <w:rPr>
-          <w:rFonts w:ascii="Roboto" w:hAnsi="Roboto" w:eastAsia="Roboto"/>
-        </w:rPr>
-        <w:t>Shell-and-tube heat exchangers for process heating and cooling</w:t>
-      </w:r>
-    </w:p>
-    <w:p>
-      <w:pPr>
-        <w:pStyle w:val="ListBullet"/>
-      </w:pPr>
-      <w:r>
-        <w:rPr>
-          <w:rFonts w:ascii="Roboto" w:hAnsi="Roboto" w:eastAsia="Roboto"/>
-        </w:rPr>
-        <w:t>Plate-and-frame heat exchangers for compact thermal duty</w:t>
-      </w:r>
-    </w:p>
-    <w:p>
-      <w:pPr>
-        <w:pStyle w:val="ListBullet"/>
-      </w:pPr>
-      <w:r>
-        <w:rPr>
-          <w:rFonts w:ascii="Roboto" w:hAnsi="Roboto" w:eastAsia="Roboto"/>
-        </w:rPr>
-        <w:t>Graphite block heat exchangers for corrosive process streams</w:t>
-      </w:r>
-    </w:p>
-    <w:p>
-      <w:pPr>
-        <w:pStyle w:val="ListBullet"/>
-      </w:pPr>
-      <w:r>
-        <w:rPr>
-          <w:rFonts w:ascii="Roboto" w:hAnsi="Roboto" w:eastAsia="Roboto"/>
-        </w:rPr>
-        <w:t>Spiral and welded plate heat exchangers</w:t>
-      </w:r>
-    </w:p>
-    <w:p>
-      <w:pPr>
-        <w:pStyle w:val="ListBullet"/>
-      </w:pPr>
-      <w:r>
-        <w:rPr>
-          <w:rFonts w:ascii="Roboto" w:hAnsi="Roboto" w:eastAsia="Roboto"/>
-        </w:rPr>
-        <w:t>Air fin coolers for process stream cooling</w:t>
-      </w:r>
-    </w:p>
-    <w:p>
-      <w:r>
-        <w:rPr>
-          <w:rFonts w:ascii="Roboto" w:hAnsi="Roboto" w:eastAsia="Roboto"/>
-        </w:rPr>
-        <w:t>Each heat exchanger listing states heat transfer area, shell and tube pressure, temperature and material. Stainless steel 316 and graphite lead our heat exchanger inventory, alongside stainless steel 304 and 316L, carbon steel, titanium and Hastelloy C-276, with heat transfer areas up to 2,124 m² (22,863 ft²). Pricing depends on manufacturer, heat transfer area, material of construction and condition, and our team quotes each stock number individually.</w:t>
-      </w:r>
-    </w:p>
-    <w:p>
-      <w:r>
-        <w:rPr>
-          <w:rFonts w:ascii="Roboto" w:hAnsi="Roboto" w:eastAsia="Roboto"/>
-        </w:rPr>
-        <w:t>Featured listing: shell, tubes and tubesheet in stainless steel 316L.</w:t>
-      </w:r>
-    </w:p>
-    <w:p>
-      <w:r>
-        <w:rPr>
-          <w:rFonts w:ascii="Roboto" w:hAnsi="Roboto" w:eastAsia="Roboto"/>
-        </w:rPr>
-        <w:t>Browse used heat exchangers ↗</w:t>
-      </w:r>
-    </w:p>
-    <w:p>
-      <w:pPr>
-        <w:pStyle w:val="Heading3"/>
-      </w:pPr>
-      <w:r>
-        <w:rPr>
-          <w:rFonts w:ascii="Montserrat" w:hAnsi="Montserrat" w:eastAsia="Outfit"/>
-        </w:rPr>
-        <w:t>Evaporators</w:t>
-      </w:r>
-    </w:p>
-    <w:p>
-      <w:r>
-        <w:rPr>
-          <w:rFonts w:ascii="Roboto" w:hAnsi="Roboto" w:eastAsia="Roboto"/>
-        </w:rPr>
-        <w:t>Film, flash and crystallizer evaporators for concentration and solvent removal.</w:t>
-      </w:r>
-    </w:p>
-    <w:p>
-      <w:r>
-        <w:rPr>
-          <w:rFonts w:ascii="Roboto" w:hAnsi="Roboto" w:eastAsia="Roboto"/>
-        </w:rPr>
-        <w:t>We supply used evaporators to chemical plants that concentrate solutions, recover solvents and crystallize products. As a supplier chemical producers trust for evaporation duty, IPP sources units from Luwa SMS, Buss-SMS-Canzler, Buflovak/Blaw Knox and Pfaudler and records evaporation rate and heat transfer area for each stock number.</w:t>
-      </w:r>
-    </w:p>
-    <w:p>
-      <w:r>
-        <w:rPr>
-          <w:rFonts w:ascii="Roboto" w:hAnsi="Roboto" w:eastAsia="Roboto"/>
-        </w:rPr>
-        <w:t>Evaporator types in our inventory cover:</w:t>
-      </w:r>
-    </w:p>
-    <w:p>
-      <w:pPr>
-        <w:pStyle w:val="ListBullet"/>
-      </w:pPr>
-      <w:r>
-        <w:rPr>
-          <w:rFonts w:ascii="Roboto" w:hAnsi="Roboto" w:eastAsia="Roboto"/>
-        </w:rPr>
-        <w:t>Rising and falling film evaporators, including multiple-effect systems</w:t>
-      </w:r>
-    </w:p>
-    <w:p>
-      <w:pPr>
-        <w:pStyle w:val="ListBullet"/>
-      </w:pPr>
-      <w:r>
-        <w:rPr>
-          <w:rFonts w:ascii="Roboto" w:hAnsi="Roboto" w:eastAsia="Roboto"/>
-        </w:rPr>
-        <w:t>Wiped and thin film evaporators</w:t>
-      </w:r>
-    </w:p>
-    <w:p>
-      <w:pPr>
-        <w:pStyle w:val="ListBullet"/>
-      </w:pPr>
-      <w:r>
-        <w:rPr>
-          <w:rFonts w:ascii="Roboto" w:hAnsi="Roboto" w:eastAsia="Roboto"/>
-        </w:rPr>
-        <w:t>Flash evaporators</w:t>
-      </w:r>
-    </w:p>
-    <w:p>
-      <w:pPr>
-        <w:pStyle w:val="ListBullet"/>
-      </w:pPr>
-      <w:r>
-        <w:rPr>
-          <w:rFonts w:ascii="Roboto" w:hAnsi="Roboto" w:eastAsia="Roboto"/>
-        </w:rPr>
-        <w:t>Crystallizer evaporators from zero liquid discharge systems</w:t>
-      </w:r>
-    </w:p>
-    <w:p>
-      <w:pPr>
-        <w:pStyle w:val="ListBullet"/>
-      </w:pPr>
-      <w:r>
-        <w:rPr>
-          <w:rFonts w:ascii="Roboto" w:hAnsi="Roboto" w:eastAsia="Roboto"/>
-        </w:rPr>
-        <w:t>Hastelloy C-22 clad and titanium units for corrosive service</w:t>
-      </w:r>
-    </w:p>
-    <w:p>
-      <w:r>
-        <w:rPr>
-          <w:rFonts w:ascii="Roboto" w:hAnsi="Roboto" w:eastAsia="Roboto"/>
-        </w:rPr>
-        <w:t>Each evaporator listing states evaporation rate, heat transfer area, pressure and temperature. Stainless steel 316 leads our evaporator inventory, alongside stainless steel 304 and 316L, fiberglass, glass-lined steel and titanium, with evaporation rates from 4.5 kg/h to 36,300 kg/h (10 to 80,000 lb/h) and heat transfer areas up to 1,473 m² (15,850 ft²). Pricing depends on manufacturer, evaporation rate, material of construction and condition, and our team quotes each stock number individually.</w:t>
-      </w:r>
-    </w:p>
-    <w:p>
-      <w:r>
-        <w:rPr>
-          <w:rFonts w:ascii="Roboto" w:hAnsi="Roboto" w:eastAsia="Roboto"/>
-        </w:rPr>
-        <w:t>Featured listing: Hastelloy C-22 clad wiped film evaporator with 340 kg/h (750 lb/h) evaporation.</w:t>
-      </w:r>
-    </w:p>
-    <w:p>
-      <w:r>
-        <w:rPr>
-          <w:rFonts w:ascii="Roboto" w:hAnsi="Roboto" w:eastAsia="Roboto"/>
-        </w:rPr>
-        <w:t>Browse used evaporators ↗</w:t>
-      </w:r>
-    </w:p>
-    <w:p>
-      <w:pPr>
-        <w:pStyle w:val="Heading3"/>
-      </w:pPr>
-      <w:r>
-        <w:rPr>
-          <w:rFonts w:ascii="Montserrat" w:hAnsi="Montserrat" w:eastAsia="Outfit"/>
-        </w:rPr>
-        <w:t>Distillation columns and stills</w:t>
-      </w:r>
-    </w:p>
-    <w:p>
-      <w:r>
-        <w:rPr>
-          <w:rFonts w:ascii="Roboto" w:hAnsi="Roboto" w:eastAsia="Roboto"/>
-        </w:rPr>
-        <w:t>For purification, solvent recovery and fractional separation.</w:t>
-      </w:r>
-    </w:p>
-    <w:p>
-      <w:r>
-        <w:rPr>
-          <w:rFonts w:ascii="Roboto" w:hAnsi="Roboto" w:eastAsia="Roboto"/>
-        </w:rPr>
-        <w:t>IPP supplies used distillation columns and stills to chemical and pharmaceutical plants for solvent recovery, product purification and fractional separation. With Pfaudler, De Dietrich, Kühni and Schott columns and Santasalo-Sohlberg, Finn-Aqua and Paul Mueller stills in stock, we supply packed, tray and column still designs in glass-lined steel, stainless steel and specialty alloys.</w:t>
-      </w:r>
-    </w:p>
-    <w:p>
-      <w:r>
-        <w:rPr>
-          <w:rFonts w:ascii="Roboto" w:hAnsi="Roboto" w:eastAsia="Roboto"/>
-        </w:rPr>
-        <w:t>Column and still types in our inventory cover:</w:t>
-      </w:r>
-    </w:p>
-    <w:p>
-      <w:pPr>
-        <w:pStyle w:val="ListBullet"/>
-      </w:pPr>
-      <w:r>
-        <w:rPr>
-          <w:rFonts w:ascii="Roboto" w:hAnsi="Roboto" w:eastAsia="Roboto"/>
-        </w:rPr>
-        <w:t>Packed columns, including ceramic-packed glass-lined units</w:t>
-      </w:r>
-    </w:p>
-    <w:p>
-      <w:pPr>
-        <w:pStyle w:val="ListBullet"/>
-      </w:pPr>
-      <w:r>
-        <w:rPr>
-          <w:rFonts w:ascii="Roboto" w:hAnsi="Roboto" w:eastAsia="Roboto"/>
-        </w:rPr>
-        <w:t>Tray and combination packed and tray columns</w:t>
-      </w:r>
-    </w:p>
-    <w:p>
-      <w:pPr>
-        <w:pStyle w:val="ListBullet"/>
-      </w:pPr>
-      <w:r>
-        <w:rPr>
-          <w:rFonts w:ascii="Roboto" w:hAnsi="Roboto" w:eastAsia="Roboto"/>
-        </w:rPr>
-        <w:t>Contactor columns for liquid-liquid extraction</w:t>
-      </w:r>
-    </w:p>
-    <w:p>
-      <w:pPr>
-        <w:pStyle w:val="ListBullet"/>
-      </w:pPr>
-      <w:r>
-        <w:rPr>
-          <w:rFonts w:ascii="Roboto" w:hAnsi="Roboto" w:eastAsia="Roboto"/>
-        </w:rPr>
-        <w:t>Column stills and pot stills</w:t>
-      </w:r>
-    </w:p>
-    <w:p>
-      <w:pPr>
-        <w:pStyle w:val="ListBullet"/>
-      </w:pPr>
-      <w:r>
-        <w:rPr>
-          <w:rFonts w:ascii="Roboto" w:hAnsi="Roboto" w:eastAsia="Roboto"/>
-        </w:rPr>
-        <w:t>Multiple-effect stills with skid-mounted controls</w:t>
-      </w:r>
-    </w:p>
-    <w:p>
-      <w:r>
-        <w:rPr>
-          <w:rFonts w:ascii="Roboto" w:hAnsi="Roboto" w:eastAsia="Roboto"/>
-        </w:rPr>
-        <w:t>Each column and still listing states diameter, length, pressure and temperature. Glass-lined and stainless steel 316 columns lead our column inventory, alongside stainless steel 304, Hastelloy C-276 and graphite, with diameters from 76 mm (3 in) to 8,000 mm (315 in). Stainless steel 316, 316L and 321 lead our still inventory, with diameters from 229 mm (9 in) to 2,210 mm (87 in). Pricing depends on manufacturer, diameter, material of construction and condition, and our team quotes each stock number individually.</w:t>
-      </w:r>
-    </w:p>
-    <w:p>
-      <w:r>
-        <w:rPr>
-          <w:rFonts w:ascii="Roboto" w:hAnsi="Roboto" w:eastAsia="Roboto"/>
-        </w:rPr>
-        <w:t>Featured listings: glass-lined packed column with ceramic packing and a stainless steel 321 column still.</w:t>
-      </w:r>
-    </w:p>
-    <w:p>
-      <w:r>
-        <w:rPr>
-          <w:rFonts w:ascii="Roboto" w:hAnsi="Roboto" w:eastAsia="Roboto"/>
-        </w:rPr>
-        <w:t>Browse used distillation columns ↗</w:t>
-      </w:r>
-    </w:p>
-    <w:p>
-      <w:r>
-        <w:rPr>
-          <w:rFonts w:ascii="Roboto" w:hAnsi="Roboto" w:eastAsia="Roboto"/>
-        </w:rPr>
-        <w:t>Browse used stills ↗</w:t>
-      </w:r>
-    </w:p>
-    <w:p>
-      <w:pPr>
-        <w:pStyle w:val="Heading3"/>
-      </w:pPr>
-      <w:r>
-        <w:rPr>
-          <w:rFonts w:ascii="Montserrat" w:hAnsi="Montserrat" w:eastAsia="Outfit"/>
-        </w:rPr>
-        <w:t>Centrifuges</w:t>
-      </w:r>
-    </w:p>
-    <w:p>
-      <w:r>
-        <w:rPr>
-          <w:rFonts w:ascii="Roboto" w:hAnsi="Roboto" w:eastAsia="Roboto"/>
-        </w:rPr>
-        <w:t>Used for purification, separation and crystallization. Basket, inverting and peeler models available.</w:t>
-      </w:r>
-    </w:p>
-    <w:p>
-      <w:r>
-        <w:rPr>
-          <w:rFonts w:ascii="Roboto" w:hAnsi="Roboto" w:eastAsia="Roboto"/>
-        </w:rPr>
-        <w:t>We supply used centrifuges to chemical and pharmaceutical plants for solid-liquid separation, crystal recovery and product purification. As a source process engineers trust for separation equipment, IPP stocks Krauss Maffei, Alfa Laval, Westfalia and Sharples machines and records the basket or bowl size, material and motor power for each stock number.</w:t>
-      </w:r>
-    </w:p>
-    <w:p>
-      <w:r>
-        <w:rPr>
-          <w:rFonts w:ascii="Roboto" w:hAnsi="Roboto" w:eastAsia="Roboto"/>
-        </w:rPr>
-        <w:t>Centrifuge types in our inventory cover:</w:t>
-      </w:r>
-    </w:p>
-    <w:p>
-      <w:pPr>
-        <w:pStyle w:val="ListBullet"/>
-      </w:pPr>
-      <w:r>
-        <w:rPr>
-          <w:rFonts w:ascii="Roboto" w:hAnsi="Roboto" w:eastAsia="Roboto"/>
-        </w:rPr>
-        <w:t>Bottom-discharge and top-discharge basket centrifuges</w:t>
-      </w:r>
-    </w:p>
-    <w:p>
-      <w:pPr>
-        <w:pStyle w:val="ListBullet"/>
-      </w:pPr>
-      <w:r>
-        <w:rPr>
-          <w:rFonts w:ascii="Roboto" w:hAnsi="Roboto" w:eastAsia="Roboto"/>
-        </w:rPr>
-        <w:t>Peeler centrifuges, including Hastelloy units</w:t>
-      </w:r>
-    </w:p>
-    <w:p>
-      <w:pPr>
-        <w:pStyle w:val="ListBullet"/>
-      </w:pPr>
-      <w:r>
-        <w:rPr>
-          <w:rFonts w:ascii="Roboto" w:hAnsi="Roboto" w:eastAsia="Roboto"/>
-        </w:rPr>
-        <w:t>Inverting filter centrifuges</w:t>
-      </w:r>
-    </w:p>
-    <w:p>
-      <w:pPr>
-        <w:pStyle w:val="ListBullet"/>
-      </w:pPr>
-      <w:r>
-        <w:rPr>
-          <w:rFonts w:ascii="Roboto" w:hAnsi="Roboto" w:eastAsia="Roboto"/>
-        </w:rPr>
-        <w:t>Disc bowl centrifuges for liquid clarification</w:t>
-      </w:r>
-    </w:p>
-    <w:p>
-      <w:pPr>
-        <w:pStyle w:val="ListBullet"/>
-      </w:pPr>
-      <w:r>
-        <w:rPr>
-          <w:rFonts w:ascii="Roboto" w:hAnsi="Roboto" w:eastAsia="Roboto"/>
-        </w:rPr>
-        <w:t>Solid bowl decanter centrifuges for continuous separation</w:t>
-      </w:r>
-    </w:p>
-    <w:p>
-      <w:r>
-        <w:rPr>
-          <w:rFonts w:ascii="Roboto" w:hAnsi="Roboto" w:eastAsia="Roboto"/>
-        </w:rPr>
-        <w:t>Each centrifuge listing states basket or bowl size, material, filtration area and motor power. Our featured Krauss Maffei peeler centrifuge carries 0.6 m² (6.5 ft²) of filtration area and an 18 kW (24.1 hp) motor. Pricing depends on manufacturer, model, material of construction and condition, and IPP quotes each stock number individually with a video or on-site inspection on request.</w:t>
-      </w:r>
-    </w:p>
-    <w:p>
-      <w:r>
-        <w:rPr>
-          <w:rFonts w:ascii="Roboto" w:hAnsi="Roboto" w:eastAsia="Roboto"/>
-        </w:rPr>
-        <w:t>Featured listing: Hastelloy C22 peeler centrifuge with a 630 mm (24.8 in) basket.</w:t>
-      </w:r>
-    </w:p>
-    <w:p>
-      <w:r>
-        <w:rPr>
-          <w:rFonts w:ascii="Roboto" w:hAnsi="Roboto" w:eastAsia="Roboto"/>
-        </w:rPr>
-        <w:t>Browse used centrifuges ↗</w:t>
-      </w:r>
-    </w:p>
-    <w:p>
-      <w:pPr>
-        <w:pStyle w:val="Heading3"/>
-      </w:pPr>
-      <w:r>
-        <w:rPr>
-          <w:rFonts w:ascii="Montserrat" w:hAnsi="Montserrat" w:eastAsia="Outfit"/>
-        </w:rPr>
-        <w:t>Filters</w:t>
-      </w:r>
-    </w:p>
-    <w:p>
-      <w:r>
-        <w:rPr>
-          <w:rFonts w:ascii="Roboto" w:hAnsi="Roboto" w:eastAsia="Roboto"/>
-        </w:rPr>
-        <w:t>Pressure and vacuum systems to remove particulates or recover solids.</w:t>
-      </w:r>
-    </w:p>
-    <w:p>
-      <w:r>
-        <w:rPr>
-          <w:rFonts w:ascii="Roboto" w:hAnsi="Roboto" w:eastAsia="Roboto"/>
-        </w:rPr>
-        <w:t>We supply used filters to chemical plants that clarify process liquids, recover solids and wash and dry filter cake. As a supplier chemical producers trust for solid-liquid separation, IPP sources filters from Schenk, Cogeim, Chemap and Rosenmund and lists filtration area, pressure and material for each stock number.</w:t>
-      </w:r>
-    </w:p>
-    <w:p>
-      <w:r>
-        <w:rPr>
-          <w:rFonts w:ascii="Roboto" w:hAnsi="Roboto" w:eastAsia="Roboto"/>
-        </w:rPr>
-        <w:t>Our used filter inventory covers:</w:t>
-      </w:r>
-    </w:p>
-    <w:p>
-      <w:pPr>
-        <w:pStyle w:val="ListBullet"/>
-      </w:pPr>
-      <w:r>
-        <w:rPr>
-          <w:rFonts w:ascii="Roboto" w:hAnsi="Roboto" w:eastAsia="Roboto"/>
-        </w:rPr>
-        <w:t>Filter presses for high-volume solids recovery</w:t>
-      </w:r>
-    </w:p>
-    <w:p>
-      <w:pPr>
-        <w:pStyle w:val="ListBullet"/>
-      </w:pPr>
-      <w:r>
-        <w:rPr>
-          <w:rFonts w:ascii="Roboto" w:hAnsi="Roboto" w:eastAsia="Roboto"/>
-        </w:rPr>
-        <w:t>Rosenmund and Cogeim filter dryers</w:t>
-      </w:r>
-    </w:p>
-    <w:p>
-      <w:pPr>
-        <w:pStyle w:val="ListBullet"/>
-      </w:pPr>
-      <w:r>
-        <w:rPr>
-          <w:rFonts w:ascii="Roboto" w:hAnsi="Roboto" w:eastAsia="Roboto"/>
-        </w:rPr>
-        <w:t>Nutsche filters for batch filtration</w:t>
-      </w:r>
-    </w:p>
-    <w:p>
-      <w:pPr>
-        <w:pStyle w:val="ListBullet"/>
-      </w:pPr>
-      <w:r>
-        <w:rPr>
-          <w:rFonts w:ascii="Roboto" w:hAnsi="Roboto" w:eastAsia="Roboto"/>
-        </w:rPr>
-        <w:t>Pressure leaf filters for liquid clarification</w:t>
-      </w:r>
-    </w:p>
-    <w:p>
-      <w:r>
-        <w:rPr>
-          <w:rFonts w:ascii="Roboto" w:hAnsi="Roboto" w:eastAsia="Roboto"/>
-        </w:rPr>
-        <w:t>Each filter listing states filtration area, pressure, temperature and material. Stainless steel 316 and polypropylene lead our filter inventory, alongside stainless steel 304, Hastelloy C-22 and C-276 and carbon steel, with filtration areas up to 330 m² (3,557 ft²). Pricing depends on manufacturer, filtration area, material of construction and condition, and IPP quotes each stock number individually with a video or on-site inspection on request.</w:t>
-      </w:r>
-    </w:p>
-    <w:p>
-      <w:r>
-        <w:rPr>
-          <w:rFonts w:ascii="Roboto" w:hAnsi="Roboto" w:eastAsia="Roboto"/>
-        </w:rPr>
-        <w:t>Featured listing: polypropylene plate-and-frame filter press.</w:t>
-      </w:r>
-    </w:p>
-    <w:p>
-      <w:r>
-        <w:rPr>
-          <w:rFonts w:ascii="Roboto" w:hAnsi="Roboto" w:eastAsia="Roboto"/>
-        </w:rPr>
-        <w:t>Browse used filters ↗</w:t>
-      </w:r>
-    </w:p>
-    <w:p>
-      <w:pPr>
-        <w:pStyle w:val="Heading3"/>
-      </w:pPr>
-      <w:r>
-        <w:rPr>
-          <w:rFonts w:ascii="Montserrat" w:hAnsi="Montserrat" w:eastAsia="Outfit"/>
-        </w:rPr>
-        <w:t>Dryers</w:t>
-      </w:r>
-    </w:p>
-    <w:p>
-      <w:r>
-        <w:rPr>
-          <w:rFonts w:ascii="Roboto" w:hAnsi="Roboto" w:eastAsia="Roboto"/>
-        </w:rPr>
-        <w:t>Moisture removal solutions including rotary, vacuum and disc dryers.</w:t>
-      </w:r>
-    </w:p>
-    <w:p>
-      <w:r>
-        <w:rPr>
-          <w:rFonts w:ascii="Roboto" w:hAnsi="Roboto" w:eastAsia="Roboto"/>
-        </w:rPr>
-        <w:t>IPP supplies used dryers to chemical plants that remove moisture and solvents from powders, pastes, crystals and slurries. With dryers from Gale Process Solutions, Glatt, Niro and Pfaudler in stock, we match the drying principle, chamber size and material to each product.</w:t>
-      </w:r>
-    </w:p>
-    <w:p>
-      <w:r>
-        <w:rPr>
-          <w:rFonts w:ascii="Roboto" w:hAnsi="Roboto" w:eastAsia="Roboto"/>
-        </w:rPr>
-        <w:t>Our used dryer inventory covers:</w:t>
-      </w:r>
-    </w:p>
-    <w:p>
-      <w:pPr>
-        <w:pStyle w:val="ListBullet"/>
-      </w:pPr>
-      <w:r>
-        <w:rPr>
-          <w:rFonts w:ascii="Roboto" w:hAnsi="Roboto" w:eastAsia="Roboto"/>
-        </w:rPr>
-        <w:t>Rotary vacuum dryers</w:t>
-      </w:r>
-    </w:p>
-    <w:p>
-      <w:pPr>
-        <w:pStyle w:val="ListBullet"/>
-      </w:pPr>
-      <w:r>
-        <w:rPr>
-          <w:rFonts w:ascii="Roboto" w:hAnsi="Roboto" w:eastAsia="Roboto"/>
-        </w:rPr>
-        <w:t>Double cone and twin shell dryers</w:t>
-      </w:r>
-    </w:p>
-    <w:p>
-      <w:pPr>
-        <w:pStyle w:val="ListBullet"/>
-      </w:pPr>
-      <w:r>
-        <w:rPr>
-          <w:rFonts w:ascii="Roboto" w:hAnsi="Roboto" w:eastAsia="Roboto"/>
-        </w:rPr>
-        <w:t>Fluid bed dryers for granular products</w:t>
-      </w:r>
-    </w:p>
-    <w:p>
-      <w:pPr>
-        <w:pStyle w:val="ListBullet"/>
-      </w:pPr>
-      <w:r>
-        <w:rPr>
-          <w:rFonts w:ascii="Roboto" w:hAnsi="Roboto" w:eastAsia="Roboto"/>
-        </w:rPr>
-        <w:t>Spray dryers for liquid feeds</w:t>
-      </w:r>
-    </w:p>
-    <w:p>
-      <w:pPr>
-        <w:pStyle w:val="ListBullet"/>
-      </w:pPr>
-      <w:r>
-        <w:rPr>
-          <w:rFonts w:ascii="Roboto" w:hAnsi="Roboto" w:eastAsia="Roboto"/>
-        </w:rPr>
-        <w:t>Paddle, ribbon, porcupine and screw dryers</w:t>
-      </w:r>
-    </w:p>
-    <w:p>
-      <w:r>
-        <w:rPr>
-          <w:rFonts w:ascii="Roboto" w:hAnsi="Roboto" w:eastAsia="Roboto"/>
-        </w:rPr>
-        <w:t>Each dryer listing states chamber size, evaporation rate, inlet temperature and material. Our featured APV Anhydro spray dryer evaporates 31.8 kg/h (70 lb/h) at a 354.4 °C (670 °F) inlet temperature in stainless steel 316. Pricing depends on manufacturer, drying capacity, material of construction and condition, and our team quotes each stock number individually.</w:t>
-      </w:r>
-    </w:p>
-    <w:p>
-      <w:r>
-        <w:rPr>
-          <w:rFonts w:ascii="Roboto" w:hAnsi="Roboto" w:eastAsia="Roboto"/>
-        </w:rPr>
-        <w:t>Featured listing: stainless steel 316 spray dryer with 31.8 kg/h (70 lb/h) evaporation.</w:t>
-      </w:r>
-    </w:p>
-    <w:p>
-      <w:r>
-        <w:rPr>
-          <w:rFonts w:ascii="Roboto" w:hAnsi="Roboto" w:eastAsia="Roboto"/>
-        </w:rPr>
-        <w:t>Browse used dryers ↗</w:t>
-      </w:r>
-    </w:p>
-    <w:p>
-      <w:pPr>
-        <w:pStyle w:val="Heading3"/>
-      </w:pPr>
-      <w:r>
-        <w:rPr>
-          <w:rFonts w:ascii="Montserrat" w:hAnsi="Montserrat" w:eastAsia="Outfit"/>
-        </w:rPr>
-        <w:t>Tanks</w:t>
-      </w:r>
-    </w:p>
-    <w:p>
-      <w:r>
-        <w:rPr>
-          <w:rFonts w:ascii="Roboto" w:hAnsi="Roboto" w:eastAsia="Roboto"/>
-        </w:rPr>
-        <w:t>For storage, blending and transfer. Jacketed and non-jacketed tanks available.</w:t>
-      </w:r>
-    </w:p>
-    <w:p>
-      <w:r>
-        <w:rPr>
-          <w:rFonts w:ascii="Roboto" w:hAnsi="Roboto" w:eastAsia="Roboto"/>
-        </w:rPr>
-        <w:t>We supply used tanks to chemical plants for raw material storage, blending and product transfer. As a supplier chemical producers trust for vessel capacity, IPP sources tanks from Pfaudler, De Dietrich, Grundy and Sinclair Stainless Fabrications in jacketed and non-jacketed designs.</w:t>
-      </w:r>
-    </w:p>
-    <w:p>
-      <w:r>
-        <w:rPr>
-          <w:rFonts w:ascii="Roboto" w:hAnsi="Roboto" w:eastAsia="Roboto"/>
-        </w:rPr>
-        <w:t>Our used tank inventory covers:</w:t>
-      </w:r>
-    </w:p>
-    <w:p>
-      <w:pPr>
-        <w:pStyle w:val="ListBullet"/>
-      </w:pPr>
-      <w:r>
-        <w:rPr>
-          <w:rFonts w:ascii="Roboto" w:hAnsi="Roboto" w:eastAsia="Roboto"/>
-        </w:rPr>
-        <w:t>Glass-lined tanks for corrosive chemicals</w:t>
-      </w:r>
-    </w:p>
-    <w:p>
-      <w:pPr>
-        <w:pStyle w:val="ListBullet"/>
-      </w:pPr>
-      <w:r>
-        <w:rPr>
-          <w:rFonts w:ascii="Roboto" w:hAnsi="Roboto" w:eastAsia="Roboto"/>
-        </w:rPr>
-        <w:t>Stainless steel 304, 316 and 316L process tanks</w:t>
-      </w:r>
-    </w:p>
-    <w:p>
-      <w:pPr>
-        <w:pStyle w:val="ListBullet"/>
-      </w:pPr>
-      <w:r>
-        <w:rPr>
-          <w:rFonts w:ascii="Roboto" w:hAnsi="Roboto" w:eastAsia="Roboto"/>
-        </w:rPr>
-        <w:t>Jacketed tanks for heating and cooling</w:t>
-      </w:r>
-    </w:p>
-    <w:p>
-      <w:pPr>
-        <w:pStyle w:val="ListBullet"/>
-      </w:pPr>
-      <w:r>
-        <w:rPr>
-          <w:rFonts w:ascii="Roboto" w:hAnsi="Roboto" w:eastAsia="Roboto"/>
-        </w:rPr>
-        <w:t>Non-jacketed storage tanks</w:t>
-      </w:r>
-    </w:p>
-    <w:p>
-      <w:pPr>
-        <w:pStyle w:val="ListBullet"/>
-      </w:pPr>
-      <w:r>
-        <w:rPr>
-          <w:rFonts w:ascii="Roboto" w:hAnsi="Roboto" w:eastAsia="Roboto"/>
-        </w:rPr>
-        <w:t>Carbon steel and fiberglass storage tanks</w:t>
-      </w:r>
-    </w:p>
-    <w:p>
-      <w:r>
-        <w:rPr>
-          <w:rFonts w:ascii="Roboto" w:hAnsi="Roboto" w:eastAsia="Roboto"/>
-        </w:rPr>
-        <w:t>Each tank listing states capacity, internal pressure, temperature and material. Stainless steel 304 and glass-lined tanks lead our tank inventory, alongside stainless steel 316 and 316L, carbon steel and fiberglass, with capacities from 5 L to 565,000 L (1 to 149,258 gal). Pricing depends on manufacturer, capacity, material of construction and condition, and IPP quotes each stock number individually with a video or on-site inspection on request.</w:t>
-      </w:r>
-    </w:p>
-    <w:p>
-      <w:r>
-        <w:rPr>
-          <w:rFonts w:ascii="Roboto" w:hAnsi="Roboto" w:eastAsia="Roboto"/>
-        </w:rPr>
-        <w:t>Featured listing: stainless steel 316L vertical tank.</w:t>
-      </w:r>
-    </w:p>
-    <w:p>
-      <w:r>
-        <w:rPr>
-          <w:rFonts w:ascii="Roboto" w:hAnsi="Roboto" w:eastAsia="Roboto"/>
-        </w:rPr>
-        <w:t>Browse used tanks ↗</w:t>
-      </w:r>
-    </w:p>
-    <w:p>
-      <w:pPr>
-        <w:pStyle w:val="Heading3"/>
-      </w:pPr>
-      <w:r>
-        <w:rPr>
-          <w:rFonts w:ascii="Montserrat" w:hAnsi="Montserrat" w:eastAsia="Outfit"/>
-        </w:rPr>
-        <w:t>Glass-lined and reactor parts</w:t>
-      </w:r>
-    </w:p>
-    <w:p>
-      <w:r>
-        <w:rPr>
-          <w:rFonts w:ascii="Roboto" w:hAnsi="Roboto" w:eastAsia="Roboto"/>
-        </w:rPr>
-        <w:t>Spare parts that return glass-lined and alloy reactors to service.</w:t>
-      </w:r>
-    </w:p>
-    <w:p>
-      <w:r>
-        <w:rPr>
-          <w:rFonts w:ascii="Roboto" w:hAnsi="Roboto" w:eastAsia="Roboto"/>
-        </w:rPr>
-        <w:t>IPP supplies used, re-glassed and new glass-lined parts to chemical plants that maintain Pfaudler, De Dietrich and other glass-lined reactors and tanks. Glass-lined parts form the largest equipment type in our chemical processing inventory, and we also stock new seals and seal plans for exotic alloy reactors.</w:t>
-      </w:r>
-    </w:p>
-    <w:p>
-      <w:r>
-        <w:rPr>
-          <w:rFonts w:ascii="Roboto" w:hAnsi="Roboto" w:eastAsia="Roboto"/>
-        </w:rPr>
-        <w:t>Glass-lined and reactor parts in our inventory cover:</w:t>
-      </w:r>
-    </w:p>
-    <w:p>
-      <w:pPr>
-        <w:pStyle w:val="ListBullet"/>
-      </w:pPr>
-      <w:r>
-        <w:rPr>
-          <w:rFonts w:ascii="Roboto" w:hAnsi="Roboto" w:eastAsia="Roboto"/>
-        </w:rPr>
-        <w:t>Glass-lined agitators, including retreat curve and Cryo-Lock blades</w:t>
-      </w:r>
-    </w:p>
-    <w:p>
-      <w:pPr>
-        <w:pStyle w:val="ListBullet"/>
-      </w:pPr>
-      <w:r>
-        <w:rPr>
-          <w:rFonts w:ascii="Roboto" w:hAnsi="Roboto" w:eastAsia="Roboto"/>
-        </w:rPr>
-        <w:t>Main covers and manway covers</w:t>
-      </w:r>
-    </w:p>
-    <w:p>
-      <w:pPr>
-        <w:pStyle w:val="ListBullet"/>
-      </w:pPr>
-      <w:r>
-        <w:rPr>
-          <w:rFonts w:ascii="Roboto" w:hAnsi="Roboto" w:eastAsia="Roboto"/>
-        </w:rPr>
-        <w:t>Baffles, thermowells and adapter plates</w:t>
-      </w:r>
-    </w:p>
-    <w:p>
-      <w:pPr>
-        <w:pStyle w:val="ListBullet"/>
-      </w:pPr>
-      <w:r>
-        <w:rPr>
-          <w:rFonts w:ascii="Roboto" w:hAnsi="Roboto" w:eastAsia="Roboto"/>
-        </w:rPr>
-        <w:t>Pro-rings, split flanges and clamps</w:t>
-      </w:r>
-    </w:p>
-    <w:p>
-      <w:pPr>
-        <w:pStyle w:val="ListBullet"/>
-      </w:pPr>
-      <w:r>
-        <w:rPr>
-          <w:rFonts w:ascii="Roboto" w:hAnsi="Roboto" w:eastAsia="Roboto"/>
-        </w:rPr>
-        <w:t>Hastelloy C-22 seals and seal plans for exotic alloy reactors</w:t>
-      </w:r>
-    </w:p>
-    <w:p>
-      <w:r>
-        <w:rPr>
-          <w:rFonts w:ascii="Roboto" w:hAnsi="Roboto" w:eastAsia="Roboto"/>
-        </w:rPr>
-        <w:t>Each part listing states the vessel size it fits, diameter, length and whether the part is re-glassed. Pfaudler and De Dietrich parts lead our glass-lined parts inventory, alongside 3V Tech, Schott and UGE, for vessels from 8 L to 37,850 L (2 to 10,000 gal). Pricing depends on manufacturer, vessel size, glass condition and re-glassing, and IPP quotes each stock number individually with a video or on-site inspection on request.</w:t>
-      </w:r>
-    </w:p>
-    <w:p>
-      <w:r>
-        <w:rPr>
-          <w:rFonts w:ascii="Roboto" w:hAnsi="Roboto" w:eastAsia="Roboto"/>
-        </w:rPr>
-        <w:t>Featured listings: re-glassed Pfaudler retreat curve agitator for a 1,150 L (300 gal) vessel and a new Hastelloy C-22 reactor seal.</w:t>
-      </w:r>
-    </w:p>
-    <w:p>
-      <w:r>
-        <w:rPr>
-          <w:rFonts w:ascii="Roboto" w:hAnsi="Roboto" w:eastAsia="Roboto"/>
-        </w:rPr>
-        <w:t>Browse used glass-lined parts ↗</w:t>
-      </w:r>
-    </w:p>
-    <w:p>
-      <w:r>
-        <w:rPr>
-          <w:rFonts w:ascii="Roboto" w:hAnsi="Roboto" w:eastAsia="Roboto"/>
-        </w:rPr>
-        <w:t>Browse reactor parts ↗</w:t>
-      </w:r>
-    </w:p>
-    <w:p>
-      <w:pPr>
-        <w:pStyle w:val="Heading2"/>
-      </w:pPr>
-      <w:r>
-        <w:rPr>
-          <w:rFonts w:ascii="Montserrat" w:hAnsi="Montserrat" w:eastAsia="Outfit"/>
-        </w:rPr>
-        <w:t>Equipment manufacturers in our inventory</w:t>
-      </w:r>
-    </w:p>
-    <w:p>
-      <w:r>
-        <w:rPr>
-          <w:rFonts w:ascii="Roboto" w:hAnsi="Roboto" w:eastAsia="Roboto"/>
-        </w:rPr>
-        <w:t>IPP’s chemical process inventory carries reactors, heat exchangers, centrifuges, tanks and columns from the original manufacturers that built them. Buyers search a maker’s units directly through IPP’s inventory filters.</w:t>
-      </w:r>
-    </w:p>
-    <w:p>
-      <w:r>
-        <w:rPr>
-          <w:rFonts w:ascii="Roboto" w:hAnsi="Roboto" w:eastAsia="Roboto"/>
-        </w:rPr>
-        <w:t>Leading manufacturers in IPP’s chemical inventory include:</w:t>
-      </w:r>
-    </w:p>
-    <w:p>
-      <w:pPr>
-        <w:pStyle w:val="ListBullet"/>
-      </w:pPr>
       <w:hyperlink r:id="rId12">
         <w:r>
           <w:rPr>
@@ -4885,20 +2975,15 @@
             <w:color w:val="0563C1"/>
             <w:u w:val="single"/>
           </w:rPr>
-          <w:t xml:space="preserve">Pfaudler ↗</w:t>
+          <w:t xml:space="preserve">View all plant listings</w:t>
         </w:r>
       </w:hyperlink>
       <w:r>
         <w:rPr>
           <w:rFonts w:ascii="Roboto" w:hAnsi="Roboto" w:eastAsia="Roboto"/>
         </w:rPr>
-        <w:t>Glass-lined reactors (RA, E, BE and ELL models), tanks, agitators and columns</w:t>
-      </w:r>
-    </w:p>
-    <w:p>
-      <w:pPr>
-        <w:pStyle w:val="ListBullet"/>
-      </w:pPr>
+        <w:t xml:space="preserve"> · </w:t>
+      </w:r>
       <w:hyperlink r:id="rId13">
         <w:r>
           <w:rPr>
@@ -4906,20 +2991,136 @@
             <w:color w:val="0563C1"/>
             <w:u w:val="single"/>
           </w:rPr>
-          <w:t xml:space="preserve">De Dietrich ↗</w:t>
+          <w:t xml:space="preserve">View all chemical processing equipment</w:t>
         </w:r>
       </w:hyperlink>
-      <w:r>
-        <w:rPr>
-          <w:rFonts w:ascii="Roboto" w:hAnsi="Roboto" w:eastAsia="Roboto"/>
-        </w:rPr>
-        <w:t>Glass-lined reactors (SA, CTJ, STA and CSA models), tanks and columns</w:t>
+    </w:p>
+    <w:p>
+      <w:pPr>
+        <w:pStyle w:val="Heading2"/>
+      </w:pPr>
+      <w:r>
+        <w:rPr>
+          <w:rFonts w:ascii="Montserrat" w:hAnsi="Montserrat" w:eastAsia="Outfit"/>
+        </w:rPr>
+        <w:t>What used chemical process equipment do we supply?</w:t>
+      </w:r>
+    </w:p>
+    <w:p>
+      <w:r>
+        <w:rPr>
+          <w:rFonts w:ascii="Roboto" w:hAnsi="Roboto" w:eastAsia="Roboto"/>
+        </w:rPr>
+        <w:t>IPP stocks used chemical process equipment and machinery as individual units, connected systems and spare parts for reaction, mixing, fermentation, heat transfer, evaporation, distillation, separation, filtration, drying and storage. Chemical processing plants buy these units to add capacity or replace process units.</w:t>
+      </w:r>
+    </w:p>
+    <w:p>
+      <w:pPr>
+        <w:pStyle w:val="Heading3"/>
+      </w:pPr>
+      <w:r>
+        <w:rPr>
+          <w:rFonts w:ascii="Montserrat" w:hAnsi="Montserrat" w:eastAsia="Outfit"/>
+        </w:rPr>
+        <w:t>Reactors</w:t>
+      </w:r>
+    </w:p>
+    <w:p>
+      <w:r>
+        <w:rPr>
+          <w:rFonts w:ascii="Roboto" w:hAnsi="Roboto" w:eastAsia="Roboto"/>
+        </w:rPr>
+        <w:t>Precision-controlled systems for chemical synthesis, available in glass-lined, stainless and specialty alloys.</w:t>
+      </w:r>
+    </w:p>
+    <w:p>
+      <w:r>
+        <w:rPr>
+          <w:rFonts w:ascii="Roboto" w:hAnsi="Roboto" w:eastAsia="Roboto"/>
+        </w:rPr>
+        <w:t>We supply used reactors to chemical plants that need batch or continuous synthesis capacity for reaction, mixing and heat transfer under controlled pressure and temperature. As a supplier chemical producers trust worldwide, IPP sources reactors from Pfaudler, De Dietrich, UGE and Gale Process Solutions, documents each stock number and coordinates removal, shipping and start-up support through one team.</w:t>
+      </w:r>
+    </w:p>
+    <w:p>
+      <w:r>
+        <w:rPr>
+          <w:rFonts w:ascii="Roboto" w:hAnsi="Roboto" w:eastAsia="Roboto"/>
+        </w:rPr>
+        <w:t>Our used reactor inventory covers:</w:t>
       </w:r>
     </w:p>
     <w:p>
       <w:pPr>
         <w:pStyle w:val="ListBullet"/>
       </w:pPr>
+      <w:r>
+        <w:rPr>
+          <w:rFonts w:ascii="Roboto" w:hAnsi="Roboto" w:eastAsia="Roboto"/>
+        </w:rPr>
+        <w:t>Batch-type agitated reactors with complete agitation systems</w:t>
+      </w:r>
+    </w:p>
+    <w:p>
+      <w:pPr>
+        <w:pStyle w:val="ListBullet"/>
+      </w:pPr>
+      <w:r>
+        <w:rPr>
+          <w:rFonts w:ascii="Roboto" w:hAnsi="Roboto" w:eastAsia="Roboto"/>
+        </w:rPr>
+        <w:t>Batch type body only reactor shells for buyers with existing drives</w:t>
+      </w:r>
+    </w:p>
+    <w:p>
+      <w:pPr>
+        <w:pStyle w:val="ListBullet"/>
+      </w:pPr>
+      <w:r>
+        <w:rPr>
+          <w:rFonts w:ascii="Roboto" w:hAnsi="Roboto" w:eastAsia="Roboto"/>
+        </w:rPr>
+        <w:t>Hydrogenation reactors for high-pressure hydrogen service</w:t>
+      </w:r>
+    </w:p>
+    <w:p>
+      <w:pPr>
+        <w:pStyle w:val="ListBullet"/>
+      </w:pPr>
+      <w:r>
+        <w:rPr>
+          <w:rFonts w:ascii="Roboto" w:hAnsi="Roboto" w:eastAsia="Roboto"/>
+        </w:rPr>
+        <w:t>Fixed bed catalytic and tubular continuous-flow reactors</w:t>
+      </w:r>
+    </w:p>
+    <w:p>
+      <w:pPr>
+        <w:pStyle w:val="ListBullet"/>
+      </w:pPr>
+      <w:r>
+        <w:rPr>
+          <w:rFonts w:ascii="Roboto" w:hAnsi="Roboto" w:eastAsia="Roboto"/>
+        </w:rPr>
+        <w:t>Glass-lined reactors re-glassed through Universal Glasteel Equipment</w:t>
+      </w:r>
+    </w:p>
+    <w:p>
+      <w:r>
+        <w:rPr>
+          <w:rFonts w:ascii="Roboto" w:hAnsi="Roboto" w:eastAsia="Roboto"/>
+        </w:rPr>
+        <w:t>Each reactor listing states capacity, internal pressure, temperature, material and condition, so process engineers can match a unit to the reaction before an inspection. Glass-lined units lead our reactor inventory, alongside stainless steel 316, 316L and 304, Hastelloy C-276 and C-22 and titanium, with capacities from 2 L to 80,000 L (0.5 to 21,134 gal). Pricing depends on manufacturer, capacity, material of construction and condition, and IPP quotes each stock number individually with a video or on-site inspection on request.</w:t>
+      </w:r>
+    </w:p>
+    <w:p>
+      <w:r>
+        <w:rPr>
+          <w:rFonts w:ascii="Roboto" w:hAnsi="Roboto" w:eastAsia="Roboto"/>
+        </w:rPr>
+        <w:t>Featured listing: stainless steel 316L batch-type agitated reactor.</w:t>
+      </w:r>
+    </w:p>
+    <w:p>
       <w:hyperlink r:id="rId14">
         <w:r>
           <w:rPr>
@@ -4927,20 +3128,117 @@
             <w:color w:val="0563C1"/>
             <w:u w:val="single"/>
           </w:rPr>
-          <w:t xml:space="preserve">Alfa Laval ↗</w:t>
+          <w:t xml:space="preserve">Browse used reactors</w:t>
         </w:r>
       </w:hyperlink>
-      <w:r>
-        <w:rPr>
-          <w:rFonts w:ascii="Roboto" w:hAnsi="Roboto" w:eastAsia="Roboto"/>
-        </w:rPr>
-        <w:t>Heat exchangers and centrifuges</w:t>
+    </w:p>
+    <w:p>
+      <w:pPr>
+        <w:pStyle w:val="Heading3"/>
+      </w:pPr>
+      <w:r>
+        <w:rPr>
+          <w:rFonts w:ascii="Montserrat" w:hAnsi="Montserrat" w:eastAsia="Outfit"/>
+        </w:rPr>
+        <w:t>Agitators</w:t>
+      </w:r>
+    </w:p>
+    <w:p>
+      <w:r>
+        <w:rPr>
+          <w:rFonts w:ascii="Roboto" w:hAnsi="Roboto" w:eastAsia="Roboto"/>
+        </w:rPr>
+        <w:t>Glass drives, drive units and shaft mixers for reactors, tanks and blending vessels.</w:t>
+      </w:r>
+    </w:p>
+    <w:p>
+      <w:r>
+        <w:rPr>
+          <w:rFonts w:ascii="Roboto" w:hAnsi="Roboto" w:eastAsia="Roboto"/>
+        </w:rPr>
+        <w:t>IPP supplies used agitators to chemical plants that mix, suspend and disperse materials in reactors, tanks and blending vessels. With agitators from Pfaudler, Lightnin, De Dietrich, Philadelphia and Chemineer in stock, our team matches the drive power, shaft length and impeller to the vessel each buyer runs.</w:t>
+      </w:r>
+    </w:p>
+    <w:p>
+      <w:r>
+        <w:rPr>
+          <w:rFonts w:ascii="Roboto" w:hAnsi="Roboto" w:eastAsia="Roboto"/>
+        </w:rPr>
+        <w:t>Agitator types in our inventory cover:</w:t>
       </w:r>
     </w:p>
     <w:p>
       <w:pPr>
         <w:pStyle w:val="ListBullet"/>
       </w:pPr>
+      <w:r>
+        <w:rPr>
+          <w:rFonts w:ascii="Roboto" w:hAnsi="Roboto" w:eastAsia="Roboto"/>
+        </w:rPr>
+        <w:t>Glass drives for glass-lined reactors</w:t>
+      </w:r>
+    </w:p>
+    <w:p>
+      <w:pPr>
+        <w:pStyle w:val="ListBullet"/>
+      </w:pPr>
+      <w:r>
+        <w:rPr>
+          <w:rFonts w:ascii="Roboto" w:hAnsi="Roboto" w:eastAsia="Roboto"/>
+        </w:rPr>
+        <w:t>Motor and gear drive units for vertical mounting</w:t>
+      </w:r>
+    </w:p>
+    <w:p>
+      <w:pPr>
+        <w:pStyle w:val="ListBullet"/>
+      </w:pPr>
+      <w:r>
+        <w:rPr>
+          <w:rFonts w:ascii="Roboto" w:hAnsi="Roboto" w:eastAsia="Roboto"/>
+        </w:rPr>
+        <w:t>Shaft and mixer assemblies with pitch-blade impellers</w:t>
+      </w:r>
+    </w:p>
+    <w:p>
+      <w:pPr>
+        <w:pStyle w:val="ListBullet"/>
+      </w:pPr>
+      <w:r>
+        <w:rPr>
+          <w:rFonts w:ascii="Roboto" w:hAnsi="Roboto" w:eastAsia="Roboto"/>
+        </w:rPr>
+        <w:t>Hastelloy C-276 shafts for corrosive service</w:t>
+      </w:r>
+    </w:p>
+    <w:p>
+      <w:pPr>
+        <w:pStyle w:val="ListBullet"/>
+      </w:pPr>
+      <w:r>
+        <w:rPr>
+          <w:rFonts w:ascii="Roboto" w:hAnsi="Roboto" w:eastAsia="Roboto"/>
+        </w:rPr>
+        <w:t>Pfaudler DTW and De Dietrich DIN drive models</w:t>
+      </w:r>
+    </w:p>
+    <w:p>
+      <w:r>
+        <w:rPr>
+          <w:rFonts w:ascii="Roboto" w:hAnsi="Roboto" w:eastAsia="Roboto"/>
+        </w:rPr>
+        <w:t>Each agitator listing states drive power, speed, shaft length and impeller type. Glass-lined and carbon steel units lead our agitator inventory, alongside Hastelloy C-276 and stainless steel 316, for vessels from 76 L to 10,031 L (20 to 2,650 gal) and drives up to 101 kW (135 hp). Pricing depends on manufacturer, drive power, material of construction and condition, and our team quotes each stock number individually.</w:t>
+      </w:r>
+    </w:p>
+    <w:p>
+      <w:r>
+        <w:rPr>
+          <w:rFonts w:ascii="Roboto" w:hAnsi="Roboto" w:eastAsia="Roboto"/>
+        </w:rPr>
+        <w:t>Featured listing: Pfaudler 4DTW glass drive with 11.6 kW (15.5 hp) drive power.</w:t>
+      </w:r>
+    </w:p>
+    <w:p>
       <w:hyperlink r:id="rId15">
         <w:r>
           <w:rPr>
@@ -4948,20 +3246,117 @@
             <w:color w:val="0563C1"/>
             <w:u w:val="single"/>
           </w:rPr>
-          <w:t xml:space="preserve">Krauss Maffei ↗</w:t>
+          <w:t xml:space="preserve">Browse used agitators</w:t>
         </w:r>
       </w:hyperlink>
-      <w:r>
-        <w:rPr>
-          <w:rFonts w:ascii="Roboto" w:hAnsi="Roboto" w:eastAsia="Roboto"/>
-        </w:rPr>
-        <w:t>Centrifuges, including Hastelloy C22 peeler units</w:t>
+    </w:p>
+    <w:p>
+      <w:pPr>
+        <w:pStyle w:val="Heading3"/>
+      </w:pPr>
+      <w:r>
+        <w:rPr>
+          <w:rFonts w:ascii="Montserrat" w:hAnsi="Montserrat" w:eastAsia="Outfit"/>
+        </w:rPr>
+        <w:t>Fermenters</w:t>
+      </w:r>
+    </w:p>
+    <w:p>
+      <w:r>
+        <w:rPr>
+          <w:rFonts w:ascii="Roboto" w:hAnsi="Roboto" w:eastAsia="Roboto"/>
+        </w:rPr>
+        <w:t>Stainless steel fermenters for biochemical, pharmaceutical and fermentation-based chemical production.</w:t>
+      </w:r>
+    </w:p>
+    <w:p>
+      <w:r>
+        <w:rPr>
+          <w:rFonts w:ascii="Roboto" w:hAnsi="Roboto" w:eastAsia="Roboto"/>
+        </w:rPr>
+        <w:t>We supply used fermenters to chemical, pharmaceutical and biotech plants that grow cultures and make fermentation-based products under controlled temperature and pressure. As a source process engineers trust for fermentation capacity, IPP stocks units from ThermoFisher, B. Braun Diessel Biotech, Bujalski, Biolafitte, Chemap and Sartorius.</w:t>
+      </w:r>
+    </w:p>
+    <w:p>
+      <w:r>
+        <w:rPr>
+          <w:rFonts w:ascii="Roboto" w:hAnsi="Roboto" w:eastAsia="Roboto"/>
+        </w:rPr>
+        <w:t>Our used fermenter inventory covers:</w:t>
       </w:r>
     </w:p>
     <w:p>
       <w:pPr>
         <w:pStyle w:val="ListBullet"/>
       </w:pPr>
+      <w:r>
+        <w:rPr>
+          <w:rFonts w:ascii="Roboto" w:hAnsi="Roboto" w:eastAsia="Roboto"/>
+        </w:rPr>
+        <w:t>Agitated stainless steel fermenters</w:t>
+      </w:r>
+    </w:p>
+    <w:p>
+      <w:pPr>
+        <w:pStyle w:val="ListBullet"/>
+      </w:pPr>
+      <w:r>
+        <w:rPr>
+          <w:rFonts w:ascii="Roboto" w:hAnsi="Roboto" w:eastAsia="Roboto"/>
+        </w:rPr>
+        <w:t>Fermenters with standard and dimple jackets</w:t>
+      </w:r>
+    </w:p>
+    <w:p>
+      <w:pPr>
+        <w:pStyle w:val="ListBullet"/>
+      </w:pPr>
+      <w:r>
+        <w:rPr>
+          <w:rFonts w:ascii="Roboto" w:hAnsi="Roboto" w:eastAsia="Roboto"/>
+        </w:rPr>
+        <w:t>Single-use fermenters from ThermoFisher</w:t>
+      </w:r>
+    </w:p>
+    <w:p>
+      <w:pPr>
+        <w:pStyle w:val="ListBullet"/>
+      </w:pPr>
+      <w:r>
+        <w:rPr>
+          <w:rFonts w:ascii="Roboto" w:hAnsi="Roboto" w:eastAsia="Roboto"/>
+        </w:rPr>
+        <w:t>Laboratory and pilot fermenters</w:t>
+      </w:r>
+    </w:p>
+    <w:p>
+      <w:pPr>
+        <w:pStyle w:val="ListBullet"/>
+      </w:pPr>
+      <w:r>
+        <w:rPr>
+          <w:rFonts w:ascii="Roboto" w:hAnsi="Roboto" w:eastAsia="Roboto"/>
+        </w:rPr>
+        <w:t>Unused production-scale fermenters</w:t>
+      </w:r>
+    </w:p>
+    <w:p>
+      <w:r>
+        <w:rPr>
+          <w:rFonts w:ascii="Roboto" w:hAnsi="Roboto" w:eastAsia="Roboto"/>
+        </w:rPr>
+        <w:t>Each fermenter listing states capacity, pressure, temperature, jacket and agitation details. Stainless steel 316 and 304 lead our fermenter inventory, alongside stainless steel 316L, with capacities from 19 L to 65,300 L (5 to 17,250 gal). Pricing depends on manufacturer, capacity, material of construction and condition, and IPP quotes each stock number individually with a video or on-site inspection on request.</w:t>
+      </w:r>
+    </w:p>
+    <w:p>
+      <w:r>
+        <w:rPr>
+          <w:rFonts w:ascii="Roboto" w:hAnsi="Roboto" w:eastAsia="Roboto"/>
+        </w:rPr>
+        <w:t>Featured listing: stainless steel 316 fermenter with 12,500 L (3,300 gal) capacity.</w:t>
+      </w:r>
+    </w:p>
+    <w:p>
       <w:hyperlink r:id="rId16">
         <w:r>
           <w:rPr>
@@ -4969,20 +3364,117 @@
             <w:color w:val="0563C1"/>
             <w:u w:val="single"/>
           </w:rPr>
-          <w:t xml:space="preserve">Westfalia ↗</w:t>
+          <w:t xml:space="preserve">Browse used fermenters</w:t>
         </w:r>
       </w:hyperlink>
-      <w:r>
-        <w:rPr>
-          <w:rFonts w:ascii="Roboto" w:hAnsi="Roboto" w:eastAsia="Roboto"/>
-        </w:rPr>
-        <w:t>Centrifuges</w:t>
+    </w:p>
+    <w:p>
+      <w:pPr>
+        <w:pStyle w:val="Heading3"/>
+      </w:pPr>
+      <w:r>
+        <w:rPr>
+          <w:rFonts w:ascii="Montserrat" w:hAnsi="Montserrat" w:eastAsia="Outfit"/>
+        </w:rPr>
+        <w:t>Heat exchangers</w:t>
+      </w:r>
+    </w:p>
+    <w:p>
+      <w:r>
+        <w:rPr>
+          <w:rFonts w:ascii="Roboto" w:hAnsi="Roboto" w:eastAsia="Roboto"/>
+        </w:rPr>
+        <w:t>Shell-and-tube and plate exchangers for thermal control and energy recovery.</w:t>
+      </w:r>
+    </w:p>
+    <w:p>
+      <w:r>
+        <w:rPr>
+          <w:rFonts w:ascii="Roboto" w:hAnsi="Roboto" w:eastAsia="Roboto"/>
+        </w:rPr>
+        <w:t>IPP supplies used heat exchangers to chemical plants for heating, cooling, condensing and heat recovery across process streams. With exchangers from Alfa Laval, Vicarb, Ralph Coidan and Graham in stock, our team matches shell, tube and plate configurations to the thermal duty each buyer specifies.</w:t>
+      </w:r>
+    </w:p>
+    <w:p>
+      <w:r>
+        <w:rPr>
+          <w:rFonts w:ascii="Roboto" w:hAnsi="Roboto" w:eastAsia="Roboto"/>
+        </w:rPr>
+        <w:t>Our used heat exchanger inventory covers:</w:t>
       </w:r>
     </w:p>
     <w:p>
       <w:pPr>
         <w:pStyle w:val="ListBullet"/>
       </w:pPr>
+      <w:r>
+        <w:rPr>
+          <w:rFonts w:ascii="Roboto" w:hAnsi="Roboto" w:eastAsia="Roboto"/>
+        </w:rPr>
+        <w:t>Shell-and-tube heat exchangers for process heating and cooling</w:t>
+      </w:r>
+    </w:p>
+    <w:p>
+      <w:pPr>
+        <w:pStyle w:val="ListBullet"/>
+      </w:pPr>
+      <w:r>
+        <w:rPr>
+          <w:rFonts w:ascii="Roboto" w:hAnsi="Roboto" w:eastAsia="Roboto"/>
+        </w:rPr>
+        <w:t>Plate-and-frame heat exchangers for compact thermal duty</w:t>
+      </w:r>
+    </w:p>
+    <w:p>
+      <w:pPr>
+        <w:pStyle w:val="ListBullet"/>
+      </w:pPr>
+      <w:r>
+        <w:rPr>
+          <w:rFonts w:ascii="Roboto" w:hAnsi="Roboto" w:eastAsia="Roboto"/>
+        </w:rPr>
+        <w:t>Graphite block heat exchangers for corrosive process streams</w:t>
+      </w:r>
+    </w:p>
+    <w:p>
+      <w:pPr>
+        <w:pStyle w:val="ListBullet"/>
+      </w:pPr>
+      <w:r>
+        <w:rPr>
+          <w:rFonts w:ascii="Roboto" w:hAnsi="Roboto" w:eastAsia="Roboto"/>
+        </w:rPr>
+        <w:t>Spiral and welded plate heat exchangers</w:t>
+      </w:r>
+    </w:p>
+    <w:p>
+      <w:pPr>
+        <w:pStyle w:val="ListBullet"/>
+      </w:pPr>
+      <w:r>
+        <w:rPr>
+          <w:rFonts w:ascii="Roboto" w:hAnsi="Roboto" w:eastAsia="Roboto"/>
+        </w:rPr>
+        <w:t>Air fin coolers for process stream cooling</w:t>
+      </w:r>
+    </w:p>
+    <w:p>
+      <w:r>
+        <w:rPr>
+          <w:rFonts w:ascii="Roboto" w:hAnsi="Roboto" w:eastAsia="Roboto"/>
+        </w:rPr>
+        <w:t>Each heat exchanger listing states heat transfer area, shell and tube pressure, temperature and material. Stainless steel 316 and graphite lead our heat exchanger inventory, alongside stainless steel 304 and 316L, carbon steel, titanium and Hastelloy C-276, with heat transfer areas up to 2,124 m² (22,863 ft²). Pricing depends on manufacturer, heat transfer area, material of construction and condition, and our team quotes each stock number individually.</w:t>
+      </w:r>
+    </w:p>
+    <w:p>
+      <w:r>
+        <w:rPr>
+          <w:rFonts w:ascii="Roboto" w:hAnsi="Roboto" w:eastAsia="Roboto"/>
+        </w:rPr>
+        <w:t>Featured listing: shell, tubes and tubesheet in stainless steel 316L.</w:t>
+      </w:r>
+    </w:p>
+    <w:p>
       <w:hyperlink r:id="rId17">
         <w:r>
           <w:rPr>
@@ -4990,20 +3482,117 @@
             <w:color w:val="0563C1"/>
             <w:u w:val="single"/>
           </w:rPr>
-          <w:t xml:space="preserve">Gale Process Solutions ↗</w:t>
+          <w:t xml:space="preserve">Browse used heat exchangers</w:t>
         </w:r>
       </w:hyperlink>
-      <w:r>
-        <w:rPr>
-          <w:rFonts w:ascii="Roboto" w:hAnsi="Roboto" w:eastAsia="Roboto"/>
-        </w:rPr>
-        <w:t>New 316L stainless steel and Hastelloy reactors from the IPP group, 12 to 16 week average delivery</w:t>
+    </w:p>
+    <w:p>
+      <w:pPr>
+        <w:pStyle w:val="Heading3"/>
+      </w:pPr>
+      <w:r>
+        <w:rPr>
+          <w:rFonts w:ascii="Montserrat" w:hAnsi="Montserrat" w:eastAsia="Outfit"/>
+        </w:rPr>
+        <w:t>Evaporators</w:t>
+      </w:r>
+    </w:p>
+    <w:p>
+      <w:r>
+        <w:rPr>
+          <w:rFonts w:ascii="Roboto" w:hAnsi="Roboto" w:eastAsia="Roboto"/>
+        </w:rPr>
+        <w:t>Film, flash and crystallizer evaporators for concentration and solvent removal.</w:t>
+      </w:r>
+    </w:p>
+    <w:p>
+      <w:r>
+        <w:rPr>
+          <w:rFonts w:ascii="Roboto" w:hAnsi="Roboto" w:eastAsia="Roboto"/>
+        </w:rPr>
+        <w:t>We supply used evaporators to chemical plants that concentrate solutions, recover solvents and crystallize products. As a supplier chemical producers trust for evaporation duty, IPP sources units from Luwa SMS, Buss-SMS-Canzler, Buflovak/Blaw Knox and Pfaudler and records evaporation rate and heat transfer area for each stock number.</w:t>
+      </w:r>
+    </w:p>
+    <w:p>
+      <w:r>
+        <w:rPr>
+          <w:rFonts w:ascii="Roboto" w:hAnsi="Roboto" w:eastAsia="Roboto"/>
+        </w:rPr>
+        <w:t>Evaporator types in our inventory cover:</w:t>
       </w:r>
     </w:p>
     <w:p>
       <w:pPr>
         <w:pStyle w:val="ListBullet"/>
       </w:pPr>
+      <w:r>
+        <w:rPr>
+          <w:rFonts w:ascii="Roboto" w:hAnsi="Roboto" w:eastAsia="Roboto"/>
+        </w:rPr>
+        <w:t>Rising and falling film evaporators, including multiple-effect systems</w:t>
+      </w:r>
+    </w:p>
+    <w:p>
+      <w:pPr>
+        <w:pStyle w:val="ListBullet"/>
+      </w:pPr>
+      <w:r>
+        <w:rPr>
+          <w:rFonts w:ascii="Roboto" w:hAnsi="Roboto" w:eastAsia="Roboto"/>
+        </w:rPr>
+        <w:t>Wiped and thin film evaporators</w:t>
+      </w:r>
+    </w:p>
+    <w:p>
+      <w:pPr>
+        <w:pStyle w:val="ListBullet"/>
+      </w:pPr>
+      <w:r>
+        <w:rPr>
+          <w:rFonts w:ascii="Roboto" w:hAnsi="Roboto" w:eastAsia="Roboto"/>
+        </w:rPr>
+        <w:t>Flash evaporators</w:t>
+      </w:r>
+    </w:p>
+    <w:p>
+      <w:pPr>
+        <w:pStyle w:val="ListBullet"/>
+      </w:pPr>
+      <w:r>
+        <w:rPr>
+          <w:rFonts w:ascii="Roboto" w:hAnsi="Roboto" w:eastAsia="Roboto"/>
+        </w:rPr>
+        <w:t>Crystallizer evaporators from zero liquid discharge systems</w:t>
+      </w:r>
+    </w:p>
+    <w:p>
+      <w:pPr>
+        <w:pStyle w:val="ListBullet"/>
+      </w:pPr>
+      <w:r>
+        <w:rPr>
+          <w:rFonts w:ascii="Roboto" w:hAnsi="Roboto" w:eastAsia="Roboto"/>
+        </w:rPr>
+        <w:t>Hastelloy C-22 clad and titanium units for corrosive service</w:t>
+      </w:r>
+    </w:p>
+    <w:p>
+      <w:r>
+        <w:rPr>
+          <w:rFonts w:ascii="Roboto" w:hAnsi="Roboto" w:eastAsia="Roboto"/>
+        </w:rPr>
+        <w:t>Each evaporator listing states evaporation rate, heat transfer area, pressure and temperature. Stainless steel 316 leads our evaporator inventory, alongside stainless steel 304 and 316L, fiberglass, glass-lined steel and titanium, with evaporation rates from 4.5 kg/h to 36,300 kg/h (10 to 80,000 lb/h) and heat transfer areas up to 1,473 m² (15,850 ft²). Pricing depends on manufacturer, evaporation rate, material of construction and condition, and our team quotes each stock number individually.</w:t>
+      </w:r>
+    </w:p>
+    <w:p>
+      <w:r>
+        <w:rPr>
+          <w:rFonts w:ascii="Roboto" w:hAnsi="Roboto" w:eastAsia="Roboto"/>
+        </w:rPr>
+        <w:t>Featured listing: Hastelloy C-22 clad wiped film evaporator with 340 kg/h (750 lb/h) evaporation.</w:t>
+      </w:r>
+    </w:p>
+    <w:p>
       <w:hyperlink r:id="rId18">
         <w:r>
           <w:rPr>
@@ -5011,9 +3600,948 @@
             <w:color w:val="0563C1"/>
             <w:u w:val="single"/>
           </w:rPr>
-          <w:t xml:space="preserve">Universal Glasteel Equipment ↗</w:t>
+          <w:t xml:space="preserve">Browse used evaporators</w:t>
         </w:r>
       </w:hyperlink>
+    </w:p>
+    <w:p>
+      <w:pPr>
+        <w:pStyle w:val="Heading3"/>
+      </w:pPr>
+      <w:r>
+        <w:rPr>
+          <w:rFonts w:ascii="Montserrat" w:hAnsi="Montserrat" w:eastAsia="Outfit"/>
+        </w:rPr>
+        <w:t>Distillation columns and stills</w:t>
+      </w:r>
+    </w:p>
+    <w:p>
+      <w:r>
+        <w:rPr>
+          <w:rFonts w:ascii="Roboto" w:hAnsi="Roboto" w:eastAsia="Roboto"/>
+        </w:rPr>
+        <w:t>For purification, solvent recovery and fractional separation.</w:t>
+      </w:r>
+    </w:p>
+    <w:p>
+      <w:r>
+        <w:rPr>
+          <w:rFonts w:ascii="Roboto" w:hAnsi="Roboto" w:eastAsia="Roboto"/>
+        </w:rPr>
+        <w:t>IPP supplies used distillation columns and stills to chemical and pharmaceutical plants for solvent recovery, product purification and fractional separation. With Pfaudler, De Dietrich, Kühni and Schott columns and Santasalo-Sohlberg, Finn-Aqua and Paul Mueller stills in stock, we supply packed, tray and column still designs in glass-lined steel, stainless steel and specialty alloys.</w:t>
+      </w:r>
+    </w:p>
+    <w:p>
+      <w:r>
+        <w:rPr>
+          <w:rFonts w:ascii="Roboto" w:hAnsi="Roboto" w:eastAsia="Roboto"/>
+        </w:rPr>
+        <w:t>Column and still types in our inventory cover:</w:t>
+      </w:r>
+    </w:p>
+    <w:p>
+      <w:pPr>
+        <w:pStyle w:val="ListBullet"/>
+      </w:pPr>
+      <w:r>
+        <w:rPr>
+          <w:rFonts w:ascii="Roboto" w:hAnsi="Roboto" w:eastAsia="Roboto"/>
+        </w:rPr>
+        <w:t>Packed columns, including ceramic-packed glass-lined units</w:t>
+      </w:r>
+    </w:p>
+    <w:p>
+      <w:pPr>
+        <w:pStyle w:val="ListBullet"/>
+      </w:pPr>
+      <w:r>
+        <w:rPr>
+          <w:rFonts w:ascii="Roboto" w:hAnsi="Roboto" w:eastAsia="Roboto"/>
+        </w:rPr>
+        <w:t>Tray and combination packed and tray columns</w:t>
+      </w:r>
+    </w:p>
+    <w:p>
+      <w:pPr>
+        <w:pStyle w:val="ListBullet"/>
+      </w:pPr>
+      <w:r>
+        <w:rPr>
+          <w:rFonts w:ascii="Roboto" w:hAnsi="Roboto" w:eastAsia="Roboto"/>
+        </w:rPr>
+        <w:t>Contactor columns for liquid-liquid extraction</w:t>
+      </w:r>
+    </w:p>
+    <w:p>
+      <w:pPr>
+        <w:pStyle w:val="ListBullet"/>
+      </w:pPr>
+      <w:r>
+        <w:rPr>
+          <w:rFonts w:ascii="Roboto" w:hAnsi="Roboto" w:eastAsia="Roboto"/>
+        </w:rPr>
+        <w:t>Column stills and pot stills</w:t>
+      </w:r>
+    </w:p>
+    <w:p>
+      <w:pPr>
+        <w:pStyle w:val="ListBullet"/>
+      </w:pPr>
+      <w:r>
+        <w:rPr>
+          <w:rFonts w:ascii="Roboto" w:hAnsi="Roboto" w:eastAsia="Roboto"/>
+        </w:rPr>
+        <w:t>Multiple-effect stills with skid-mounted controls</w:t>
+      </w:r>
+    </w:p>
+    <w:p>
+      <w:r>
+        <w:rPr>
+          <w:rFonts w:ascii="Roboto" w:hAnsi="Roboto" w:eastAsia="Roboto"/>
+        </w:rPr>
+        <w:t>Each column and still listing states diameter, length, pressure and temperature. Glass-lined and stainless steel 316 columns lead our column inventory, alongside stainless steel 304, Hastelloy C-276 and graphite, with diameters from 76 mm (3 in) to 8,000 mm (315 in). Stainless steel 316, 316L and 321 lead our still inventory, with diameters from 229 mm (9 in) to 2,210 mm (87 in). Pricing depends on manufacturer, diameter, material of construction and condition, and our team quotes each stock number individually.</w:t>
+      </w:r>
+    </w:p>
+    <w:p>
+      <w:r>
+        <w:rPr>
+          <w:rFonts w:ascii="Roboto" w:hAnsi="Roboto" w:eastAsia="Roboto"/>
+        </w:rPr>
+        <w:t>Featured listings: glass-lined packed column with ceramic packing and a stainless steel 321 column still.</w:t>
+      </w:r>
+    </w:p>
+    <w:p>
+      <w:hyperlink r:id="rId19">
+        <w:r>
+          <w:rPr>
+            <w:rFonts w:ascii="Roboto" w:hAnsi="Roboto"/>
+            <w:color w:val="0563C1"/>
+            <w:u w:val="single"/>
+          </w:rPr>
+          <w:t xml:space="preserve">Browse used distillation columns</w:t>
+        </w:r>
+      </w:hyperlink>
+      <w:r>
+        <w:rPr>
+          <w:rFonts w:ascii="Roboto" w:hAnsi="Roboto" w:eastAsia="Roboto"/>
+        </w:rPr>
+        <w:t xml:space="preserve"> · </w:t>
+      </w:r>
+      <w:hyperlink r:id="rId20">
+        <w:r>
+          <w:rPr>
+            <w:rFonts w:ascii="Roboto" w:hAnsi="Roboto"/>
+            <w:color w:val="0563C1"/>
+            <w:u w:val="single"/>
+          </w:rPr>
+          <w:t xml:space="preserve">Browse used stills</w:t>
+        </w:r>
+      </w:hyperlink>
+    </w:p>
+    <w:p>
+      <w:pPr>
+        <w:pStyle w:val="Heading3"/>
+      </w:pPr>
+      <w:r>
+        <w:rPr>
+          <w:rFonts w:ascii="Montserrat" w:hAnsi="Montserrat" w:eastAsia="Outfit"/>
+        </w:rPr>
+        <w:t>Centrifuges</w:t>
+      </w:r>
+    </w:p>
+    <w:p>
+      <w:r>
+        <w:rPr>
+          <w:rFonts w:ascii="Roboto" w:hAnsi="Roboto" w:eastAsia="Roboto"/>
+        </w:rPr>
+        <w:t>Used for purification, separation and crystallization. Basket, inverting and peeler models available.</w:t>
+      </w:r>
+    </w:p>
+    <w:p>
+      <w:r>
+        <w:rPr>
+          <w:rFonts w:ascii="Roboto" w:hAnsi="Roboto" w:eastAsia="Roboto"/>
+        </w:rPr>
+        <w:t>We supply used centrifuges to chemical and pharmaceutical plants for solid-liquid separation, crystal recovery and product purification. As a source process engineers trust for separation equipment, IPP stocks Krauss Maffei, Alfa Laval, Westfalia and Sharples machines and records the basket or bowl size, material and motor power for each stock number.</w:t>
+      </w:r>
+    </w:p>
+    <w:p>
+      <w:r>
+        <w:rPr>
+          <w:rFonts w:ascii="Roboto" w:hAnsi="Roboto" w:eastAsia="Roboto"/>
+        </w:rPr>
+        <w:t>Centrifuge types in our inventory cover:</w:t>
+      </w:r>
+    </w:p>
+    <w:p>
+      <w:pPr>
+        <w:pStyle w:val="ListBullet"/>
+      </w:pPr>
+      <w:r>
+        <w:rPr>
+          <w:rFonts w:ascii="Roboto" w:hAnsi="Roboto" w:eastAsia="Roboto"/>
+        </w:rPr>
+        <w:t>Bottom-discharge and top-discharge basket centrifuges</w:t>
+      </w:r>
+    </w:p>
+    <w:p>
+      <w:pPr>
+        <w:pStyle w:val="ListBullet"/>
+      </w:pPr>
+      <w:r>
+        <w:rPr>
+          <w:rFonts w:ascii="Roboto" w:hAnsi="Roboto" w:eastAsia="Roboto"/>
+        </w:rPr>
+        <w:t>Peeler centrifuges, including Hastelloy units</w:t>
+      </w:r>
+    </w:p>
+    <w:p>
+      <w:pPr>
+        <w:pStyle w:val="ListBullet"/>
+      </w:pPr>
+      <w:r>
+        <w:rPr>
+          <w:rFonts w:ascii="Roboto" w:hAnsi="Roboto" w:eastAsia="Roboto"/>
+        </w:rPr>
+        <w:t>Inverting filter centrifuges</w:t>
+      </w:r>
+    </w:p>
+    <w:p>
+      <w:pPr>
+        <w:pStyle w:val="ListBullet"/>
+      </w:pPr>
+      <w:r>
+        <w:rPr>
+          <w:rFonts w:ascii="Roboto" w:hAnsi="Roboto" w:eastAsia="Roboto"/>
+        </w:rPr>
+        <w:t>Disc bowl centrifuges for liquid clarification</w:t>
+      </w:r>
+    </w:p>
+    <w:p>
+      <w:pPr>
+        <w:pStyle w:val="ListBullet"/>
+      </w:pPr>
+      <w:r>
+        <w:rPr>
+          <w:rFonts w:ascii="Roboto" w:hAnsi="Roboto" w:eastAsia="Roboto"/>
+        </w:rPr>
+        <w:t>Solid bowl decanter centrifuges for continuous separation</w:t>
+      </w:r>
+    </w:p>
+    <w:p>
+      <w:r>
+        <w:rPr>
+          <w:rFonts w:ascii="Roboto" w:hAnsi="Roboto" w:eastAsia="Roboto"/>
+        </w:rPr>
+        <w:t>Each centrifuge listing states basket or bowl size, material, filtration area and motor power. Our featured Krauss Maffei peeler centrifuge carries 0.6 m² (6.5 ft²) of filtration area and an 18 kW (24.1 hp) motor. Pricing depends on manufacturer, model, material of construction and condition, and IPP quotes each stock number individually with a video or on-site inspection on request.</w:t>
+      </w:r>
+    </w:p>
+    <w:p>
+      <w:r>
+        <w:rPr>
+          <w:rFonts w:ascii="Roboto" w:hAnsi="Roboto" w:eastAsia="Roboto"/>
+        </w:rPr>
+        <w:t>Featured listing: Hastelloy C22 peeler centrifuge with a 630 mm (24.8 in) basket.</w:t>
+      </w:r>
+    </w:p>
+    <w:p>
+      <w:hyperlink r:id="rId21">
+        <w:r>
+          <w:rPr>
+            <w:rFonts w:ascii="Roboto" w:hAnsi="Roboto"/>
+            <w:color w:val="0563C1"/>
+            <w:u w:val="single"/>
+          </w:rPr>
+          <w:t xml:space="preserve">Browse used centrifuges</w:t>
+        </w:r>
+      </w:hyperlink>
+    </w:p>
+    <w:p>
+      <w:pPr>
+        <w:pStyle w:val="Heading3"/>
+      </w:pPr>
+      <w:r>
+        <w:rPr>
+          <w:rFonts w:ascii="Montserrat" w:hAnsi="Montserrat" w:eastAsia="Outfit"/>
+        </w:rPr>
+        <w:t>Filters</w:t>
+      </w:r>
+    </w:p>
+    <w:p>
+      <w:r>
+        <w:rPr>
+          <w:rFonts w:ascii="Roboto" w:hAnsi="Roboto" w:eastAsia="Roboto"/>
+        </w:rPr>
+        <w:t>Pressure and vacuum systems to remove particulates or recover solids.</w:t>
+      </w:r>
+    </w:p>
+    <w:p>
+      <w:r>
+        <w:rPr>
+          <w:rFonts w:ascii="Roboto" w:hAnsi="Roboto" w:eastAsia="Roboto"/>
+        </w:rPr>
+        <w:t>We supply used filters to chemical plants that clarify process liquids, recover solids and wash and dry filter cake. As a supplier chemical producers trust for solid-liquid separation, IPP sources filters from Schenk, Cogeim, Chemap and Rosenmund and lists filtration area, pressure and material for each stock number.</w:t>
+      </w:r>
+    </w:p>
+    <w:p>
+      <w:r>
+        <w:rPr>
+          <w:rFonts w:ascii="Roboto" w:hAnsi="Roboto" w:eastAsia="Roboto"/>
+        </w:rPr>
+        <w:t>Our used filter inventory covers:</w:t>
+      </w:r>
+    </w:p>
+    <w:p>
+      <w:pPr>
+        <w:pStyle w:val="ListBullet"/>
+      </w:pPr>
+      <w:r>
+        <w:rPr>
+          <w:rFonts w:ascii="Roboto" w:hAnsi="Roboto" w:eastAsia="Roboto"/>
+        </w:rPr>
+        <w:t>Filter presses for high-volume solids recovery</w:t>
+      </w:r>
+    </w:p>
+    <w:p>
+      <w:pPr>
+        <w:pStyle w:val="ListBullet"/>
+      </w:pPr>
+      <w:r>
+        <w:rPr>
+          <w:rFonts w:ascii="Roboto" w:hAnsi="Roboto" w:eastAsia="Roboto"/>
+        </w:rPr>
+        <w:t>Rosenmund and Cogeim filter dryers</w:t>
+      </w:r>
+    </w:p>
+    <w:p>
+      <w:pPr>
+        <w:pStyle w:val="ListBullet"/>
+      </w:pPr>
+      <w:r>
+        <w:rPr>
+          <w:rFonts w:ascii="Roboto" w:hAnsi="Roboto" w:eastAsia="Roboto"/>
+        </w:rPr>
+        <w:t>Nutsche filters for batch filtration</w:t>
+      </w:r>
+    </w:p>
+    <w:p>
+      <w:pPr>
+        <w:pStyle w:val="ListBullet"/>
+      </w:pPr>
+      <w:r>
+        <w:rPr>
+          <w:rFonts w:ascii="Roboto" w:hAnsi="Roboto" w:eastAsia="Roboto"/>
+        </w:rPr>
+        <w:t>Pressure leaf filters for liquid clarification</w:t>
+      </w:r>
+    </w:p>
+    <w:p>
+      <w:r>
+        <w:rPr>
+          <w:rFonts w:ascii="Roboto" w:hAnsi="Roboto" w:eastAsia="Roboto"/>
+        </w:rPr>
+        <w:t>Each filter listing states filtration area, pressure, temperature and material. Stainless steel 316 and polypropylene lead our filter inventory, alongside stainless steel 304, Hastelloy C-22 and C-276 and carbon steel, with filtration areas up to 330 m² (3,557 ft²). Pricing depends on manufacturer, filtration area, material of construction and condition, and IPP quotes each stock number individually with a video or on-site inspection on request.</w:t>
+      </w:r>
+    </w:p>
+    <w:p>
+      <w:r>
+        <w:rPr>
+          <w:rFonts w:ascii="Roboto" w:hAnsi="Roboto" w:eastAsia="Roboto"/>
+        </w:rPr>
+        <w:t>Featured listing: polypropylene plate-and-frame filter press.</w:t>
+      </w:r>
+    </w:p>
+    <w:p>
+      <w:hyperlink r:id="rId22">
+        <w:r>
+          <w:rPr>
+            <w:rFonts w:ascii="Roboto" w:hAnsi="Roboto"/>
+            <w:color w:val="0563C1"/>
+            <w:u w:val="single"/>
+          </w:rPr>
+          <w:t xml:space="preserve">Browse used filters</w:t>
+        </w:r>
+      </w:hyperlink>
+    </w:p>
+    <w:p>
+      <w:pPr>
+        <w:pStyle w:val="Heading3"/>
+      </w:pPr>
+      <w:r>
+        <w:rPr>
+          <w:rFonts w:ascii="Montserrat" w:hAnsi="Montserrat" w:eastAsia="Outfit"/>
+        </w:rPr>
+        <w:t>Dryers</w:t>
+      </w:r>
+    </w:p>
+    <w:p>
+      <w:r>
+        <w:rPr>
+          <w:rFonts w:ascii="Roboto" w:hAnsi="Roboto" w:eastAsia="Roboto"/>
+        </w:rPr>
+        <w:t>Moisture removal solutions including rotary, vacuum and disc dryers.</w:t>
+      </w:r>
+    </w:p>
+    <w:p>
+      <w:r>
+        <w:rPr>
+          <w:rFonts w:ascii="Roboto" w:hAnsi="Roboto" w:eastAsia="Roboto"/>
+        </w:rPr>
+        <w:t>IPP supplies used dryers to chemical plants that remove moisture and solvents from powders, pastes, crystals and slurries. With dryers from Gale Process Solutions, Glatt, Niro and Pfaudler in stock, we match the drying principle, chamber size and material to each product.</w:t>
+      </w:r>
+    </w:p>
+    <w:p>
+      <w:r>
+        <w:rPr>
+          <w:rFonts w:ascii="Roboto" w:hAnsi="Roboto" w:eastAsia="Roboto"/>
+        </w:rPr>
+        <w:t>Our used dryer inventory covers:</w:t>
+      </w:r>
+    </w:p>
+    <w:p>
+      <w:pPr>
+        <w:pStyle w:val="ListBullet"/>
+      </w:pPr>
+      <w:r>
+        <w:rPr>
+          <w:rFonts w:ascii="Roboto" w:hAnsi="Roboto" w:eastAsia="Roboto"/>
+        </w:rPr>
+        <w:t>Rotary vacuum dryers</w:t>
+      </w:r>
+    </w:p>
+    <w:p>
+      <w:pPr>
+        <w:pStyle w:val="ListBullet"/>
+      </w:pPr>
+      <w:r>
+        <w:rPr>
+          <w:rFonts w:ascii="Roboto" w:hAnsi="Roboto" w:eastAsia="Roboto"/>
+        </w:rPr>
+        <w:t>Double cone and twin shell dryers</w:t>
+      </w:r>
+    </w:p>
+    <w:p>
+      <w:pPr>
+        <w:pStyle w:val="ListBullet"/>
+      </w:pPr>
+      <w:r>
+        <w:rPr>
+          <w:rFonts w:ascii="Roboto" w:hAnsi="Roboto" w:eastAsia="Roboto"/>
+        </w:rPr>
+        <w:t>Fluid bed dryers for granular products</w:t>
+      </w:r>
+    </w:p>
+    <w:p>
+      <w:pPr>
+        <w:pStyle w:val="ListBullet"/>
+      </w:pPr>
+      <w:r>
+        <w:rPr>
+          <w:rFonts w:ascii="Roboto" w:hAnsi="Roboto" w:eastAsia="Roboto"/>
+        </w:rPr>
+        <w:t>Spray dryers for liquid feeds</w:t>
+      </w:r>
+    </w:p>
+    <w:p>
+      <w:pPr>
+        <w:pStyle w:val="ListBullet"/>
+      </w:pPr>
+      <w:r>
+        <w:rPr>
+          <w:rFonts w:ascii="Roboto" w:hAnsi="Roboto" w:eastAsia="Roboto"/>
+        </w:rPr>
+        <w:t>Paddle, ribbon, porcupine and screw dryers</w:t>
+      </w:r>
+    </w:p>
+    <w:p>
+      <w:r>
+        <w:rPr>
+          <w:rFonts w:ascii="Roboto" w:hAnsi="Roboto" w:eastAsia="Roboto"/>
+        </w:rPr>
+        <w:t>Each dryer listing states chamber size, evaporation rate, inlet temperature and material. Our featured APV Anhydro spray dryer evaporates 31.8 kg/h (70 lb/h) at a 354.4 °C (670 °F) inlet temperature in stainless steel 316. Pricing depends on manufacturer, drying capacity, material of construction and condition, and our team quotes each stock number individually.</w:t>
+      </w:r>
+    </w:p>
+    <w:p>
+      <w:r>
+        <w:rPr>
+          <w:rFonts w:ascii="Roboto" w:hAnsi="Roboto" w:eastAsia="Roboto"/>
+        </w:rPr>
+        <w:t>Featured listing: stainless steel 316 spray dryer with 31.8 kg/h (70 lb/h) evaporation.</w:t>
+      </w:r>
+    </w:p>
+    <w:p>
+      <w:hyperlink r:id="rId23">
+        <w:r>
+          <w:rPr>
+            <w:rFonts w:ascii="Roboto" w:hAnsi="Roboto"/>
+            <w:color w:val="0563C1"/>
+            <w:u w:val="single"/>
+          </w:rPr>
+          <w:t xml:space="preserve">Browse used dryers</w:t>
+        </w:r>
+      </w:hyperlink>
+    </w:p>
+    <w:p>
+      <w:pPr>
+        <w:pStyle w:val="Heading3"/>
+      </w:pPr>
+      <w:r>
+        <w:rPr>
+          <w:rFonts w:ascii="Montserrat" w:hAnsi="Montserrat" w:eastAsia="Outfit"/>
+        </w:rPr>
+        <w:t>Tanks</w:t>
+      </w:r>
+    </w:p>
+    <w:p>
+      <w:r>
+        <w:rPr>
+          <w:rFonts w:ascii="Roboto" w:hAnsi="Roboto" w:eastAsia="Roboto"/>
+        </w:rPr>
+        <w:t>For storage, blending and transfer. Jacketed and non-jacketed tanks available.</w:t>
+      </w:r>
+    </w:p>
+    <w:p>
+      <w:r>
+        <w:rPr>
+          <w:rFonts w:ascii="Roboto" w:hAnsi="Roboto" w:eastAsia="Roboto"/>
+        </w:rPr>
+        <w:t>We supply used tanks to chemical plants for raw material storage, blending and product transfer. As a supplier chemical producers trust for vessel capacity, IPP sources tanks from Pfaudler, De Dietrich, Grundy and Sinclair Stainless Fabrications in jacketed and non-jacketed designs.</w:t>
+      </w:r>
+    </w:p>
+    <w:p>
+      <w:r>
+        <w:rPr>
+          <w:rFonts w:ascii="Roboto" w:hAnsi="Roboto" w:eastAsia="Roboto"/>
+        </w:rPr>
+        <w:t>Our used tank inventory covers:</w:t>
+      </w:r>
+    </w:p>
+    <w:p>
+      <w:pPr>
+        <w:pStyle w:val="ListBullet"/>
+      </w:pPr>
+      <w:r>
+        <w:rPr>
+          <w:rFonts w:ascii="Roboto" w:hAnsi="Roboto" w:eastAsia="Roboto"/>
+        </w:rPr>
+        <w:t>Glass-lined tanks for corrosive chemicals</w:t>
+      </w:r>
+    </w:p>
+    <w:p>
+      <w:pPr>
+        <w:pStyle w:val="ListBullet"/>
+      </w:pPr>
+      <w:r>
+        <w:rPr>
+          <w:rFonts w:ascii="Roboto" w:hAnsi="Roboto" w:eastAsia="Roboto"/>
+        </w:rPr>
+        <w:t>Stainless steel 304, 316 and 316L process tanks</w:t>
+      </w:r>
+    </w:p>
+    <w:p>
+      <w:pPr>
+        <w:pStyle w:val="ListBullet"/>
+      </w:pPr>
+      <w:r>
+        <w:rPr>
+          <w:rFonts w:ascii="Roboto" w:hAnsi="Roboto" w:eastAsia="Roboto"/>
+        </w:rPr>
+        <w:t>Jacketed tanks for heating and cooling</w:t>
+      </w:r>
+    </w:p>
+    <w:p>
+      <w:pPr>
+        <w:pStyle w:val="ListBullet"/>
+      </w:pPr>
+      <w:r>
+        <w:rPr>
+          <w:rFonts w:ascii="Roboto" w:hAnsi="Roboto" w:eastAsia="Roboto"/>
+        </w:rPr>
+        <w:t>Non-jacketed storage tanks</w:t>
+      </w:r>
+    </w:p>
+    <w:p>
+      <w:pPr>
+        <w:pStyle w:val="ListBullet"/>
+      </w:pPr>
+      <w:r>
+        <w:rPr>
+          <w:rFonts w:ascii="Roboto" w:hAnsi="Roboto" w:eastAsia="Roboto"/>
+        </w:rPr>
+        <w:t>Carbon steel and fiberglass storage tanks</w:t>
+      </w:r>
+    </w:p>
+    <w:p>
+      <w:r>
+        <w:rPr>
+          <w:rFonts w:ascii="Roboto" w:hAnsi="Roboto" w:eastAsia="Roboto"/>
+        </w:rPr>
+        <w:t>Each tank listing states capacity, internal pressure, temperature and material. Stainless steel 304 and glass-lined tanks lead our tank inventory, alongside stainless steel 316 and 316L, carbon steel and fiberglass, with capacities from 5 L to 565,000 L (1 to 149,258 gal). Pricing depends on manufacturer, capacity, material of construction and condition, and IPP quotes each stock number individually with a video or on-site inspection on request.</w:t>
+      </w:r>
+    </w:p>
+    <w:p>
+      <w:r>
+        <w:rPr>
+          <w:rFonts w:ascii="Roboto" w:hAnsi="Roboto" w:eastAsia="Roboto"/>
+        </w:rPr>
+        <w:t>Featured listing: stainless steel 316L vertical tank.</w:t>
+      </w:r>
+    </w:p>
+    <w:p>
+      <w:hyperlink r:id="rId24">
+        <w:r>
+          <w:rPr>
+            <w:rFonts w:ascii="Roboto" w:hAnsi="Roboto"/>
+            <w:color w:val="0563C1"/>
+            <w:u w:val="single"/>
+          </w:rPr>
+          <w:t xml:space="preserve">Browse used tanks</w:t>
+        </w:r>
+      </w:hyperlink>
+    </w:p>
+    <w:p>
+      <w:pPr>
+        <w:pStyle w:val="Heading3"/>
+      </w:pPr>
+      <w:r>
+        <w:rPr>
+          <w:rFonts w:ascii="Montserrat" w:hAnsi="Montserrat" w:eastAsia="Outfit"/>
+        </w:rPr>
+        <w:t>Glass-lined and reactor parts</w:t>
+      </w:r>
+    </w:p>
+    <w:p>
+      <w:r>
+        <w:rPr>
+          <w:rFonts w:ascii="Roboto" w:hAnsi="Roboto" w:eastAsia="Roboto"/>
+        </w:rPr>
+        <w:t>Spare parts that return glass-lined and alloy reactors to service.</w:t>
+      </w:r>
+    </w:p>
+    <w:p>
+      <w:r>
+        <w:rPr>
+          <w:rFonts w:ascii="Roboto" w:hAnsi="Roboto" w:eastAsia="Roboto"/>
+        </w:rPr>
+        <w:t>IPP supplies used, re-glassed and new glass-lined parts to chemical plants that maintain Pfaudler, De Dietrich and other glass-lined reactors and tanks. Glass-lined parts form the largest equipment type in our chemical processing inventory, and we also stock new seals and seal plans for exotic alloy reactors.</w:t>
+      </w:r>
+    </w:p>
+    <w:p>
+      <w:r>
+        <w:rPr>
+          <w:rFonts w:ascii="Roboto" w:hAnsi="Roboto" w:eastAsia="Roboto"/>
+        </w:rPr>
+        <w:t>Glass-lined and reactor parts in our inventory cover:</w:t>
+      </w:r>
+    </w:p>
+    <w:p>
+      <w:pPr>
+        <w:pStyle w:val="ListBullet"/>
+      </w:pPr>
+      <w:r>
+        <w:rPr>
+          <w:rFonts w:ascii="Roboto" w:hAnsi="Roboto" w:eastAsia="Roboto"/>
+        </w:rPr>
+        <w:t>Glass-lined agitators, including retreat curve and Cryo-Lock blades</w:t>
+      </w:r>
+    </w:p>
+    <w:p>
+      <w:pPr>
+        <w:pStyle w:val="ListBullet"/>
+      </w:pPr>
+      <w:r>
+        <w:rPr>
+          <w:rFonts w:ascii="Roboto" w:hAnsi="Roboto" w:eastAsia="Roboto"/>
+        </w:rPr>
+        <w:t>Main covers and manway covers</w:t>
+      </w:r>
+    </w:p>
+    <w:p>
+      <w:pPr>
+        <w:pStyle w:val="ListBullet"/>
+      </w:pPr>
+      <w:r>
+        <w:rPr>
+          <w:rFonts w:ascii="Roboto" w:hAnsi="Roboto" w:eastAsia="Roboto"/>
+        </w:rPr>
+        <w:t>Baffles, thermowells and adapter plates</w:t>
+      </w:r>
+    </w:p>
+    <w:p>
+      <w:pPr>
+        <w:pStyle w:val="ListBullet"/>
+      </w:pPr>
+      <w:r>
+        <w:rPr>
+          <w:rFonts w:ascii="Roboto" w:hAnsi="Roboto" w:eastAsia="Roboto"/>
+        </w:rPr>
+        <w:t>Pro-rings, split flanges and clamps</w:t>
+      </w:r>
+    </w:p>
+    <w:p>
+      <w:pPr>
+        <w:pStyle w:val="ListBullet"/>
+      </w:pPr>
+      <w:r>
+        <w:rPr>
+          <w:rFonts w:ascii="Roboto" w:hAnsi="Roboto" w:eastAsia="Roboto"/>
+        </w:rPr>
+        <w:t>Hastelloy C-22 seals and seal plans for exotic alloy reactors</w:t>
+      </w:r>
+    </w:p>
+    <w:p>
+      <w:r>
+        <w:rPr>
+          <w:rFonts w:ascii="Roboto" w:hAnsi="Roboto" w:eastAsia="Roboto"/>
+        </w:rPr>
+        <w:t>Each part listing states the vessel size it fits, diameter, length and whether the part is re-glassed. Pfaudler and De Dietrich parts lead our glass-lined parts inventory, alongside 3V Tech, Schott and UGE, for vessels from 8 L to 37,850 L (2 to 10,000 gal). Pricing depends on manufacturer, vessel size, glass condition and re-glassing, and IPP quotes each stock number individually with a video or on-site inspection on request.</w:t>
+      </w:r>
+    </w:p>
+    <w:p>
+      <w:r>
+        <w:rPr>
+          <w:rFonts w:ascii="Roboto" w:hAnsi="Roboto" w:eastAsia="Roboto"/>
+        </w:rPr>
+        <w:t>Featured listings: re-glassed Pfaudler retreat curve agitator for a 1,150 L (300 gal) vessel and a new Hastelloy C-22 reactor seal.</w:t>
+      </w:r>
+    </w:p>
+    <w:p>
+      <w:hyperlink r:id="rId25">
+        <w:r>
+          <w:rPr>
+            <w:rFonts w:ascii="Roboto" w:hAnsi="Roboto"/>
+            <w:color w:val="0563C1"/>
+            <w:u w:val="single"/>
+          </w:rPr>
+          <w:t xml:space="preserve">Browse used glass-lined parts</w:t>
+        </w:r>
+      </w:hyperlink>
+      <w:r>
+        <w:rPr>
+          <w:rFonts w:ascii="Roboto" w:hAnsi="Roboto" w:eastAsia="Roboto"/>
+        </w:rPr>
+        <w:t xml:space="preserve"> · </w:t>
+      </w:r>
+      <w:hyperlink r:id="rId26">
+        <w:r>
+          <w:rPr>
+            <w:rFonts w:ascii="Roboto" w:hAnsi="Roboto"/>
+            <w:color w:val="0563C1"/>
+            <w:u w:val="single"/>
+          </w:rPr>
+          <w:t xml:space="preserve">Browse reactor parts</w:t>
+        </w:r>
+      </w:hyperlink>
+    </w:p>
+    <w:p>
+      <w:pPr>
+        <w:pStyle w:val="Heading2"/>
+      </w:pPr>
+      <w:r>
+        <w:rPr>
+          <w:rFonts w:ascii="Montserrat" w:hAnsi="Montserrat" w:eastAsia="Outfit"/>
+        </w:rPr>
+        <w:t>Equipment manufacturers in our inventory</w:t>
+      </w:r>
+    </w:p>
+    <w:p>
+      <w:r>
+        <w:rPr>
+          <w:rFonts w:ascii="Roboto" w:hAnsi="Roboto" w:eastAsia="Roboto"/>
+        </w:rPr>
+        <w:t>IPP’s chemical process inventory carries reactors, heat exchangers, centrifuges, tanks and columns from the original manufacturers that built them. Buyers search a maker’s units directly through IPP’s inventory filters.</w:t>
+      </w:r>
+    </w:p>
+    <w:p>
+      <w:r>
+        <w:rPr>
+          <w:rFonts w:ascii="Roboto" w:hAnsi="Roboto" w:eastAsia="Roboto"/>
+        </w:rPr>
+        <w:t>Leading manufacturers in IPP’s chemical inventory include:</w:t>
+      </w:r>
+    </w:p>
+    <w:p>
+      <w:pPr>
+        <w:pStyle w:val="ListBullet"/>
+      </w:pPr>
+      <w:hyperlink r:id="rId27">
+        <w:r>
+          <w:rPr>
+            <w:rFonts w:ascii="Roboto" w:hAnsi="Roboto"/>
+            <w:color w:val="0563C1"/>
+            <w:u w:val="single"/>
+          </w:rPr>
+          <w:t xml:space="preserve">Pfaudler</w:t>
+        </w:r>
+      </w:hyperlink>
+      <w:r>
+        <w:rPr>
+          <w:rFonts w:ascii="Roboto" w:hAnsi="Roboto" w:eastAsia="Roboto"/>
+        </w:rPr>
+        <w:t xml:space="preserve">: </w:t>
+      </w:r>
+      <w:r>
+        <w:rPr>
+          <w:rFonts w:ascii="Roboto" w:hAnsi="Roboto" w:eastAsia="Roboto"/>
+        </w:rPr>
+        <w:t>Glass-lined reactors (RA, E, BE and ELL models), tanks, agitators and columns</w:t>
+      </w:r>
+    </w:p>
+    <w:p>
+      <w:pPr>
+        <w:pStyle w:val="ListBullet"/>
+      </w:pPr>
+      <w:hyperlink r:id="rId28">
+        <w:r>
+          <w:rPr>
+            <w:rFonts w:ascii="Roboto" w:hAnsi="Roboto"/>
+            <w:color w:val="0563C1"/>
+            <w:u w:val="single"/>
+          </w:rPr>
+          <w:t xml:space="preserve">De Dietrich</w:t>
+        </w:r>
+      </w:hyperlink>
+      <w:r>
+        <w:rPr>
+          <w:rFonts w:ascii="Roboto" w:hAnsi="Roboto" w:eastAsia="Roboto"/>
+        </w:rPr>
+        <w:t xml:space="preserve">: </w:t>
+      </w:r>
+      <w:r>
+        <w:rPr>
+          <w:rFonts w:ascii="Roboto" w:hAnsi="Roboto" w:eastAsia="Roboto"/>
+        </w:rPr>
+        <w:t>Glass-lined reactors (SA, CTJ, STA and CSA models), tanks and columns</w:t>
+      </w:r>
+    </w:p>
+    <w:p>
+      <w:pPr>
+        <w:pStyle w:val="ListBullet"/>
+      </w:pPr>
+      <w:hyperlink r:id="rId29">
+        <w:r>
+          <w:rPr>
+            <w:rFonts w:ascii="Roboto" w:hAnsi="Roboto"/>
+            <w:color w:val="0563C1"/>
+            <w:u w:val="single"/>
+          </w:rPr>
+          <w:t xml:space="preserve">Alfa Laval</w:t>
+        </w:r>
+      </w:hyperlink>
+      <w:r>
+        <w:rPr>
+          <w:rFonts w:ascii="Roboto" w:hAnsi="Roboto" w:eastAsia="Roboto"/>
+        </w:rPr>
+        <w:t xml:space="preserve">: </w:t>
+      </w:r>
+      <w:r>
+        <w:rPr>
+          <w:rFonts w:ascii="Roboto" w:hAnsi="Roboto" w:eastAsia="Roboto"/>
+        </w:rPr>
+        <w:t>Heat exchangers and centrifuges</w:t>
+      </w:r>
+    </w:p>
+    <w:p>
+      <w:pPr>
+        <w:pStyle w:val="ListBullet"/>
+      </w:pPr>
+      <w:hyperlink r:id="rId30">
+        <w:r>
+          <w:rPr>
+            <w:rFonts w:ascii="Roboto" w:hAnsi="Roboto"/>
+            <w:color w:val="0563C1"/>
+            <w:u w:val="single"/>
+          </w:rPr>
+          <w:t xml:space="preserve">Krauss Maffei</w:t>
+        </w:r>
+      </w:hyperlink>
+      <w:r>
+        <w:rPr>
+          <w:rFonts w:ascii="Roboto" w:hAnsi="Roboto" w:eastAsia="Roboto"/>
+        </w:rPr>
+        <w:t xml:space="preserve">: </w:t>
+      </w:r>
+      <w:r>
+        <w:rPr>
+          <w:rFonts w:ascii="Roboto" w:hAnsi="Roboto" w:eastAsia="Roboto"/>
+        </w:rPr>
+        <w:t>Centrifuges, including Hastelloy C22 peeler units</w:t>
+      </w:r>
+    </w:p>
+    <w:p>
+      <w:pPr>
+        <w:pStyle w:val="ListBullet"/>
+      </w:pPr>
+      <w:hyperlink r:id="rId31">
+        <w:r>
+          <w:rPr>
+            <w:rFonts w:ascii="Roboto" w:hAnsi="Roboto"/>
+            <w:color w:val="0563C1"/>
+            <w:u w:val="single"/>
+          </w:rPr>
+          <w:t xml:space="preserve">Westfalia</w:t>
+        </w:r>
+      </w:hyperlink>
+      <w:r>
+        <w:rPr>
+          <w:rFonts w:ascii="Roboto" w:hAnsi="Roboto" w:eastAsia="Roboto"/>
+        </w:rPr>
+        <w:t xml:space="preserve">: </w:t>
+      </w:r>
+      <w:r>
+        <w:rPr>
+          <w:rFonts w:ascii="Roboto" w:hAnsi="Roboto" w:eastAsia="Roboto"/>
+        </w:rPr>
+        <w:t>Centrifuges</w:t>
+      </w:r>
+    </w:p>
+    <w:p>
+      <w:pPr>
+        <w:pStyle w:val="ListBullet"/>
+      </w:pPr>
+      <w:hyperlink r:id="rId32">
+        <w:r>
+          <w:rPr>
+            <w:rFonts w:ascii="Roboto" w:hAnsi="Roboto"/>
+            <w:color w:val="0563C1"/>
+            <w:u w:val="single"/>
+          </w:rPr>
+          <w:t xml:space="preserve">Gale Process Solutions</w:t>
+        </w:r>
+      </w:hyperlink>
+      <w:r>
+        <w:rPr>
+          <w:rFonts w:ascii="Roboto" w:hAnsi="Roboto" w:eastAsia="Roboto"/>
+        </w:rPr>
+        <w:t xml:space="preserve">: </w:t>
+      </w:r>
+      <w:r>
+        <w:rPr>
+          <w:rFonts w:ascii="Roboto" w:hAnsi="Roboto" w:eastAsia="Roboto"/>
+        </w:rPr>
+        <w:t>New 316L stainless steel and Hastelloy reactors from the IPP group, 12 to 16 week average delivery</w:t>
+      </w:r>
+    </w:p>
+    <w:p>
+      <w:pPr>
+        <w:pStyle w:val="ListBullet"/>
+      </w:pPr>
+      <w:hyperlink r:id="rId33">
+        <w:r>
+          <w:rPr>
+            <w:rFonts w:ascii="Roboto" w:hAnsi="Roboto"/>
+            <w:color w:val="0563C1"/>
+            <w:u w:val="single"/>
+          </w:rPr>
+          <w:t xml:space="preserve">Universal Glasteel Equipment</w:t>
+        </w:r>
+      </w:hyperlink>
+      <w:r>
+        <w:rPr>
+          <w:rFonts w:ascii="Roboto" w:hAnsi="Roboto" w:eastAsia="Roboto"/>
+        </w:rPr>
+        <w:t xml:space="preserve">: </w:t>
+      </w:r>
       <w:r>
         <w:rPr>
           <w:rFonts w:ascii="Roboto" w:hAnsi="Roboto" w:eastAsia="Roboto"/>
@@ -5046,6 +4574,15 @@
           <w:rFonts w:ascii="Roboto" w:hAnsi="Roboto" w:eastAsia="Roboto"/>
         </w:rPr>
         <w:t>Chemical manufacturers choose International Process Plants (IPP) on both sides of a plant transaction. Producers buy from IPP when added capacity cannot wait for new-build lead times, and plant owners sell to IPP when a closing site needs one accountable buyer. Five advantages apply to each side:</w:t>
+      </w:r>
+    </w:p>
+    <w:p>
+      <w:r>
+        <w:rPr>
+          <w:rFonts w:ascii="Roboto" w:hAnsi="Roboto" w:eastAsia="Roboto"/>
+          <w:b/>
+        </w:rPr>
+        <w:t>For buyers</w:t>
       </w:r>
     </w:p>
     <w:p>
@@ -5504,6 +5041,15 @@
       </w:r>
     </w:p>
     <w:p>
+      <w:r>
+        <w:rPr>
+          <w:rFonts w:ascii="Roboto" w:hAnsi="Roboto" w:eastAsia="Roboto"/>
+          <w:b/>
+        </w:rPr>
+        <w:t>For sellers</w:t>
+      </w:r>
+    </w:p>
+    <w:p>
       <w:pPr>
         <w:pStyle w:val="Heading3"/>
       </w:pPr>
@@ -5986,7 +5532,7 @@
       </w:r>
     </w:p>
     <w:p>
-      <w:hyperlink r:id="rId19">
+      <w:hyperlink r:id="rId34">
         <w:r>
           <w:rPr>
             <w:rFonts w:ascii="Roboto" w:hAnsi="Roboto"/>
@@ -6002,7 +5548,7 @@
         </w:rPr>
         <w:t xml:space="preserve">, an IPP group company, fabricates new stainless steel process equipment with 12 to 16 week average delivery. </w:t>
       </w:r>
-      <w:hyperlink r:id="rId20">
+      <w:hyperlink r:id="rId35">
         <w:r>
           <w:rPr>
             <w:rFonts w:ascii="Roboto" w:hAnsi="Roboto"/>
@@ -6024,7 +5570,7 @@
         <w:rPr>
           <w:rFonts w:ascii="Roboto" w:hAnsi="Roboto" w:eastAsia="Roboto"/>
         </w:rPr>
-        <w:t>UGE glass-lined equipment and re-glassing ↗</w:t>
+        <w:t>UGE glass-lined equipment and re-glassing</w:t>
       </w:r>
     </w:p>
     <w:p>
@@ -6051,143 +5597,91 @@
         <w:rPr>
           <w:rFonts w:ascii="Roboto" w:hAnsi="Roboto" w:eastAsia="Roboto"/>
         </w:rPr>
-        <w:t>Watch the Customer Testimonials playlist ↗</w:t>
+        <w:t>Watch the Customer Testimonials playlist</w:t>
       </w:r>
     </w:p>
     <w:p>
       <w:pPr>
         <w:pStyle w:val="ListBullet"/>
       </w:pPr>
-      <w:hyperlink r:id="rId21">
+      <w:hyperlink r:id="rId36">
         <w:r>
           <w:rPr>
             <w:rFonts w:ascii="Roboto" w:hAnsi="Roboto"/>
             <w:color w:val="0563C1"/>
             <w:u w:val="single"/>
           </w:rPr>
-          <w:t xml:space="preserve">▶</w:t>
+          <w:t xml:space="preserve">“The International Process Plants team is outstanding! They understand my business”</w:t>
         </w:r>
       </w:hyperlink>
       <w:r>
         <w:rPr>
           <w:rFonts w:ascii="Roboto" w:hAnsi="Roboto" w:eastAsia="Roboto"/>
         </w:rPr>
-        <w:t>“The International Process Plants team is outstanding! They understand my business”</w:t>
-      </w:r>
-      <w:r>
-        <w:rPr>
-          <w:rFonts w:ascii="Roboto" w:hAnsi="Roboto" w:eastAsia="Roboto"/>
-          <w:b/>
-        </w:rPr>
-        <w:t>Chuck Castley</w:t>
-      </w:r>
-      <w:r>
-        <w:rPr>
-          <w:rFonts w:ascii="Roboto" w:hAnsi="Roboto" w:eastAsia="Roboto"/>
-        </w:rPr>
-        <w:t>Commercial vice president, Chemicals Incorporated, Baytown, Texas</w:t>
+        <w:t xml:space="preserve"> Chuck Castley, Commercial vice president, Chemicals Incorporated, Baytown, Texas (video)</w:t>
       </w:r>
     </w:p>
     <w:p>
       <w:pPr>
         <w:pStyle w:val="ListBullet"/>
       </w:pPr>
-      <w:hyperlink r:id="rId22">
+      <w:hyperlink r:id="rId37">
         <w:r>
           <w:rPr>
             <w:rFonts w:ascii="Roboto" w:hAnsi="Roboto"/>
             <w:color w:val="0563C1"/>
             <w:u w:val="single"/>
           </w:rPr>
-          <w:t xml:space="preserve">▶</w:t>
+          <w:t xml:space="preserve">“If somebody asked me to rate IPP 1-10, I’d give them a 10 every time!”</w:t>
         </w:r>
       </w:hyperlink>
       <w:r>
         <w:rPr>
           <w:rFonts w:ascii="Roboto" w:hAnsi="Roboto" w:eastAsia="Roboto"/>
         </w:rPr>
-        <w:t>“If somebody asked me to rate IPP 1-10, I’d give them a 10 every time!”</w:t>
-      </w:r>
-      <w:r>
-        <w:rPr>
-          <w:rFonts w:ascii="Roboto" w:hAnsi="Roboto" w:eastAsia="Roboto"/>
-          <w:b/>
-        </w:rPr>
-        <w:t>Joel Salzman</w:t>
-      </w:r>
-      <w:r>
-        <w:rPr>
-          <w:rFonts w:ascii="Roboto" w:hAnsi="Roboto" w:eastAsia="Roboto"/>
-        </w:rPr>
-        <w:t>VP of Operations, ChemDesign Products, Inc., Marinette, Wisconsin</w:t>
+        <w:t xml:space="preserve"> Joel Salzman, VP of Operations, ChemDesign Products, Inc., Marinette, Wisconsin (video)</w:t>
       </w:r>
     </w:p>
     <w:p>
       <w:pPr>
         <w:pStyle w:val="ListBullet"/>
       </w:pPr>
-      <w:hyperlink r:id="rId23">
+      <w:hyperlink r:id="rId38">
         <w:r>
           <w:rPr>
             <w:rFonts w:ascii="Roboto" w:hAnsi="Roboto"/>
             <w:color w:val="0563C1"/>
             <w:u w:val="single"/>
           </w:rPr>
-          <w:t xml:space="preserve">▶</w:t>
+          <w:t xml:space="preserve">The power of partnership: A testimonial to International Process Plants’ customer commitment</w:t>
         </w:r>
       </w:hyperlink>
       <w:r>
         <w:rPr>
           <w:rFonts w:ascii="Roboto" w:hAnsi="Roboto" w:eastAsia="Roboto"/>
         </w:rPr>
-        <w:t>The power of partnership: A testimonial to International Process Plants’ customer commitment</w:t>
-      </w:r>
-      <w:r>
-        <w:rPr>
-          <w:rFonts w:ascii="Roboto" w:hAnsi="Roboto" w:eastAsia="Roboto"/>
-          <w:b/>
-        </w:rPr>
-        <w:t>Clay Pace</w:t>
-      </w:r>
-      <w:r>
-        <w:rPr>
-          <w:rFonts w:ascii="Roboto" w:hAnsi="Roboto" w:eastAsia="Roboto"/>
-        </w:rPr>
-        <w:t>President of Commercial &amp; Technology, Seatex, LLC, Houston</w:t>
+        <w:t xml:space="preserve"> Clay Pace, President of Commercial &amp; Technology, Seatex, LLC, Houston (video)</w:t>
       </w:r>
     </w:p>
     <w:p>
       <w:pPr>
         <w:pStyle w:val="ListBullet"/>
       </w:pPr>
-      <w:hyperlink r:id="rId24">
+      <w:hyperlink r:id="rId39">
         <w:r>
           <w:rPr>
             <w:rFonts w:ascii="Roboto" w:hAnsi="Roboto"/>
             <w:color w:val="0563C1"/>
             <w:u w:val="single"/>
           </w:rPr>
-          <w:t xml:space="preserve">▶</w:t>
+          <w:t xml:space="preserve">Communication and quick customer response are what sets IPP apart</w:t>
         </w:r>
       </w:hyperlink>
       <w:r>
         <w:rPr>
           <w:rFonts w:ascii="Roboto" w:hAnsi="Roboto" w:eastAsia="Roboto"/>
         </w:rPr>
-        <w:t>Communication and quick customer response are what sets IPP apart</w:t>
-      </w:r>
-      <w:r>
-        <w:rPr>
-          <w:rFonts w:ascii="Roboto" w:hAnsi="Roboto" w:eastAsia="Roboto"/>
-          <w:b/>
-        </w:rPr>
-        <w:t>Anna Nguyen</w:t>
-      </w:r>
-      <w:r>
-        <w:rPr>
-          <w:rFonts w:ascii="Roboto" w:hAnsi="Roboto" w:eastAsia="Roboto"/>
-        </w:rPr>
-        <w:t>Commercial Sales &amp; Operations Manager, Hoyer Global</w:t>
+        <w:t xml:space="preserve"> Anna Nguyen, Commercial Sales &amp; Operations Manager, Hoyer Global (video)</w:t>
       </w:r>
     </w:p>
     <w:p>
@@ -6220,8 +5714,15 @@
       <w:r>
         <w:rPr>
           <w:rFonts w:ascii="Roboto" w:hAnsi="Roboto" w:eastAsia="Roboto"/>
+          <w:b/>
         </w:rPr>
         <w:t>Share your requirements</w:t>
+      </w:r>
+      <w:r>
+        <w:rPr>
+          <w:rFonts w:ascii="Roboto" w:hAnsi="Roboto" w:eastAsia="Roboto"/>
+        </w:rPr>
+        <w:t xml:space="preserve">: </w:t>
       </w:r>
       <w:r>
         <w:rPr>
@@ -6241,8 +5742,15 @@
       <w:r>
         <w:rPr>
           <w:rFonts w:ascii="Roboto" w:hAnsi="Roboto" w:eastAsia="Roboto"/>
+          <w:b/>
         </w:rPr>
         <w:t>Review specifications and inspect</w:t>
+      </w:r>
+      <w:r>
+        <w:rPr>
+          <w:rFonts w:ascii="Roboto" w:hAnsi="Roboto" w:eastAsia="Roboto"/>
+        </w:rPr>
+        <w:t xml:space="preserve">: </w:t>
       </w:r>
       <w:r>
         <w:rPr>
@@ -6262,8 +5770,15 @@
       <w:r>
         <w:rPr>
           <w:rFonts w:ascii="Roboto" w:hAnsi="Roboto" w:eastAsia="Roboto"/>
+          <w:b/>
         </w:rPr>
         <w:t>Agree the purchase scope</w:t>
+      </w:r>
+      <w:r>
+        <w:rPr>
+          <w:rFonts w:ascii="Roboto" w:hAnsi="Roboto" w:eastAsia="Roboto"/>
+        </w:rPr>
+        <w:t xml:space="preserve">: </w:t>
       </w:r>
       <w:r>
         <w:rPr>
@@ -6299,8 +5814,15 @@
       <w:r>
         <w:rPr>
           <w:rFonts w:ascii="Roboto" w:hAnsi="Roboto" w:eastAsia="Roboto"/>
+          <w:b/>
         </w:rPr>
         <w:t>Plan dismantling and relocation</w:t>
+      </w:r>
+      <w:r>
+        <w:rPr>
+          <w:rFonts w:ascii="Roboto" w:hAnsi="Roboto" w:eastAsia="Roboto"/>
+        </w:rPr>
+        <w:t xml:space="preserve">: </w:t>
       </w:r>
       <w:r>
         <w:rPr>
@@ -6320,6 +5842,7 @@
       <w:r>
         <w:rPr>
           <w:rFonts w:ascii="Roboto" w:hAnsi="Roboto" w:eastAsia="Roboto"/>
+          <w:b/>
         </w:rPr>
         <w:t>Arrange shipping and start-up support</w:t>
       </w:r>
@@ -6327,6 +5850,12 @@
         <w:rPr>
           <w:rFonts w:ascii="Roboto" w:hAnsi="Roboto" w:eastAsia="Roboto"/>
         </w:rPr>
+        <w:t xml:space="preserve">: </w:t>
+      </w:r>
+      <w:r>
+        <w:rPr>
+          <w:rFonts w:ascii="Roboto" w:hAnsi="Roboto" w:eastAsia="Roboto"/>
+        </w:rPr>
         <w:t>IPP offers international shipping options, or buyers can arrange their own shipping. Discuss destination-site installation and start-up support as part of the project scope.</w:t>
       </w:r>
     </w:p>
@@ -6358,20 +5887,32 @@
       </w:r>
     </w:p>
     <w:p>
-      <w:r>
-        <w:rPr>
-          <w:rFonts w:ascii="Roboto" w:hAnsi="Roboto" w:eastAsia="Roboto"/>
-        </w:rPr>
-        <w:t>Sell a plant ↗</w:t>
-      </w:r>
-    </w:p>
-    <w:p>
-      <w:r>
-        <w:rPr>
-          <w:rFonts w:ascii="Roboto" w:hAnsi="Roboto" w:eastAsia="Roboto"/>
-        </w:rPr>
-        <w:t>Sell equipment ↗</w:t>
-      </w:r>
+      <w:hyperlink r:id="rId10">
+        <w:r>
+          <w:rPr>
+            <w:rFonts w:ascii="Roboto" w:hAnsi="Roboto"/>
+            <w:color w:val="0563C1"/>
+            <w:u w:val="single"/>
+          </w:rPr>
+          <w:t xml:space="preserve">Sell a plant</w:t>
+        </w:r>
+      </w:hyperlink>
+      <w:r>
+        <w:rPr>
+          <w:rFonts w:ascii="Roboto" w:hAnsi="Roboto" w:eastAsia="Roboto"/>
+        </w:rPr>
+        <w:t xml:space="preserve"> · </w:t>
+      </w:r>
+      <w:hyperlink r:id="rId11">
+        <w:r>
+          <w:rPr>
+            <w:rFonts w:ascii="Roboto" w:hAnsi="Roboto"/>
+            <w:color w:val="0563C1"/>
+            <w:u w:val="single"/>
+          </w:rPr>
+          <w:t xml:space="preserve">Sell equipment</w:t>
+        </w:r>
+      </w:hyperlink>
     </w:p>
     <w:p>
       <w:pPr>
@@ -6917,224 +6458,144 @@
         <w:rPr>
           <w:rFonts w:ascii="Roboto" w:hAnsi="Roboto" w:eastAsia="Roboto"/>
         </w:rPr>
-        <w:t>Read the announcement ↗</w:t>
-      </w:r>
-    </w:p>
-    <w:p>
-      <w:hyperlink r:id="rId25">
+        <w:t>Novartis · January 2024</w:t>
+      </w:r>
+    </w:p>
+    <w:p>
+      <w:pPr>
+        <w:pStyle w:val="Heading3"/>
+      </w:pPr>
+      <w:r>
+        <w:rPr>
+          <w:rFonts w:ascii="Montserrat" w:hAnsi="Montserrat" w:eastAsia="Outfit"/>
+        </w:rPr>
+        <w:t>Repurposing a pharmaceutical site</w:t>
+      </w:r>
+    </w:p>
+    <w:p>
+      <w:r>
+        <w:rPr>
+          <w:rFonts w:ascii="Roboto" w:hAnsi="Roboto" w:eastAsia="Roboto"/>
+        </w:rPr>
+        <w:t>Humber Industrials, an IPP affiliate, agreed in January 2024 to purchase Novartis UK’s 170-acre API manufacturing site and assets in Grimsby. The site holds 90 reaction suites with 900 m³ (237,755 gal) of total capacity, 17 centrifuges, 26 dryer systems and 10 solvent recovery systems. Our Grimsby redevelopment project transitions the shuttered site into a viable future asset.</w:t>
+      </w:r>
+    </w:p>
+    <w:p>
+      <w:r>
+        <w:rPr>
+          <w:rFonts w:ascii="Roboto" w:hAnsi="Roboto" w:eastAsia="Roboto"/>
+        </w:rPr>
+        <w:t>API equipment acquisition</w:t>
+      </w:r>
+    </w:p>
+    <w:p>
+      <w:pPr>
+        <w:pStyle w:val="Heading3"/>
+      </w:pPr>
+      <w:r>
+        <w:rPr>
+          <w:rFonts w:ascii="Montserrat" w:hAnsi="Montserrat" w:eastAsia="Outfit"/>
+        </w:rPr>
+        <w:t>Moving assets into their next use</w:t>
+      </w:r>
+    </w:p>
+    <w:p>
+      <w:r>
+        <w:rPr>
+          <w:rFonts w:ascii="Roboto" w:hAnsi="Roboto" w:eastAsia="Roboto"/>
+        </w:rPr>
+        <w:t>IPP bought a U.S. API plant from a CDMO headquartered in Europe and dismantled it on an expedited schedule to meet the seller’s timeline. We moved 18 reactors, 20 tanks, four filter dryers, centrifuges, vacuum dryers and heat exchangers in Hastelloy, glass-lined steel, stainless steel and Karbate to our Eastover, South Carolina facility. The emptied building now serves as a warehouse.</w:t>
+      </w:r>
+    </w:p>
+    <w:p>
+      <w:r>
+        <w:rPr>
+          <w:rFonts w:ascii="Roboto" w:hAnsi="Roboto" w:eastAsia="Roboto"/>
+        </w:rPr>
+        <w:t>Decommissioning · ISN RAVS Plus</w:t>
+      </w:r>
+    </w:p>
+    <w:p>
+      <w:pPr>
+        <w:pStyle w:val="Heading3"/>
+      </w:pPr>
+      <w:r>
+        <w:rPr>
+          <w:rFonts w:ascii="Montserrat" w:hAnsi="Montserrat" w:eastAsia="Outfit"/>
+        </w:rPr>
+        <w:t>Decommissioning and site transfer</w:t>
+      </w:r>
+    </w:p>
+    <w:p>
+      <w:r>
+        <w:rPr>
+          <w:rFonts w:ascii="Roboto" w:hAnsi="Roboto" w:eastAsia="Roboto"/>
+        </w:rPr>
+        <w:t>IPP holds ISN RAVS Plus verification for plant decommissioning. We have completed full-scale decommissions in Ohio, Alabama, Louisiana, the United Kingdom and Germany. Our team helped transfer a shuttered biobased chemicals plant in Minnesota to Nuol Green Chemistry, a deal SOCMA highlighted.</w:t>
+      </w:r>
+    </w:p>
+    <w:p>
+      <w:pPr>
+        <w:pStyle w:val="ListBullet"/>
+      </w:pPr>
+      <w:hyperlink r:id="rId40">
         <w:r>
           <w:rPr>
             <w:rFonts w:ascii="Roboto" w:hAnsi="Roboto"/>
             <w:color w:val="0563C1"/>
             <w:u w:val="single"/>
           </w:rPr>
-          <w:t xml:space="preserve">Source / details</w:t>
+          <w:t xml:space="preserve">SOCMA: GEO Specialty Chemicals site acquisition</w:t>
         </w:r>
       </w:hyperlink>
     </w:p>
     <w:p>
-      <w:r>
-        <w:rPr>
-          <w:rFonts w:ascii="Roboto" w:hAnsi="Roboto" w:eastAsia="Roboto"/>
-        </w:rPr>
-        <w:t>Novartis · January 2024</w:t>
-      </w:r>
-    </w:p>
-    <w:p>
-      <w:pPr>
-        <w:pStyle w:val="Heading3"/>
-      </w:pPr>
-      <w:r>
-        <w:rPr>
-          <w:rFonts w:ascii="Montserrat" w:hAnsi="Montserrat" w:eastAsia="Outfit"/>
-        </w:rPr>
-        <w:t>Repurposing a pharmaceutical site</w:t>
-      </w:r>
-    </w:p>
-    <w:p>
-      <w:r>
-        <w:rPr>
-          <w:rFonts w:ascii="Roboto" w:hAnsi="Roboto" w:eastAsia="Roboto"/>
-        </w:rPr>
-        <w:t>Humber Industrials, an IPP affiliate, agreed in January 2024 to purchase Novartis UK’s 170-acre API manufacturing site and assets in Grimsby. The site holds 90 reaction suites with 900 m³ (237,755 gal) of total capacity, 17 centrifuges, 26 dryer systems and 10 solvent recovery systems. Our Grimsby redevelopment project transitions the shuttered site into a viable future asset.</w:t>
-      </w:r>
-    </w:p>
-    <w:p>
-      <w:r>
-        <w:rPr>
-          <w:rFonts w:ascii="Roboto" w:hAnsi="Roboto" w:eastAsia="Roboto"/>
-        </w:rPr>
-        <w:t>Read the announcement ↗</w:t>
-      </w:r>
-    </w:p>
-    <w:p>
-      <w:hyperlink r:id="rId26">
+      <w:pPr>
+        <w:pStyle w:val="ListBullet"/>
+      </w:pPr>
+      <w:hyperlink r:id="rId41">
         <w:r>
           <w:rPr>
             <w:rFonts w:ascii="Roboto" w:hAnsi="Roboto"/>
             <w:color w:val="0563C1"/>
             <w:u w:val="single"/>
           </w:rPr>
-          <w:t xml:space="preserve">Source / details</w:t>
+          <w:t xml:space="preserve">ISN RAVS Plus: Decommissioning designation, August 2024</w:t>
         </w:r>
       </w:hyperlink>
     </w:p>
     <w:p>
-      <w:r>
-        <w:rPr>
-          <w:rFonts w:ascii="Roboto" w:hAnsi="Roboto" w:eastAsia="Roboto"/>
-        </w:rPr>
-        <w:t>API equipment acquisition</w:t>
-      </w:r>
-    </w:p>
-    <w:p>
-      <w:pPr>
-        <w:pStyle w:val="Heading3"/>
-      </w:pPr>
-      <w:r>
-        <w:rPr>
-          <w:rFonts w:ascii="Montserrat" w:hAnsi="Montserrat" w:eastAsia="Outfit"/>
-        </w:rPr>
-        <w:t>Moving assets into their next use</w:t>
-      </w:r>
-    </w:p>
-    <w:p>
-      <w:r>
-        <w:rPr>
-          <w:rFonts w:ascii="Roboto" w:hAnsi="Roboto" w:eastAsia="Roboto"/>
-        </w:rPr>
-        <w:t>IPP bought a U.S. API plant from a CDMO headquartered in Europe and dismantled it on an expedited schedule to meet the seller’s timeline. We moved 18 reactors, 20 tanks, four filter dryers, centrifuges, vacuum dryers and heat exchangers in Hastelloy, glass-lined steel, stainless steel and Karbate to our Eastover, South Carolina facility. The emptied building now serves as a warehouse.</w:t>
-      </w:r>
-    </w:p>
-    <w:p>
-      <w:r>
-        <w:rPr>
-          <w:rFonts w:ascii="Roboto" w:hAnsi="Roboto" w:eastAsia="Roboto"/>
-        </w:rPr>
-        <w:t>Read the project story ↗</w:t>
-      </w:r>
-    </w:p>
-    <w:p>
-      <w:hyperlink r:id="rId27">
+      <w:pPr>
+        <w:pStyle w:val="ListBullet"/>
+      </w:pPr>
+      <w:hyperlink r:id="rId42">
         <w:r>
           <w:rPr>
             <w:rFonts w:ascii="Roboto" w:hAnsi="Roboto"/>
             <w:color w:val="0563C1"/>
             <w:u w:val="single"/>
           </w:rPr>
-          <w:t xml:space="preserve">Source / details</w:t>
+          <w:t xml:space="preserve">Chemical Processing: Ross Gale on IPP’s chemical plant work</w:t>
         </w:r>
       </w:hyperlink>
     </w:p>
     <w:p>
-      <w:r>
-        <w:rPr>
-          <w:rFonts w:ascii="Roboto" w:hAnsi="Roboto" w:eastAsia="Roboto"/>
-        </w:rPr>
-        <w:t>Decommissioning · ISN RAVS Plus</w:t>
-      </w:r>
-    </w:p>
-    <w:p>
-      <w:pPr>
-        <w:pStyle w:val="Heading3"/>
-      </w:pPr>
-      <w:r>
-        <w:rPr>
-          <w:rFonts w:ascii="Montserrat" w:hAnsi="Montserrat" w:eastAsia="Outfit"/>
-        </w:rPr>
-        <w:t>Decommissioning and site transfer</w:t>
-      </w:r>
-    </w:p>
-    <w:p>
-      <w:r>
-        <w:rPr>
-          <w:rFonts w:ascii="Roboto" w:hAnsi="Roboto" w:eastAsia="Roboto"/>
-        </w:rPr>
-        <w:t>IPP holds ISN RAVS Plus verification for plant decommissioning. We have completed full-scale decommissions in Ohio, Alabama, Louisiana, the United Kingdom and Germany. Our team helped transfer a shuttered biobased chemicals plant in Minnesota to Nuol Green Chemistry, a deal SOCMA highlighted.</w:t>
-      </w:r>
-    </w:p>
-    <w:p>
-      <w:r>
-        <w:rPr>
-          <w:rFonts w:ascii="Roboto" w:hAnsi="Roboto" w:eastAsia="Roboto"/>
-        </w:rPr>
-        <w:t>Read about IPP decommissioning ↗</w:t>
-      </w:r>
-    </w:p>
-    <w:p>
-      <w:hyperlink r:id="rId28">
+      <w:pPr>
+        <w:pStyle w:val="ListBullet"/>
+      </w:pPr>
+      <w:hyperlink r:id="rId43">
         <w:r>
           <w:rPr>
             <w:rFonts w:ascii="Roboto" w:hAnsi="Roboto"/>
             <w:color w:val="0563C1"/>
             <w:u w:val="single"/>
           </w:rPr>
-          <w:t xml:space="preserve">Source / details</w:t>
+          <w:t xml:space="preserve">Chemical Engineering: Ross Gale, December 2024</w:t>
         </w:r>
       </w:hyperlink>
     </w:p>
     <w:p>
       <w:pPr>
-        <w:pStyle w:val="ListBullet"/>
-      </w:pPr>
-      <w:hyperlink r:id="rId29">
-        <w:r>
-          <w:rPr>
-            <w:rFonts w:ascii="Roboto" w:hAnsi="Roboto"/>
-            <w:color w:val="0563C1"/>
-            <w:u w:val="single"/>
-          </w:rPr>
-          <w:t xml:space="preserve">SOCMAGEO Specialty Chemicals site acquisition</w:t>
-        </w:r>
-      </w:hyperlink>
-    </w:p>
-    <w:p>
-      <w:pPr>
-        <w:pStyle w:val="ListBullet"/>
-      </w:pPr>
-      <w:hyperlink r:id="rId30">
-        <w:r>
-          <w:rPr>
-            <w:rFonts w:ascii="Roboto" w:hAnsi="Roboto"/>
-            <w:color w:val="0563C1"/>
-            <w:u w:val="single"/>
-          </w:rPr>
-          <w:t xml:space="preserve">ISN RAVS PlusDecommissioning designation, August 2024</w:t>
-        </w:r>
-      </w:hyperlink>
-    </w:p>
-    <w:p>
-      <w:pPr>
-        <w:pStyle w:val="ListBullet"/>
-      </w:pPr>
-      <w:hyperlink r:id="rId31">
-        <w:r>
-          <w:rPr>
-            <w:rFonts w:ascii="Roboto" w:hAnsi="Roboto"/>
-            <w:color w:val="0563C1"/>
-            <w:u w:val="single"/>
-          </w:rPr>
-          <w:t xml:space="preserve">Chemical ProcessingRoss Gale on IPP’s chemical plant work</w:t>
-        </w:r>
-      </w:hyperlink>
-    </w:p>
-    <w:p>
-      <w:pPr>
-        <w:pStyle w:val="ListBullet"/>
-      </w:pPr>
-      <w:hyperlink r:id="rId32">
-        <w:r>
-          <w:rPr>
-            <w:rFonts w:ascii="Roboto" w:hAnsi="Roboto"/>
-            <w:color w:val="0563C1"/>
-            <w:u w:val="single"/>
-          </w:rPr>
-          <w:t xml:space="preserve">Chemical EngineeringRoss Gale, December 2024</w:t>
-        </w:r>
-      </w:hyperlink>
-    </w:p>
-    <w:p>
-      <w:pPr>
         <w:pStyle w:val="Heading2"/>
       </w:pPr>
       <w:r>
@@ -7202,7 +6663,7 @@
         </w:rPr>
         <w:t>Ross Gale, IPP’s vice president, wrote “</w:t>
       </w:r>
-      <w:hyperlink r:id="rId32">
+      <w:hyperlink r:id="rId43">
         <w:r>
           <w:rPr>
             <w:rFonts w:ascii="Roboto" w:hAnsi="Roboto"/>
@@ -7224,7 +6685,7 @@
         <w:rPr>
           <w:rFonts w:ascii="Roboto" w:hAnsi="Roboto" w:eastAsia="Roboto"/>
         </w:rPr>
-        <w:t>IPP company profile ↗</w:t>
+        <w:t>IPP company profile</w:t>
       </w:r>
     </w:p>
     <w:p>
@@ -7251,7 +6712,7 @@
         <w:rPr>
           <w:rFonts w:ascii="Roboto" w:hAnsi="Roboto" w:eastAsia="Roboto"/>
         </w:rPr>
-        <w:t>Ask an expert ↗</w:t>
+        <w:t>Ask an expert</w:t>
       </w:r>
     </w:p>
     <w:p>
@@ -7272,7 +6733,7 @@
         </w:rPr>
         <w:t xml:space="preserve">Yes. In addition to individual equipment, we sell </w:t>
       </w:r>
-      <w:hyperlink r:id="rId33">
+      <w:hyperlink r:id="rId12">
         <w:r>
           <w:rPr>
             <w:rFonts w:ascii="Roboto" w:hAnsi="Roboto"/>
@@ -7361,7 +6822,7 @@
         </w:rPr>
         <w:t xml:space="preserve">Chemical process plant equipment is the set of reactors, heat exchangers, centrifuges, dryers, filters, columns and tanks that converts raw materials into chemical products. Read IPP’s </w:t>
       </w:r>
-      <w:hyperlink r:id="rId34">
+      <w:hyperlink r:id="rId44">
         <w:r>
           <w:rPr>
             <w:rFonts w:ascii="Roboto" w:hAnsi="Roboto"/>
@@ -7504,7 +6965,7 @@
         </w:rPr>
         <w:t xml:space="preserve">Yes. </w:t>
       </w:r>
-      <w:hyperlink r:id="rId19">
+      <w:hyperlink r:id="rId34">
         <w:r>
           <w:rPr>
             <w:rFonts w:ascii="Roboto" w:hAnsi="Roboto"/>
@@ -7520,7 +6981,7 @@
         </w:rPr>
         <w:t xml:space="preserve">, an IPP group company, fabricates new stainless steel process equipment with 12 to 16 week average delivery. </w:t>
       </w:r>
-      <w:hyperlink r:id="rId20">
+      <w:hyperlink r:id="rId35">
         <w:r>
           <w:rPr>
             <w:rFonts w:ascii="Roboto" w:hAnsi="Roboto"/>
@@ -7641,7 +7102,7 @@
         </w:rPr>
         <w:t xml:space="preserve">Yes. IPP purchases complete plant sites, including the land, buildings, equipment and intellectual property. We also buy individual process units and equipment systems within a site. </w:t>
       </w:r>
-      <w:hyperlink r:id="rId35">
+      <w:hyperlink r:id="rId45">
         <w:r>
           <w:rPr>
             <w:rFonts w:ascii="Roboto" w:hAnsi="Roboto"/>
@@ -7804,7 +7265,7 @@
         <w:rPr>
           <w:rFonts w:ascii="Roboto" w:hAnsi="Roboto" w:eastAsia="Roboto"/>
         </w:rPr>
-        <w:t>All IPP articles ↗</w:t>
+        <w:t>All IPP articles</w:t>
       </w:r>
     </w:p>
     <w:p>
@@ -7839,26 +7300,6 @@
         <w:rPr>
           <w:rFonts w:ascii="Roboto" w:hAnsi="Roboto" w:eastAsia="Roboto"/>
         </w:rPr>
-        <w:t>Read article ↗</w:t>
-      </w:r>
-    </w:p>
-    <w:p>
-      <w:hyperlink r:id="rId34">
-        <w:r>
-          <w:rPr>
-            <w:rFonts w:ascii="Roboto" w:hAnsi="Roboto"/>
-            <w:color w:val="0563C1"/>
-            <w:u w:val="single"/>
-          </w:rPr>
-          <w:t xml:space="preserve">Source / details</w:t>
-        </w:r>
-      </w:hyperlink>
-    </w:p>
-    <w:p>
-      <w:r>
-        <w:rPr>
-          <w:rFonts w:ascii="Roboto" w:hAnsi="Roboto" w:eastAsia="Roboto"/>
-        </w:rPr>
         <w:t>Guide</w:t>
       </w:r>
     </w:p>
@@ -7886,26 +7327,6 @@
         <w:rPr>
           <w:rFonts w:ascii="Roboto" w:hAnsi="Roboto" w:eastAsia="Roboto"/>
         </w:rPr>
-        <w:t>Read article ↗</w:t>
-      </w:r>
-    </w:p>
-    <w:p>
-      <w:hyperlink r:id="rId36">
-        <w:r>
-          <w:rPr>
-            <w:rFonts w:ascii="Roboto" w:hAnsi="Roboto"/>
-            <w:color w:val="0563C1"/>
-            <w:u w:val="single"/>
-          </w:rPr>
-          <w:t xml:space="preserve">Source / details</w:t>
-        </w:r>
-      </w:hyperlink>
-    </w:p>
-    <w:p>
-      <w:r>
-        <w:rPr>
-          <w:rFonts w:ascii="Roboto" w:hAnsi="Roboto" w:eastAsia="Roboto"/>
-        </w:rPr>
         <w:t>Guide</w:t>
       </w:r>
     </w:p>
@@ -7933,26 +7354,6 @@
         <w:rPr>
           <w:rFonts w:ascii="Roboto" w:hAnsi="Roboto" w:eastAsia="Roboto"/>
         </w:rPr>
-        <w:t>Read article ↗</w:t>
-      </w:r>
-    </w:p>
-    <w:p>
-      <w:hyperlink r:id="rId37">
-        <w:r>
-          <w:rPr>
-            <w:rFonts w:ascii="Roboto" w:hAnsi="Roboto"/>
-            <w:color w:val="0563C1"/>
-            <w:u w:val="single"/>
-          </w:rPr>
-          <w:t xml:space="preserve">Source / details</w:t>
-        </w:r>
-      </w:hyperlink>
-    </w:p>
-    <w:p>
-      <w:r>
-        <w:rPr>
-          <w:rFonts w:ascii="Roboto" w:hAnsi="Roboto" w:eastAsia="Roboto"/>
-        </w:rPr>
         <w:t>Guide</w:t>
       </w:r>
     </w:p>
@@ -7980,26 +7381,6 @@
         <w:rPr>
           <w:rFonts w:ascii="Roboto" w:hAnsi="Roboto" w:eastAsia="Roboto"/>
         </w:rPr>
-        <w:t>Read article ↗</w:t>
-      </w:r>
-    </w:p>
-    <w:p>
-      <w:hyperlink r:id="rId38">
-        <w:r>
-          <w:rPr>
-            <w:rFonts w:ascii="Roboto" w:hAnsi="Roboto"/>
-            <w:color w:val="0563C1"/>
-            <w:u w:val="single"/>
-          </w:rPr>
-          <w:t xml:space="preserve">Source / details</w:t>
-        </w:r>
-      </w:hyperlink>
-    </w:p>
-    <w:p>
-      <w:r>
-        <w:rPr>
-          <w:rFonts w:ascii="Roboto" w:hAnsi="Roboto" w:eastAsia="Roboto"/>
-        </w:rPr>
         <w:t>Guide</w:t>
       </w:r>
     </w:p>
@@ -8027,26 +7408,6 @@
         <w:rPr>
           <w:rFonts w:ascii="Roboto" w:hAnsi="Roboto" w:eastAsia="Roboto"/>
         </w:rPr>
-        <w:t>Read article ↗</w:t>
-      </w:r>
-    </w:p>
-    <w:p>
-      <w:hyperlink r:id="rId39">
-        <w:r>
-          <w:rPr>
-            <w:rFonts w:ascii="Roboto" w:hAnsi="Roboto"/>
-            <w:color w:val="0563C1"/>
-            <w:u w:val="single"/>
-          </w:rPr>
-          <w:t xml:space="preserve">Source / details</w:t>
-        </w:r>
-      </w:hyperlink>
-    </w:p>
-    <w:p>
-      <w:r>
-        <w:rPr>
-          <w:rFonts w:ascii="Roboto" w:hAnsi="Roboto" w:eastAsia="Roboto"/>
-        </w:rPr>
         <w:t>For sellers</w:t>
       </w:r>
     </w:p>
@@ -8070,26 +7431,6 @@
       </w:r>
     </w:p>
     <w:p>
-      <w:r>
-        <w:rPr>
-          <w:rFonts w:ascii="Roboto" w:hAnsi="Roboto" w:eastAsia="Roboto"/>
-        </w:rPr>
-        <w:t>Read article ↗</w:t>
-      </w:r>
-    </w:p>
-    <w:p>
-      <w:hyperlink r:id="rId28">
-        <w:r>
-          <w:rPr>
-            <w:rFonts w:ascii="Roboto" w:hAnsi="Roboto"/>
-            <w:color w:val="0563C1"/>
-            <w:u w:val="single"/>
-          </w:rPr>
-          <w:t xml:space="preserve">Source / details</w:t>
-        </w:r>
-      </w:hyperlink>
-    </w:p>
-    <w:p>
       <w:pPr>
         <w:pStyle w:val="Heading2"/>
       </w:pPr>
@@ -8138,7 +7479,7 @@
         </w:rPr>
         <w:t xml:space="preserve"> · </w:t>
       </w:r>
-      <w:hyperlink r:id="rId40">
+      <w:hyperlink r:id="rId46">
         <w:r>
           <w:rPr>
             <w:rFonts w:ascii="Roboto" w:hAnsi="Roboto"/>
@@ -8150,40 +7491,48 @@
       </w:hyperlink>
     </w:p>
     <w:p>
-      <w:r>
-        <w:rPr>
-          <w:rFonts w:ascii="Roboto" w:hAnsi="Roboto" w:eastAsia="Roboto"/>
-        </w:rPr>
-        <w:t xml:space="preserve">Contact IPP </w:t>
-      </w:r>
-      <w:r>
-        <w:rPr>
-          <w:rFonts w:ascii="Roboto" w:hAnsi="Roboto" w:eastAsia="Roboto"/>
-        </w:rPr>
-        <w:t>↗</w:t>
-      </w:r>
-    </w:p>
-    <w:p>
-      <w:r>
-        <w:rPr>
-          <w:rFonts w:ascii="Roboto" w:hAnsi="Roboto" w:eastAsia="Roboto"/>
-        </w:rPr>
-        <w:t xml:space="preserve">Sell a plant </w:t>
-      </w:r>
-      <w:r>
-        <w:rPr>
-          <w:rFonts w:ascii="Roboto" w:hAnsi="Roboto" w:eastAsia="Roboto"/>
-        </w:rPr>
-        <w:t>↗</w:t>
-      </w:r>
-    </w:p>
-    <w:p>
-      <w:r>
-        <w:rPr>
-          <w:rFonts w:ascii="Roboto" w:hAnsi="Roboto" w:eastAsia="Roboto"/>
-        </w:rPr>
-        <w:t>Sell equipment ↗</w:t>
-      </w:r>
+      <w:hyperlink r:id="rId9">
+        <w:r>
+          <w:rPr>
+            <w:rFonts w:ascii="Roboto" w:hAnsi="Roboto"/>
+            <w:color w:val="0563C1"/>
+            <w:u w:val="single"/>
+          </w:rPr>
+          <w:t xml:space="preserve">Contact IPP</w:t>
+        </w:r>
+      </w:hyperlink>
+      <w:r>
+        <w:rPr>
+          <w:rFonts w:ascii="Roboto" w:hAnsi="Roboto" w:eastAsia="Roboto"/>
+        </w:rPr>
+        <w:t xml:space="preserve"> · </w:t>
+      </w:r>
+      <w:hyperlink r:id="rId10">
+        <w:r>
+          <w:rPr>
+            <w:rFonts w:ascii="Roboto" w:hAnsi="Roboto"/>
+            <w:color w:val="0563C1"/>
+            <w:u w:val="single"/>
+          </w:rPr>
+          <w:t xml:space="preserve">Sell a plant</w:t>
+        </w:r>
+      </w:hyperlink>
+      <w:r>
+        <w:rPr>
+          <w:rFonts w:ascii="Roboto" w:hAnsi="Roboto" w:eastAsia="Roboto"/>
+        </w:rPr>
+        <w:t xml:space="preserve"> · </w:t>
+      </w:r>
+      <w:hyperlink r:id="rId11">
+        <w:r>
+          <w:rPr>
+            <w:rFonts w:ascii="Roboto" w:hAnsi="Roboto"/>
+            <w:color w:val="0563C1"/>
+            <w:u w:val="single"/>
+          </w:rPr>
+          <w:t xml:space="preserve">Sell equipment</w:t>
+        </w:r>
+      </w:hyperlink>
     </w:p>
     <w:sectPr>
       <w:pgSz w:w="12240" w:h="15840"/>

</xml_diff>

<commit_message>
Chemical page: no links in the company intro
The closing intro paragraph keeps both actions and the phone number as
plain text; links stay in the hero buttons, seller section and closing
call to action. The validator fails on any link in the company intro.

Co-Authored-By: Claude Opus 5.5 <noreply@anthropic.com>
</commit_message>
<xml_diff>
--- a/docs/chemical-build/deliverables/used-chemical-process-plants-for-sale-content.docx
+++ b/docs/chemical-build/deliverables/used-chemical-process-plants-for-sale-content.docx
@@ -197,67 +197,7 @@
         <w:rPr>
           <w:rFonts w:ascii="Roboto" w:hAnsi="Roboto" w:eastAsia="Roboto"/>
         </w:rPr>
-        <w:t xml:space="preserve">Buyers request specifications, inspections and quotations through </w:t>
-      </w:r>
-      <w:hyperlink r:id="rId9">
-        <w:r>
-          <w:rPr>
-            <w:rFonts w:ascii="Roboto" w:hAnsi="Roboto"/>
-            <w:color w:val="0563C1"/>
-            <w:u w:val="single"/>
-          </w:rPr>
-          <w:t xml:space="preserve">IPP’s team</w:t>
-        </w:r>
-      </w:hyperlink>
-      <w:r>
-        <w:rPr>
-          <w:rFonts w:ascii="Roboto" w:hAnsi="Roboto" w:eastAsia="Roboto"/>
-        </w:rPr>
-        <w:t xml:space="preserve">. Plant owners start a sale through the </w:t>
-      </w:r>
-      <w:hyperlink r:id="rId10">
-        <w:r>
-          <w:rPr>
-            <w:rFonts w:ascii="Roboto" w:hAnsi="Roboto"/>
-            <w:color w:val="0563C1"/>
-            <w:u w:val="single"/>
-          </w:rPr>
-          <w:t xml:space="preserve">sell-a-plant</w:t>
-        </w:r>
-      </w:hyperlink>
-      <w:r>
-        <w:rPr>
-          <w:rFonts w:ascii="Roboto" w:hAnsi="Roboto" w:eastAsia="Roboto"/>
-        </w:rPr>
-        <w:t xml:space="preserve"> or </w:t>
-      </w:r>
-      <w:hyperlink r:id="rId11">
-        <w:r>
-          <w:rPr>
-            <w:rFonts w:ascii="Roboto" w:hAnsi="Roboto"/>
-            <w:color w:val="0563C1"/>
-            <w:u w:val="single"/>
-          </w:rPr>
-          <w:t xml:space="preserve">sell-equipment</w:t>
-        </w:r>
-      </w:hyperlink>
-      <w:r>
-        <w:rPr>
-          <w:rFonts w:ascii="Roboto" w:hAnsi="Roboto" w:eastAsia="Roboto"/>
-        </w:rPr>
-        <w:t xml:space="preserve"> form. Call </w:t>
-      </w:r>
-      <w:r>
-        <w:rPr>
-          <w:rFonts w:ascii="Roboto" w:hAnsi="Roboto" w:eastAsia="Roboto"/>
-        </w:rPr>
-        <w:t>+1 609-586-8004</w:t>
-      </w:r>
-      <w:r>
-        <w:rPr>
-          <w:rFonts w:ascii="Roboto" w:hAnsi="Roboto" w:eastAsia="Roboto"/>
-        </w:rPr>
-        <w:t xml:space="preserve"> to discuss a purchase or a sale with our team.</w:t>
+        <w:t>Buyers request specifications, inspections and quotations through IPP’s team. Plant owners start a sale through the Sell Plants or Sell Equipment form. Call +1 609-586-8004 to discuss a purchase or a sale with our team.</w:t>
       </w:r>
     </w:p>
     <w:p>
@@ -2968,7 +2908,7 @@
       </w:r>
     </w:p>
     <w:p>
-      <w:hyperlink r:id="rId12">
+      <w:hyperlink r:id="rId9">
         <w:r>
           <w:rPr>
             <w:rFonts w:ascii="Roboto" w:hAnsi="Roboto"/>
@@ -2984,7 +2924,7 @@
         </w:rPr>
         <w:t xml:space="preserve"> · </w:t>
       </w:r>
-      <w:hyperlink r:id="rId13">
+      <w:hyperlink r:id="rId10">
         <w:r>
           <w:rPr>
             <w:rFonts w:ascii="Roboto" w:hAnsi="Roboto"/>
@@ -3121,7 +3061,7 @@
       </w:r>
     </w:p>
     <w:p>
-      <w:hyperlink r:id="rId14">
+      <w:hyperlink r:id="rId11">
         <w:r>
           <w:rPr>
             <w:rFonts w:ascii="Roboto" w:hAnsi="Roboto"/>
@@ -3239,7 +3179,7 @@
       </w:r>
     </w:p>
     <w:p>
-      <w:hyperlink r:id="rId15">
+      <w:hyperlink r:id="rId12">
         <w:r>
           <w:rPr>
             <w:rFonts w:ascii="Roboto" w:hAnsi="Roboto"/>
@@ -3357,7 +3297,7 @@
       </w:r>
     </w:p>
     <w:p>
-      <w:hyperlink r:id="rId16">
+      <w:hyperlink r:id="rId13">
         <w:r>
           <w:rPr>
             <w:rFonts w:ascii="Roboto" w:hAnsi="Roboto"/>
@@ -3475,7 +3415,7 @@
       </w:r>
     </w:p>
     <w:p>
-      <w:hyperlink r:id="rId17">
+      <w:hyperlink r:id="rId14">
         <w:r>
           <w:rPr>
             <w:rFonts w:ascii="Roboto" w:hAnsi="Roboto"/>
@@ -3593,7 +3533,7 @@
       </w:r>
     </w:p>
     <w:p>
-      <w:hyperlink r:id="rId18">
+      <w:hyperlink r:id="rId15">
         <w:r>
           <w:rPr>
             <w:rFonts w:ascii="Roboto" w:hAnsi="Roboto"/>
@@ -3711,7 +3651,7 @@
       </w:r>
     </w:p>
     <w:p>
-      <w:hyperlink r:id="rId19">
+      <w:hyperlink r:id="rId16">
         <w:r>
           <w:rPr>
             <w:rFonts w:ascii="Roboto" w:hAnsi="Roboto"/>
@@ -3727,7 +3667,7 @@
         </w:rPr>
         <w:t xml:space="preserve"> · </w:t>
       </w:r>
-      <w:hyperlink r:id="rId20">
+      <w:hyperlink r:id="rId17">
         <w:r>
           <w:rPr>
             <w:rFonts w:ascii="Roboto" w:hAnsi="Roboto"/>
@@ -3845,7 +3785,7 @@
       </w:r>
     </w:p>
     <w:p>
-      <w:hyperlink r:id="rId21">
+      <w:hyperlink r:id="rId18">
         <w:r>
           <w:rPr>
             <w:rFonts w:ascii="Roboto" w:hAnsi="Roboto"/>
@@ -3952,7 +3892,7 @@
       </w:r>
     </w:p>
     <w:p>
-      <w:hyperlink r:id="rId22">
+      <w:hyperlink r:id="rId19">
         <w:r>
           <w:rPr>
             <w:rFonts w:ascii="Roboto" w:hAnsi="Roboto"/>
@@ -4070,7 +4010,7 @@
       </w:r>
     </w:p>
     <w:p>
-      <w:hyperlink r:id="rId23">
+      <w:hyperlink r:id="rId20">
         <w:r>
           <w:rPr>
             <w:rFonts w:ascii="Roboto" w:hAnsi="Roboto"/>
@@ -4188,7 +4128,7 @@
       </w:r>
     </w:p>
     <w:p>
-      <w:hyperlink r:id="rId24">
+      <w:hyperlink r:id="rId21">
         <w:r>
           <w:rPr>
             <w:rFonts w:ascii="Roboto" w:hAnsi="Roboto"/>
@@ -4306,7 +4246,7 @@
       </w:r>
     </w:p>
     <w:p>
-      <w:hyperlink r:id="rId25">
+      <w:hyperlink r:id="rId22">
         <w:r>
           <w:rPr>
             <w:rFonts w:ascii="Roboto" w:hAnsi="Roboto"/>
@@ -4322,7 +4262,7 @@
         </w:rPr>
         <w:t xml:space="preserve"> · </w:t>
       </w:r>
-      <w:hyperlink r:id="rId26">
+      <w:hyperlink r:id="rId23">
         <w:r>
           <w:rPr>
             <w:rFonts w:ascii="Roboto" w:hAnsi="Roboto"/>
@@ -4364,7 +4304,7 @@
       <w:pPr>
         <w:pStyle w:val="ListBullet"/>
       </w:pPr>
-      <w:hyperlink r:id="rId27">
+      <w:hyperlink r:id="rId24">
         <w:r>
           <w:rPr>
             <w:rFonts w:ascii="Roboto" w:hAnsi="Roboto"/>
@@ -4391,7 +4331,7 @@
       <w:pPr>
         <w:pStyle w:val="ListBullet"/>
       </w:pPr>
-      <w:hyperlink r:id="rId28">
+      <w:hyperlink r:id="rId25">
         <w:r>
           <w:rPr>
             <w:rFonts w:ascii="Roboto" w:hAnsi="Roboto"/>
@@ -4418,7 +4358,7 @@
       <w:pPr>
         <w:pStyle w:val="ListBullet"/>
       </w:pPr>
-      <w:hyperlink r:id="rId29">
+      <w:hyperlink r:id="rId26">
         <w:r>
           <w:rPr>
             <w:rFonts w:ascii="Roboto" w:hAnsi="Roboto"/>
@@ -4445,7 +4385,7 @@
       <w:pPr>
         <w:pStyle w:val="ListBullet"/>
       </w:pPr>
-      <w:hyperlink r:id="rId30">
+      <w:hyperlink r:id="rId27">
         <w:r>
           <w:rPr>
             <w:rFonts w:ascii="Roboto" w:hAnsi="Roboto"/>
@@ -4472,7 +4412,7 @@
       <w:pPr>
         <w:pStyle w:val="ListBullet"/>
       </w:pPr>
-      <w:hyperlink r:id="rId31">
+      <w:hyperlink r:id="rId28">
         <w:r>
           <w:rPr>
             <w:rFonts w:ascii="Roboto" w:hAnsi="Roboto"/>
@@ -4499,7 +4439,7 @@
       <w:pPr>
         <w:pStyle w:val="ListBullet"/>
       </w:pPr>
-      <w:hyperlink r:id="rId32">
+      <w:hyperlink r:id="rId29">
         <w:r>
           <w:rPr>
             <w:rFonts w:ascii="Roboto" w:hAnsi="Roboto"/>
@@ -4526,7 +4466,7 @@
       <w:pPr>
         <w:pStyle w:val="ListBullet"/>
       </w:pPr>
-      <w:hyperlink r:id="rId33">
+      <w:hyperlink r:id="rId30">
         <w:r>
           <w:rPr>
             <w:rFonts w:ascii="Roboto" w:hAnsi="Roboto"/>
@@ -5023,7 +4963,7 @@
         </w:rPr>
         <w:t xml:space="preserve">We provide a detailed quote for each stock number on request. </w:t>
       </w:r>
-      <w:hyperlink r:id="rId9">
+      <w:hyperlink r:id="rId31">
         <w:r>
           <w:rPr>
             <w:rFonts w:ascii="Roboto" w:hAnsi="Roboto"/>
@@ -5138,7 +5078,7 @@
         </w:rPr>
         <w:t xml:space="preserve">Our team confirms the assets included in the purchase agreement. Plant owners start the sale through the </w:t>
       </w:r>
-      <w:hyperlink r:id="rId10">
+      <w:hyperlink r:id="rId32">
         <w:r>
           <w:rPr>
             <w:rFonts w:ascii="Roboto" w:hAnsi="Roboto"/>
@@ -5154,7 +5094,7 @@
         </w:rPr>
         <w:t xml:space="preserve"> or </w:t>
       </w:r>
-      <w:hyperlink r:id="rId11">
+      <w:hyperlink r:id="rId33">
         <w:r>
           <w:rPr>
             <w:rFonts w:ascii="Roboto" w:hAnsi="Roboto"/>
@@ -5786,7 +5726,7 @@
         </w:rPr>
         <w:t xml:space="preserve">Confirm the equipment included, commercial terms and services required. </w:t>
       </w:r>
-      <w:hyperlink r:id="rId9">
+      <w:hyperlink r:id="rId31">
         <w:r>
           <w:rPr>
             <w:rFonts w:ascii="Roboto" w:hAnsi="Roboto"/>
@@ -5887,7 +5827,7 @@
       </w:r>
     </w:p>
     <w:p>
-      <w:hyperlink r:id="rId10">
+      <w:hyperlink r:id="rId32">
         <w:r>
           <w:rPr>
             <w:rFonts w:ascii="Roboto" w:hAnsi="Roboto"/>
@@ -5903,7 +5843,7 @@
         </w:rPr>
         <w:t xml:space="preserve"> · </w:t>
       </w:r>
-      <w:hyperlink r:id="rId11">
+      <w:hyperlink r:id="rId33">
         <w:r>
           <w:rPr>
             <w:rFonts w:ascii="Roboto" w:hAnsi="Roboto"/>
@@ -6003,7 +5943,7 @@
         </w:rPr>
         <w:t xml:space="preserve">Our team reviews the information and confirms the next steps. Sellers send the details through the </w:t>
       </w:r>
-      <w:hyperlink r:id="rId10">
+      <w:hyperlink r:id="rId32">
         <w:r>
           <w:rPr>
             <w:rFonts w:ascii="Roboto" w:hAnsi="Roboto"/>
@@ -6019,7 +5959,7 @@
         </w:rPr>
         <w:t xml:space="preserve"> or </w:t>
       </w:r>
-      <w:hyperlink r:id="rId11">
+      <w:hyperlink r:id="rId33">
         <w:r>
           <w:rPr>
             <w:rFonts w:ascii="Roboto" w:hAnsi="Roboto"/>
@@ -6733,7 +6673,7 @@
         </w:rPr>
         <w:t xml:space="preserve">Yes. In addition to individual equipment, we sell </w:t>
       </w:r>
-      <w:hyperlink r:id="rId12">
+      <w:hyperlink r:id="rId9">
         <w:r>
           <w:rPr>
             <w:rFonts w:ascii="Roboto" w:hAnsi="Roboto"/>
@@ -6768,7 +6708,7 @@
         </w:rPr>
         <w:t xml:space="preserve">Yes. IPP offers on-site and video inspections for most equipment. </w:t>
       </w:r>
-      <w:hyperlink r:id="rId9">
+      <w:hyperlink r:id="rId31">
         <w:r>
           <w:rPr>
             <w:rFonts w:ascii="Roboto" w:hAnsi="Roboto"/>
@@ -6857,7 +6797,7 @@
         </w:rPr>
         <w:t xml:space="preserve">We quote each plant and unit individually. </w:t>
       </w:r>
-      <w:hyperlink r:id="rId9">
+      <w:hyperlink r:id="rId31">
         <w:r>
           <w:rPr>
             <w:rFonts w:ascii="Roboto" w:hAnsi="Roboto"/>
@@ -6930,7 +6870,7 @@
         </w:rPr>
         <w:t xml:space="preserve">Yes. IPP advertises financing for its plants and equipment. </w:t>
       </w:r>
-      <w:hyperlink r:id="rId9">
+      <w:hyperlink r:id="rId31">
         <w:r>
           <w:rPr>
             <w:rFonts w:ascii="Roboto" w:hAnsi="Roboto"/>
@@ -7016,7 +6956,7 @@
         </w:rPr>
         <w:t xml:space="preserve">Yes. We buy complete plants, process lines and individual equipment from shutdown, idled and restructured sites. Start with the </w:t>
       </w:r>
-      <w:hyperlink r:id="rId10">
+      <w:hyperlink r:id="rId32">
         <w:r>
           <w:rPr>
             <w:rFonts w:ascii="Roboto" w:hAnsi="Roboto"/>
@@ -7032,7 +6972,7 @@
         </w:rPr>
         <w:t xml:space="preserve"> or </w:t>
       </w:r>
-      <w:hyperlink r:id="rId11">
+      <w:hyperlink r:id="rId33">
         <w:r>
           <w:rPr>
             <w:rFonts w:ascii="Roboto" w:hAnsi="Roboto"/>
@@ -7067,7 +7007,7 @@
         </w:rPr>
         <w:t xml:space="preserve">Provide an asset list, photographs, the plant location, available technical documents and your removal deadline. </w:t>
       </w:r>
-      <w:hyperlink r:id="rId9">
+      <w:hyperlink r:id="rId31">
         <w:r>
           <w:rPr>
             <w:rFonts w:ascii="Roboto" w:hAnsi="Roboto"/>
@@ -7137,7 +7077,7 @@
         </w:rPr>
         <w:t xml:space="preserve">Yes, in some acquisitions. IPP buys sites with known contamination and assumes site cleanup and regulatory compliance obligations as the buyer. Our remediation partners work with local environmental authorities on each site. </w:t>
       </w:r>
-      <w:hyperlink r:id="rId10">
+      <w:hyperlink r:id="rId32">
         <w:r>
           <w:rPr>
             <w:rFonts w:ascii="Roboto" w:hAnsi="Roboto"/>
@@ -7491,7 +7431,7 @@
       </w:hyperlink>
     </w:p>
     <w:p>
-      <w:hyperlink r:id="rId9">
+      <w:hyperlink r:id="rId31">
         <w:r>
           <w:rPr>
             <w:rFonts w:ascii="Roboto" w:hAnsi="Roboto"/>
@@ -7507,7 +7447,7 @@
         </w:rPr>
         <w:t xml:space="preserve"> · </w:t>
       </w:r>
-      <w:hyperlink r:id="rId10">
+      <w:hyperlink r:id="rId32">
         <w:r>
           <w:rPr>
             <w:rFonts w:ascii="Roboto" w:hAnsi="Roboto"/>
@@ -7523,7 +7463,7 @@
         </w:rPr>
         <w:t xml:space="preserve"> · </w:t>
       </w:r>
-      <w:hyperlink r:id="rId11">
+      <w:hyperlink r:id="rId33">
         <w:r>
           <w:rPr>
             <w:rFonts w:ascii="Roboto" w:hAnsi="Roboto"/>

</xml_diff>

<commit_message>
Chemical page: listings that read clearly
- Reactor seal card removed: outside the IMS chemical family and its
  size data conflicts. 19 listings: six plants, 13 equipment units.
- Fertilizer plants use the IMS type name "Fertilizer & agrochemical".
- Choosing a plant type points the plant button at that IMS plant type,
  matching how the equipment button follows an equipment type.
- Fertilizer, petrochemical and pharmaceutical plants and the
  centrifuge, filter and dryer listings stay for buyers.

Co-Authored-By: Claude Opus 5.5 <noreply@anthropic.com>
</commit_message>
<xml_diff>
--- a/docs/chemical-build/deliverables/used-chemical-process-plants-for-sale-content.docx
+++ b/docs/chemical-build/deliverables/used-chemical-process-plants-for-sale-content.docx
@@ -216,7 +216,7 @@
         <w:rPr>
           <w:rFonts w:ascii="Roboto" w:hAnsi="Roboto" w:eastAsia="Roboto"/>
         </w:rPr>
-        <w:t>International Process Plants (IPP)’s inventory includes used chemical process plant equipment like reactors, heat exchangers and centrifuges, ready to ship for fast redeployment. This list features six used chemical plants and 14 units of chemical process equipment, with at least one listing for each equipment type we supply. Plant listings show capacity, technology, feedstock and location. Equipment listings show material, condition, pressure and temperature. Each listing opens the full specifications and photographs in IPP’s inventory.</w:t>
+        <w:t>International Process Plants (IPP)’s inventory includes used chemical process plant equipment like reactors, heat exchangers and centrifuges, ready to ship for fast redeployment. This list features six used chemical plants and 13 units of chemical process equipment, with at least one listing for each equipment type we supply. Plant listings show capacity, technology, feedstock and location. Equipment listings show material, condition, pressure and temperature. Each listing opens the full specifications and photographs in IPP’s inventory.</w:t>
       </w:r>
     </w:p>
     <w:p>
@@ -2790,120 +2790,6 @@
         <w:rPr>
           <w:rFonts w:ascii="Roboto" w:hAnsi="Roboto" w:eastAsia="Roboto"/>
         </w:rPr>
-        <w:t>IPP STOCK #249252</w:t>
-      </w:r>
-    </w:p>
-    <w:p>
-      <w:pPr>
-        <w:pStyle w:val="Heading3"/>
-      </w:pPr>
-      <w:r>
-        <w:rPr>
-          <w:rFonts w:ascii="Montserrat" w:hAnsi="Montserrat" w:eastAsia="Outfit"/>
-        </w:rPr>
-        <w:t>Hastelloy C22 reactor seal</w:t>
-      </w:r>
-    </w:p>
-    <w:tbl>
-      <w:tblPr>
-        <w:tblStyle w:val="TableGrid"/>
-        <w:tblW w:type="auto" w:w="0"/>
-        <w:tblLook w:firstColumn="1" w:firstRow="1" w:lastColumn="0" w:lastRow="0" w:noHBand="0" w:noVBand="1" w:val="04A0"/>
-      </w:tblPr>
-      <w:tblGrid>
-        <w:gridCol w:w="4320"/>
-        <w:gridCol w:w="4320"/>
-      </w:tblGrid>
-      <w:tr>
-        <w:tc>
-          <w:tcPr>
-            <w:tcW w:type="dxa" w:w="4320"/>
-          </w:tcPr>
-          <w:p>
-            <w:r>
-              <w:rPr>
-                <w:rFonts w:ascii="Roboto" w:hAnsi="Roboto" w:eastAsia="Roboto"/>
-              </w:rPr>
-              <w:t>Part</w:t>
-            </w:r>
-          </w:p>
-        </w:tc>
-        <w:tc>
-          <w:tcPr>
-            <w:tcW w:type="dxa" w:w="4320"/>
-          </w:tcPr>
-          <w:p>
-            <w:r>
-              <w:rPr>
-                <w:rFonts w:ascii="Roboto" w:hAnsi="Roboto" w:eastAsia="Roboto"/>
-              </w:rPr>
-              <w:t>Seal and seal plan</w:t>
-            </w:r>
-          </w:p>
-        </w:tc>
-      </w:tr>
-      <w:tr>
-        <w:tc>
-          <w:tcPr>
-            <w:tcW w:type="dxa" w:w="4320"/>
-          </w:tcPr>
-          <w:p>
-            <w:r>
-              <w:rPr>
-                <w:rFonts w:ascii="Roboto" w:hAnsi="Roboto" w:eastAsia="Roboto"/>
-              </w:rPr>
-              <w:t>Material</w:t>
-            </w:r>
-          </w:p>
-        </w:tc>
-        <w:tc>
-          <w:tcPr>
-            <w:tcW w:type="dxa" w:w="4320"/>
-          </w:tcPr>
-          <w:p>
-            <w:r>
-              <w:rPr>
-                <w:rFonts w:ascii="Roboto" w:hAnsi="Roboto" w:eastAsia="Roboto"/>
-              </w:rPr>
-              <w:t>Hastelloy C22</w:t>
-            </w:r>
-          </w:p>
-        </w:tc>
-      </w:tr>
-      <w:tr>
-        <w:tc>
-          <w:tcPr>
-            <w:tcW w:type="dxa" w:w="4320"/>
-          </w:tcPr>
-          <w:p>
-            <w:r>
-              <w:rPr>
-                <w:rFonts w:ascii="Roboto" w:hAnsi="Roboto" w:eastAsia="Roboto"/>
-              </w:rPr>
-              <w:t>Service</w:t>
-            </w:r>
-          </w:p>
-        </w:tc>
-        <w:tc>
-          <w:tcPr>
-            <w:tcW w:type="dxa" w:w="4320"/>
-          </w:tcPr>
-          <w:p>
-            <w:r>
-              <w:rPr>
-                <w:rFonts w:ascii="Roboto" w:hAnsi="Roboto" w:eastAsia="Roboto"/>
-              </w:rPr>
-              <w:t>Exotic alloy reactors</w:t>
-            </w:r>
-          </w:p>
-        </w:tc>
-      </w:tr>
-    </w:tbl>
-    <w:p>
-      <w:r>
-        <w:rPr>
-          <w:rFonts w:ascii="Roboto" w:hAnsi="Roboto" w:eastAsia="Roboto"/>
-        </w:rPr>
         <w:t>Each listing confirms current availability and the equipment included.</w:t>
       </w:r>
     </w:p>
@@ -4242,7 +4128,7 @@
         <w:rPr>
           <w:rFonts w:ascii="Roboto" w:hAnsi="Roboto" w:eastAsia="Roboto"/>
         </w:rPr>
-        <w:t>Featured listings: re-glassed Pfaudler retreat curve agitator for a 1,150 L (300 gal) vessel and a new Hastelloy C-22 reactor seal.</w:t>
+        <w:t>Featured listing: re-glassed Pfaudler retreat curve agitator for a 1,150 L (300 gal) vessel.</w:t>
       </w:r>
     </w:p>
     <w:p>

</xml_diff>